<commit_message>
Documentação base da DenseNet
</commit_message>
<xml_diff>
--- a/Documents and Backups/Estudos Conduzidos.docx
+++ b/Documents and Backups/Estudos Conduzidos.docx
@@ -88,6 +88,7 @@
       <w:r>
         <w:t xml:space="preserve">utilizaram os </w:t>
       </w:r>
+      <w:proofErr w:type="spellStart"/>
       <w:r>
         <w:rPr>
           <w:i/>
@@ -95,9 +96,11 @@
         </w:rPr>
         <w:t>TFRecords</w:t>
       </w:r>
+      <w:proofErr w:type="spellEnd"/>
       <w:r>
         <w:t xml:space="preserve"> da </w:t>
       </w:r>
+      <w:proofErr w:type="spellStart"/>
       <w:r>
         <w:rPr>
           <w:i/>
@@ -105,6 +108,7 @@
         </w:rPr>
         <w:t>ImageNet</w:t>
       </w:r>
+      <w:proofErr w:type="spellEnd"/>
       <w:r>
         <w:t xml:space="preserve"> como entrada. </w:t>
       </w:r>
@@ -144,6 +148,7 @@
       <w:r>
         <w:t xml:space="preserve">em vez de processar milhares/milhões de pequenos arquivos de imagem. Um </w:t>
       </w:r>
+      <w:proofErr w:type="spellStart"/>
       <w:r>
         <w:rPr>
           <w:i/>
@@ -151,6 +156,7 @@
         </w:rPr>
         <w:t>TFRecord</w:t>
       </w:r>
+      <w:proofErr w:type="spellEnd"/>
       <w:r>
         <w:t xml:space="preserve"> é basicamente uma lista de exemplos serializados, onde cada exemplo contém features, descritas pela Figura </w:t>
       </w:r>
@@ -197,8 +203,17 @@
           <w:sz w:val="18"/>
           <w:szCs w:val="18"/>
         </w:rPr>
-        <w:t>Exemplo da estrutura de um TFRecord</w:t>
-      </w:r>
+        <w:t xml:space="preserve">Exemplo da estrutura de um </w:t>
+      </w:r>
+      <w:proofErr w:type="spellStart"/>
+      <w:r>
+        <w:rPr>
+          <w:sz w:val="18"/>
+          <w:szCs w:val="18"/>
+        </w:rPr>
+        <w:t>TFRecord</w:t>
+      </w:r>
+      <w:proofErr w:type="spellEnd"/>
     </w:p>
     <w:p>
       <w:pPr>
@@ -262,6 +277,7 @@
         <w:ind w:left="1080"/>
         <w:jc w:val="both"/>
       </w:pPr>
+      <w:proofErr w:type="spellStart"/>
       <w:r>
         <w:rPr>
           <w:i/>
@@ -269,6 +285,7 @@
         </w:rPr>
         <w:t>Protocol</w:t>
       </w:r>
+      <w:proofErr w:type="spellEnd"/>
       <w:r>
         <w:t xml:space="preserve"> </w:t>
       </w:r>
@@ -282,6 +299,7 @@
       <w:r>
         <w:t xml:space="preserve"> (</w:t>
       </w:r>
+      <w:proofErr w:type="spellStart"/>
       <w:r>
         <w:rPr>
           <w:i/>
@@ -289,9 +307,11 @@
         </w:rPr>
         <w:t>Protobuf</w:t>
       </w:r>
+      <w:proofErr w:type="spellEnd"/>
       <w:r>
         <w:t xml:space="preserve">) é um formato de serialização de dados criado pelo Google e utilizado na criação dos </w:t>
       </w:r>
+      <w:proofErr w:type="spellStart"/>
       <w:r>
         <w:rPr>
           <w:i/>
@@ -299,6 +319,7 @@
         </w:rPr>
         <w:t>TFRecords</w:t>
       </w:r>
+      <w:proofErr w:type="spellEnd"/>
       <w:r>
         <w:t xml:space="preserve"> que busca transformar estruturas de dados (listas, dicionários, tensores, objetos) em bytes binários de maneira eficiente, para armazenar ou transmitir, e depois reconstruí-las exatamente iguais. </w:t>
       </w:r>
@@ -329,6 +350,7 @@
       <w:r>
         <w:t xml:space="preserve"> apresenta uma tabela com uma relação estimada entre o tamanho e complexidade da base de dados com a conversão prévia para </w:t>
       </w:r>
+      <w:proofErr w:type="spellStart"/>
       <w:r>
         <w:rPr>
           <w:i/>
@@ -336,9 +358,11 @@
         </w:rPr>
         <w:t>TFRecords</w:t>
       </w:r>
+      <w:proofErr w:type="spellEnd"/>
       <w:r>
         <w:t xml:space="preserve">. De modo geral, a conversão para </w:t>
       </w:r>
+      <w:proofErr w:type="spellStart"/>
       <w:r>
         <w:rPr>
           <w:i/>
@@ -346,6 +370,7 @@
         </w:rPr>
         <w:t>TFRecords</w:t>
       </w:r>
+      <w:proofErr w:type="spellEnd"/>
       <w:r>
         <w:t xml:space="preserve"> se mostra apenas vantajoso para casos onde a base de dados é extensa, ou quando houver treinamento distribuído.</w:t>
       </w:r>
@@ -394,7 +419,39 @@
           <w:sz w:val="18"/>
           <w:szCs w:val="18"/>
         </w:rPr>
-        <w:t xml:space="preserve">Relação entre o tamanho/complexidade de um dataset com o uso do TFRecords </w:t>
+        <w:t xml:space="preserve">Relação entre o tamanho/complexidade de um </w:t>
+      </w:r>
+      <w:proofErr w:type="spellStart"/>
+      <w:r>
+        <w:rPr>
+          <w:sz w:val="18"/>
+          <w:szCs w:val="18"/>
+        </w:rPr>
+        <w:t>dataset</w:t>
+      </w:r>
+      <w:proofErr w:type="spellEnd"/>
+      <w:r>
+        <w:rPr>
+          <w:sz w:val="18"/>
+          <w:szCs w:val="18"/>
+        </w:rPr>
+        <w:t xml:space="preserve"> com o uso do </w:t>
+      </w:r>
+      <w:proofErr w:type="spellStart"/>
+      <w:r>
+        <w:rPr>
+          <w:sz w:val="18"/>
+          <w:szCs w:val="18"/>
+        </w:rPr>
+        <w:t>TFRecords</w:t>
+      </w:r>
+      <w:proofErr w:type="spellEnd"/>
+      <w:r>
+        <w:rPr>
+          <w:sz w:val="18"/>
+          <w:szCs w:val="18"/>
+        </w:rPr>
+        <w:t xml:space="preserve"> </w:t>
       </w:r>
     </w:p>
     <w:p>
@@ -458,6 +515,7 @@
         <w:lastRenderedPageBreak/>
         <w:t xml:space="preserve">Utilizar diretamente as imagens PNG é a abordagem mais simples e comum para </w:t>
       </w:r>
+      <w:proofErr w:type="spellStart"/>
       <w:r>
         <w:rPr>
           <w:i/>
@@ -465,9 +523,11 @@
         </w:rPr>
         <w:t>datasets</w:t>
       </w:r>
+      <w:proofErr w:type="spellEnd"/>
       <w:r>
         <w:t xml:space="preserve"> pequenos e médios. Nesse caso, o </w:t>
       </w:r>
+      <w:proofErr w:type="spellStart"/>
       <w:r>
         <w:rPr>
           <w:i/>
@@ -475,9 +535,11 @@
         </w:rPr>
         <w:t>TensorFlow</w:t>
       </w:r>
+      <w:proofErr w:type="spellEnd"/>
       <w:r>
         <w:t xml:space="preserve"> faz a leitura dos arquivos individuais, decodifica o PNG, aplica os pré-processamentos necessários e envia os tensores para a GPU. Para um </w:t>
       </w:r>
+      <w:proofErr w:type="spellStart"/>
       <w:r>
         <w:rPr>
           <w:i/>
@@ -485,6 +547,7 @@
         </w:rPr>
         <w:t>dataset</w:t>
       </w:r>
+      <w:proofErr w:type="spellEnd"/>
       <w:r>
         <w:t xml:space="preserve"> com 13.000 imagens, esse pipeline é mais do que suficiente.</w:t>
       </w:r>
@@ -509,6 +572,7 @@
       <w:r>
         <w:t xml:space="preserve">A principal desvantagem dessa opção é a baixa escalabilidade. Caso o </w:t>
       </w:r>
+      <w:proofErr w:type="spellStart"/>
       <w:r>
         <w:rPr>
           <w:i/>
@@ -516,6 +580,7 @@
         </w:rPr>
         <w:t>dataset</w:t>
       </w:r>
+      <w:proofErr w:type="spellEnd"/>
       <w:r>
         <w:t xml:space="preserve"> cresça consideravelmente, ou seja, utilizado o treinamento distribuído, o acesso a muitos arquivos pequenos pode se tornar um gargalo de I/O.</w:t>
       </w:r>
@@ -540,6 +605,7 @@
       <w:r>
         <w:t xml:space="preserve">É importante destacar que </w:t>
       </w:r>
+      <w:proofErr w:type="spellStart"/>
       <w:r>
         <w:rPr>
           <w:i/>
@@ -547,9 +613,11 @@
         </w:rPr>
         <w:t>TFRecords</w:t>
       </w:r>
+      <w:proofErr w:type="spellEnd"/>
       <w:r>
         <w:t xml:space="preserve"> não alteram a qualidade do treinamento. Eles não melhoram </w:t>
       </w:r>
+      <w:proofErr w:type="spellStart"/>
       <w:r>
         <w:rPr>
           <w:i/>
@@ -557,9 +625,11 @@
         </w:rPr>
         <w:t>accuracy</w:t>
       </w:r>
+      <w:proofErr w:type="spellEnd"/>
       <w:r>
         <w:t xml:space="preserve">, </w:t>
       </w:r>
+      <w:proofErr w:type="spellStart"/>
       <w:r>
         <w:rPr>
           <w:i/>
@@ -567,9 +637,11 @@
         </w:rPr>
         <w:t>loss</w:t>
       </w:r>
+      <w:proofErr w:type="spellEnd"/>
       <w:r>
         <w:t xml:space="preserve"> ou capacidade de generalização do modelo. O conteúdo do dado é exatamente o mesmo; o que muda é apenas a forma como ele é carregado. Como conclusão, a base de dados dos camundongos para este projeto NÃO será convertida em </w:t>
       </w:r>
+      <w:proofErr w:type="spellStart"/>
       <w:r>
         <w:rPr>
           <w:i/>
@@ -577,6 +649,7 @@
         </w:rPr>
         <w:t>TFRecords</w:t>
       </w:r>
+      <w:proofErr w:type="spellEnd"/>
       <w:r>
         <w:t xml:space="preserve"> para o treinamento.</w:t>
       </w:r>
@@ -825,6 +898,7 @@
         </w:rPr>
         <w:t xml:space="preserve">Fase 1 — </w:t>
       </w:r>
+      <w:proofErr w:type="spellStart"/>
       <w:r>
         <w:rPr>
           <w:b/>
@@ -832,8 +906,29 @@
           <w:i/>
           <w:iCs/>
         </w:rPr>
-        <w:t>Sanity Check</w:t>
-      </w:r>
+        <w:t>Sanity</w:t>
+      </w:r>
+      <w:proofErr w:type="spellEnd"/>
+      <w:r>
+        <w:rPr>
+          <w:b/>
+          <w:bCs/>
+          <w:i/>
+          <w:iCs/>
+        </w:rPr>
+        <w:t xml:space="preserve"> </w:t>
+      </w:r>
+      <w:proofErr w:type="spellStart"/>
+      <w:r>
+        <w:rPr>
+          <w:b/>
+          <w:bCs/>
+          <w:i/>
+          <w:iCs/>
+        </w:rPr>
+        <w:t>Check</w:t>
+      </w:r>
+      <w:proofErr w:type="spellEnd"/>
       <w:r>
         <w:rPr>
           <w:b/>
@@ -883,12 +978,14 @@
         </w:rPr>
         <w:t>STEP_PER_EPOCH = 100 (</w:t>
       </w:r>
+      <w:proofErr w:type="spellStart"/>
       <w:r>
         <w:rPr>
           <w:lang w:val="en-US"/>
         </w:rPr>
         <w:t>limitado</w:t>
       </w:r>
+      <w:proofErr w:type="spellEnd"/>
       <w:r>
         <w:rPr>
           <w:lang w:val="en-US"/>
@@ -976,7 +1073,23 @@
           <w:b/>
           <w:bCs/>
         </w:rPr>
-        <w:t xml:space="preserve"> Exploração de hiperparâmetros: </w:t>
+        <w:t xml:space="preserve"> Exploração de </w:t>
+      </w:r>
+      <w:proofErr w:type="spellStart"/>
+      <w:r>
+        <w:rPr>
+          <w:b/>
+          <w:bCs/>
+        </w:rPr>
+        <w:t>hiperparâmetros</w:t>
+      </w:r>
+      <w:proofErr w:type="spellEnd"/>
+      <w:r>
+        <w:rPr>
+          <w:b/>
+          <w:bCs/>
+        </w:rPr>
+        <w:t xml:space="preserve">: </w:t>
       </w:r>
       <w:r>
         <w:t>S</w:t>
@@ -984,6 +1097,7 @@
       <w:r>
         <w:t xml:space="preserve">erve para avaliar </w:t>
       </w:r>
+      <w:proofErr w:type="spellStart"/>
       <w:r>
         <w:rPr>
           <w:i/>
@@ -991,9 +1105,11 @@
         </w:rPr>
         <w:t>overfitting</w:t>
       </w:r>
+      <w:proofErr w:type="spellEnd"/>
       <w:r>
         <w:t xml:space="preserve"> e definir valores de Learning Rate e Batch </w:t>
       </w:r>
+      <w:proofErr w:type="spellStart"/>
       <w:r>
         <w:rPr>
           <w:i/>
@@ -1001,6 +1117,7 @@
         </w:rPr>
         <w:t>Size</w:t>
       </w:r>
+      <w:proofErr w:type="spellEnd"/>
       <w:r>
         <w:t xml:space="preserve">. A ideia é observar o comportamento do treinamento, avaliar curvas, otimizar a arquitetura e salvar o melhor checkpoint. </w:t>
       </w:r>
@@ -1097,6 +1214,7 @@
       <w:r>
         <w:t xml:space="preserve">Tem o objetivo de obter a melhor generalização possível para o modelo, possibilitando a coleta de um resultado verdadeiramente científico. Para </w:t>
       </w:r>
+      <w:proofErr w:type="spellStart"/>
       <w:r>
         <w:rPr>
           <w:i/>
@@ -1104,6 +1222,7 @@
         </w:rPr>
         <w:t>datasets</w:t>
       </w:r>
+      <w:proofErr w:type="spellEnd"/>
       <w:r>
         <w:t xml:space="preserve"> menores (como o caso deste projeto), o valor total de steps gira em torno de 10K à 30K.</w:t>
       </w:r>
@@ -1275,6 +1394,7 @@
         </w:rPr>
         <w:t xml:space="preserve">1 </w:t>
       </w:r>
+      <w:proofErr w:type="spellStart"/>
       <w:r>
         <w:rPr>
           <w:b/>
@@ -1284,6 +1404,7 @@
         </w:rPr>
         <w:t>Epoch</w:t>
       </w:r>
+      <w:proofErr w:type="spellEnd"/>
       <w:r>
         <w:t xml:space="preserve"> = “</w:t>
       </w:r>
@@ -1293,6 +1414,7 @@
       <w:r>
         <w:t xml:space="preserve">” pelo </w:t>
       </w:r>
+      <w:proofErr w:type="spellStart"/>
       <w:r>
         <w:rPr>
           <w:i/>
@@ -1300,6 +1422,7 @@
         </w:rPr>
         <w:t>dataset</w:t>
       </w:r>
+      <w:proofErr w:type="spellEnd"/>
       <w:r>
         <w:t xml:space="preserve"> (ou pela amostra definida)</w:t>
       </w:r>
@@ -1482,11 +1605,20 @@
         <w:jc w:val="both"/>
       </w:pPr>
       <w:r>
-        <w:t xml:space="preserve">O experimento 6 da ResNet </w:t>
+        <w:t xml:space="preserve">O experimento 6 da </w:t>
+      </w:r>
+      <w:proofErr w:type="spellStart"/>
+      <w:r>
+        <w:t>ResNet</w:t>
+      </w:r>
+      <w:proofErr w:type="spellEnd"/>
+      <w:r>
+        <w:t xml:space="preserve"> </w:t>
       </w:r>
       <w:r>
         <w:t xml:space="preserve">chegou rapidamente ao limite de informação que o </w:t>
       </w:r>
+      <w:proofErr w:type="spellStart"/>
       <w:r>
         <w:rPr>
           <w:i/>
@@ -1494,6 +1626,7 @@
         </w:rPr>
         <w:t>dataset</w:t>
       </w:r>
+      <w:proofErr w:type="spellEnd"/>
       <w:r>
         <w:t xml:space="preserve"> consegue fornecer. Em outras palavras: a rede aprende tudo o que é estatisticamente aprendível cedo no treinamento, e depois disso só faz refinamentos muito pequenos.</w:t>
       </w:r>
@@ -1536,7 +1669,23 @@
           <w:b/>
           <w:bCs/>
         </w:rPr>
-        <w:t xml:space="preserve"> dataset é pequeno</w:t>
+        <w:t xml:space="preserve"> </w:t>
+      </w:r>
+      <w:proofErr w:type="spellStart"/>
+      <w:r>
+        <w:rPr>
+          <w:b/>
+          <w:bCs/>
+        </w:rPr>
+        <w:t>dataset</w:t>
+      </w:r>
+      <w:proofErr w:type="spellEnd"/>
+      <w:r>
+        <w:rPr>
+          <w:b/>
+          <w:bCs/>
+        </w:rPr>
+        <w:t xml:space="preserve"> é pequeno</w:t>
       </w:r>
       <w:r>
         <w:t>:</w:t>
@@ -1550,6 +1699,7 @@
       <w:r>
         <w:t xml:space="preserve">esmo com </w:t>
       </w:r>
+      <w:proofErr w:type="spellStart"/>
       <w:r>
         <w:rPr>
           <w:i/>
@@ -1557,6 +1707,7 @@
         </w:rPr>
         <w:t>augmentations</w:t>
       </w:r>
+      <w:proofErr w:type="spellEnd"/>
       <w:r>
         <w:t xml:space="preserve">, a diversidade estatística real é limitada. Redes convolucionais aprendem padrões visuais relativamente rápido quando as classes são poucas (3 classes, no </w:t>
       </w:r>
@@ -1614,6 +1765,7 @@
       <w:r>
         <w:t xml:space="preserve"> normalização correta, </w:t>
       </w:r>
+      <w:proofErr w:type="spellStart"/>
       <w:r>
         <w:rPr>
           <w:i/>
@@ -1621,9 +1773,11 @@
         </w:rPr>
         <w:t>augmentations</w:t>
       </w:r>
+      <w:proofErr w:type="spellEnd"/>
       <w:r>
         <w:t xml:space="preserve"> coerentes, </w:t>
       </w:r>
+      <w:proofErr w:type="spellStart"/>
       <w:r>
         <w:rPr>
           <w:i/>
@@ -1631,6 +1785,7 @@
         </w:rPr>
         <w:t>scheduler</w:t>
       </w:r>
+      <w:proofErr w:type="spellEnd"/>
       <w:r>
         <w:t xml:space="preserve"> de </w:t>
       </w:r>
@@ -1699,15 +1854,25 @@
       <w:r>
         <w:t xml:space="preserve">a </w:t>
       </w:r>
-      <w:r>
-        <w:t>ResNet utilizam convoluções padrão, que são computacionalmente caras porque, para cada filtro, há uma combinação completa entre todos os canais de entrada. Isso faz com que o número de operações cresça rapidamente conforme a rede se aprofunda.</w:t>
+      <w:proofErr w:type="spellStart"/>
+      <w:r>
+        <w:t>ResNet</w:t>
+      </w:r>
+      <w:proofErr w:type="spellEnd"/>
+      <w:r>
+        <w:t xml:space="preserve"> utilizam convoluções padrão, que são computacionalmente caras porque, para cada filtro, há uma combinação completa entre todos os canais de entrada. Isso faz com que o número de operações cresça rapidamente conforme a rede se aprofunda.</w:t>
       </w:r>
       <w:r>
         <w:t xml:space="preserve"> </w:t>
       </w:r>
       <w:r>
-        <w:t>A MobileNet</w:t>
-      </w:r>
+        <w:t xml:space="preserve">A </w:t>
+      </w:r>
+      <w:proofErr w:type="spellStart"/>
+      <w:r>
+        <w:t>MobileNet</w:t>
+      </w:r>
+      <w:proofErr w:type="spellEnd"/>
       <w:r>
         <w:t xml:space="preserve"> busca</w:t>
       </w:r>
@@ -1730,13 +1895,47 @@
       <w:r>
         <w:t xml:space="preserve">, chamadas de </w:t>
       </w:r>
+      <w:proofErr w:type="spellStart"/>
       <w:r>
         <w:rPr>
           <w:i/>
           <w:iCs/>
         </w:rPr>
-        <w:t>depthwise separable convolutions</w:t>
-      </w:r>
+        <w:t>depthwise</w:t>
+      </w:r>
+      <w:proofErr w:type="spellEnd"/>
+      <w:r>
+        <w:rPr>
+          <w:i/>
+          <w:iCs/>
+        </w:rPr>
+        <w:t xml:space="preserve"> </w:t>
+      </w:r>
+      <w:proofErr w:type="spellStart"/>
+      <w:r>
+        <w:rPr>
+          <w:i/>
+          <w:iCs/>
+        </w:rPr>
+        <w:t>separable</w:t>
+      </w:r>
+      <w:proofErr w:type="spellEnd"/>
+      <w:r>
+        <w:rPr>
+          <w:i/>
+          <w:iCs/>
+        </w:rPr>
+        <w:t xml:space="preserve"> </w:t>
+      </w:r>
+      <w:proofErr w:type="spellStart"/>
+      <w:r>
+        <w:rPr>
+          <w:i/>
+          <w:iCs/>
+        </w:rPr>
+        <w:t>convolutions</w:t>
+      </w:r>
+      <w:proofErr w:type="spellEnd"/>
       <w:r>
         <w:t>.</w:t>
       </w:r>
@@ -1775,13 +1974,31 @@
         </w:rPr>
         <w:t xml:space="preserve">Ilustração do conceito de </w:t>
       </w:r>
+      <w:proofErr w:type="spellStart"/>
       <w:r>
         <w:rPr>
           <w:sz w:val="18"/>
           <w:szCs w:val="18"/>
         </w:rPr>
-        <w:t>Depthwise Convolution</w:t>
-      </w:r>
+        <w:t>Depthwise</w:t>
+      </w:r>
+      <w:proofErr w:type="spellEnd"/>
+      <w:r>
+        <w:rPr>
+          <w:sz w:val="18"/>
+          <w:szCs w:val="18"/>
+        </w:rPr>
+        <w:t xml:space="preserve"> </w:t>
+      </w:r>
+      <w:proofErr w:type="spellStart"/>
+      <w:r>
+        <w:rPr>
+          <w:sz w:val="18"/>
+          <w:szCs w:val="18"/>
+        </w:rPr>
+        <w:t>Convolution</w:t>
+      </w:r>
+      <w:proofErr w:type="spellEnd"/>
     </w:p>
     <w:p>
       <w:pPr>
@@ -1874,8 +2091,49 @@
           <w:b/>
           <w:bCs/>
         </w:rPr>
-        <w:t xml:space="preserve"> Depthwise Separable Convolution</w:t>
-      </w:r>
+        <w:t xml:space="preserve"> </w:t>
+      </w:r>
+      <w:proofErr w:type="spellStart"/>
+      <w:r>
+        <w:rPr>
+          <w:b/>
+          <w:bCs/>
+        </w:rPr>
+        <w:t>Depthwise</w:t>
+      </w:r>
+      <w:proofErr w:type="spellEnd"/>
+      <w:r>
+        <w:rPr>
+          <w:b/>
+          <w:bCs/>
+        </w:rPr>
+        <w:t xml:space="preserve"> </w:t>
+      </w:r>
+      <w:proofErr w:type="spellStart"/>
+      <w:r>
+        <w:rPr>
+          <w:b/>
+          <w:bCs/>
+        </w:rPr>
+        <w:t>Separable</w:t>
+      </w:r>
+      <w:proofErr w:type="spellEnd"/>
+      <w:r>
+        <w:rPr>
+          <w:b/>
+          <w:bCs/>
+        </w:rPr>
+        <w:t xml:space="preserve"> </w:t>
+      </w:r>
+      <w:proofErr w:type="spellStart"/>
+      <w:r>
+        <w:rPr>
+          <w:b/>
+          <w:bCs/>
+        </w:rPr>
+        <w:t>Convolution</w:t>
+      </w:r>
+      <w:proofErr w:type="spellEnd"/>
       <w:r>
         <w:rPr>
           <w:b/>
@@ -1926,12 +2184,37 @@
           <w:bCs/>
         </w:rPr>
       </w:pPr>
-      <w:r>
-        <w:rPr>
-          <w:b/>
-          <w:bCs/>
-        </w:rPr>
-        <w:t>Depthwise Convolution (filtragem espacial):</w:t>
+      <w:proofErr w:type="spellStart"/>
+      <w:r>
+        <w:rPr>
+          <w:b/>
+          <w:bCs/>
+        </w:rPr>
+        <w:t>Depthwise</w:t>
+      </w:r>
+      <w:proofErr w:type="spellEnd"/>
+      <w:r>
+        <w:rPr>
+          <w:b/>
+          <w:bCs/>
+        </w:rPr>
+        <w:t xml:space="preserve"> </w:t>
+      </w:r>
+      <w:proofErr w:type="spellStart"/>
+      <w:r>
+        <w:rPr>
+          <w:b/>
+          <w:bCs/>
+        </w:rPr>
+        <w:t>Convolution</w:t>
+      </w:r>
+      <w:proofErr w:type="spellEnd"/>
+      <w:r>
+        <w:rPr>
+          <w:b/>
+          <w:bCs/>
+        </w:rPr>
+        <w:t xml:space="preserve"> (filtragem espacial):</w:t>
       </w:r>
       <w:r>
         <w:t xml:space="preserve"> </w:t>
@@ -2026,12 +2309,37 @@
           <w:bCs/>
         </w:rPr>
       </w:pPr>
-      <w:r>
-        <w:rPr>
-          <w:b/>
-          <w:bCs/>
-        </w:rPr>
-        <w:t>Pointwise Convolution (combinação de canais)</w:t>
+      <w:proofErr w:type="spellStart"/>
+      <w:r>
+        <w:rPr>
+          <w:b/>
+          <w:bCs/>
+        </w:rPr>
+        <w:t>Pointwise</w:t>
+      </w:r>
+      <w:proofErr w:type="spellEnd"/>
+      <w:r>
+        <w:rPr>
+          <w:b/>
+          <w:bCs/>
+        </w:rPr>
+        <w:t xml:space="preserve"> </w:t>
+      </w:r>
+      <w:proofErr w:type="spellStart"/>
+      <w:r>
+        <w:rPr>
+          <w:b/>
+          <w:bCs/>
+        </w:rPr>
+        <w:t>Convolution</w:t>
+      </w:r>
+      <w:proofErr w:type="spellEnd"/>
+      <w:r>
+        <w:rPr>
+          <w:b/>
+          <w:bCs/>
+        </w:rPr>
+        <w:t xml:space="preserve"> (combinação de canais)</w:t>
       </w:r>
       <w:r>
         <w:rPr>
@@ -2051,7 +2359,15 @@
         <w:t xml:space="preserve">ocorre após </w:t>
       </w:r>
       <w:r>
-        <w:t xml:space="preserve">a etapa depthwise, </w:t>
+        <w:t xml:space="preserve">a etapa </w:t>
+      </w:r>
+      <w:proofErr w:type="spellStart"/>
+      <w:r>
+        <w:t>depthwise</w:t>
+      </w:r>
+      <w:proofErr w:type="spellEnd"/>
+      <w:r>
+        <w:t xml:space="preserve">, </w:t>
       </w:r>
       <w:r>
         <w:t xml:space="preserve">onde </w:t>
@@ -2069,6 +2385,7 @@
       <w:r>
         <w:t xml:space="preserve">, chamada de </w:t>
       </w:r>
+      <w:proofErr w:type="spellStart"/>
       <w:r>
         <w:rPr>
           <w:i/>
@@ -2076,6 +2393,7 @@
         </w:rPr>
         <w:t>pointwise</w:t>
       </w:r>
+      <w:proofErr w:type="spellEnd"/>
       <w:r>
         <w:t xml:space="preserve"> é aplicada com o intuito de combinar os canais gerados previamente e aprender as relações entre as features extraídas</w:t>
       </w:r>
@@ -2180,7 +2498,23 @@
           <w:b/>
           <w:bCs/>
         </w:rPr>
-        <w:t xml:space="preserve">O bloco base da MobileNet </w:t>
+        <w:t xml:space="preserve">O bloco base da </w:t>
+      </w:r>
+      <w:proofErr w:type="spellStart"/>
+      <w:r>
+        <w:rPr>
+          <w:b/>
+          <w:bCs/>
+        </w:rPr>
+        <w:t>MobileNet</w:t>
+      </w:r>
+      <w:proofErr w:type="spellEnd"/>
+      <w:r>
+        <w:rPr>
+          <w:b/>
+          <w:bCs/>
+        </w:rPr>
+        <w:t xml:space="preserve"> </w:t>
       </w:r>
       <w:r>
         <w:t>é basicamente uma pilha</w:t>
@@ -2224,8 +2558,21 @@
         </w:numPr>
         <w:jc w:val="both"/>
       </w:pPr>
-      <w:r>
-        <w:t>Depthwise Conv (3x3)</w:t>
+      <w:proofErr w:type="spellStart"/>
+      <w:r>
+        <w:t>Depthwise</w:t>
+      </w:r>
+      <w:proofErr w:type="spellEnd"/>
+      <w:r>
+        <w:t xml:space="preserve"> </w:t>
+      </w:r>
+      <w:proofErr w:type="spellStart"/>
+      <w:r>
+        <w:t>Conv</w:t>
+      </w:r>
+      <w:proofErr w:type="spellEnd"/>
+      <w:r>
+        <w:t xml:space="preserve"> (3x3)</w:t>
       </w:r>
     </w:p>
     <w:p>
@@ -2238,8 +2585,13 @@
         <w:jc w:val="both"/>
       </w:pPr>
       <w:r>
-        <w:t>Batch Normalization</w:t>
-      </w:r>
+        <w:t xml:space="preserve">Batch </w:t>
+      </w:r>
+      <w:proofErr w:type="spellStart"/>
+      <w:r>
+        <w:t>Normalization</w:t>
+      </w:r>
+      <w:proofErr w:type="spellEnd"/>
     </w:p>
     <w:p>
       <w:pPr>
@@ -2250,9 +2602,11 @@
         </w:numPr>
         <w:jc w:val="both"/>
       </w:pPr>
+      <w:proofErr w:type="spellStart"/>
       <w:r>
         <w:t>ReLU</w:t>
       </w:r>
+      <w:proofErr w:type="spellEnd"/>
     </w:p>
     <w:p>
       <w:pPr>
@@ -2263,8 +2617,21 @@
         </w:numPr>
         <w:jc w:val="both"/>
       </w:pPr>
-      <w:r>
-        <w:t>Pointwise Conv (1x1)</w:t>
+      <w:proofErr w:type="spellStart"/>
+      <w:r>
+        <w:t>Pointwise</w:t>
+      </w:r>
+      <w:proofErr w:type="spellEnd"/>
+      <w:r>
+        <w:t xml:space="preserve"> </w:t>
+      </w:r>
+      <w:proofErr w:type="spellStart"/>
+      <w:r>
+        <w:t>Conv</w:t>
+      </w:r>
+      <w:proofErr w:type="spellEnd"/>
+      <w:r>
+        <w:t xml:space="preserve"> (1x1)</w:t>
       </w:r>
     </w:p>
     <w:p>
@@ -2277,8 +2644,13 @@
         <w:jc w:val="both"/>
       </w:pPr>
       <w:r>
-        <w:t>Batch Normalization</w:t>
-      </w:r>
+        <w:t xml:space="preserve">Batch </w:t>
+      </w:r>
+      <w:proofErr w:type="spellStart"/>
+      <w:r>
+        <w:t>Normalization</w:t>
+      </w:r>
+      <w:proofErr w:type="spellEnd"/>
     </w:p>
     <w:p>
       <w:pPr>
@@ -2289,9 +2661,11 @@
         </w:numPr>
         <w:jc w:val="both"/>
       </w:pPr>
+      <w:proofErr w:type="spellStart"/>
       <w:r>
         <w:t>ReLU</w:t>
       </w:r>
+      <w:proofErr w:type="spellEnd"/>
     </w:p>
     <w:p>
       <w:pPr>
@@ -2345,11 +2719,43 @@
         <w:jc w:val="both"/>
       </w:pPr>
       <w:r>
-        <w:t>A primeira camada da rede não usa depthwise separable conv.</w:t>
+        <w:t xml:space="preserve">A primeira camada da rede não usa </w:t>
+      </w:r>
+      <w:proofErr w:type="spellStart"/>
+      <w:r>
+        <w:t>depthwise</w:t>
+      </w:r>
+      <w:proofErr w:type="spellEnd"/>
+      <w:r>
+        <w:t xml:space="preserve"> </w:t>
+      </w:r>
+      <w:proofErr w:type="spellStart"/>
+      <w:r>
+        <w:t>separable</w:t>
+      </w:r>
+      <w:proofErr w:type="spellEnd"/>
+      <w:r>
+        <w:t xml:space="preserve"> </w:t>
+      </w:r>
+      <w:proofErr w:type="spellStart"/>
+      <w:r>
+        <w:t>conv</w:t>
+      </w:r>
+      <w:proofErr w:type="spellEnd"/>
+      <w:r>
+        <w:t>.</w:t>
       </w:r>
       <w:r>
         <w:br/>
-        <w:t>Ela utiliza uma convolução padrão 3x3 com stride 2</w:t>
+        <w:t xml:space="preserve">Ela utiliza uma convolução padrão 3x3 com </w:t>
+      </w:r>
+      <w:proofErr w:type="spellStart"/>
+      <w:r>
+        <w:t>stride</w:t>
+      </w:r>
+      <w:proofErr w:type="spellEnd"/>
+      <w:r>
+        <w:t xml:space="preserve"> 2</w:t>
       </w:r>
       <w:r>
         <w:t xml:space="preserve">, visto que </w:t>
@@ -2375,7 +2781,15 @@
         <w:jc w:val="both"/>
       </w:pPr>
       <w:r>
-        <w:t>A MobileNet reduz o tamanho das imagens ao longo da</w:t>
+        <w:t xml:space="preserve">A </w:t>
+      </w:r>
+      <w:proofErr w:type="spellStart"/>
+      <w:r>
+        <w:t>MobileNet</w:t>
+      </w:r>
+      <w:proofErr w:type="spellEnd"/>
+      <w:r>
+        <w:t xml:space="preserve"> reduz o tamanho das imagens ao longo da</w:t>
       </w:r>
       <w:r>
         <w:t>s camadas da</w:t>
@@ -2383,16 +2797,38 @@
       <w:r>
         <w:t xml:space="preserve"> rede usando </w:t>
       </w:r>
-      <w:r>
-        <w:rPr>
-          <w:b/>
-          <w:bCs/>
-        </w:rPr>
-        <w:t>stride = 2</w:t>
-      </w:r>
-      <w:r>
-        <w:t xml:space="preserve"> em algumas depthwise convolutions</w:t>
-      </w:r>
+      <w:proofErr w:type="spellStart"/>
+      <w:r>
+        <w:rPr>
+          <w:b/>
+          <w:bCs/>
+        </w:rPr>
+        <w:t>stride</w:t>
+      </w:r>
+      <w:proofErr w:type="spellEnd"/>
+      <w:r>
+        <w:rPr>
+          <w:b/>
+          <w:bCs/>
+        </w:rPr>
+        <w:t xml:space="preserve"> = 2</w:t>
+      </w:r>
+      <w:r>
+        <w:t xml:space="preserve"> em algumas </w:t>
+      </w:r>
+      <w:proofErr w:type="spellStart"/>
+      <w:r>
+        <w:t>depthwise</w:t>
+      </w:r>
+      <w:proofErr w:type="spellEnd"/>
+      <w:r>
+        <w:t xml:space="preserve"> </w:t>
+      </w:r>
+      <w:proofErr w:type="spellStart"/>
+      <w:r>
+        <w:t>convolutions</w:t>
+      </w:r>
+      <w:proofErr w:type="spellEnd"/>
       <w:r>
         <w:t>, a fim de diminuir a resolução espacial, aumentar o campo receptivo e reduzir o custo computacional.</w:t>
       </w:r>
@@ -2412,7 +2848,23 @@
         <w:jc w:val="both"/>
       </w:pPr>
       <w:r>
-        <w:t>No final da rede é aplicado um Global Average Pooling para extrair as características globais mais relevantes e utilizar como entrada de uma camada totalmente conectada</w:t>
+        <w:t xml:space="preserve">No final da rede é aplicado um Global </w:t>
+      </w:r>
+      <w:proofErr w:type="spellStart"/>
+      <w:r>
+        <w:t>Average</w:t>
+      </w:r>
+      <w:proofErr w:type="spellEnd"/>
+      <w:r>
+        <w:t xml:space="preserve"> </w:t>
+      </w:r>
+      <w:proofErr w:type="spellStart"/>
+      <w:r>
+        <w:t>Pooling</w:t>
+      </w:r>
+      <w:proofErr w:type="spellEnd"/>
+      <w:r>
+        <w:t xml:space="preserve"> para extrair as características globais mais relevantes e utilizar como entrada de uma camada totalmente conectada</w:t>
       </w:r>
     </w:p>
     <w:p>
@@ -2443,7 +2895,23 @@
           <w:b/>
           <w:bCs/>
         </w:rPr>
-        <w:t>Controle de complexidade e hiperparâmetros específicos:</w:t>
+        <w:t xml:space="preserve">Controle de complexidade e </w:t>
+      </w:r>
+      <w:proofErr w:type="spellStart"/>
+      <w:r>
+        <w:rPr>
+          <w:b/>
+          <w:bCs/>
+        </w:rPr>
+        <w:t>hiperparâmetros</w:t>
+      </w:r>
+      <w:proofErr w:type="spellEnd"/>
+      <w:r>
+        <w:rPr>
+          <w:b/>
+          <w:bCs/>
+        </w:rPr>
+        <w:t xml:space="preserve"> específicos:</w:t>
       </w:r>
     </w:p>
     <w:p>
@@ -2470,15 +2938,56 @@
           <w:bCs/>
         </w:rPr>
       </w:pPr>
-      <w:r>
-        <w:rPr>
-          <w:b/>
-          <w:bCs/>
-        </w:rPr>
-        <w:t xml:space="preserve">Width Multiplier (α): </w:t>
-      </w:r>
-      <w:r>
-        <w:t>controla o número de canais da rede com o intuiuto de reduzir parâmetros e custos, mas pode interferir na precisão (ex: α = 1 → modelo completo; α = 0.5 → metade dos filtros)</w:t>
+      <w:proofErr w:type="spellStart"/>
+      <w:r>
+        <w:rPr>
+          <w:b/>
+          <w:bCs/>
+        </w:rPr>
+        <w:t>Width</w:t>
+      </w:r>
+      <w:proofErr w:type="spellEnd"/>
+      <w:r>
+        <w:rPr>
+          <w:b/>
+          <w:bCs/>
+        </w:rPr>
+        <w:t xml:space="preserve"> </w:t>
+      </w:r>
+      <w:proofErr w:type="spellStart"/>
+      <w:r>
+        <w:rPr>
+          <w:b/>
+          <w:bCs/>
+        </w:rPr>
+        <w:t>Multiplier</w:t>
+      </w:r>
+      <w:proofErr w:type="spellEnd"/>
+      <w:r>
+        <w:rPr>
+          <w:b/>
+          <w:bCs/>
+        </w:rPr>
+        <w:t xml:space="preserve"> (α): </w:t>
+      </w:r>
+      <w:r>
+        <w:t xml:space="preserve">controla o número de canais da rede com o </w:t>
+      </w:r>
+      <w:proofErr w:type="spellStart"/>
+      <w:r>
+        <w:t>intuiuto</w:t>
+      </w:r>
+      <w:proofErr w:type="spellEnd"/>
+      <w:r>
+        <w:t xml:space="preserve"> de reduzir parâmetros e custos, mas pode interferir na precisão (</w:t>
+      </w:r>
+      <w:proofErr w:type="spellStart"/>
+      <w:r>
+        <w:t>ex</w:t>
+      </w:r>
+      <w:proofErr w:type="spellEnd"/>
+      <w:r>
+        <w:t>: α = 1 → modelo completo; α = 0.5 → metade dos filtros)</w:t>
       </w:r>
     </w:p>
     <w:p>
@@ -2501,12 +3010,37 @@
           <w:bCs/>
         </w:rPr>
       </w:pPr>
-      <w:r>
-        <w:rPr>
-          <w:b/>
-          <w:bCs/>
-        </w:rPr>
-        <w:t>Resolution Multiplier (ρ)</w:t>
+      <w:proofErr w:type="spellStart"/>
+      <w:r>
+        <w:rPr>
+          <w:b/>
+          <w:bCs/>
+        </w:rPr>
+        <w:t>Resolution</w:t>
+      </w:r>
+      <w:proofErr w:type="spellEnd"/>
+      <w:r>
+        <w:rPr>
+          <w:b/>
+          <w:bCs/>
+        </w:rPr>
+        <w:t xml:space="preserve"> </w:t>
+      </w:r>
+      <w:proofErr w:type="spellStart"/>
+      <w:r>
+        <w:rPr>
+          <w:b/>
+          <w:bCs/>
+        </w:rPr>
+        <w:t>Multiplier</w:t>
+      </w:r>
+      <w:proofErr w:type="spellEnd"/>
+      <w:r>
+        <w:rPr>
+          <w:b/>
+          <w:bCs/>
+        </w:rPr>
+        <w:t xml:space="preserve"> (ρ)</w:t>
       </w:r>
       <w:r>
         <w:rPr>
@@ -2564,7 +3098,7 @@
           <w:bCs/>
           <w:color w:val="00B050"/>
         </w:rPr>
-        <w:t xml:space="preserve">ESTUDO EXPLORATÓRIO </w:t>
+        <w:t xml:space="preserve">ESTUDO EXPLORATÓRIO 5 – </w:t>
       </w:r>
       <w:r>
         <w:rPr>
@@ -2572,22 +3106,6 @@
           <w:bCs/>
           <w:color w:val="00B050"/>
         </w:rPr>
-        <w:t>5</w:t>
-      </w:r>
-      <w:r>
-        <w:rPr>
-          <w:b/>
-          <w:bCs/>
-          <w:color w:val="00B050"/>
-        </w:rPr>
-        <w:t xml:space="preserve"> – </w:t>
-      </w:r>
-      <w:r>
-        <w:rPr>
-          <w:b/>
-          <w:bCs/>
-          <w:color w:val="00B050"/>
-        </w:rPr>
         <w:t>MOBILENET V2</w:t>
       </w:r>
     </w:p>
@@ -2603,7 +3121,35 @@
         <w:rPr>
           <w:color w:val="000000" w:themeColor="text1"/>
         </w:rPr>
-        <w:t xml:space="preserve">A MobileNet V2 surge como uma evolução direta da MobileNet V1. O objetivo continua sendo </w:t>
+        <w:t xml:space="preserve">A </w:t>
+      </w:r>
+      <w:proofErr w:type="spellStart"/>
+      <w:r>
+        <w:rPr>
+          <w:color w:val="000000" w:themeColor="text1"/>
+        </w:rPr>
+        <w:t>MobileNet</w:t>
+      </w:r>
+      <w:proofErr w:type="spellEnd"/>
+      <w:r>
+        <w:rPr>
+          <w:color w:val="000000" w:themeColor="text1"/>
+        </w:rPr>
+        <w:t xml:space="preserve"> V2 surge como uma evolução direta da </w:t>
+      </w:r>
+      <w:proofErr w:type="spellStart"/>
+      <w:r>
+        <w:rPr>
+          <w:color w:val="000000" w:themeColor="text1"/>
+        </w:rPr>
+        <w:t>MobileNet</w:t>
+      </w:r>
+      <w:proofErr w:type="spellEnd"/>
+      <w:r>
+        <w:rPr>
+          <w:color w:val="000000" w:themeColor="text1"/>
+        </w:rPr>
+        <w:t xml:space="preserve"> V1. O objetivo continua sendo </w:t>
       </w:r>
       <w:r>
         <w:rPr>
@@ -2663,7 +3209,21 @@
         <w:rPr>
           <w:color w:val="000000" w:themeColor="text1"/>
         </w:rPr>
-        <w:t xml:space="preserve"> perda de informação causada por operações não lineares (ReLU) em espaços de baixa dimensão. </w:t>
+        <w:t xml:space="preserve"> perda de informação causada por operações não lineares (</w:t>
+      </w:r>
+      <w:proofErr w:type="spellStart"/>
+      <w:r>
+        <w:rPr>
+          <w:color w:val="000000" w:themeColor="text1"/>
+        </w:rPr>
+        <w:t>ReLU</w:t>
+      </w:r>
+      <w:proofErr w:type="spellEnd"/>
+      <w:r>
+        <w:rPr>
+          <w:color w:val="000000" w:themeColor="text1"/>
+        </w:rPr>
+        <w:t xml:space="preserve">) em espaços de baixa dimensão. </w:t>
       </w:r>
     </w:p>
     <w:p>
@@ -2729,41 +3289,88 @@
         </w:rPr>
         <w:t xml:space="preserve"> </w:t>
       </w:r>
-      <w:r>
-        <w:rPr>
-          <w:color w:val="000000" w:themeColor="text1"/>
-        </w:rPr>
-        <w:t>Depthwise convolution</w:t>
-      </w:r>
+      <w:proofErr w:type="spellStart"/>
+      <w:r>
+        <w:rPr>
+          <w:color w:val="000000" w:themeColor="text1"/>
+        </w:rPr>
+        <w:t>Depthwise</w:t>
+      </w:r>
+      <w:proofErr w:type="spellEnd"/>
+      <w:r>
+        <w:rPr>
+          <w:color w:val="000000" w:themeColor="text1"/>
+        </w:rPr>
+        <w:t xml:space="preserve"> </w:t>
+      </w:r>
+      <w:proofErr w:type="spellStart"/>
+      <w:r>
+        <w:rPr>
+          <w:color w:val="000000" w:themeColor="text1"/>
+        </w:rPr>
+        <w:t>convolution</w:t>
+      </w:r>
+      <w:proofErr w:type="spellEnd"/>
       <w:r>
         <w:rPr>
           <w:color w:val="000000" w:themeColor="text1"/>
         </w:rPr>
         <w:t xml:space="preserve">, seguido por </w:t>
       </w:r>
-      <w:r>
-        <w:rPr>
-          <w:color w:val="000000" w:themeColor="text1"/>
-        </w:rPr>
-        <w:t>Pointwise convolution</w:t>
-      </w:r>
+      <w:proofErr w:type="spellStart"/>
+      <w:r>
+        <w:rPr>
+          <w:color w:val="000000" w:themeColor="text1"/>
+        </w:rPr>
+        <w:t>Pointwise</w:t>
+      </w:r>
+      <w:proofErr w:type="spellEnd"/>
+      <w:r>
+        <w:rPr>
+          <w:color w:val="000000" w:themeColor="text1"/>
+        </w:rPr>
+        <w:t xml:space="preserve"> </w:t>
+      </w:r>
+      <w:proofErr w:type="spellStart"/>
+      <w:r>
+        <w:rPr>
+          <w:color w:val="000000" w:themeColor="text1"/>
+        </w:rPr>
+        <w:t>convolution</w:t>
+      </w:r>
+      <w:proofErr w:type="spellEnd"/>
       <w:r>
         <w:rPr>
           <w:color w:val="000000" w:themeColor="text1"/>
         </w:rPr>
         <w:t xml:space="preserve"> e </w:t>
       </w:r>
-      <w:r>
-        <w:rPr>
-          <w:color w:val="000000" w:themeColor="text1"/>
-        </w:rPr>
-        <w:t>ReLU em todas as etapas</w:t>
-      </w:r>
-      <w:r>
-        <w:rPr>
-          <w:color w:val="000000" w:themeColor="text1"/>
-        </w:rPr>
-        <w:t>. O problema é que a função ReL</w:t>
+      <w:proofErr w:type="spellStart"/>
+      <w:r>
+        <w:rPr>
+          <w:color w:val="000000" w:themeColor="text1"/>
+        </w:rPr>
+        <w:t>ReLU</w:t>
+      </w:r>
+      <w:proofErr w:type="spellEnd"/>
+      <w:r>
+        <w:rPr>
+          <w:color w:val="000000" w:themeColor="text1"/>
+        </w:rPr>
+        <w:t xml:space="preserve"> em todas as etapas</w:t>
+      </w:r>
+      <w:r>
+        <w:rPr>
+          <w:color w:val="000000" w:themeColor="text1"/>
+        </w:rPr>
+        <w:t xml:space="preserve">. O problema é que a função </w:t>
+      </w:r>
+      <w:proofErr w:type="spellStart"/>
+      <w:r>
+        <w:rPr>
+          <w:color w:val="000000" w:themeColor="text1"/>
+        </w:rPr>
+        <w:t>ReL</w:t>
       </w:r>
       <w:r>
         <w:rPr>
@@ -2771,6 +3378,7 @@
         </w:rPr>
         <w:t>U</w:t>
       </w:r>
+      <w:proofErr w:type="spellEnd"/>
       <w:r>
         <w:rPr>
           <w:color w:val="000000" w:themeColor="text1"/>
@@ -2826,7 +3434,21 @@
           <w:color w:val="000000" w:themeColor="text1"/>
         </w:rPr>
         <w:lastRenderedPageBreak/>
-        <w:t>A MobileNet V2 resolve esse problema com três ideias principais:</w:t>
+        <w:t xml:space="preserve">A </w:t>
+      </w:r>
+      <w:proofErr w:type="spellStart"/>
+      <w:r>
+        <w:rPr>
+          <w:color w:val="000000" w:themeColor="text1"/>
+        </w:rPr>
+        <w:t>MobileNet</w:t>
+      </w:r>
+      <w:proofErr w:type="spellEnd"/>
+      <w:r>
+        <w:rPr>
+          <w:color w:val="000000" w:themeColor="text1"/>
+        </w:rPr>
+        <w:t xml:space="preserve"> V2 resolve esse problema com três ideias principais:</w:t>
       </w:r>
     </w:p>
     <w:p>
@@ -2859,8 +3481,9 @@
           <w:color w:val="000000" w:themeColor="text1"/>
           <w:lang w:val="en-US"/>
         </w:rPr>
-        <w:t>Inverted Residual Block (Bloco Residual Invertido)</w:t>
-      </w:r>
+        <w:t xml:space="preserve">Inverted Residual Block (Bloco Residual </w:t>
+      </w:r>
+      <w:proofErr w:type="spellStart"/>
       <w:r>
         <w:rPr>
           <w:b/>
@@ -2868,7 +3491,17 @@
           <w:color w:val="000000" w:themeColor="text1"/>
           <w:lang w:val="en-US"/>
         </w:rPr>
-        <w:t>:</w:t>
+        <w:t>Invertido</w:t>
+      </w:r>
+      <w:proofErr w:type="spellEnd"/>
+      <w:r>
+        <w:rPr>
+          <w:b/>
+          <w:bCs/>
+          <w:color w:val="000000" w:themeColor="text1"/>
+          <w:lang w:val="en-US"/>
+        </w:rPr>
+        <w:t>):</w:t>
       </w:r>
     </w:p>
     <w:p>
@@ -2884,7 +3517,21 @@
         <w:rPr>
           <w:color w:val="000000" w:themeColor="text1"/>
         </w:rPr>
-        <w:t xml:space="preserve">Diferente de arquiteturas como a ResNet, onde o fluxo </w:t>
+        <w:t xml:space="preserve">Diferente de arquiteturas como a </w:t>
+      </w:r>
+      <w:proofErr w:type="spellStart"/>
+      <w:r>
+        <w:rPr>
+          <w:color w:val="000000" w:themeColor="text1"/>
+        </w:rPr>
+        <w:t>ResNet</w:t>
+      </w:r>
+      <w:proofErr w:type="spellEnd"/>
+      <w:r>
+        <w:rPr>
+          <w:color w:val="000000" w:themeColor="text1"/>
+        </w:rPr>
+        <w:t xml:space="preserve">, onde o fluxo </w:t>
       </w:r>
       <w:r>
         <w:rPr>
@@ -2902,7 +3549,21 @@
         <w:rPr>
           <w:color w:val="000000" w:themeColor="text1"/>
         </w:rPr>
-        <w:t>”, a MobileNet aplica o inverso “</w:t>
+        <w:t xml:space="preserve">”, a </w:t>
+      </w:r>
+      <w:proofErr w:type="spellStart"/>
+      <w:r>
+        <w:rPr>
+          <w:color w:val="000000" w:themeColor="text1"/>
+        </w:rPr>
+        <w:t>MobileNet</w:t>
+      </w:r>
+      <w:proofErr w:type="spellEnd"/>
+      <w:r>
+        <w:rPr>
+          <w:color w:val="000000" w:themeColor="text1"/>
+        </w:rPr>
+        <w:t xml:space="preserve"> aplica o inverso “</w:t>
       </w:r>
       <w:r>
         <w:rPr>
@@ -2963,8 +3624,30 @@
         <w:rPr>
           <w:color w:val="000000" w:themeColor="text1"/>
         </w:rPr>
-        <w:t xml:space="preserve"> de inverted residual block</w:t>
-      </w:r>
+        <w:t xml:space="preserve"> de </w:t>
+      </w:r>
+      <w:proofErr w:type="spellStart"/>
+      <w:r>
+        <w:rPr>
+          <w:color w:val="000000" w:themeColor="text1"/>
+        </w:rPr>
+        <w:t>inverted</w:t>
+      </w:r>
+      <w:proofErr w:type="spellEnd"/>
+      <w:r>
+        <w:rPr>
+          <w:color w:val="000000" w:themeColor="text1"/>
+        </w:rPr>
+        <w:t xml:space="preserve"> residual </w:t>
+      </w:r>
+      <w:proofErr w:type="spellStart"/>
+      <w:r>
+        <w:rPr>
+          <w:color w:val="000000" w:themeColor="text1"/>
+        </w:rPr>
+        <w:t>block</w:t>
+      </w:r>
+      <w:proofErr w:type="spellEnd"/>
       <w:r>
         <w:rPr>
           <w:color w:val="000000" w:themeColor="text1"/>
@@ -2995,21 +3678,45 @@
           <w:bCs/>
           <w:color w:val="000000" w:themeColor="text1"/>
         </w:rPr>
-        <w:t>E</w:t>
-      </w:r>
-      <w:r>
-        <w:rPr>
-          <w:b/>
-          <w:bCs/>
-          <w:color w:val="000000" w:themeColor="text1"/>
-        </w:rPr>
-        <w:t>xpansão (1x1 convolution)</w:t>
-      </w:r>
-      <w:r>
-        <w:rPr>
-          <w:color w:val="000000" w:themeColor="text1"/>
-        </w:rPr>
-        <w:t xml:space="preserve"> – Busca aumentar o numero de canais, levando os dados para um espaço com alta dimensionalidade</w:t>
+        <w:t xml:space="preserve">Expansão (1x1 </w:t>
+      </w:r>
+      <w:proofErr w:type="spellStart"/>
+      <w:r>
+        <w:rPr>
+          <w:b/>
+          <w:bCs/>
+          <w:color w:val="000000" w:themeColor="text1"/>
+        </w:rPr>
+        <w:t>convolution</w:t>
+      </w:r>
+      <w:proofErr w:type="spellEnd"/>
+      <w:r>
+        <w:rPr>
+          <w:b/>
+          <w:bCs/>
+          <w:color w:val="000000" w:themeColor="text1"/>
+        </w:rPr>
+        <w:t>)</w:t>
+      </w:r>
+      <w:r>
+        <w:rPr>
+          <w:color w:val="000000" w:themeColor="text1"/>
+        </w:rPr>
+        <w:t xml:space="preserve"> – Busca aumentar o </w:t>
+      </w:r>
+      <w:proofErr w:type="spellStart"/>
+      <w:r>
+        <w:rPr>
+          <w:color w:val="000000" w:themeColor="text1"/>
+        </w:rPr>
+        <w:t>numero</w:t>
+      </w:r>
+      <w:proofErr w:type="spellEnd"/>
+      <w:r>
+        <w:rPr>
+          <w:color w:val="000000" w:themeColor="text1"/>
+        </w:rPr>
+        <w:t xml:space="preserve"> de canais, levando os dados para um espaço com alta dimensionalidade</w:t>
       </w:r>
     </w:p>
     <w:p>
@@ -3023,13 +3730,41 @@
           <w:color w:val="000000" w:themeColor="text1"/>
         </w:rPr>
       </w:pPr>
-      <w:r>
-        <w:rPr>
-          <w:b/>
-          <w:bCs/>
-          <w:color w:val="000000" w:themeColor="text1"/>
-        </w:rPr>
-        <w:t>Depthwise convolution (3x3)</w:t>
+      <w:proofErr w:type="spellStart"/>
+      <w:r>
+        <w:rPr>
+          <w:b/>
+          <w:bCs/>
+          <w:color w:val="000000" w:themeColor="text1"/>
+        </w:rPr>
+        <w:t>Depthwise</w:t>
+      </w:r>
+      <w:proofErr w:type="spellEnd"/>
+      <w:r>
+        <w:rPr>
+          <w:b/>
+          <w:bCs/>
+          <w:color w:val="000000" w:themeColor="text1"/>
+        </w:rPr>
+        <w:t xml:space="preserve"> </w:t>
+      </w:r>
+      <w:proofErr w:type="spellStart"/>
+      <w:r>
+        <w:rPr>
+          <w:b/>
+          <w:bCs/>
+          <w:color w:val="000000" w:themeColor="text1"/>
+        </w:rPr>
+        <w:t>convolution</w:t>
+      </w:r>
+      <w:proofErr w:type="spellEnd"/>
+      <w:r>
+        <w:rPr>
+          <w:b/>
+          <w:bCs/>
+          <w:color w:val="000000" w:themeColor="text1"/>
+        </w:rPr>
+        <w:t xml:space="preserve"> (3x3)</w:t>
       </w:r>
       <w:r>
         <w:rPr>
@@ -3061,13 +3796,45 @@
           <w:bCs/>
           <w:color w:val="000000" w:themeColor="text1"/>
         </w:rPr>
-        <w:t>Projeção (1x1 Convolution)</w:t>
-      </w:r>
-      <w:r>
-        <w:rPr>
-          <w:color w:val="000000" w:themeColor="text1"/>
-        </w:rPr>
-        <w:t xml:space="preserve"> – Reduz novamente o numero de canais, retornando a um espaço compacto</w:t>
+        <w:t xml:space="preserve">Projeção (1x1 </w:t>
+      </w:r>
+      <w:proofErr w:type="spellStart"/>
+      <w:r>
+        <w:rPr>
+          <w:b/>
+          <w:bCs/>
+          <w:color w:val="000000" w:themeColor="text1"/>
+        </w:rPr>
+        <w:t>Convolution</w:t>
+      </w:r>
+      <w:proofErr w:type="spellEnd"/>
+      <w:r>
+        <w:rPr>
+          <w:b/>
+          <w:bCs/>
+          <w:color w:val="000000" w:themeColor="text1"/>
+        </w:rPr>
+        <w:t>)</w:t>
+      </w:r>
+      <w:r>
+        <w:rPr>
+          <w:color w:val="000000" w:themeColor="text1"/>
+        </w:rPr>
+        <w:t xml:space="preserve"> – Reduz novamente o </w:t>
+      </w:r>
+      <w:proofErr w:type="spellStart"/>
+      <w:r>
+        <w:rPr>
+          <w:color w:val="000000" w:themeColor="text1"/>
+        </w:rPr>
+        <w:t>numero</w:t>
+      </w:r>
+      <w:proofErr w:type="spellEnd"/>
+      <w:r>
+        <w:rPr>
+          <w:color w:val="000000" w:themeColor="text1"/>
+        </w:rPr>
+        <w:t xml:space="preserve"> de canais, retornando a um espaço compacto</w:t>
       </w:r>
     </w:p>
     <w:p>
@@ -3102,15 +3869,25 @@
           <w:bCs/>
           <w:color w:val="000000" w:themeColor="text1"/>
         </w:rPr>
-        <w:t>Linear Bottleneck (o conceito mais importante)</w:t>
-      </w:r>
-      <w:r>
-        <w:rPr>
-          <w:b/>
-          <w:bCs/>
-          <w:color w:val="000000" w:themeColor="text1"/>
-        </w:rPr>
-        <w:t>:</w:t>
+        <w:t xml:space="preserve">Linear </w:t>
+      </w:r>
+      <w:proofErr w:type="spellStart"/>
+      <w:r>
+        <w:rPr>
+          <w:b/>
+          <w:bCs/>
+          <w:color w:val="000000" w:themeColor="text1"/>
+        </w:rPr>
+        <w:t>Bottleneck</w:t>
+      </w:r>
+      <w:proofErr w:type="spellEnd"/>
+      <w:r>
+        <w:rPr>
+          <w:b/>
+          <w:bCs/>
+          <w:color w:val="000000" w:themeColor="text1"/>
+        </w:rPr>
+        <w:t xml:space="preserve"> (o conceito mais importante):</w:t>
       </w:r>
       <w:r>
         <w:rPr>
@@ -3134,8 +3911,16 @@
         <w:rPr>
           <w:color w:val="000000" w:themeColor="text1"/>
         </w:rPr>
-        <w:t>A última camada do bloco (projeção) não usa ReLU</w:t>
-      </w:r>
+        <w:t xml:space="preserve">A última camada do bloco (projeção) não usa </w:t>
+      </w:r>
+      <w:proofErr w:type="spellStart"/>
+      <w:r>
+        <w:rPr>
+          <w:color w:val="000000" w:themeColor="text1"/>
+        </w:rPr>
+        <w:t>ReLU</w:t>
+      </w:r>
+      <w:proofErr w:type="spellEnd"/>
       <w:r>
         <w:rPr>
           <w:color w:val="000000" w:themeColor="text1"/>
@@ -3270,15 +4055,25 @@
           <w:bCs/>
           <w:color w:val="000000" w:themeColor="text1"/>
         </w:rPr>
-        <w:t>Conexões residuais (skip connections)</w:t>
-      </w:r>
-      <w:r>
-        <w:rPr>
-          <w:b/>
-          <w:bCs/>
-          <w:color w:val="000000" w:themeColor="text1"/>
-        </w:rPr>
-        <w:t>:</w:t>
+        <w:t>Conexões residuais (</w:t>
+      </w:r>
+      <w:proofErr w:type="spellStart"/>
+      <w:r>
+        <w:rPr>
+          <w:b/>
+          <w:bCs/>
+          <w:color w:val="000000" w:themeColor="text1"/>
+        </w:rPr>
+        <w:t>skip</w:t>
+      </w:r>
+      <w:proofErr w:type="spellEnd"/>
+      <w:r>
+        <w:rPr>
+          <w:b/>
+          <w:bCs/>
+          <w:color w:val="000000" w:themeColor="text1"/>
+        </w:rPr>
+        <w:t xml:space="preserve"> connections):</w:t>
       </w:r>
     </w:p>
     <w:p>
@@ -3364,15 +4159,25 @@
           <w:bCs/>
           <w:color w:val="000000" w:themeColor="text1"/>
         </w:rPr>
-        <w:t>Con</w:t>
-      </w:r>
-      <w:r>
-        <w:rPr>
-          <w:b/>
-          <w:bCs/>
-          <w:color w:val="000000" w:themeColor="text1"/>
-        </w:rPr>
-        <w:t>strução da MobileNet V2:</w:t>
+        <w:t xml:space="preserve">Construção da </w:t>
+      </w:r>
+      <w:proofErr w:type="spellStart"/>
+      <w:r>
+        <w:rPr>
+          <w:b/>
+          <w:bCs/>
+          <w:color w:val="000000" w:themeColor="text1"/>
+        </w:rPr>
+        <w:t>MobileNet</w:t>
+      </w:r>
+      <w:proofErr w:type="spellEnd"/>
+      <w:r>
+        <w:rPr>
+          <w:b/>
+          <w:bCs/>
+          <w:color w:val="000000" w:themeColor="text1"/>
+        </w:rPr>
+        <w:t xml:space="preserve"> V2:</w:t>
       </w:r>
     </w:p>
     <w:p>
@@ -3401,13 +4206,55 @@
         <w:rPr>
           <w:color w:val="000000" w:themeColor="text1"/>
         </w:rPr>
-        <w:t xml:space="preserve">A arquitetura é composta por vários inverted residual blocks empilhados, com variações </w:t>
-      </w:r>
-      <w:r>
-        <w:rPr>
-          <w:color w:val="000000" w:themeColor="text1"/>
-        </w:rPr>
-        <w:t>do número de canais, número de repetições, stride (para reduzir resolução, se necessário)</w:t>
+        <w:t xml:space="preserve">A arquitetura é composta por vários </w:t>
+      </w:r>
+      <w:proofErr w:type="spellStart"/>
+      <w:r>
+        <w:rPr>
+          <w:color w:val="000000" w:themeColor="text1"/>
+        </w:rPr>
+        <w:t>inverted</w:t>
+      </w:r>
+      <w:proofErr w:type="spellEnd"/>
+      <w:r>
+        <w:rPr>
+          <w:color w:val="000000" w:themeColor="text1"/>
+        </w:rPr>
+        <w:t xml:space="preserve"> residual </w:t>
+      </w:r>
+      <w:proofErr w:type="spellStart"/>
+      <w:r>
+        <w:rPr>
+          <w:color w:val="000000" w:themeColor="text1"/>
+        </w:rPr>
+        <w:t>blocks</w:t>
+      </w:r>
+      <w:proofErr w:type="spellEnd"/>
+      <w:r>
+        <w:rPr>
+          <w:color w:val="000000" w:themeColor="text1"/>
+        </w:rPr>
+        <w:t xml:space="preserve"> empilhados, com variações </w:t>
+      </w:r>
+      <w:r>
+        <w:rPr>
+          <w:color w:val="000000" w:themeColor="text1"/>
+        </w:rPr>
+        <w:t xml:space="preserve">do número de canais, número de repetições, </w:t>
+      </w:r>
+      <w:proofErr w:type="spellStart"/>
+      <w:r>
+        <w:rPr>
+          <w:color w:val="000000" w:themeColor="text1"/>
+        </w:rPr>
+        <w:t>stride</w:t>
+      </w:r>
+      <w:proofErr w:type="spellEnd"/>
+      <w:r>
+        <w:rPr>
+          <w:color w:val="000000" w:themeColor="text1"/>
+        </w:rPr>
+        <w:t xml:space="preserve"> (para reduzir resolução, se necessário)</w:t>
       </w:r>
       <w:r>
         <w:rPr>
@@ -3438,11 +4285,19 @@
           <w:color w:val="000000" w:themeColor="text1"/>
         </w:rPr>
       </w:pPr>
-      <w:r>
-        <w:rPr>
-          <w:color w:val="000000" w:themeColor="text1"/>
-        </w:rPr>
-        <w:t>Conv 1x1 (expansão)</w:t>
+      <w:proofErr w:type="spellStart"/>
+      <w:r>
+        <w:rPr>
+          <w:color w:val="000000" w:themeColor="text1"/>
+        </w:rPr>
+        <w:t>Conv</w:t>
+      </w:r>
+      <w:proofErr w:type="spellEnd"/>
+      <w:r>
+        <w:rPr>
+          <w:color w:val="000000" w:themeColor="text1"/>
+        </w:rPr>
+        <w:t xml:space="preserve"> 1x1 (expansão)</w:t>
       </w:r>
     </w:p>
     <w:p>
@@ -3457,12 +4312,14 @@
           <w:color w:val="000000" w:themeColor="text1"/>
         </w:rPr>
       </w:pPr>
+      <w:proofErr w:type="spellStart"/>
       <w:r>
         <w:rPr>
           <w:color w:val="000000" w:themeColor="text1"/>
         </w:rPr>
         <w:t>BatchNorm</w:t>
       </w:r>
+      <w:proofErr w:type="spellEnd"/>
     </w:p>
     <w:p>
       <w:pPr>
@@ -3495,11 +4352,33 @@
           <w:color w:val="000000" w:themeColor="text1"/>
         </w:rPr>
       </w:pPr>
-      <w:r>
-        <w:rPr>
-          <w:color w:val="000000" w:themeColor="text1"/>
-        </w:rPr>
-        <w:t>Depthwise Conv 3x3</w:t>
+      <w:proofErr w:type="spellStart"/>
+      <w:r>
+        <w:rPr>
+          <w:color w:val="000000" w:themeColor="text1"/>
+        </w:rPr>
+        <w:t>Depthwise</w:t>
+      </w:r>
+      <w:proofErr w:type="spellEnd"/>
+      <w:r>
+        <w:rPr>
+          <w:color w:val="000000" w:themeColor="text1"/>
+        </w:rPr>
+        <w:t xml:space="preserve"> </w:t>
+      </w:r>
+      <w:proofErr w:type="spellStart"/>
+      <w:r>
+        <w:rPr>
+          <w:color w:val="000000" w:themeColor="text1"/>
+        </w:rPr>
+        <w:t>Conv</w:t>
+      </w:r>
+      <w:proofErr w:type="spellEnd"/>
+      <w:r>
+        <w:rPr>
+          <w:color w:val="000000" w:themeColor="text1"/>
+        </w:rPr>
+        <w:t xml:space="preserve"> 3x3</w:t>
       </w:r>
     </w:p>
     <w:p>
@@ -3514,12 +4393,14 @@
           <w:color w:val="000000" w:themeColor="text1"/>
         </w:rPr>
       </w:pPr>
+      <w:proofErr w:type="spellStart"/>
       <w:r>
         <w:rPr>
           <w:color w:val="000000" w:themeColor="text1"/>
         </w:rPr>
         <w:t>BatchNorm</w:t>
       </w:r>
+      <w:proofErr w:type="spellEnd"/>
     </w:p>
     <w:p>
       <w:pPr>
@@ -3563,7 +4444,21 @@
         <w:rPr>
           <w:color w:val="000000" w:themeColor="text1"/>
         </w:rPr>
-        <w:t>, não ReLU padrão</w:t>
+        <w:t xml:space="preserve">, não </w:t>
+      </w:r>
+      <w:proofErr w:type="spellStart"/>
+      <w:r>
+        <w:rPr>
+          <w:color w:val="000000" w:themeColor="text1"/>
+        </w:rPr>
+        <w:t>ReLU</w:t>
+      </w:r>
+      <w:proofErr w:type="spellEnd"/>
+      <w:r>
+        <w:rPr>
+          <w:color w:val="000000" w:themeColor="text1"/>
+        </w:rPr>
+        <w:t xml:space="preserve"> padrão</w:t>
       </w:r>
       <w:r>
         <w:rPr>
@@ -3584,11 +4479,33 @@
           <w:color w:val="000000" w:themeColor="text1"/>
         </w:rPr>
       </w:pPr>
-      <w:r>
-        <w:rPr>
-          <w:color w:val="000000" w:themeColor="text1"/>
-        </w:rPr>
-        <w:t>Conv 1x1 (projeção — sem ReLU)</w:t>
+      <w:proofErr w:type="spellStart"/>
+      <w:r>
+        <w:rPr>
+          <w:color w:val="000000" w:themeColor="text1"/>
+        </w:rPr>
+        <w:t>Conv</w:t>
+      </w:r>
+      <w:proofErr w:type="spellEnd"/>
+      <w:r>
+        <w:rPr>
+          <w:color w:val="000000" w:themeColor="text1"/>
+        </w:rPr>
+        <w:t xml:space="preserve"> 1x1 (projeção — sem </w:t>
+      </w:r>
+      <w:proofErr w:type="spellStart"/>
+      <w:r>
+        <w:rPr>
+          <w:color w:val="000000" w:themeColor="text1"/>
+        </w:rPr>
+        <w:t>ReLU</w:t>
+      </w:r>
+      <w:proofErr w:type="spellEnd"/>
+      <w:r>
+        <w:rPr>
+          <w:color w:val="000000" w:themeColor="text1"/>
+        </w:rPr>
+        <w:t>)</w:t>
       </w:r>
     </w:p>
     <w:p>
@@ -3603,12 +4520,14 @@
           <w:color w:val="000000" w:themeColor="text1"/>
         </w:rPr>
       </w:pPr>
+      <w:proofErr w:type="spellStart"/>
       <w:r>
         <w:rPr>
           <w:color w:val="000000" w:themeColor="text1"/>
         </w:rPr>
         <w:t>BatchNorm</w:t>
       </w:r>
+      <w:proofErr w:type="spellEnd"/>
     </w:p>
     <w:p>
       <w:pPr>
@@ -3626,7 +4545,21 @@
         <w:rPr>
           <w:color w:val="000000" w:themeColor="text1"/>
         </w:rPr>
-        <w:t>(Opcional) Skip connection</w:t>
+        <w:t xml:space="preserve">(Opcional) </w:t>
+      </w:r>
+      <w:proofErr w:type="spellStart"/>
+      <w:r>
+        <w:rPr>
+          <w:color w:val="000000" w:themeColor="text1"/>
+        </w:rPr>
+        <w:t>Skip</w:t>
+      </w:r>
+      <w:proofErr w:type="spellEnd"/>
+      <w:r>
+        <w:rPr>
+          <w:color w:val="000000" w:themeColor="text1"/>
+        </w:rPr>
+        <w:t xml:space="preserve"> connection</w:t>
       </w:r>
     </w:p>
     <w:p>
@@ -3690,11 +4623,19 @@
         </w:rPr>
         <w:t xml:space="preserve"> e as últimas camadas são compostas por </w:t>
       </w:r>
-      <w:r>
-        <w:rPr>
-          <w:color w:val="000000" w:themeColor="text1"/>
-        </w:rPr>
-        <w:t>Conv 1x1</w:t>
+      <w:proofErr w:type="spellStart"/>
+      <w:r>
+        <w:rPr>
+          <w:color w:val="000000" w:themeColor="text1"/>
+        </w:rPr>
+        <w:t>Conv</w:t>
+      </w:r>
+      <w:proofErr w:type="spellEnd"/>
+      <w:r>
+        <w:rPr>
+          <w:color w:val="000000" w:themeColor="text1"/>
+        </w:rPr>
+        <w:t xml:space="preserve"> 1x1</w:t>
       </w:r>
       <w:r>
         <w:rPr>
@@ -3706,8 +4647,30 @@
         <w:rPr>
           <w:color w:val="000000" w:themeColor="text1"/>
         </w:rPr>
-        <w:t>Global Average Pooling</w:t>
-      </w:r>
+        <w:t xml:space="preserve">Global </w:t>
+      </w:r>
+      <w:proofErr w:type="spellStart"/>
+      <w:r>
+        <w:rPr>
+          <w:color w:val="000000" w:themeColor="text1"/>
+        </w:rPr>
+        <w:t>Average</w:t>
+      </w:r>
+      <w:proofErr w:type="spellEnd"/>
+      <w:r>
+        <w:rPr>
+          <w:color w:val="000000" w:themeColor="text1"/>
+        </w:rPr>
+        <w:t xml:space="preserve"> </w:t>
+      </w:r>
+      <w:proofErr w:type="spellStart"/>
+      <w:r>
+        <w:rPr>
+          <w:color w:val="000000" w:themeColor="text1"/>
+        </w:rPr>
+        <w:t>Pooling</w:t>
+      </w:r>
+      <w:proofErr w:type="spellEnd"/>
       <w:r>
         <w:rPr>
           <w:color w:val="000000" w:themeColor="text1"/>
@@ -3730,10 +4693,7 @@
     <w:p>
       <w:pPr>
         <w:pStyle w:val="PargrafodaLista"/>
-        <w:numPr>
-          <w:ilvl w:val="1"/>
-          <w:numId w:val="41"/>
-        </w:numPr>
+        <w:ind w:left="1788"/>
         <w:jc w:val="both"/>
         <w:rPr>
           <w:color w:val="000000" w:themeColor="text1"/>
@@ -3771,9 +4731,1253 @@
         </w:rPr>
         <w:t>6</w:t>
       </w:r>
-    </w:p>
-    <w:p>
-      <w:pPr>
+      <w:r>
+        <w:rPr>
+          <w:b/>
+          <w:bCs/>
+          <w:color w:val="00B050"/>
+        </w:rPr>
+        <w:t xml:space="preserve"> – DENSENET</w:t>
+      </w:r>
+    </w:p>
+    <w:p>
+      <w:pPr>
+        <w:pStyle w:val="PargrafodaLista"/>
+        <w:ind w:left="360" w:firstLine="348"/>
+        <w:jc w:val="both"/>
+      </w:pPr>
+    </w:p>
+    <w:p>
+      <w:pPr>
+        <w:pStyle w:val="PargrafodaLista"/>
+        <w:ind w:left="360" w:firstLine="348"/>
+        <w:jc w:val="both"/>
+      </w:pPr>
+      <w:r>
+        <w:t xml:space="preserve">A </w:t>
+      </w:r>
+      <w:proofErr w:type="spellStart"/>
+      <w:r>
+        <w:t>DenseNet</w:t>
+      </w:r>
+      <w:proofErr w:type="spellEnd"/>
+      <w:r>
+        <w:t xml:space="preserve"> </w:t>
+      </w:r>
+      <w:r>
+        <w:t>tenta</w:t>
+      </w:r>
+      <w:r>
+        <w:t xml:space="preserve"> resolver um problema clássico: a perda de informação e gradiente em redes muito profundas. A proposta da </w:t>
+      </w:r>
+      <w:proofErr w:type="spellStart"/>
+      <w:r>
+        <w:t>DenseNet</w:t>
+      </w:r>
+      <w:proofErr w:type="spellEnd"/>
+      <w:r>
+        <w:t xml:space="preserve"> é radical: cada camada recebe como entrada todas as saídas das camadas anteriores. Ou seja, em vez de uma cadeia linear de processamento, a rede cria um padrão altamente conectado, onde cada camada tem acesso direto ao “histórico completo” de features já aprendidas. </w:t>
+      </w:r>
+    </w:p>
+    <w:p>
+      <w:pPr>
+        <w:pStyle w:val="PargrafodaLista"/>
+        <w:ind w:left="1068"/>
+        <w:jc w:val="both"/>
+        <w:rPr>
+          <w:b/>
+          <w:bCs/>
+        </w:rPr>
+      </w:pPr>
+    </w:p>
+    <w:p>
+      <w:pPr>
+        <w:pStyle w:val="PargrafodaLista"/>
+        <w:numPr>
+          <w:ilvl w:val="0"/>
+          <w:numId w:val="41"/>
+        </w:numPr>
+        <w:jc w:val="both"/>
+        <w:rPr>
+          <w:b/>
+          <w:bCs/>
+        </w:rPr>
+      </w:pPr>
+      <w:r>
+        <w:rPr>
+          <w:b/>
+          <w:bCs/>
+        </w:rPr>
+        <w:t>Reuso de features</w:t>
+      </w:r>
+      <w:r>
+        <w:rPr>
+          <w:b/>
+          <w:bCs/>
+        </w:rPr>
+        <w:t xml:space="preserve">: </w:t>
+      </w:r>
+      <w:r>
+        <w:t>Camadas posteriores reutilizam diretamente padrões aprendidos nas primeiras camadas</w:t>
+      </w:r>
+    </w:p>
+    <w:p>
+      <w:pPr>
+        <w:pStyle w:val="PargrafodaLista"/>
+        <w:numPr>
+          <w:ilvl w:val="0"/>
+          <w:numId w:val="41"/>
+        </w:numPr>
+        <w:jc w:val="both"/>
+        <w:rPr>
+          <w:b/>
+          <w:bCs/>
+        </w:rPr>
+      </w:pPr>
+      <w:r>
+        <w:rPr>
+          <w:b/>
+          <w:bCs/>
+        </w:rPr>
+        <w:t>Menor redundância</w:t>
+      </w:r>
+      <w:r>
+        <w:rPr>
+          <w:b/>
+          <w:bCs/>
+        </w:rPr>
+        <w:t xml:space="preserve">:  </w:t>
+      </w:r>
+      <w:r>
+        <w:t>A rede não precisa reaprender a mesma feature várias vezes</w:t>
+      </w:r>
+    </w:p>
+    <w:p>
+      <w:pPr>
+        <w:pStyle w:val="PargrafodaLista"/>
+        <w:numPr>
+          <w:ilvl w:val="0"/>
+          <w:numId w:val="41"/>
+        </w:numPr>
+        <w:jc w:val="both"/>
+        <w:rPr>
+          <w:b/>
+          <w:bCs/>
+        </w:rPr>
+      </w:pPr>
+      <w:r>
+        <w:rPr>
+          <w:b/>
+          <w:bCs/>
+        </w:rPr>
+        <w:t>Eficiência de parâmetros</w:t>
+      </w:r>
+      <w:r>
+        <w:rPr>
+          <w:b/>
+          <w:bCs/>
+        </w:rPr>
+        <w:t xml:space="preserve">: </w:t>
+      </w:r>
+      <w:r>
+        <w:t xml:space="preserve">Mesmo sendo profunda, a </w:t>
+      </w:r>
+      <w:proofErr w:type="spellStart"/>
+      <w:r>
+        <w:t>DenseNet</w:t>
+      </w:r>
+      <w:proofErr w:type="spellEnd"/>
+      <w:r>
+        <w:t xml:space="preserve"> usa menos parâmetros que redes tradicionais</w:t>
+      </w:r>
+    </w:p>
+    <w:p>
+      <w:pPr>
+        <w:pStyle w:val="PargrafodaLista"/>
+        <w:ind w:left="360" w:firstLine="348"/>
+        <w:jc w:val="both"/>
+      </w:pPr>
+    </w:p>
+    <w:p>
+      <w:pPr>
+        <w:pStyle w:val="PargrafodaLista"/>
+        <w:ind w:left="360" w:firstLine="348"/>
+        <w:jc w:val="both"/>
+      </w:pPr>
+      <w:r>
+        <w:t xml:space="preserve">O principal diferencial da </w:t>
+      </w:r>
+      <w:proofErr w:type="spellStart"/>
+      <w:r>
+        <w:t>DenseNet</w:t>
+      </w:r>
+      <w:proofErr w:type="spellEnd"/>
+      <w:r>
+        <w:t xml:space="preserve"> está na forma como as camadas se conectam. Diferente da </w:t>
+      </w:r>
+      <w:proofErr w:type="spellStart"/>
+      <w:r>
+        <w:t>ResNet</w:t>
+      </w:r>
+      <w:proofErr w:type="spellEnd"/>
+      <w:r>
+        <w:t>, que soma entradas (</w:t>
+      </w:r>
+      <w:proofErr w:type="spellStart"/>
+      <w:r>
+        <w:t>skip</w:t>
+      </w:r>
+      <w:proofErr w:type="spellEnd"/>
+      <w:r>
+        <w:t xml:space="preserve"> connection), a </w:t>
+      </w:r>
+      <w:proofErr w:type="spellStart"/>
+      <w:r>
+        <w:t>DenseNet</w:t>
+      </w:r>
+      <w:proofErr w:type="spellEnd"/>
+      <w:r>
+        <w:t xml:space="preserve"> utiliza concatenação.</w:t>
+      </w:r>
+      <w:r>
+        <w:t xml:space="preserve"> </w:t>
+      </w:r>
+      <w:r>
+        <w:t>Este método garante que n</w:t>
+      </w:r>
+      <w:r>
+        <w:t xml:space="preserve">enhuma informação </w:t>
+      </w:r>
+      <w:r>
+        <w:t>seja</w:t>
+      </w:r>
+      <w:r>
+        <w:t xml:space="preserve"> sobrescrit</w:t>
+      </w:r>
+      <w:r>
+        <w:t>a e que todas</w:t>
+      </w:r>
+      <w:r>
+        <w:t xml:space="preserve"> as features </w:t>
+      </w:r>
+      <w:r>
+        <w:t>sejam</w:t>
+      </w:r>
+      <w:r>
+        <w:t xml:space="preserve"> preservadas</w:t>
+      </w:r>
+      <w:r>
+        <w:t xml:space="preserve">. </w:t>
+      </w:r>
+      <w:r>
+        <w:t xml:space="preserve">Para organizar </w:t>
+      </w:r>
+      <w:r>
+        <w:t>a</w:t>
+      </w:r>
+      <w:r>
+        <w:t xml:space="preserve"> conectividade intensa, a </w:t>
+      </w:r>
+      <w:proofErr w:type="spellStart"/>
+      <w:r>
+        <w:t>DenseNet</w:t>
+      </w:r>
+      <w:proofErr w:type="spellEnd"/>
+      <w:r>
+        <w:t xml:space="preserve"> é dividida em </w:t>
+      </w:r>
+      <w:proofErr w:type="spellStart"/>
+      <w:r>
+        <w:rPr>
+          <w:b/>
+          <w:bCs/>
+        </w:rPr>
+        <w:t>Dense</w:t>
+      </w:r>
+      <w:proofErr w:type="spellEnd"/>
+      <w:r>
+        <w:rPr>
+          <w:b/>
+          <w:bCs/>
+        </w:rPr>
+        <w:t xml:space="preserve"> </w:t>
+      </w:r>
+      <w:proofErr w:type="spellStart"/>
+      <w:r>
+        <w:rPr>
+          <w:b/>
+          <w:bCs/>
+        </w:rPr>
+        <w:t>Blocks</w:t>
+      </w:r>
+      <w:proofErr w:type="spellEnd"/>
+      <w:r>
+        <w:t>, os quais são estruturados da seguinte forma:</w:t>
+      </w:r>
+    </w:p>
+    <w:p>
+      <w:pPr>
+        <w:pStyle w:val="PargrafodaLista"/>
+        <w:ind w:left="360" w:firstLine="348"/>
+        <w:jc w:val="both"/>
+      </w:pPr>
+    </w:p>
+    <w:p>
+      <w:pPr>
+        <w:pStyle w:val="PargrafodaLista"/>
+        <w:numPr>
+          <w:ilvl w:val="0"/>
+          <w:numId w:val="43"/>
+        </w:numPr>
+        <w:jc w:val="both"/>
+        <w:rPr>
+          <w:b/>
+          <w:bCs/>
+        </w:rPr>
+      </w:pPr>
+      <w:r>
+        <w:rPr>
+          <w:b/>
+          <w:bCs/>
+        </w:rPr>
+        <w:t>DENSE BLOCKS</w:t>
+      </w:r>
+      <w:r>
+        <w:rPr>
+          <w:b/>
+          <w:bCs/>
+        </w:rPr>
+        <w:t>:</w:t>
+      </w:r>
+    </w:p>
+    <w:p>
+      <w:pPr>
+        <w:pStyle w:val="PargrafodaLista"/>
+        <w:numPr>
+          <w:ilvl w:val="0"/>
+          <w:numId w:val="44"/>
+        </w:numPr>
+        <w:jc w:val="both"/>
+      </w:pPr>
+      <w:r>
+        <w:t>Todas as camadas estão conectadas entre si</w:t>
+      </w:r>
+    </w:p>
+    <w:p>
+      <w:pPr>
+        <w:pStyle w:val="PargrafodaLista"/>
+        <w:numPr>
+          <w:ilvl w:val="0"/>
+          <w:numId w:val="44"/>
+        </w:numPr>
+        <w:jc w:val="both"/>
+      </w:pPr>
+      <w:r>
+        <w:t>A resolução espacial (altura/largura) é mantida constante</w:t>
+      </w:r>
+    </w:p>
+    <w:p>
+      <w:pPr>
+        <w:pStyle w:val="PargrafodaLista"/>
+        <w:numPr>
+          <w:ilvl w:val="0"/>
+          <w:numId w:val="44"/>
+        </w:numPr>
+        <w:jc w:val="both"/>
+      </w:pPr>
+      <w:r>
+        <w:t>O número de canais cresce progressivamente</w:t>
+      </w:r>
+    </w:p>
+    <w:p>
+      <w:pPr>
+        <w:pStyle w:val="PargrafodaLista"/>
+        <w:ind w:left="360" w:firstLine="348"/>
+        <w:jc w:val="both"/>
+      </w:pPr>
+    </w:p>
+    <w:p>
+      <w:pPr>
+        <w:pStyle w:val="PargrafodaLista"/>
+        <w:ind w:left="1068"/>
+        <w:jc w:val="both"/>
+      </w:pPr>
+      <w:r>
+        <w:t xml:space="preserve">Cada camada dentro do bloco realiza uma transformação chamada </w:t>
+      </w:r>
+      <m:oMath>
+        <m:r>
+          <w:rPr>
+            <w:rFonts w:ascii="Cambria Math" w:hAnsi="Cambria Math"/>
+          </w:rPr>
+          <m:t>Hl(</m:t>
+        </m:r>
+        <m:r>
+          <w:rPr>
+            <w:rFonts w:ascii="Cambria Math" w:hAnsi="Cambria Math" w:cs="Cambria Math"/>
+          </w:rPr>
+          <m:t>⋅</m:t>
+        </m:r>
+        <m:r>
+          <w:rPr>
+            <w:rFonts w:ascii="Cambria Math" w:hAnsi="Cambria Math"/>
+          </w:rPr>
+          <m:t>)</m:t>
+        </m:r>
+      </m:oMath>
+      <w:r>
+        <w:rPr>
+          <w:rFonts w:eastAsiaTheme="minorEastAsia"/>
+        </w:rPr>
+        <w:t xml:space="preserve"> </w:t>
+      </w:r>
+      <w:r>
+        <w:t xml:space="preserve">que </w:t>
+      </w:r>
+      <w:r>
+        <w:rPr>
+          <w:rFonts w:ascii="Calibri" w:hAnsi="Calibri" w:cs="Calibri"/>
+        </w:rPr>
+        <w:t>é</w:t>
+      </w:r>
+      <w:r>
+        <w:t xml:space="preserve"> composta por:</w:t>
+      </w:r>
+      <w:r>
+        <w:t xml:space="preserve"> </w:t>
+      </w:r>
+      <w:r>
+        <w:t xml:space="preserve">Batch </w:t>
+      </w:r>
+      <w:proofErr w:type="spellStart"/>
+      <w:r>
+        <w:t>Normalization</w:t>
+      </w:r>
+      <w:proofErr w:type="spellEnd"/>
+      <w:r>
+        <w:t xml:space="preserve">, </w:t>
+      </w:r>
+      <w:proofErr w:type="spellStart"/>
+      <w:r>
+        <w:t>ReLU</w:t>
+      </w:r>
+      <w:proofErr w:type="spellEnd"/>
+      <w:r>
+        <w:t xml:space="preserve"> e </w:t>
+      </w:r>
+      <w:r>
+        <w:t>Convolução</w:t>
+      </w:r>
+      <w:r>
+        <w:t xml:space="preserve">. </w:t>
+      </w:r>
+      <w:r>
+        <w:t>No modelo mais eficiente (</w:t>
+      </w:r>
+      <w:proofErr w:type="spellStart"/>
+      <w:r>
+        <w:t>DenseNet</w:t>
+      </w:r>
+      <w:proofErr w:type="spellEnd"/>
+      <w:r>
+        <w:t xml:space="preserve">-BC), essa transformação é expandida para incluir um </w:t>
+      </w:r>
+      <w:proofErr w:type="spellStart"/>
+      <w:r>
+        <w:t>bottleneck</w:t>
+      </w:r>
+      <w:proofErr w:type="spellEnd"/>
+      <w:r>
+        <w:t>:</w:t>
+      </w:r>
+    </w:p>
+    <w:p>
+      <w:pPr>
+        <w:pStyle w:val="PargrafodaLista"/>
+        <w:ind w:left="360" w:firstLine="348"/>
+        <w:jc w:val="both"/>
+      </w:pPr>
+    </w:p>
+    <w:p>
+      <w:pPr>
+        <w:pStyle w:val="PargrafodaLista"/>
+        <w:numPr>
+          <w:ilvl w:val="1"/>
+          <w:numId w:val="43"/>
+        </w:numPr>
+        <w:jc w:val="both"/>
+      </w:pPr>
+      <w:r>
+        <w:t xml:space="preserve">BN → </w:t>
+      </w:r>
+      <w:proofErr w:type="spellStart"/>
+      <w:r>
+        <w:t>ReLU</w:t>
+      </w:r>
+      <w:proofErr w:type="spellEnd"/>
+      <w:r>
+        <w:t xml:space="preserve"> → </w:t>
+      </w:r>
+      <w:proofErr w:type="spellStart"/>
+      <w:proofErr w:type="gramStart"/>
+      <w:r>
+        <w:t>Conv</w:t>
+      </w:r>
+      <w:proofErr w:type="spellEnd"/>
+      <w:r>
+        <w:t>(</w:t>
+      </w:r>
+      <w:proofErr w:type="gramEnd"/>
+      <w:r>
+        <w:t>1×1)</w:t>
+      </w:r>
+    </w:p>
+    <w:p>
+      <w:pPr>
+        <w:pStyle w:val="PargrafodaLista"/>
+        <w:numPr>
+          <w:ilvl w:val="1"/>
+          <w:numId w:val="43"/>
+        </w:numPr>
+        <w:jc w:val="both"/>
+      </w:pPr>
+      <w:r>
+        <w:t xml:space="preserve">BN → </w:t>
+      </w:r>
+      <w:proofErr w:type="spellStart"/>
+      <w:r>
+        <w:t>ReLU</w:t>
+      </w:r>
+      <w:proofErr w:type="spellEnd"/>
+      <w:r>
+        <w:t xml:space="preserve"> → </w:t>
+      </w:r>
+      <w:proofErr w:type="spellStart"/>
+      <w:proofErr w:type="gramStart"/>
+      <w:r>
+        <w:t>Conv</w:t>
+      </w:r>
+      <w:proofErr w:type="spellEnd"/>
+      <w:r>
+        <w:t>(</w:t>
+      </w:r>
+      <w:proofErr w:type="gramEnd"/>
+      <w:r>
+        <w:t>3×3)</w:t>
+      </w:r>
+    </w:p>
+    <w:p>
+      <w:pPr>
+        <w:pStyle w:val="PargrafodaLista"/>
+        <w:ind w:left="360" w:firstLine="348"/>
+        <w:jc w:val="both"/>
+      </w:pPr>
+    </w:p>
+    <w:p>
+      <w:pPr>
+        <w:pStyle w:val="PargrafodaLista"/>
+        <w:ind w:left="1068"/>
+        <w:jc w:val="both"/>
+      </w:pPr>
+      <w:r>
+        <w:t xml:space="preserve">O uso do </w:t>
+      </w:r>
+      <w:proofErr w:type="spellStart"/>
+      <w:r>
+        <w:t>conv</w:t>
+      </w:r>
+      <w:proofErr w:type="spellEnd"/>
+      <w:r>
+        <w:t xml:space="preserve"> 1×1 antes do 3×3 serve para reduzir dimensionalidade e custo computacional, mantendo a eficiência</w:t>
+      </w:r>
+      <w:r>
+        <w:t>.</w:t>
+      </w:r>
+    </w:p>
+    <w:p>
+      <w:pPr>
+        <w:pStyle w:val="PargrafodaLista"/>
+        <w:ind w:left="1068"/>
+        <w:jc w:val="both"/>
+      </w:pPr>
+    </w:p>
+    <w:p>
+      <w:pPr>
+        <w:pStyle w:val="PargrafodaLista"/>
+        <w:numPr>
+          <w:ilvl w:val="0"/>
+          <w:numId w:val="43"/>
+        </w:numPr>
+        <w:jc w:val="both"/>
+        <w:rPr>
+          <w:b/>
+          <w:bCs/>
+        </w:rPr>
+      </w:pPr>
+      <w:r>
+        <w:rPr>
+          <w:b/>
+          <w:bCs/>
+        </w:rPr>
+        <w:t>GROWTH RATE</w:t>
+      </w:r>
+      <w:r>
+        <w:rPr>
+          <w:b/>
+          <w:bCs/>
+        </w:rPr>
+        <w:t xml:space="preserve"> (k): </w:t>
+      </w:r>
+    </w:p>
+    <w:p>
+      <w:pPr>
+        <w:pStyle w:val="PargrafodaLista"/>
+        <w:ind w:left="1068"/>
+        <w:jc w:val="both"/>
+      </w:pPr>
+      <w:r>
+        <w:t xml:space="preserve">Um conceito fundamental na </w:t>
+      </w:r>
+      <w:proofErr w:type="spellStart"/>
+      <w:r>
+        <w:t>DenseNet</w:t>
+      </w:r>
+      <w:proofErr w:type="spellEnd"/>
+      <w:r>
+        <w:t xml:space="preserve"> é o </w:t>
+      </w:r>
+      <w:proofErr w:type="spellStart"/>
+      <w:r>
+        <w:t>growth</w:t>
+      </w:r>
+      <w:proofErr w:type="spellEnd"/>
+      <w:r>
+        <w:t xml:space="preserve"> rate (k).</w:t>
+      </w:r>
+      <w:r>
+        <w:t xml:space="preserve"> </w:t>
+      </w:r>
+      <w:r>
+        <w:t>Ele define quantos novos canais cada camada adiciona ao modelo</w:t>
+      </w:r>
+      <w:r>
+        <w:t xml:space="preserve">, dessa forma a rede cresce de forma controlada em que cada camada </w:t>
+      </w:r>
+      <w:r>
+        <w:t>adicion</w:t>
+      </w:r>
+      <w:r>
+        <w:t>e</w:t>
+      </w:r>
+      <w:r>
+        <w:t xml:space="preserve"> apenas uma pequena quantidade de informação nova</w:t>
+      </w:r>
+    </w:p>
+    <w:p>
+      <w:pPr>
+        <w:pStyle w:val="PargrafodaLista"/>
+        <w:ind w:left="1068"/>
+        <w:jc w:val="both"/>
+        <w:rPr>
+          <w:b/>
+          <w:bCs/>
+        </w:rPr>
+      </w:pPr>
+    </w:p>
+    <w:p>
+      <w:pPr>
+        <w:pStyle w:val="PargrafodaLista"/>
+        <w:ind w:left="1068"/>
+        <w:jc w:val="both"/>
+      </w:pPr>
+      <w:r>
+        <w:rPr>
+          <w:b/>
+          <w:bCs/>
+        </w:rPr>
+        <w:t xml:space="preserve">Exemplo: </w:t>
+      </w:r>
+      <w:r>
+        <w:t>Entrada inicial</w:t>
+      </w:r>
+      <w:r>
+        <w:t xml:space="preserve"> tem</w:t>
+      </w:r>
+      <w:r>
+        <w:t xml:space="preserve"> 64 canais</w:t>
+      </w:r>
+      <w:r>
+        <w:t xml:space="preserve"> e k = 32</w:t>
+      </w:r>
+    </w:p>
+    <w:p>
+      <w:pPr>
+        <w:pStyle w:val="PargrafodaLista"/>
+        <w:ind w:left="1068"/>
+        <w:jc w:val="both"/>
+      </w:pPr>
+      <w:r>
+        <w:rPr>
+          <w:b/>
+          <w:bCs/>
+        </w:rPr>
+        <w:tab/>
+        <w:t xml:space="preserve">           </w:t>
+      </w:r>
+      <w:r>
+        <w:t xml:space="preserve">Após 6 camadas, teremos </w:t>
+      </w:r>
+      <w:r>
+        <w:t>64 + (6 × 32) = 256 canais</w:t>
+      </w:r>
+      <w:r>
+        <w:t>.</w:t>
+      </w:r>
+    </w:p>
+    <w:p>
+      <w:pPr>
+        <w:pStyle w:val="PargrafodaLista"/>
+        <w:ind w:left="1068"/>
+        <w:jc w:val="both"/>
+      </w:pPr>
+    </w:p>
+    <w:p>
+      <w:pPr>
+        <w:pStyle w:val="PargrafodaLista"/>
+        <w:ind w:left="1068"/>
+        <w:jc w:val="both"/>
+        <w:rPr>
+          <w:u w:val="single"/>
+        </w:rPr>
+      </w:pPr>
+      <w:r>
+        <w:rPr>
+          <w:b/>
+          <w:bCs/>
+        </w:rPr>
+        <w:lastRenderedPageBreak/>
+        <w:t>Observação:</w:t>
+      </w:r>
+      <w:r>
+        <w:t xml:space="preserve"> </w:t>
+      </w:r>
+      <w:r>
+        <w:t xml:space="preserve">Esse design é essencial, porque sem isso a rede explodiria em tamanho rapidamente. O </w:t>
+      </w:r>
+      <w:proofErr w:type="spellStart"/>
+      <w:r>
+        <w:t>paper</w:t>
+      </w:r>
+      <w:proofErr w:type="spellEnd"/>
+      <w:r>
+        <w:t xml:space="preserve"> mostra que valores pequenos como </w:t>
+      </w:r>
+      <w:r>
+        <w:rPr>
+          <w:u w:val="single"/>
+        </w:rPr>
+        <w:t>k = 12 ou 32 já são suficientes</w:t>
+      </w:r>
+    </w:p>
+    <w:p>
+      <w:pPr>
+        <w:pStyle w:val="PargrafodaLista"/>
+        <w:ind w:left="1068"/>
+        <w:jc w:val="both"/>
+      </w:pPr>
+    </w:p>
+    <w:p>
+      <w:pPr>
+        <w:pStyle w:val="PargrafodaLista"/>
+        <w:numPr>
+          <w:ilvl w:val="0"/>
+          <w:numId w:val="43"/>
+        </w:numPr>
+        <w:jc w:val="both"/>
+      </w:pPr>
+      <w:r>
+        <w:rPr>
+          <w:b/>
+          <w:bCs/>
+        </w:rPr>
+        <w:t>TRANSITION LAYERS (CONTROLE DE COMPLEXIDADE):</w:t>
+      </w:r>
+    </w:p>
+    <w:p>
+      <w:pPr>
+        <w:pStyle w:val="PargrafodaLista"/>
+        <w:ind w:left="1068"/>
+        <w:jc w:val="both"/>
+      </w:pPr>
+      <w:r>
+        <w:t xml:space="preserve">Entre os </w:t>
+      </w:r>
+      <w:proofErr w:type="spellStart"/>
+      <w:r>
+        <w:t>Dense</w:t>
+      </w:r>
+      <w:proofErr w:type="spellEnd"/>
+      <w:r>
+        <w:t xml:space="preserve"> </w:t>
+      </w:r>
+      <w:proofErr w:type="spellStart"/>
+      <w:r>
+        <w:t>Blocks</w:t>
+      </w:r>
+      <w:proofErr w:type="spellEnd"/>
+      <w:r>
+        <w:t xml:space="preserve"> existem as </w:t>
+      </w:r>
+      <w:proofErr w:type="spellStart"/>
+      <w:r>
+        <w:t>Transition</w:t>
+      </w:r>
+      <w:proofErr w:type="spellEnd"/>
+      <w:r>
+        <w:t xml:space="preserve"> </w:t>
+      </w:r>
+      <w:proofErr w:type="spellStart"/>
+      <w:r>
+        <w:t>Layers</w:t>
+      </w:r>
+      <w:proofErr w:type="spellEnd"/>
+      <w:r>
+        <w:t xml:space="preserve">, </w:t>
+      </w:r>
+      <w:r>
+        <w:t>responsáveis por r</w:t>
+      </w:r>
+      <w:r>
+        <w:t>eduzir a dimensão espacial (</w:t>
+      </w:r>
+      <w:proofErr w:type="spellStart"/>
+      <w:r>
+        <w:t>downsampling</w:t>
+      </w:r>
+      <w:proofErr w:type="spellEnd"/>
+      <w:r>
+        <w:t>)</w:t>
+      </w:r>
+      <w:r>
+        <w:t xml:space="preserve"> e c</w:t>
+      </w:r>
+      <w:r>
+        <w:t>ontrolar o crescimento do número de canais</w:t>
+      </w:r>
+      <w:r>
+        <w:t xml:space="preserve">. A estrutura base é: </w:t>
+      </w:r>
+      <w:r>
+        <w:t xml:space="preserve">BN → </w:t>
+      </w:r>
+      <w:proofErr w:type="spellStart"/>
+      <w:proofErr w:type="gramStart"/>
+      <w:r>
+        <w:t>Conv</w:t>
+      </w:r>
+      <w:proofErr w:type="spellEnd"/>
+      <w:r>
+        <w:t>(</w:t>
+      </w:r>
+      <w:proofErr w:type="gramEnd"/>
+      <w:r>
+        <w:t xml:space="preserve">1×1) → </w:t>
+      </w:r>
+      <w:proofErr w:type="spellStart"/>
+      <w:proofErr w:type="gramStart"/>
+      <w:r>
+        <w:t>AvgPool</w:t>
+      </w:r>
+      <w:proofErr w:type="spellEnd"/>
+      <w:r>
+        <w:t>(</w:t>
+      </w:r>
+      <w:proofErr w:type="gramEnd"/>
+      <w:r>
+        <w:t>2×2)</w:t>
+      </w:r>
+      <w:r>
+        <w:t>.</w:t>
+      </w:r>
+    </w:p>
+    <w:p>
+      <w:pPr>
+        <w:pStyle w:val="PargrafodaLista"/>
+        <w:ind w:left="1068"/>
+        <w:jc w:val="both"/>
+      </w:pPr>
+    </w:p>
+    <w:p>
+      <w:pPr>
+        <w:ind w:left="1068"/>
+        <w:jc w:val="both"/>
+        <w:rPr>
+          <w:rFonts w:eastAsiaTheme="minorEastAsia"/>
+        </w:rPr>
+      </w:pPr>
+      <w:r>
+        <w:t>Adicionalmente</w:t>
+      </w:r>
+      <w:r>
+        <w:t>, a Dense</w:t>
+      </w:r>
+      <w:proofErr w:type="spellStart"/>
+      <w:r>
+        <w:t>Net</w:t>
+      </w:r>
+      <w:proofErr w:type="spellEnd"/>
+      <w:r>
+        <w:t xml:space="preserve"> introduz o conceito de compressão (θ)</w:t>
+      </w:r>
+      <w:r>
+        <w:t xml:space="preserve"> para reduzir o número de canais</w:t>
+      </w:r>
+      <w:r>
+        <w:t>:</w:t>
+      </w:r>
+      <w:r>
+        <w:t xml:space="preserve"> </w:t>
+      </w:r>
+      <m:oMath>
+        <m:r>
+          <w:rPr>
+            <w:rFonts w:ascii="Cambria Math" w:hAnsi="Cambria Math"/>
+          </w:rPr>
+          <m:t>out=θ</m:t>
+        </m:r>
+        <m:r>
+          <w:rPr>
+            <w:rFonts w:ascii="Cambria Math" w:hAnsi="Cambria Math" w:cs="Cambria Math"/>
+          </w:rPr>
+          <m:t>⋅</m:t>
+        </m:r>
+        <m:r>
+          <w:rPr>
+            <w:rFonts w:ascii="Cambria Math" w:hAnsi="Cambria Math"/>
+          </w:rPr>
+          <m:t>in</m:t>
+        </m:r>
+      </m:oMath>
+    </w:p>
+    <w:p>
+      <w:pPr>
+        <w:pStyle w:val="PargrafodaLista"/>
+        <w:numPr>
+          <w:ilvl w:val="1"/>
+          <w:numId w:val="43"/>
+        </w:numPr>
+        <w:jc w:val="both"/>
+      </w:pPr>
+      <w:r>
+        <w:t>Com θ = 0.5, por exemplo, a rede reduz pela metade o número de canais</w:t>
+      </w:r>
+      <w:r>
+        <w:t>, evitando crescimento excessivo e melhorando a eficiência geral da rede</w:t>
+      </w:r>
+    </w:p>
+    <w:p>
+      <w:pPr>
+        <w:pStyle w:val="PargrafodaLista"/>
+        <w:ind w:left="1068"/>
+        <w:jc w:val="both"/>
+      </w:pPr>
+    </w:p>
+    <w:p>
+      <w:pPr>
+        <w:pStyle w:val="PargrafodaLista"/>
+        <w:numPr>
+          <w:ilvl w:val="0"/>
+          <w:numId w:val="43"/>
+        </w:numPr>
+        <w:jc w:val="both"/>
+        <w:rPr>
+          <w:b/>
+          <w:bCs/>
+        </w:rPr>
+      </w:pPr>
+      <w:r>
+        <w:rPr>
+          <w:b/>
+          <w:bCs/>
+        </w:rPr>
+        <w:t>ESTRUTURA DA DENSENET (IMAGENET)</w:t>
+      </w:r>
+      <w:r>
+        <w:rPr>
+          <w:b/>
+          <w:bCs/>
+        </w:rPr>
+        <w:t>:</w:t>
+      </w:r>
+    </w:p>
+    <w:p>
+      <w:pPr>
+        <w:pStyle w:val="PargrafodaLista"/>
+        <w:ind w:left="1068"/>
+        <w:jc w:val="both"/>
+        <w:rPr>
+          <w:b/>
+          <w:bCs/>
+        </w:rPr>
+      </w:pPr>
+      <w:r>
+        <w:rPr>
+          <w:b/>
+          <w:bCs/>
+        </w:rPr>
+        <w:drawing>
+          <wp:inline distT="0" distB="0" distL="0" distR="0" wp14:anchorId="012B8EB1" wp14:editId="49C3C67B">
+            <wp:extent cx="4707172" cy="2353586"/>
+            <wp:effectExtent l="0" t="0" r="0" b="8890"/>
+            <wp:docPr id="145839179" name="Imagem 1"/>
+            <wp:cNvGraphicFramePr>
+              <a:graphicFrameLocks xmlns:a="http://schemas.openxmlformats.org/drawingml/2006/main" noChangeAspect="1"/>
+            </wp:cNvGraphicFramePr>
+            <a:graphic xmlns:a="http://schemas.openxmlformats.org/drawingml/2006/main">
+              <a:graphicData uri="http://schemas.openxmlformats.org/drawingml/2006/picture">
+                <pic:pic xmlns:pic="http://schemas.openxmlformats.org/drawingml/2006/picture">
+                  <pic:nvPicPr>
+                    <pic:cNvPr id="145839179" name=""/>
+                    <pic:cNvPicPr/>
+                  </pic:nvPicPr>
+                  <pic:blipFill>
+                    <a:blip r:embed="rId14"/>
+                    <a:stretch>
+                      <a:fillRect/>
+                    </a:stretch>
+                  </pic:blipFill>
+                  <pic:spPr>
+                    <a:xfrm>
+                      <a:off x="0" y="0"/>
+                      <a:ext cx="4714552" cy="2357276"/>
+                    </a:xfrm>
+                    <a:prstGeom prst="rect">
+                      <a:avLst/>
+                    </a:prstGeom>
+                  </pic:spPr>
+                </pic:pic>
+              </a:graphicData>
+            </a:graphic>
+          </wp:inline>
+        </w:drawing>
+      </w:r>
+    </w:p>
+    <w:p>
+      <w:pPr>
+        <w:pStyle w:val="PargrafodaLista"/>
+        <w:ind w:left="1068"/>
+        <w:jc w:val="both"/>
+        <w:rPr>
+          <w:b/>
+          <w:bCs/>
+        </w:rPr>
+      </w:pPr>
+    </w:p>
+    <w:p>
+      <w:pPr>
+        <w:pStyle w:val="PargrafodaLista"/>
+        <w:numPr>
+          <w:ilvl w:val="0"/>
+          <w:numId w:val="43"/>
+        </w:numPr>
+        <w:jc w:val="both"/>
+        <w:rPr>
+          <w:b/>
+          <w:bCs/>
+        </w:rPr>
+      </w:pPr>
+      <w:r>
+        <w:rPr>
+          <w:b/>
+          <w:bCs/>
+        </w:rPr>
+        <w:t>COMPORTAMENTO DA REDE:</w:t>
+      </w:r>
+    </w:p>
+    <w:p>
+      <w:pPr>
+        <w:pStyle w:val="PargrafodaLista"/>
+        <w:ind w:left="1788"/>
+        <w:jc w:val="both"/>
+        <w:rPr>
+          <w:b/>
+          <w:bCs/>
+        </w:rPr>
+      </w:pPr>
+    </w:p>
+    <w:p>
+      <w:pPr>
+        <w:pStyle w:val="PargrafodaLista"/>
+        <w:numPr>
+          <w:ilvl w:val="0"/>
+          <w:numId w:val="45"/>
+        </w:numPr>
+        <w:spacing w:line="240" w:lineRule="auto"/>
+        <w:jc w:val="both"/>
+      </w:pPr>
+      <w:r>
+        <w:t xml:space="preserve">Cada camada recebe diretamente o input original e gradientes da saída final, o que cria um efeito de </w:t>
+      </w:r>
+      <w:proofErr w:type="spellStart"/>
+      <w:r>
+        <w:t>deep</w:t>
+      </w:r>
+      <w:proofErr w:type="spellEnd"/>
+      <w:r>
+        <w:t xml:space="preserve"> </w:t>
+      </w:r>
+      <w:proofErr w:type="spellStart"/>
+      <w:r>
+        <w:t>supervision</w:t>
+      </w:r>
+      <w:proofErr w:type="spellEnd"/>
+      <w:r>
+        <w:t xml:space="preserve"> implícita</w:t>
+      </w:r>
+      <w:r>
+        <w:t>.</w:t>
+      </w:r>
+    </w:p>
+    <w:p>
+      <w:pPr>
+        <w:pStyle w:val="PargrafodaLista"/>
+        <w:spacing w:line="240" w:lineRule="auto"/>
+        <w:ind w:left="1788"/>
+        <w:jc w:val="both"/>
+      </w:pPr>
+    </w:p>
+    <w:p>
+      <w:pPr>
+        <w:pStyle w:val="PargrafodaLista"/>
+        <w:numPr>
+          <w:ilvl w:val="0"/>
+          <w:numId w:val="45"/>
+        </w:numPr>
+        <w:spacing w:line="240" w:lineRule="auto"/>
+        <w:jc w:val="both"/>
+      </w:pPr>
+      <w:r>
+        <w:t>Em vez de substituir features antigas</w:t>
+      </w:r>
+      <w:r>
+        <w:t xml:space="preserve"> a rede preserva todas e adiciona novas, criando uma representação rica e diversificada</w:t>
+      </w:r>
+    </w:p>
+    <w:p>
+      <w:pPr>
+        <w:pStyle w:val="PargrafodaLista"/>
+        <w:spacing w:line="240" w:lineRule="auto"/>
+        <w:ind w:left="1788"/>
+        <w:jc w:val="both"/>
+        <w:rPr>
+          <w:color w:val="000000" w:themeColor="text1"/>
+        </w:rPr>
+      </w:pPr>
+    </w:p>
+    <w:p>
+      <w:pPr>
+        <w:pStyle w:val="PargrafodaLista"/>
+        <w:numPr>
+          <w:ilvl w:val="0"/>
+          <w:numId w:val="45"/>
+        </w:numPr>
+        <w:spacing w:line="240" w:lineRule="auto"/>
+        <w:jc w:val="both"/>
+        <w:rPr>
+          <w:color w:val="000000" w:themeColor="text1"/>
+        </w:rPr>
+      </w:pPr>
+      <w:r>
+        <w:t>Como as features são reutilizadas</w:t>
+      </w:r>
+      <w:r>
+        <w:t xml:space="preserve"> </w:t>
+      </w:r>
+      <w:r>
+        <w:t xml:space="preserve">a rede evita </w:t>
+      </w:r>
+      <w:proofErr w:type="spellStart"/>
+      <w:r>
+        <w:t>overfitting</w:t>
+      </w:r>
+      <w:proofErr w:type="spellEnd"/>
+      <w:r>
+        <w:t>, reduzindo a necessidade de parâmetros</w:t>
+      </w:r>
+    </w:p>
+    <w:p>
+      <w:pPr>
+        <w:pStyle w:val="PargrafodaLista"/>
+        <w:spacing w:line="240" w:lineRule="auto"/>
+        <w:ind w:left="1788"/>
+        <w:jc w:val="both"/>
+        <w:rPr>
+          <w:color w:val="000000" w:themeColor="text1"/>
+        </w:rPr>
+      </w:pPr>
+    </w:p>
+    <w:p>
+      <w:pPr>
+        <w:pStyle w:val="PargrafodaLista"/>
+        <w:numPr>
+          <w:ilvl w:val="0"/>
+          <w:numId w:val="45"/>
+        </w:numPr>
+        <w:spacing w:line="240" w:lineRule="auto"/>
+        <w:jc w:val="both"/>
+        <w:rPr>
+          <w:color w:val="000000" w:themeColor="text1"/>
+        </w:rPr>
+      </w:pPr>
+      <w:r>
+        <w:rPr>
+          <w:color w:val="000000" w:themeColor="text1"/>
+        </w:rPr>
+        <w:t>O artigo indica que c</w:t>
+      </w:r>
+      <w:r>
+        <w:rPr>
+          <w:color w:val="000000" w:themeColor="text1"/>
+        </w:rPr>
+        <w:t xml:space="preserve">amadas profundas ainda utilizam features das primeiras </w:t>
+      </w:r>
+      <w:r>
+        <w:rPr>
+          <w:color w:val="000000" w:themeColor="text1"/>
+        </w:rPr>
+        <w:t>camadas.</w:t>
+      </w:r>
+      <w:r>
+        <w:rPr>
+          <w:color w:val="000000" w:themeColor="text1"/>
+        </w:rPr>
+        <w:t xml:space="preserve"> </w:t>
+      </w:r>
+      <w:r>
+        <w:rPr>
+          <w:color w:val="000000" w:themeColor="text1"/>
+        </w:rPr>
+        <w:t xml:space="preserve">Isso indica que a rede aprende uma hierarquia </w:t>
+      </w:r>
+      <w:r>
+        <w:rPr>
+          <w:b/>
+          <w:bCs/>
+          <w:color w:val="000000" w:themeColor="text1"/>
+        </w:rPr>
+        <w:t>mais integrada e menos sequencial</w:t>
+      </w:r>
+      <w:r>
+        <w:rPr>
+          <w:color w:val="000000" w:themeColor="text1"/>
+        </w:rPr>
+        <w:t>.</w:t>
+      </w:r>
+    </w:p>
+    <w:p>
+      <w:pPr>
+        <w:pStyle w:val="PargrafodaLista"/>
+        <w:ind w:left="1788"/>
         <w:jc w:val="both"/>
         <w:rPr>
           <w:color w:val="000000" w:themeColor="text1"/>
@@ -3863,7 +6067,7 @@
         <v:path o:extrusionok="f" gradientshapeok="t" o:connecttype="rect"/>
         <o:lock v:ext="edit" aspectratio="t"/>
       </v:shapetype>
-      <v:shape id="_x0000_i1172" type="#_x0000_t75" style="width:693.1pt;height:487.1pt;visibility:visible;mso-wrap-style:square" o:bullet="t">
+      <v:shape id="_x0000_i1118" type="#_x0000_t75" style="width:693.1pt;height:487.1pt;visibility:visible;mso-wrap-style:square" o:bullet="t">
         <v:imagedata r:id="rId1" o:title="" croptop="19686f" cropbottom="43833f" cropleft="8606f" cropright="55951f"/>
       </v:shape>
     </w:pict>
@@ -4520,6 +6724,119 @@
     </w:lvl>
   </w:abstractNum>
   <w:abstractNum w:abstractNumId="6" w15:restartNumberingAfterBreak="0">
+    <w:nsid w:val="086C5A6B"/>
+    <w:multiLevelType w:val="hybridMultilevel"/>
+    <w:tmpl w:val="7534C7DC"/>
+    <w:lvl w:ilvl="0" w:tplc="0416001B">
+      <w:start w:val="1"/>
+      <w:numFmt w:val="lowerRoman"/>
+      <w:lvlText w:val="%1."/>
+      <w:lvlJc w:val="right"/>
+      <w:pPr>
+        <w:ind w:left="1776" w:hanging="360"/>
+      </w:pPr>
+      <w:rPr>
+        <w:rFonts w:hint="default"/>
+      </w:rPr>
+    </w:lvl>
+    <w:lvl w:ilvl="1" w:tplc="FFFFFFFF">
+      <w:start w:val="1"/>
+      <w:numFmt w:val="bullet"/>
+      <w:lvlText w:val="o"/>
+      <w:lvlJc w:val="left"/>
+      <w:pPr>
+        <w:ind w:left="2496" w:hanging="360"/>
+      </w:pPr>
+      <w:rPr>
+        <w:rFonts w:ascii="Courier New" w:hAnsi="Courier New" w:cs="Courier New" w:hint="default"/>
+      </w:rPr>
+    </w:lvl>
+    <w:lvl w:ilvl="2" w:tplc="FFFFFFFF" w:tentative="1">
+      <w:start w:val="1"/>
+      <w:numFmt w:val="bullet"/>
+      <w:lvlText w:val=""/>
+      <w:lvlJc w:val="left"/>
+      <w:pPr>
+        <w:ind w:left="3216" w:hanging="360"/>
+      </w:pPr>
+      <w:rPr>
+        <w:rFonts w:ascii="Wingdings" w:hAnsi="Wingdings" w:hint="default"/>
+      </w:rPr>
+    </w:lvl>
+    <w:lvl w:ilvl="3" w:tplc="FFFFFFFF" w:tentative="1">
+      <w:start w:val="1"/>
+      <w:numFmt w:val="bullet"/>
+      <w:lvlText w:val=""/>
+      <w:lvlJc w:val="left"/>
+      <w:pPr>
+        <w:ind w:left="3936" w:hanging="360"/>
+      </w:pPr>
+      <w:rPr>
+        <w:rFonts w:ascii="Symbol" w:hAnsi="Symbol" w:hint="default"/>
+      </w:rPr>
+    </w:lvl>
+    <w:lvl w:ilvl="4" w:tplc="FFFFFFFF" w:tentative="1">
+      <w:start w:val="1"/>
+      <w:numFmt w:val="bullet"/>
+      <w:lvlText w:val="o"/>
+      <w:lvlJc w:val="left"/>
+      <w:pPr>
+        <w:ind w:left="4656" w:hanging="360"/>
+      </w:pPr>
+      <w:rPr>
+        <w:rFonts w:ascii="Courier New" w:hAnsi="Courier New" w:cs="Courier New" w:hint="default"/>
+      </w:rPr>
+    </w:lvl>
+    <w:lvl w:ilvl="5" w:tplc="FFFFFFFF" w:tentative="1">
+      <w:start w:val="1"/>
+      <w:numFmt w:val="bullet"/>
+      <w:lvlText w:val=""/>
+      <w:lvlJc w:val="left"/>
+      <w:pPr>
+        <w:ind w:left="5376" w:hanging="360"/>
+      </w:pPr>
+      <w:rPr>
+        <w:rFonts w:ascii="Wingdings" w:hAnsi="Wingdings" w:hint="default"/>
+      </w:rPr>
+    </w:lvl>
+    <w:lvl w:ilvl="6" w:tplc="FFFFFFFF" w:tentative="1">
+      <w:start w:val="1"/>
+      <w:numFmt w:val="bullet"/>
+      <w:lvlText w:val=""/>
+      <w:lvlJc w:val="left"/>
+      <w:pPr>
+        <w:ind w:left="6096" w:hanging="360"/>
+      </w:pPr>
+      <w:rPr>
+        <w:rFonts w:ascii="Symbol" w:hAnsi="Symbol" w:hint="default"/>
+      </w:rPr>
+    </w:lvl>
+    <w:lvl w:ilvl="7" w:tplc="FFFFFFFF" w:tentative="1">
+      <w:start w:val="1"/>
+      <w:numFmt w:val="bullet"/>
+      <w:lvlText w:val="o"/>
+      <w:lvlJc w:val="left"/>
+      <w:pPr>
+        <w:ind w:left="6816" w:hanging="360"/>
+      </w:pPr>
+      <w:rPr>
+        <w:rFonts w:ascii="Courier New" w:hAnsi="Courier New" w:cs="Courier New" w:hint="default"/>
+      </w:rPr>
+    </w:lvl>
+    <w:lvl w:ilvl="8" w:tplc="FFFFFFFF" w:tentative="1">
+      <w:start w:val="1"/>
+      <w:numFmt w:val="bullet"/>
+      <w:lvlText w:val=""/>
+      <w:lvlJc w:val="left"/>
+      <w:pPr>
+        <w:ind w:left="7536" w:hanging="360"/>
+      </w:pPr>
+      <w:rPr>
+        <w:rFonts w:ascii="Wingdings" w:hAnsi="Wingdings" w:hint="default"/>
+      </w:rPr>
+    </w:lvl>
+  </w:abstractNum>
+  <w:abstractNum w:abstractNumId="7" w15:restartNumberingAfterBreak="0">
     <w:nsid w:val="0892038C"/>
     <w:multiLevelType w:val="hybridMultilevel"/>
     <w:tmpl w:val="AADADA2E"/>
@@ -4629,7 +6946,120 @@
       </w:rPr>
     </w:lvl>
   </w:abstractNum>
-  <w:abstractNum w:abstractNumId="7" w15:restartNumberingAfterBreak="0">
+  <w:abstractNum w:abstractNumId="8" w15:restartNumberingAfterBreak="0">
+    <w:nsid w:val="0B1D780B"/>
+    <w:multiLevelType w:val="hybridMultilevel"/>
+    <w:tmpl w:val="6744F55C"/>
+    <w:lvl w:ilvl="0" w:tplc="04160001">
+      <w:start w:val="1"/>
+      <w:numFmt w:val="bullet"/>
+      <w:lvlText w:val=""/>
+      <w:lvlJc w:val="left"/>
+      <w:pPr>
+        <w:ind w:left="1068" w:hanging="360"/>
+      </w:pPr>
+      <w:rPr>
+        <w:rFonts w:ascii="Symbol" w:hAnsi="Symbol" w:hint="default"/>
+      </w:rPr>
+    </w:lvl>
+    <w:lvl w:ilvl="1" w:tplc="04160003">
+      <w:start w:val="1"/>
+      <w:numFmt w:val="bullet"/>
+      <w:lvlText w:val="o"/>
+      <w:lvlJc w:val="left"/>
+      <w:pPr>
+        <w:ind w:left="1788" w:hanging="360"/>
+      </w:pPr>
+      <w:rPr>
+        <w:rFonts w:ascii="Courier New" w:hAnsi="Courier New" w:cs="Courier New" w:hint="default"/>
+      </w:rPr>
+    </w:lvl>
+    <w:lvl w:ilvl="2" w:tplc="04160005" w:tentative="1">
+      <w:start w:val="1"/>
+      <w:numFmt w:val="bullet"/>
+      <w:lvlText w:val=""/>
+      <w:lvlJc w:val="left"/>
+      <w:pPr>
+        <w:ind w:left="2508" w:hanging="360"/>
+      </w:pPr>
+      <w:rPr>
+        <w:rFonts w:ascii="Wingdings" w:hAnsi="Wingdings" w:hint="default"/>
+      </w:rPr>
+    </w:lvl>
+    <w:lvl w:ilvl="3" w:tplc="04160001" w:tentative="1">
+      <w:start w:val="1"/>
+      <w:numFmt w:val="bullet"/>
+      <w:lvlText w:val=""/>
+      <w:lvlJc w:val="left"/>
+      <w:pPr>
+        <w:ind w:left="3228" w:hanging="360"/>
+      </w:pPr>
+      <w:rPr>
+        <w:rFonts w:ascii="Symbol" w:hAnsi="Symbol" w:hint="default"/>
+      </w:rPr>
+    </w:lvl>
+    <w:lvl w:ilvl="4" w:tplc="04160003" w:tentative="1">
+      <w:start w:val="1"/>
+      <w:numFmt w:val="bullet"/>
+      <w:lvlText w:val="o"/>
+      <w:lvlJc w:val="left"/>
+      <w:pPr>
+        <w:ind w:left="3948" w:hanging="360"/>
+      </w:pPr>
+      <w:rPr>
+        <w:rFonts w:ascii="Courier New" w:hAnsi="Courier New" w:cs="Courier New" w:hint="default"/>
+      </w:rPr>
+    </w:lvl>
+    <w:lvl w:ilvl="5" w:tplc="04160005" w:tentative="1">
+      <w:start w:val="1"/>
+      <w:numFmt w:val="bullet"/>
+      <w:lvlText w:val=""/>
+      <w:lvlJc w:val="left"/>
+      <w:pPr>
+        <w:ind w:left="4668" w:hanging="360"/>
+      </w:pPr>
+      <w:rPr>
+        <w:rFonts w:ascii="Wingdings" w:hAnsi="Wingdings" w:hint="default"/>
+      </w:rPr>
+    </w:lvl>
+    <w:lvl w:ilvl="6" w:tplc="04160001" w:tentative="1">
+      <w:start w:val="1"/>
+      <w:numFmt w:val="bullet"/>
+      <w:lvlText w:val=""/>
+      <w:lvlJc w:val="left"/>
+      <w:pPr>
+        <w:ind w:left="5388" w:hanging="360"/>
+      </w:pPr>
+      <w:rPr>
+        <w:rFonts w:ascii="Symbol" w:hAnsi="Symbol" w:hint="default"/>
+      </w:rPr>
+    </w:lvl>
+    <w:lvl w:ilvl="7" w:tplc="04160003" w:tentative="1">
+      <w:start w:val="1"/>
+      <w:numFmt w:val="bullet"/>
+      <w:lvlText w:val="o"/>
+      <w:lvlJc w:val="left"/>
+      <w:pPr>
+        <w:ind w:left="6108" w:hanging="360"/>
+      </w:pPr>
+      <w:rPr>
+        <w:rFonts w:ascii="Courier New" w:hAnsi="Courier New" w:cs="Courier New" w:hint="default"/>
+      </w:rPr>
+    </w:lvl>
+    <w:lvl w:ilvl="8" w:tplc="04160005" w:tentative="1">
+      <w:start w:val="1"/>
+      <w:numFmt w:val="bullet"/>
+      <w:lvlText w:val=""/>
+      <w:lvlJc w:val="left"/>
+      <w:pPr>
+        <w:ind w:left="6828" w:hanging="360"/>
+      </w:pPr>
+      <w:rPr>
+        <w:rFonts w:ascii="Wingdings" w:hAnsi="Wingdings" w:hint="default"/>
+      </w:rPr>
+    </w:lvl>
+  </w:abstractNum>
+  <w:abstractNum w:abstractNumId="9" w15:restartNumberingAfterBreak="0">
     <w:nsid w:val="0BAB51F5"/>
     <w:multiLevelType w:val="hybridMultilevel"/>
     <w:tmpl w:val="CB7858C0"/>
@@ -4742,7 +7172,7 @@
       </w:rPr>
     </w:lvl>
   </w:abstractNum>
-  <w:abstractNum w:abstractNumId="8" w15:restartNumberingAfterBreak="0">
+  <w:abstractNum w:abstractNumId="10" w15:restartNumberingAfterBreak="0">
     <w:nsid w:val="0D413BB9"/>
     <w:multiLevelType w:val="hybridMultilevel"/>
     <w:tmpl w:val="AD5ADE14"/>
@@ -4855,7 +7285,7 @@
       </w:rPr>
     </w:lvl>
   </w:abstractNum>
-  <w:abstractNum w:abstractNumId="9" w15:restartNumberingAfterBreak="0">
+  <w:abstractNum w:abstractNumId="11" w15:restartNumberingAfterBreak="0">
     <w:nsid w:val="12F86942"/>
     <w:multiLevelType w:val="hybridMultilevel"/>
     <w:tmpl w:val="AFFE58F4"/>
@@ -4968,7 +7398,7 @@
       </w:rPr>
     </w:lvl>
   </w:abstractNum>
-  <w:abstractNum w:abstractNumId="10" w15:restartNumberingAfterBreak="0">
+  <w:abstractNum w:abstractNumId="12" w15:restartNumberingAfterBreak="0">
     <w:nsid w:val="18733470"/>
     <w:multiLevelType w:val="hybridMultilevel"/>
     <w:tmpl w:val="8FF8C14C"/>
@@ -5081,7 +7511,7 @@
       </w:rPr>
     </w:lvl>
   </w:abstractNum>
-  <w:abstractNum w:abstractNumId="11" w15:restartNumberingAfterBreak="0">
+  <w:abstractNum w:abstractNumId="13" w15:restartNumberingAfterBreak="0">
     <w:nsid w:val="199E656B"/>
     <w:multiLevelType w:val="hybridMultilevel"/>
     <w:tmpl w:val="1478BA84"/>
@@ -5194,7 +7624,7 @@
       </w:rPr>
     </w:lvl>
   </w:abstractNum>
-  <w:abstractNum w:abstractNumId="12" w15:restartNumberingAfterBreak="0">
+  <w:abstractNum w:abstractNumId="14" w15:restartNumberingAfterBreak="0">
     <w:nsid w:val="1BE3798F"/>
     <w:multiLevelType w:val="hybridMultilevel"/>
     <w:tmpl w:val="498C011C"/>
@@ -5307,7 +7737,7 @@
       </w:rPr>
     </w:lvl>
   </w:abstractNum>
-  <w:abstractNum w:abstractNumId="13" w15:restartNumberingAfterBreak="0">
+  <w:abstractNum w:abstractNumId="15" w15:restartNumberingAfterBreak="0">
     <w:nsid w:val="24BD2911"/>
     <w:multiLevelType w:val="hybridMultilevel"/>
     <w:tmpl w:val="F320956E"/>
@@ -5420,7 +7850,7 @@
       </w:rPr>
     </w:lvl>
   </w:abstractNum>
-  <w:abstractNum w:abstractNumId="14" w15:restartNumberingAfterBreak="0">
+  <w:abstractNum w:abstractNumId="16" w15:restartNumberingAfterBreak="0">
     <w:nsid w:val="257F3AFD"/>
     <w:multiLevelType w:val="hybridMultilevel"/>
     <w:tmpl w:val="1EC031A0"/>
@@ -5533,7 +7963,7 @@
       </w:rPr>
     </w:lvl>
   </w:abstractNum>
-  <w:abstractNum w:abstractNumId="15" w15:restartNumberingAfterBreak="0">
+  <w:abstractNum w:abstractNumId="17" w15:restartNumberingAfterBreak="0">
     <w:nsid w:val="266A6226"/>
     <w:multiLevelType w:val="hybridMultilevel"/>
     <w:tmpl w:val="56660C70"/>
@@ -5646,7 +8076,7 @@
       </w:rPr>
     </w:lvl>
   </w:abstractNum>
-  <w:abstractNum w:abstractNumId="16" w15:restartNumberingAfterBreak="0">
+  <w:abstractNum w:abstractNumId="18" w15:restartNumberingAfterBreak="0">
     <w:nsid w:val="275E06D3"/>
     <w:multiLevelType w:val="hybridMultilevel"/>
     <w:tmpl w:val="0EDC60C0"/>
@@ -5759,7 +8189,7 @@
       </w:rPr>
     </w:lvl>
   </w:abstractNum>
-  <w:abstractNum w:abstractNumId="17" w15:restartNumberingAfterBreak="0">
+  <w:abstractNum w:abstractNumId="19" w15:restartNumberingAfterBreak="0">
     <w:nsid w:val="29B241C9"/>
     <w:multiLevelType w:val="hybridMultilevel"/>
     <w:tmpl w:val="0968580C"/>
@@ -5872,7 +8302,7 @@
       </w:rPr>
     </w:lvl>
   </w:abstractNum>
-  <w:abstractNum w:abstractNumId="18" w15:restartNumberingAfterBreak="0">
+  <w:abstractNum w:abstractNumId="20" w15:restartNumberingAfterBreak="0">
     <w:nsid w:val="2CE46092"/>
     <w:multiLevelType w:val="hybridMultilevel"/>
     <w:tmpl w:val="39E2E034"/>
@@ -5985,7 +8415,7 @@
       </w:rPr>
     </w:lvl>
   </w:abstractNum>
-  <w:abstractNum w:abstractNumId="19" w15:restartNumberingAfterBreak="0">
+  <w:abstractNum w:abstractNumId="21" w15:restartNumberingAfterBreak="0">
     <w:nsid w:val="2D4852E9"/>
     <w:multiLevelType w:val="hybridMultilevel"/>
     <w:tmpl w:val="D534DECE"/>
@@ -6071,7 +8501,7 @@
       </w:pPr>
     </w:lvl>
   </w:abstractNum>
-  <w:abstractNum w:abstractNumId="20" w15:restartNumberingAfterBreak="0">
+  <w:abstractNum w:abstractNumId="22" w15:restartNumberingAfterBreak="0">
     <w:nsid w:val="306B2EE5"/>
     <w:multiLevelType w:val="hybridMultilevel"/>
     <w:tmpl w:val="F0105A24"/>
@@ -6184,7 +8614,7 @@
       </w:rPr>
     </w:lvl>
   </w:abstractNum>
-  <w:abstractNum w:abstractNumId="21" w15:restartNumberingAfterBreak="0">
+  <w:abstractNum w:abstractNumId="23" w15:restartNumberingAfterBreak="0">
     <w:nsid w:val="363B3C5A"/>
     <w:multiLevelType w:val="hybridMultilevel"/>
     <w:tmpl w:val="16A40D1A"/>
@@ -6297,7 +8727,7 @@
       </w:rPr>
     </w:lvl>
   </w:abstractNum>
-  <w:abstractNum w:abstractNumId="22" w15:restartNumberingAfterBreak="0">
+  <w:abstractNum w:abstractNumId="24" w15:restartNumberingAfterBreak="0">
     <w:nsid w:val="39EA0086"/>
     <w:multiLevelType w:val="multilevel"/>
     <w:tmpl w:val="765C0A0E"/>
@@ -6410,7 +8840,7 @@
       </w:pPr>
     </w:lvl>
   </w:abstractNum>
-  <w:abstractNum w:abstractNumId="23" w15:restartNumberingAfterBreak="0">
+  <w:abstractNum w:abstractNumId="25" w15:restartNumberingAfterBreak="0">
     <w:nsid w:val="3A44790F"/>
     <w:multiLevelType w:val="hybridMultilevel"/>
     <w:tmpl w:val="6A1AC588"/>
@@ -6523,7 +8953,7 @@
       </w:rPr>
     </w:lvl>
   </w:abstractNum>
-  <w:abstractNum w:abstractNumId="24" w15:restartNumberingAfterBreak="0">
+  <w:abstractNum w:abstractNumId="26" w15:restartNumberingAfterBreak="0">
     <w:nsid w:val="3D216CD6"/>
     <w:multiLevelType w:val="hybridMultilevel"/>
     <w:tmpl w:val="2062B20A"/>
@@ -6636,7 +9066,7 @@
       </w:rPr>
     </w:lvl>
   </w:abstractNum>
-  <w:abstractNum w:abstractNumId="25" w15:restartNumberingAfterBreak="0">
+  <w:abstractNum w:abstractNumId="27" w15:restartNumberingAfterBreak="0">
     <w:nsid w:val="435C54D2"/>
     <w:multiLevelType w:val="hybridMultilevel"/>
     <w:tmpl w:val="AC84C2FE"/>
@@ -6724,7 +9154,7 @@
       </w:pPr>
     </w:lvl>
   </w:abstractNum>
-  <w:abstractNum w:abstractNumId="26" w15:restartNumberingAfterBreak="0">
+  <w:abstractNum w:abstractNumId="28" w15:restartNumberingAfterBreak="0">
     <w:nsid w:val="467A7958"/>
     <w:multiLevelType w:val="hybridMultilevel"/>
     <w:tmpl w:val="F98C2DB2"/>
@@ -6837,7 +9267,7 @@
       </w:rPr>
     </w:lvl>
   </w:abstractNum>
-  <w:abstractNum w:abstractNumId="27" w15:restartNumberingAfterBreak="0">
+  <w:abstractNum w:abstractNumId="29" w15:restartNumberingAfterBreak="0">
     <w:nsid w:val="4B8D2BA5"/>
     <w:multiLevelType w:val="hybridMultilevel"/>
     <w:tmpl w:val="33A0FD20"/>
@@ -6950,7 +9380,7 @@
       </w:rPr>
     </w:lvl>
   </w:abstractNum>
-  <w:abstractNum w:abstractNumId="28" w15:restartNumberingAfterBreak="0">
+  <w:abstractNum w:abstractNumId="30" w15:restartNumberingAfterBreak="0">
     <w:nsid w:val="4E491E67"/>
     <w:multiLevelType w:val="hybridMultilevel"/>
     <w:tmpl w:val="65BC7184"/>
@@ -7063,7 +9493,7 @@
       </w:rPr>
     </w:lvl>
   </w:abstractNum>
-  <w:abstractNum w:abstractNumId="29" w15:restartNumberingAfterBreak="0">
+  <w:abstractNum w:abstractNumId="31" w15:restartNumberingAfterBreak="0">
     <w:nsid w:val="572156B3"/>
     <w:multiLevelType w:val="hybridMultilevel"/>
     <w:tmpl w:val="BA2471CE"/>
@@ -7176,7 +9606,93 @@
       </w:rPr>
     </w:lvl>
   </w:abstractNum>
-  <w:abstractNum w:abstractNumId="30" w15:restartNumberingAfterBreak="0">
+  <w:abstractNum w:abstractNumId="32" w15:restartNumberingAfterBreak="0">
+    <w:nsid w:val="59E26DE5"/>
+    <w:multiLevelType w:val="hybridMultilevel"/>
+    <w:tmpl w:val="7AB8865A"/>
+    <w:lvl w:ilvl="0" w:tplc="0416001B">
+      <w:start w:val="1"/>
+      <w:numFmt w:val="lowerRoman"/>
+      <w:lvlText w:val="%1."/>
+      <w:lvlJc w:val="right"/>
+      <w:pPr>
+        <w:ind w:left="1788" w:hanging="360"/>
+      </w:pPr>
+    </w:lvl>
+    <w:lvl w:ilvl="1" w:tplc="04160019" w:tentative="1">
+      <w:start w:val="1"/>
+      <w:numFmt w:val="lowerLetter"/>
+      <w:lvlText w:val="%2."/>
+      <w:lvlJc w:val="left"/>
+      <w:pPr>
+        <w:ind w:left="2508" w:hanging="360"/>
+      </w:pPr>
+    </w:lvl>
+    <w:lvl w:ilvl="2" w:tplc="0416001B" w:tentative="1">
+      <w:start w:val="1"/>
+      <w:numFmt w:val="lowerRoman"/>
+      <w:lvlText w:val="%3."/>
+      <w:lvlJc w:val="right"/>
+      <w:pPr>
+        <w:ind w:left="3228" w:hanging="180"/>
+      </w:pPr>
+    </w:lvl>
+    <w:lvl w:ilvl="3" w:tplc="0416000F" w:tentative="1">
+      <w:start w:val="1"/>
+      <w:numFmt w:val="decimal"/>
+      <w:lvlText w:val="%4."/>
+      <w:lvlJc w:val="left"/>
+      <w:pPr>
+        <w:ind w:left="3948" w:hanging="360"/>
+      </w:pPr>
+    </w:lvl>
+    <w:lvl w:ilvl="4" w:tplc="04160019" w:tentative="1">
+      <w:start w:val="1"/>
+      <w:numFmt w:val="lowerLetter"/>
+      <w:lvlText w:val="%5."/>
+      <w:lvlJc w:val="left"/>
+      <w:pPr>
+        <w:ind w:left="4668" w:hanging="360"/>
+      </w:pPr>
+    </w:lvl>
+    <w:lvl w:ilvl="5" w:tplc="0416001B" w:tentative="1">
+      <w:start w:val="1"/>
+      <w:numFmt w:val="lowerRoman"/>
+      <w:lvlText w:val="%6."/>
+      <w:lvlJc w:val="right"/>
+      <w:pPr>
+        <w:ind w:left="5388" w:hanging="180"/>
+      </w:pPr>
+    </w:lvl>
+    <w:lvl w:ilvl="6" w:tplc="0416000F" w:tentative="1">
+      <w:start w:val="1"/>
+      <w:numFmt w:val="decimal"/>
+      <w:lvlText w:val="%7."/>
+      <w:lvlJc w:val="left"/>
+      <w:pPr>
+        <w:ind w:left="6108" w:hanging="360"/>
+      </w:pPr>
+    </w:lvl>
+    <w:lvl w:ilvl="7" w:tplc="04160019" w:tentative="1">
+      <w:start w:val="1"/>
+      <w:numFmt w:val="lowerLetter"/>
+      <w:lvlText w:val="%8."/>
+      <w:lvlJc w:val="left"/>
+      <w:pPr>
+        <w:ind w:left="6828" w:hanging="360"/>
+      </w:pPr>
+    </w:lvl>
+    <w:lvl w:ilvl="8" w:tplc="0416001B" w:tentative="1">
+      <w:start w:val="1"/>
+      <w:numFmt w:val="lowerRoman"/>
+      <w:lvlText w:val="%9."/>
+      <w:lvlJc w:val="right"/>
+      <w:pPr>
+        <w:ind w:left="7548" w:hanging="180"/>
+      </w:pPr>
+    </w:lvl>
+  </w:abstractNum>
+  <w:abstractNum w:abstractNumId="33" w15:restartNumberingAfterBreak="0">
     <w:nsid w:val="5C1E465F"/>
     <w:multiLevelType w:val="hybridMultilevel"/>
     <w:tmpl w:val="CC70734E"/>
@@ -7289,7 +9805,7 @@
       </w:rPr>
     </w:lvl>
   </w:abstractNum>
-  <w:abstractNum w:abstractNumId="31" w15:restartNumberingAfterBreak="0">
+  <w:abstractNum w:abstractNumId="34" w15:restartNumberingAfterBreak="0">
     <w:nsid w:val="613B7216"/>
     <w:multiLevelType w:val="hybridMultilevel"/>
     <w:tmpl w:val="6C2069C4"/>
@@ -7381,7 +9897,7 @@
       </w:pPr>
     </w:lvl>
   </w:abstractNum>
-  <w:abstractNum w:abstractNumId="32" w15:restartNumberingAfterBreak="0">
+  <w:abstractNum w:abstractNumId="35" w15:restartNumberingAfterBreak="0">
     <w:nsid w:val="61455081"/>
     <w:multiLevelType w:val="hybridMultilevel"/>
     <w:tmpl w:val="C7EA0426"/>
@@ -7491,7 +10007,7 @@
       </w:rPr>
     </w:lvl>
   </w:abstractNum>
-  <w:abstractNum w:abstractNumId="33" w15:restartNumberingAfterBreak="0">
+  <w:abstractNum w:abstractNumId="36" w15:restartNumberingAfterBreak="0">
     <w:nsid w:val="66301293"/>
     <w:multiLevelType w:val="hybridMultilevel"/>
     <w:tmpl w:val="2A7C4AA2"/>
@@ -7604,10 +10120,10 @@
       </w:rPr>
     </w:lvl>
   </w:abstractNum>
-  <w:abstractNum w:abstractNumId="34" w15:restartNumberingAfterBreak="0">
+  <w:abstractNum w:abstractNumId="37" w15:restartNumberingAfterBreak="0">
     <w:nsid w:val="72881E46"/>
     <w:multiLevelType w:val="hybridMultilevel"/>
-    <w:tmpl w:val="49F22FAC"/>
+    <w:tmpl w:val="9FFE752E"/>
     <w:lvl w:ilvl="0" w:tplc="04160001">
       <w:start w:val="1"/>
       <w:numFmt w:val="bullet"/>
@@ -7717,7 +10233,7 @@
       </w:rPr>
     </w:lvl>
   </w:abstractNum>
-  <w:abstractNum w:abstractNumId="35" w15:restartNumberingAfterBreak="0">
+  <w:abstractNum w:abstractNumId="38" w15:restartNumberingAfterBreak="0">
     <w:nsid w:val="739B653B"/>
     <w:multiLevelType w:val="hybridMultilevel"/>
     <w:tmpl w:val="86004430"/>
@@ -7830,7 +10346,7 @@
       </w:rPr>
     </w:lvl>
   </w:abstractNum>
-  <w:abstractNum w:abstractNumId="36" w15:restartNumberingAfterBreak="0">
+  <w:abstractNum w:abstractNumId="39" w15:restartNumberingAfterBreak="0">
     <w:nsid w:val="75C603A4"/>
     <w:multiLevelType w:val="hybridMultilevel"/>
     <w:tmpl w:val="C6E0098E"/>
@@ -7940,7 +10456,156 @@
       </w:rPr>
     </w:lvl>
   </w:abstractNum>
-  <w:abstractNum w:abstractNumId="37" w15:restartNumberingAfterBreak="0">
+  <w:abstractNum w:abstractNumId="40" w15:restartNumberingAfterBreak="0">
+    <w:nsid w:val="76F55A3F"/>
+    <w:multiLevelType w:val="multilevel"/>
+    <w:tmpl w:val="D6425CC6"/>
+    <w:lvl w:ilvl="0">
+      <w:start w:val="1"/>
+      <w:numFmt w:val="bullet"/>
+      <w:lvlText w:val=""/>
+      <w:lvlJc w:val="left"/>
+      <w:pPr>
+        <w:tabs>
+          <w:tab w:val="num" w:pos="720"/>
+        </w:tabs>
+        <w:ind w:left="720" w:hanging="360"/>
+      </w:pPr>
+      <w:rPr>
+        <w:rFonts w:ascii="Symbol" w:hAnsi="Symbol" w:hint="default"/>
+        <w:sz w:val="20"/>
+      </w:rPr>
+    </w:lvl>
+    <w:lvl w:ilvl="1" w:tentative="1">
+      <w:start w:val="1"/>
+      <w:numFmt w:val="bullet"/>
+      <w:lvlText w:val="o"/>
+      <w:lvlJc w:val="left"/>
+      <w:pPr>
+        <w:tabs>
+          <w:tab w:val="num" w:pos="1440"/>
+        </w:tabs>
+        <w:ind w:left="1440" w:hanging="360"/>
+      </w:pPr>
+      <w:rPr>
+        <w:rFonts w:ascii="Courier New" w:hAnsi="Courier New" w:hint="default"/>
+        <w:sz w:val="20"/>
+      </w:rPr>
+    </w:lvl>
+    <w:lvl w:ilvl="2" w:tentative="1">
+      <w:start w:val="1"/>
+      <w:numFmt w:val="bullet"/>
+      <w:lvlText w:val=""/>
+      <w:lvlJc w:val="left"/>
+      <w:pPr>
+        <w:tabs>
+          <w:tab w:val="num" w:pos="2160"/>
+        </w:tabs>
+        <w:ind w:left="2160" w:hanging="360"/>
+      </w:pPr>
+      <w:rPr>
+        <w:rFonts w:ascii="Wingdings" w:hAnsi="Wingdings" w:hint="default"/>
+        <w:sz w:val="20"/>
+      </w:rPr>
+    </w:lvl>
+    <w:lvl w:ilvl="3" w:tentative="1">
+      <w:start w:val="1"/>
+      <w:numFmt w:val="bullet"/>
+      <w:lvlText w:val=""/>
+      <w:lvlJc w:val="left"/>
+      <w:pPr>
+        <w:tabs>
+          <w:tab w:val="num" w:pos="2880"/>
+        </w:tabs>
+        <w:ind w:left="2880" w:hanging="360"/>
+      </w:pPr>
+      <w:rPr>
+        <w:rFonts w:ascii="Wingdings" w:hAnsi="Wingdings" w:hint="default"/>
+        <w:sz w:val="20"/>
+      </w:rPr>
+    </w:lvl>
+    <w:lvl w:ilvl="4" w:tentative="1">
+      <w:start w:val="1"/>
+      <w:numFmt w:val="bullet"/>
+      <w:lvlText w:val=""/>
+      <w:lvlJc w:val="left"/>
+      <w:pPr>
+        <w:tabs>
+          <w:tab w:val="num" w:pos="3600"/>
+        </w:tabs>
+        <w:ind w:left="3600" w:hanging="360"/>
+      </w:pPr>
+      <w:rPr>
+        <w:rFonts w:ascii="Wingdings" w:hAnsi="Wingdings" w:hint="default"/>
+        <w:sz w:val="20"/>
+      </w:rPr>
+    </w:lvl>
+    <w:lvl w:ilvl="5" w:tentative="1">
+      <w:start w:val="1"/>
+      <w:numFmt w:val="bullet"/>
+      <w:lvlText w:val=""/>
+      <w:lvlJc w:val="left"/>
+      <w:pPr>
+        <w:tabs>
+          <w:tab w:val="num" w:pos="4320"/>
+        </w:tabs>
+        <w:ind w:left="4320" w:hanging="360"/>
+      </w:pPr>
+      <w:rPr>
+        <w:rFonts w:ascii="Wingdings" w:hAnsi="Wingdings" w:hint="default"/>
+        <w:sz w:val="20"/>
+      </w:rPr>
+    </w:lvl>
+    <w:lvl w:ilvl="6" w:tentative="1">
+      <w:start w:val="1"/>
+      <w:numFmt w:val="bullet"/>
+      <w:lvlText w:val=""/>
+      <w:lvlJc w:val="left"/>
+      <w:pPr>
+        <w:tabs>
+          <w:tab w:val="num" w:pos="5040"/>
+        </w:tabs>
+        <w:ind w:left="5040" w:hanging="360"/>
+      </w:pPr>
+      <w:rPr>
+        <w:rFonts w:ascii="Wingdings" w:hAnsi="Wingdings" w:hint="default"/>
+        <w:sz w:val="20"/>
+      </w:rPr>
+    </w:lvl>
+    <w:lvl w:ilvl="7" w:tentative="1">
+      <w:start w:val="1"/>
+      <w:numFmt w:val="bullet"/>
+      <w:lvlText w:val=""/>
+      <w:lvlJc w:val="left"/>
+      <w:pPr>
+        <w:tabs>
+          <w:tab w:val="num" w:pos="5760"/>
+        </w:tabs>
+        <w:ind w:left="5760" w:hanging="360"/>
+      </w:pPr>
+      <w:rPr>
+        <w:rFonts w:ascii="Wingdings" w:hAnsi="Wingdings" w:hint="default"/>
+        <w:sz w:val="20"/>
+      </w:rPr>
+    </w:lvl>
+    <w:lvl w:ilvl="8" w:tentative="1">
+      <w:start w:val="1"/>
+      <w:numFmt w:val="bullet"/>
+      <w:lvlText w:val=""/>
+      <w:lvlJc w:val="left"/>
+      <w:pPr>
+        <w:tabs>
+          <w:tab w:val="num" w:pos="6480"/>
+        </w:tabs>
+        <w:ind w:left="6480" w:hanging="360"/>
+      </w:pPr>
+      <w:rPr>
+        <w:rFonts w:ascii="Wingdings" w:hAnsi="Wingdings" w:hint="default"/>
+        <w:sz w:val="20"/>
+      </w:rPr>
+    </w:lvl>
+  </w:abstractNum>
+  <w:abstractNum w:abstractNumId="41" w15:restartNumberingAfterBreak="0">
     <w:nsid w:val="785D5530"/>
     <w:multiLevelType w:val="hybridMultilevel"/>
     <w:tmpl w:val="B5BC727C"/>
@@ -8053,7 +10718,7 @@
       </w:rPr>
     </w:lvl>
   </w:abstractNum>
-  <w:abstractNum w:abstractNumId="38" w15:restartNumberingAfterBreak="0">
+  <w:abstractNum w:abstractNumId="42" w15:restartNumberingAfterBreak="0">
     <w:nsid w:val="78A40A9E"/>
     <w:multiLevelType w:val="hybridMultilevel"/>
     <w:tmpl w:val="1E8C2ABE"/>
@@ -8139,7 +10804,7 @@
       </w:pPr>
     </w:lvl>
   </w:abstractNum>
-  <w:abstractNum w:abstractNumId="39" w15:restartNumberingAfterBreak="0">
+  <w:abstractNum w:abstractNumId="43" w15:restartNumberingAfterBreak="0">
     <w:nsid w:val="7C4F3572"/>
     <w:multiLevelType w:val="hybridMultilevel"/>
     <w:tmpl w:val="10F02A50"/>
@@ -8252,7 +10917,7 @@
       </w:rPr>
     </w:lvl>
   </w:abstractNum>
-  <w:abstractNum w:abstractNumId="40" w15:restartNumberingAfterBreak="0">
+  <w:abstractNum w:abstractNumId="44" w15:restartNumberingAfterBreak="0">
     <w:nsid w:val="7D075251"/>
     <w:multiLevelType w:val="hybridMultilevel"/>
     <w:tmpl w:val="DE3E8316"/>
@@ -8365,7 +11030,7 @@
       </w:rPr>
     </w:lvl>
   </w:abstractNum>
-  <w:abstractNum w:abstractNumId="41" w15:restartNumberingAfterBreak="0">
+  <w:abstractNum w:abstractNumId="45" w15:restartNumberingAfterBreak="0">
     <w:nsid w:val="7FD31BE5"/>
     <w:multiLevelType w:val="hybridMultilevel"/>
     <w:tmpl w:val="A54CCE82"/>
@@ -8479,130 +11144,142 @@
     </w:lvl>
   </w:abstractNum>
   <w:num w:numId="1" w16cid:durableId="231621070">
-    <w:abstractNumId w:val="25"/>
+    <w:abstractNumId w:val="27"/>
   </w:num>
   <w:num w:numId="2" w16cid:durableId="494537868">
-    <w:abstractNumId w:val="10"/>
+    <w:abstractNumId w:val="12"/>
   </w:num>
   <w:num w:numId="3" w16cid:durableId="555967944">
-    <w:abstractNumId w:val="37"/>
+    <w:abstractNumId w:val="41"/>
   </w:num>
   <w:num w:numId="4" w16cid:durableId="975720977">
-    <w:abstractNumId w:val="15"/>
+    <w:abstractNumId w:val="17"/>
   </w:num>
   <w:num w:numId="5" w16cid:durableId="1419063285">
     <w:abstractNumId w:val="2"/>
   </w:num>
   <w:num w:numId="6" w16cid:durableId="1947691180">
-    <w:abstractNumId w:val="31"/>
+    <w:abstractNumId w:val="34"/>
   </w:num>
   <w:num w:numId="7" w16cid:durableId="543980649">
-    <w:abstractNumId w:val="14"/>
+    <w:abstractNumId w:val="16"/>
   </w:num>
   <w:num w:numId="8" w16cid:durableId="523710046">
     <w:abstractNumId w:val="0"/>
   </w:num>
   <w:num w:numId="9" w16cid:durableId="736512136">
-    <w:abstractNumId w:val="29"/>
+    <w:abstractNumId w:val="31"/>
   </w:num>
   <w:num w:numId="10" w16cid:durableId="1832524834">
-    <w:abstractNumId w:val="40"/>
+    <w:abstractNumId w:val="44"/>
   </w:num>
   <w:num w:numId="11" w16cid:durableId="1122117184">
-    <w:abstractNumId w:val="20"/>
+    <w:abstractNumId w:val="22"/>
   </w:num>
   <w:num w:numId="12" w16cid:durableId="2133136465">
-    <w:abstractNumId w:val="9"/>
+    <w:abstractNumId w:val="11"/>
   </w:num>
   <w:num w:numId="13" w16cid:durableId="1067458539">
-    <w:abstractNumId w:val="17"/>
+    <w:abstractNumId w:val="19"/>
   </w:num>
   <w:num w:numId="14" w16cid:durableId="1593928561">
     <w:abstractNumId w:val="3"/>
   </w:num>
   <w:num w:numId="15" w16cid:durableId="1046374455">
+    <w:abstractNumId w:val="36"/>
+  </w:num>
+  <w:num w:numId="16" w16cid:durableId="1399130606">
+    <w:abstractNumId w:val="13"/>
+  </w:num>
+  <w:num w:numId="17" w16cid:durableId="279843836">
     <w:abstractNumId w:val="33"/>
   </w:num>
-  <w:num w:numId="16" w16cid:durableId="1399130606">
-    <w:abstractNumId w:val="11"/>
-  </w:num>
-  <w:num w:numId="17" w16cid:durableId="279843836">
-    <w:abstractNumId w:val="30"/>
-  </w:num>
   <w:num w:numId="18" w16cid:durableId="1173257668">
-    <w:abstractNumId w:val="12"/>
+    <w:abstractNumId w:val="14"/>
   </w:num>
   <w:num w:numId="19" w16cid:durableId="1573469366">
-    <w:abstractNumId w:val="28"/>
+    <w:abstractNumId w:val="30"/>
   </w:num>
   <w:num w:numId="20" w16cid:durableId="1306812659">
     <w:abstractNumId w:val="5"/>
   </w:num>
   <w:num w:numId="21" w16cid:durableId="655647183">
-    <w:abstractNumId w:val="41"/>
+    <w:abstractNumId w:val="45"/>
   </w:num>
   <w:num w:numId="22" w16cid:durableId="915549673">
     <w:abstractNumId w:val="1"/>
   </w:num>
   <w:num w:numId="23" w16cid:durableId="1525512738">
+    <w:abstractNumId w:val="28"/>
+  </w:num>
+  <w:num w:numId="24" w16cid:durableId="2027976820">
+    <w:abstractNumId w:val="29"/>
+  </w:num>
+  <w:num w:numId="25" w16cid:durableId="115225939">
+    <w:abstractNumId w:val="43"/>
+  </w:num>
+  <w:num w:numId="26" w16cid:durableId="1462114911">
+    <w:abstractNumId w:val="38"/>
+  </w:num>
+  <w:num w:numId="27" w16cid:durableId="1454132460">
+    <w:abstractNumId w:val="25"/>
+  </w:num>
+  <w:num w:numId="28" w16cid:durableId="16584153">
+    <w:abstractNumId w:val="24"/>
+  </w:num>
+  <w:num w:numId="29" w16cid:durableId="515537849">
     <w:abstractNumId w:val="26"/>
   </w:num>
-  <w:num w:numId="24" w16cid:durableId="2027976820">
-    <w:abstractNumId w:val="27"/>
+  <w:num w:numId="30" w16cid:durableId="954872968">
+    <w:abstractNumId w:val="10"/>
   </w:num>
-  <w:num w:numId="25" w16cid:durableId="115225939">
+  <w:num w:numId="31" w16cid:durableId="1487283039">
+    <w:abstractNumId w:val="23"/>
+  </w:num>
+  <w:num w:numId="32" w16cid:durableId="1614098087">
+    <w:abstractNumId w:val="9"/>
+  </w:num>
+  <w:num w:numId="33" w16cid:durableId="727531434">
+    <w:abstractNumId w:val="18"/>
+  </w:num>
+  <w:num w:numId="34" w16cid:durableId="734277080">
     <w:abstractNumId w:val="39"/>
   </w:num>
-  <w:num w:numId="26" w16cid:durableId="1462114911">
-    <w:abstractNumId w:val="35"/>
+  <w:num w:numId="35" w16cid:durableId="598677082">
+    <w:abstractNumId w:val="15"/>
   </w:num>
-  <w:num w:numId="27" w16cid:durableId="1454132460">
-    <w:abstractNumId w:val="23"/>
-  </w:num>
-  <w:num w:numId="28" w16cid:durableId="16584153">
-    <w:abstractNumId w:val="22"/>
-  </w:num>
-  <w:num w:numId="29" w16cid:durableId="515537849">
-    <w:abstractNumId w:val="24"/>
-  </w:num>
-  <w:num w:numId="30" w16cid:durableId="954872968">
-    <w:abstractNumId w:val="8"/>
-  </w:num>
-  <w:num w:numId="31" w16cid:durableId="1487283039">
-    <w:abstractNumId w:val="21"/>
-  </w:num>
-  <w:num w:numId="32" w16cid:durableId="1614098087">
+  <w:num w:numId="36" w16cid:durableId="946348536">
     <w:abstractNumId w:val="7"/>
   </w:num>
-  <w:num w:numId="33" w16cid:durableId="727531434">
-    <w:abstractNumId w:val="16"/>
-  </w:num>
-  <w:num w:numId="34" w16cid:durableId="734277080">
-    <w:abstractNumId w:val="36"/>
-  </w:num>
-  <w:num w:numId="35" w16cid:durableId="598677082">
-    <w:abstractNumId w:val="13"/>
-  </w:num>
-  <w:num w:numId="36" w16cid:durableId="946348536">
-    <w:abstractNumId w:val="6"/>
-  </w:num>
   <w:num w:numId="37" w16cid:durableId="503669862">
-    <w:abstractNumId w:val="32"/>
+    <w:abstractNumId w:val="35"/>
   </w:num>
   <w:num w:numId="38" w16cid:durableId="539130844">
     <w:abstractNumId w:val="4"/>
   </w:num>
   <w:num w:numId="39" w16cid:durableId="976566880">
-    <w:abstractNumId w:val="19"/>
+    <w:abstractNumId w:val="21"/>
   </w:num>
   <w:num w:numId="40" w16cid:durableId="1023172698">
-    <w:abstractNumId w:val="18"/>
+    <w:abstractNumId w:val="20"/>
   </w:num>
   <w:num w:numId="41" w16cid:durableId="1073894177">
-    <w:abstractNumId w:val="34"/>
+    <w:abstractNumId w:val="37"/>
   </w:num>
   <w:num w:numId="42" w16cid:durableId="776487993">
-    <w:abstractNumId w:val="38"/>
+    <w:abstractNumId w:val="42"/>
+  </w:num>
+  <w:num w:numId="43" w16cid:durableId="970675162">
+    <w:abstractNumId w:val="8"/>
+  </w:num>
+  <w:num w:numId="44" w16cid:durableId="1987125901">
+    <w:abstractNumId w:val="6"/>
+  </w:num>
+  <w:num w:numId="45" w16cid:durableId="375591668">
+    <w:abstractNumId w:val="32"/>
+  </w:num>
+  <w:num w:numId="46" w16cid:durableId="1354721866">
+    <w:abstractNumId w:val="40"/>
   </w:num>
 </w:numbering>
 </file>

</xml_diff>

<commit_message>
Correções de carregamento de dados - MOBILENET
</commit_message>
<xml_diff>
--- a/Documents and Backups/Estudos Conduzidos.docx
+++ b/Documents and Backups/Estudos Conduzidos.docx
@@ -4762,13 +4762,7 @@
       </w:r>
       <w:proofErr w:type="spellEnd"/>
       <w:r>
-        <w:t xml:space="preserve"> </w:t>
-      </w:r>
-      <w:r>
-        <w:t>tenta</w:t>
-      </w:r>
-      <w:r>
-        <w:t xml:space="preserve"> resolver um problema clássico: a perda de informação e gradiente em redes muito profundas. A proposta da </w:t>
+        <w:t xml:space="preserve"> tenta resolver um problema clássico: a perda de informação e gradiente em redes muito profundas. A proposta da </w:t>
       </w:r>
       <w:proofErr w:type="spellStart"/>
       <w:r>
@@ -5141,13 +5135,7 @@
         <w:t>é</w:t>
       </w:r>
       <w:r>
-        <w:t xml:space="preserve"> composta por:</w:t>
-      </w:r>
-      <w:r>
-        <w:t xml:space="preserve"> </w:t>
-      </w:r>
-      <w:r>
-        <w:t xml:space="preserve">Batch </w:t>
+        <w:t xml:space="preserve"> composta por: Batch </w:t>
       </w:r>
       <w:proofErr w:type="spellStart"/>
       <w:r>
@@ -5163,16 +5151,7 @@
       </w:r>
       <w:proofErr w:type="spellEnd"/>
       <w:r>
-        <w:t xml:space="preserve"> e </w:t>
-      </w:r>
-      <w:r>
-        <w:t>Convolução</w:t>
-      </w:r>
-      <w:r>
-        <w:t xml:space="preserve">. </w:t>
-      </w:r>
-      <w:r>
-        <w:t>No modelo mais eficiente (</w:t>
+        <w:t xml:space="preserve"> e Convolução. No modelo mais eficiente (</w:t>
       </w:r>
       <w:proofErr w:type="spellStart"/>
       <w:r>
@@ -5288,10 +5267,7 @@
       </w:r>
       <w:proofErr w:type="spellEnd"/>
       <w:r>
-        <w:t xml:space="preserve"> 1×1 antes do 3×3 serve para reduzir dimensionalidade e custo computacional, mantendo a eficiência</w:t>
-      </w:r>
-      <w:r>
-        <w:t>.</w:t>
+        <w:t xml:space="preserve"> 1×1 antes do 3×3 serve para reduzir dimensionalidade e custo computacional, mantendo a eficiência.</w:t>
       </w:r>
     </w:p>
     <w:p>
@@ -5352,13 +5328,7 @@
       </w:r>
       <w:proofErr w:type="spellEnd"/>
       <w:r>
-        <w:t xml:space="preserve"> rate (k).</w:t>
-      </w:r>
-      <w:r>
-        <w:t xml:space="preserve"> </w:t>
-      </w:r>
-      <w:r>
-        <w:t>Ele define quantos novos canais cada camada adiciona ao modelo</w:t>
+        <w:t xml:space="preserve"> rate (k). Ele define quantos novos canais cada camada adiciona ao modelo</w:t>
       </w:r>
       <w:r>
         <w:t xml:space="preserve">, dessa forma a rede cresce de forma controlada em que cada camada </w:t>
@@ -5425,10 +5395,7 @@
         <w:t xml:space="preserve">           </w:t>
       </w:r>
       <w:r>
-        <w:t xml:space="preserve">Após 6 camadas, teremos </w:t>
-      </w:r>
-      <w:r>
-        <w:t>64 + (6 × 32) = 256 canais</w:t>
+        <w:t>Após 6 camadas, teremos 64 + (6 × 32) = 256 canais</w:t>
       </w:r>
       <w:r>
         <w:t>.</w:t>
@@ -5619,11 +5586,11 @@
         <w:t>Adicionalmente</w:t>
       </w:r>
       <w:r>
-        <w:t>, a Dense</w:t>
-      </w:r>
-      <w:proofErr w:type="spellStart"/>
-      <w:r>
-        <w:t>Net</w:t>
+        <w:t xml:space="preserve">, a </w:t>
+      </w:r>
+      <w:proofErr w:type="spellStart"/>
+      <w:r>
+        <w:t>DenseNet</w:t>
       </w:r>
       <w:proofErr w:type="spellEnd"/>
       <w:r>
@@ -5724,6 +5691,7 @@
         <w:rPr>
           <w:b/>
           <w:bCs/>
+          <w:noProof/>
         </w:rPr>
         <w:drawing>
           <wp:inline distT="0" distB="0" distL="0" distR="0" wp14:anchorId="012B8EB1" wp14:editId="49C3C67B">
@@ -5939,13 +5907,7 @@
         <w:rPr>
           <w:color w:val="000000" w:themeColor="text1"/>
         </w:rPr>
-        <w:t xml:space="preserve">amadas profundas ainda utilizam features das primeiras </w:t>
-      </w:r>
-      <w:r>
-        <w:rPr>
-          <w:color w:val="000000" w:themeColor="text1"/>
-        </w:rPr>
-        <w:t>camadas.</w:t>
+        <w:t>amadas profundas ainda utilizam features das primeiras camadas.</w:t>
       </w:r>
       <w:r>
         <w:rPr>
@@ -5976,8 +5938,1224 @@
     </w:p>
     <w:p>
       <w:pPr>
+        <w:jc w:val="both"/>
+        <w:rPr>
+          <w:color w:val="000000" w:themeColor="text1"/>
+        </w:rPr>
+      </w:pPr>
+    </w:p>
+    <w:p>
+      <w:pPr>
+        <w:jc w:val="both"/>
+        <w:rPr>
+          <w:color w:val="000000" w:themeColor="text1"/>
+        </w:rPr>
+      </w:pPr>
+    </w:p>
+    <w:p>
+      <w:pPr>
+        <w:jc w:val="both"/>
+        <w:rPr>
+          <w:color w:val="000000" w:themeColor="text1"/>
+        </w:rPr>
+      </w:pPr>
+    </w:p>
+    <w:p>
+      <w:pPr>
         <w:pStyle w:val="PargrafodaLista"/>
         <w:ind w:left="1788"/>
+        <w:jc w:val="both"/>
+        <w:rPr>
+          <w:b/>
+          <w:bCs/>
+          <w:color w:val="00B050"/>
+        </w:rPr>
+      </w:pPr>
+    </w:p>
+    <w:p>
+      <w:pPr>
+        <w:pStyle w:val="PargrafodaLista"/>
+        <w:numPr>
+          <w:ilvl w:val="1"/>
+          <w:numId w:val="1"/>
+        </w:numPr>
+        <w:ind w:left="360"/>
+        <w:jc w:val="both"/>
+        <w:rPr>
+          <w:b/>
+          <w:bCs/>
+          <w:color w:val="00B050"/>
+        </w:rPr>
+      </w:pPr>
+      <w:r>
+        <w:rPr>
+          <w:b/>
+          <w:bCs/>
+          <w:color w:val="00B050"/>
+        </w:rPr>
+        <w:t xml:space="preserve">ESTUDO EXPLORATÓRIO </w:t>
+      </w:r>
+      <w:r>
+        <w:rPr>
+          <w:b/>
+          <w:bCs/>
+          <w:color w:val="00B050"/>
+        </w:rPr>
+        <w:t>6</w:t>
+      </w:r>
+      <w:r>
+        <w:rPr>
+          <w:b/>
+          <w:bCs/>
+          <w:color w:val="00B050"/>
+        </w:rPr>
+        <w:t xml:space="preserve"> – </w:t>
+      </w:r>
+      <w:r>
+        <w:rPr>
+          <w:b/>
+          <w:bCs/>
+          <w:color w:val="00B050"/>
+        </w:rPr>
+        <w:t>CONFIGURAÇÃO DE TREINOS</w:t>
+      </w:r>
+    </w:p>
+    <w:p>
+      <w:pPr>
+        <w:pStyle w:val="PargrafodaLista"/>
+        <w:ind w:left="360"/>
+        <w:jc w:val="both"/>
+        <w:rPr>
+          <w:b/>
+          <w:bCs/>
+          <w:color w:val="00B050"/>
+        </w:rPr>
+      </w:pPr>
+    </w:p>
+    <w:p>
+      <w:pPr>
+        <w:pStyle w:val="PargrafodaLista"/>
+        <w:numPr>
+          <w:ilvl w:val="0"/>
+          <w:numId w:val="43"/>
+        </w:numPr>
+        <w:jc w:val="both"/>
+        <w:rPr>
+          <w:b/>
+          <w:bCs/>
+        </w:rPr>
+      </w:pPr>
+      <w:r>
+        <w:rPr>
+          <w:b/>
+          <w:bCs/>
+        </w:rPr>
+        <w:t>Contexto atual do projeto (ESCOPO)</w:t>
+      </w:r>
+    </w:p>
+    <w:p>
+      <w:pPr>
+        <w:pStyle w:val="PargrafodaLista"/>
+        <w:ind w:left="1068"/>
+        <w:jc w:val="both"/>
+        <w:rPr>
+          <w:b/>
+          <w:bCs/>
+        </w:rPr>
+      </w:pPr>
+    </w:p>
+    <w:p>
+      <w:pPr>
+        <w:pStyle w:val="PargrafodaLista"/>
+        <w:numPr>
+          <w:ilvl w:val="1"/>
+          <w:numId w:val="43"/>
+        </w:numPr>
+        <w:jc w:val="both"/>
+      </w:pPr>
+      <w:proofErr w:type="spellStart"/>
+      <w:r>
+        <w:t>Dataset</w:t>
+      </w:r>
+      <w:proofErr w:type="spellEnd"/>
+      <w:r>
+        <w:t xml:space="preserve"> pequeno (~13k imagens)</w:t>
+      </w:r>
+      <w:r>
+        <w:t>;</w:t>
+      </w:r>
+    </w:p>
+    <w:p>
+      <w:pPr>
+        <w:pStyle w:val="PargrafodaLista"/>
+        <w:numPr>
+          <w:ilvl w:val="1"/>
+          <w:numId w:val="43"/>
+        </w:numPr>
+        <w:jc w:val="both"/>
+      </w:pPr>
+      <w:r>
+        <w:t>Classes bem definidas (MGS → baixa ambiguidade)</w:t>
+      </w:r>
+      <w:r>
+        <w:t>;</w:t>
+      </w:r>
+    </w:p>
+    <w:p>
+      <w:pPr>
+        <w:pStyle w:val="PargrafodaLista"/>
+        <w:numPr>
+          <w:ilvl w:val="1"/>
+          <w:numId w:val="43"/>
+        </w:numPr>
+        <w:jc w:val="both"/>
+      </w:pPr>
+      <w:r>
+        <w:t>ResNet-18 foi o melhor trade-off</w:t>
+      </w:r>
+      <w:r>
+        <w:t>;</w:t>
+      </w:r>
+    </w:p>
+    <w:p>
+      <w:pPr>
+        <w:pStyle w:val="PargrafodaLista"/>
+        <w:numPr>
+          <w:ilvl w:val="1"/>
+          <w:numId w:val="43"/>
+        </w:numPr>
+        <w:jc w:val="both"/>
+      </w:pPr>
+      <w:r>
+        <w:t>Batch menor funcionou melhor (regularização implícita)</w:t>
+      </w:r>
+      <w:r>
+        <w:t>;</w:t>
+      </w:r>
+    </w:p>
+    <w:p>
+      <w:pPr>
+        <w:pStyle w:val="PargrafodaLista"/>
+        <w:numPr>
+          <w:ilvl w:val="1"/>
+          <w:numId w:val="43"/>
+        </w:numPr>
+        <w:jc w:val="both"/>
+      </w:pPr>
+      <w:r>
+        <w:rPr>
+          <w:rFonts w:ascii="Segoe UI Emoji" w:hAnsi="Segoe UI Emoji" w:cs="Segoe UI Emoji"/>
+        </w:rPr>
+        <w:t xml:space="preserve">O </w:t>
+      </w:r>
+      <w:r>
+        <w:t>problema NÃO precisa de alta complexidade de modelo</w:t>
+      </w:r>
+      <w:r>
+        <w:t>.</w:t>
+      </w:r>
+    </w:p>
+    <w:p>
+      <w:pPr>
+        <w:pStyle w:val="PargrafodaLista"/>
+        <w:ind w:left="1068"/>
+        <w:jc w:val="both"/>
+      </w:pPr>
+    </w:p>
+    <w:p>
+      <w:pPr>
+        <w:pStyle w:val="PargrafodaLista"/>
+        <w:numPr>
+          <w:ilvl w:val="0"/>
+          <w:numId w:val="43"/>
+        </w:numPr>
+        <w:jc w:val="both"/>
+      </w:pPr>
+      <w:r>
+        <w:t xml:space="preserve">Não devemos treinar a </w:t>
+      </w:r>
+      <w:proofErr w:type="spellStart"/>
+      <w:r>
+        <w:t>MobileNet</w:t>
+      </w:r>
+      <w:proofErr w:type="spellEnd"/>
+      <w:r>
+        <w:t xml:space="preserve"> da mesma forma que a </w:t>
+      </w:r>
+      <w:proofErr w:type="spellStart"/>
+      <w:r>
+        <w:t>ResNet</w:t>
+      </w:r>
+      <w:proofErr w:type="spellEnd"/>
+      <w:r>
+        <w:t>, visto que ela</w:t>
+      </w:r>
+      <w:r>
+        <w:t xml:space="preserve"> NÃO foi projetada para o mesmo regime de treino</w:t>
+      </w:r>
+      <w:r>
+        <w:t>. (FONTE)</w:t>
+      </w:r>
+    </w:p>
+    <w:p>
+      <w:pPr>
+        <w:pStyle w:val="PargrafodaLista"/>
+        <w:ind w:left="1068"/>
+        <w:jc w:val="both"/>
+      </w:pPr>
+    </w:p>
+    <w:p>
+      <w:pPr>
+        <w:pStyle w:val="PargrafodaLista"/>
+        <w:numPr>
+          <w:ilvl w:val="0"/>
+          <w:numId w:val="43"/>
+        </w:numPr>
+        <w:jc w:val="both"/>
+        <w:rPr>
+          <w:b/>
+          <w:bCs/>
+        </w:rPr>
+      </w:pPr>
+      <w:r>
+        <w:rPr>
+          <w:b/>
+          <w:bCs/>
+        </w:rPr>
+        <w:t xml:space="preserve">Como extrair o máximo da </w:t>
+      </w:r>
+      <w:proofErr w:type="spellStart"/>
+      <w:r>
+        <w:rPr>
+          <w:b/>
+          <w:bCs/>
+        </w:rPr>
+        <w:t>MobileNet</w:t>
+      </w:r>
+      <w:proofErr w:type="spellEnd"/>
+      <w:r>
+        <w:rPr>
+          <w:b/>
+          <w:bCs/>
+        </w:rPr>
+        <w:t>?</w:t>
+      </w:r>
+    </w:p>
+    <w:p>
+      <w:pPr>
+        <w:pStyle w:val="PargrafodaLista"/>
+        <w:rPr>
+          <w:b/>
+          <w:bCs/>
+        </w:rPr>
+      </w:pPr>
+    </w:p>
+    <w:p>
+      <w:pPr>
+        <w:pStyle w:val="PargrafodaLista"/>
+        <w:numPr>
+          <w:ilvl w:val="1"/>
+          <w:numId w:val="43"/>
+        </w:numPr>
+        <w:jc w:val="both"/>
+      </w:pPr>
+      <w:r>
+        <w:t xml:space="preserve">Reduzir a </w:t>
+      </w:r>
+      <w:proofErr w:type="spellStart"/>
+      <w:r>
+        <w:t>MobileNet</w:t>
+      </w:r>
+      <w:proofErr w:type="spellEnd"/>
+      <w:r>
+        <w:t xml:space="preserve"> </w:t>
+      </w:r>
+      <w:r>
+        <w:rPr>
+          <w:rFonts w:cstheme="minorHAnsi"/>
+        </w:rPr>
+        <w:t>→</w:t>
+      </w:r>
+      <w:r>
+        <w:t xml:space="preserve"> A ideia é que a menor profundidade traga melhor generalização;</w:t>
+      </w:r>
+    </w:p>
+    <w:p>
+      <w:pPr>
+        <w:pStyle w:val="PargrafodaLista"/>
+        <w:numPr>
+          <w:ilvl w:val="1"/>
+          <w:numId w:val="43"/>
+        </w:numPr>
+        <w:jc w:val="both"/>
+      </w:pPr>
+      <w:r>
+        <w:t xml:space="preserve">Utilizar a ResNetV1 + Alpha reduzido (0.5) </w:t>
+      </w:r>
+      <w:r>
+        <w:rPr>
+          <w:rFonts w:cstheme="minorHAnsi"/>
+        </w:rPr>
+        <w:t>→</w:t>
+      </w:r>
+      <w:r>
+        <w:rPr>
+          <w:rFonts w:cstheme="minorHAnsi"/>
+        </w:rPr>
+        <w:t xml:space="preserve"> Estratégia amparada pelo artigo original;</w:t>
+      </w:r>
+    </w:p>
+    <w:p>
+      <w:pPr>
+        <w:pStyle w:val="PargrafodaLista"/>
+        <w:numPr>
+          <w:ilvl w:val="1"/>
+          <w:numId w:val="43"/>
+        </w:numPr>
+        <w:jc w:val="both"/>
+      </w:pPr>
+      <w:r>
+        <w:t xml:space="preserve">Diminuição da resolução das imagens 224 </w:t>
+      </w:r>
+      <w:r>
+        <w:rPr>
+          <w:rFonts w:cstheme="minorHAnsi"/>
+        </w:rPr>
+        <w:t>→</w:t>
+      </w:r>
+      <w:r>
+        <w:rPr>
+          <w:rFonts w:cstheme="minorHAnsi"/>
+        </w:rPr>
+        <w:t xml:space="preserve"> 160 ou 128. Dessa forma espera-se reduzir ruídos desnecessários;</w:t>
+      </w:r>
+    </w:p>
+    <w:p>
+      <w:pPr>
+        <w:pStyle w:val="PargrafodaLista"/>
+        <w:numPr>
+          <w:ilvl w:val="1"/>
+          <w:numId w:val="43"/>
+        </w:numPr>
+        <w:jc w:val="both"/>
+      </w:pPr>
+      <w:proofErr w:type="spellStart"/>
+      <w:r>
+        <w:t>Augmentation</w:t>
+      </w:r>
+      <w:proofErr w:type="spellEnd"/>
+      <w:r>
+        <w:t xml:space="preserve"> leve </w:t>
+      </w:r>
+      <w:r>
+        <w:rPr>
+          <w:rFonts w:cstheme="minorHAnsi"/>
+        </w:rPr>
+        <w:t>→</w:t>
+      </w:r>
+      <w:r>
+        <w:t xml:space="preserve"> </w:t>
+      </w:r>
+      <w:proofErr w:type="spellStart"/>
+      <w:proofErr w:type="gramStart"/>
+      <w:r>
+        <w:t>RandomRotation</w:t>
+      </w:r>
+      <w:proofErr w:type="spellEnd"/>
+      <w:r>
+        <w:t>(</w:t>
+      </w:r>
+      <w:proofErr w:type="gramEnd"/>
+      <w:r>
+        <w:t>0.1)</w:t>
+      </w:r>
+      <w:r>
+        <w:t xml:space="preserve">, </w:t>
+      </w:r>
+      <w:proofErr w:type="spellStart"/>
+      <w:proofErr w:type="gramStart"/>
+      <w:r>
+        <w:t>RandomZoom</w:t>
+      </w:r>
+      <w:proofErr w:type="spellEnd"/>
+      <w:r>
+        <w:t>(</w:t>
+      </w:r>
+      <w:proofErr w:type="gramEnd"/>
+      <w:r>
+        <w:t>0.1)</w:t>
+      </w:r>
+      <w:r>
+        <w:t xml:space="preserve">, </w:t>
+      </w:r>
+      <w:proofErr w:type="spellStart"/>
+      <w:proofErr w:type="gramStart"/>
+      <w:r>
+        <w:t>RandomContrast</w:t>
+      </w:r>
+      <w:proofErr w:type="spellEnd"/>
+      <w:r>
+        <w:t>(</w:t>
+      </w:r>
+      <w:proofErr w:type="gramEnd"/>
+      <w:r>
+        <w:t>0.1)</w:t>
+      </w:r>
+      <w:r>
+        <w:t>;</w:t>
+      </w:r>
+    </w:p>
+    <w:p>
+      <w:pPr>
+        <w:pStyle w:val="PargrafodaLista"/>
+        <w:numPr>
+          <w:ilvl w:val="1"/>
+          <w:numId w:val="43"/>
+        </w:numPr>
+        <w:jc w:val="both"/>
+      </w:pPr>
+      <w:r>
+        <w:t>Regularização:</w:t>
+      </w:r>
+    </w:p>
+    <w:p>
+      <w:pPr>
+        <w:pStyle w:val="PargrafodaLista"/>
+        <w:ind w:left="2508"/>
+        <w:jc w:val="both"/>
+      </w:pPr>
+    </w:p>
+    <w:p>
+      <w:pPr>
+        <w:pStyle w:val="PargrafodaLista"/>
+        <w:numPr>
+          <w:ilvl w:val="2"/>
+          <w:numId w:val="43"/>
+        </w:numPr>
+        <w:jc w:val="both"/>
+      </w:pPr>
+      <w:proofErr w:type="spellStart"/>
+      <w:proofErr w:type="gramStart"/>
+      <w:r>
+        <w:t>Dropout</w:t>
+      </w:r>
+      <w:proofErr w:type="spellEnd"/>
+      <w:r>
+        <w:t>(</w:t>
+      </w:r>
+      <w:proofErr w:type="gramEnd"/>
+      <w:r>
+        <w:t>0.3)</w:t>
+      </w:r>
+      <w:r>
+        <w:t xml:space="preserve"> antes da camada final</w:t>
+      </w:r>
+    </w:p>
+    <w:p>
+      <w:pPr>
+        <w:pStyle w:val="PargrafodaLista"/>
+        <w:numPr>
+          <w:ilvl w:val="2"/>
+          <w:numId w:val="43"/>
+        </w:numPr>
+        <w:jc w:val="both"/>
+      </w:pPr>
+      <w:r>
+        <w:t>Simplificação no carregamento de dados (</w:t>
+      </w:r>
+      <w:proofErr w:type="spellStart"/>
+      <w:r>
+        <w:t>DataLoader</w:t>
+      </w:r>
+      <w:proofErr w:type="spellEnd"/>
+      <w:r>
+        <w:t>)</w:t>
+      </w:r>
+    </w:p>
+    <w:p>
+      <w:pPr>
+        <w:pStyle w:val="PargrafodaLista"/>
+        <w:numPr>
+          <w:ilvl w:val="3"/>
+          <w:numId w:val="43"/>
+        </w:numPr>
+        <w:jc w:val="both"/>
+      </w:pPr>
+      <w:r>
+        <w:rPr>
+          <w:b/>
+          <w:bCs/>
+        </w:rPr>
+        <w:t>Justificativa</w:t>
+      </w:r>
+      <w:r>
+        <w:t xml:space="preserve">: </w:t>
+      </w:r>
+      <w:r>
+        <w:rPr>
+          <w:i/>
+          <w:iCs/>
+        </w:rPr>
+        <w:t xml:space="preserve">The original </w:t>
+      </w:r>
+      <w:proofErr w:type="spellStart"/>
+      <w:r>
+        <w:rPr>
+          <w:i/>
+          <w:iCs/>
+        </w:rPr>
+        <w:t>preprocessing</w:t>
+      </w:r>
+      <w:proofErr w:type="spellEnd"/>
+      <w:r>
+        <w:rPr>
+          <w:i/>
+          <w:iCs/>
+        </w:rPr>
+        <w:t xml:space="preserve"> pipeline </w:t>
+      </w:r>
+      <w:proofErr w:type="spellStart"/>
+      <w:r>
+        <w:rPr>
+          <w:i/>
+          <w:iCs/>
+        </w:rPr>
+        <w:t>was</w:t>
+      </w:r>
+      <w:proofErr w:type="spellEnd"/>
+      <w:r>
+        <w:rPr>
+          <w:i/>
+          <w:iCs/>
+        </w:rPr>
+        <w:t xml:space="preserve"> </w:t>
+      </w:r>
+      <w:proofErr w:type="spellStart"/>
+      <w:r>
+        <w:rPr>
+          <w:i/>
+          <w:iCs/>
+        </w:rPr>
+        <w:t>adapted</w:t>
+      </w:r>
+      <w:proofErr w:type="spellEnd"/>
+      <w:r>
+        <w:rPr>
+          <w:i/>
+          <w:iCs/>
+        </w:rPr>
+        <w:t xml:space="preserve"> </w:t>
+      </w:r>
+      <w:proofErr w:type="spellStart"/>
+      <w:r>
+        <w:rPr>
+          <w:i/>
+          <w:iCs/>
+        </w:rPr>
+        <w:t>to</w:t>
+      </w:r>
+      <w:proofErr w:type="spellEnd"/>
+      <w:r>
+        <w:rPr>
+          <w:i/>
+          <w:iCs/>
+        </w:rPr>
+        <w:t xml:space="preserve"> </w:t>
+      </w:r>
+      <w:proofErr w:type="spellStart"/>
+      <w:r>
+        <w:rPr>
+          <w:i/>
+          <w:iCs/>
+        </w:rPr>
+        <w:t>reduce</w:t>
+      </w:r>
+      <w:proofErr w:type="spellEnd"/>
+      <w:r>
+        <w:rPr>
+          <w:i/>
+          <w:iCs/>
+        </w:rPr>
+        <w:t xml:space="preserve"> </w:t>
+      </w:r>
+      <w:proofErr w:type="spellStart"/>
+      <w:r>
+        <w:rPr>
+          <w:i/>
+          <w:iCs/>
+        </w:rPr>
+        <w:t>excessive</w:t>
+      </w:r>
+      <w:proofErr w:type="spellEnd"/>
+      <w:r>
+        <w:rPr>
+          <w:i/>
+          <w:iCs/>
+        </w:rPr>
+        <w:t xml:space="preserve"> </w:t>
+      </w:r>
+      <w:proofErr w:type="spellStart"/>
+      <w:r>
+        <w:rPr>
+          <w:i/>
+          <w:iCs/>
+        </w:rPr>
+        <w:t>spatial</w:t>
+      </w:r>
+      <w:proofErr w:type="spellEnd"/>
+      <w:r>
+        <w:rPr>
+          <w:i/>
+          <w:iCs/>
+        </w:rPr>
+        <w:t xml:space="preserve"> </w:t>
+      </w:r>
+      <w:proofErr w:type="spellStart"/>
+      <w:r>
+        <w:rPr>
+          <w:i/>
+          <w:iCs/>
+        </w:rPr>
+        <w:t>transformations</w:t>
+      </w:r>
+      <w:proofErr w:type="spellEnd"/>
+      <w:r>
+        <w:rPr>
+          <w:i/>
+          <w:iCs/>
+        </w:rPr>
+        <w:t xml:space="preserve">, </w:t>
+      </w:r>
+      <w:proofErr w:type="spellStart"/>
+      <w:r>
+        <w:rPr>
+          <w:i/>
+          <w:iCs/>
+        </w:rPr>
+        <w:t>aiming</w:t>
+      </w:r>
+      <w:proofErr w:type="spellEnd"/>
+      <w:r>
+        <w:rPr>
+          <w:i/>
+          <w:iCs/>
+        </w:rPr>
+        <w:t xml:space="preserve"> </w:t>
+      </w:r>
+      <w:proofErr w:type="spellStart"/>
+      <w:r>
+        <w:rPr>
+          <w:i/>
+          <w:iCs/>
+        </w:rPr>
+        <w:t>to</w:t>
+      </w:r>
+      <w:proofErr w:type="spellEnd"/>
+      <w:r>
+        <w:rPr>
+          <w:i/>
+          <w:iCs/>
+        </w:rPr>
+        <w:t xml:space="preserve"> </w:t>
+      </w:r>
+      <w:proofErr w:type="spellStart"/>
+      <w:r>
+        <w:rPr>
+          <w:i/>
+          <w:iCs/>
+        </w:rPr>
+        <w:t>better</w:t>
+      </w:r>
+      <w:proofErr w:type="spellEnd"/>
+      <w:r>
+        <w:rPr>
+          <w:i/>
+          <w:iCs/>
+        </w:rPr>
+        <w:t xml:space="preserve"> preserve fine-</w:t>
+      </w:r>
+      <w:proofErr w:type="spellStart"/>
+      <w:r>
+        <w:rPr>
+          <w:i/>
+          <w:iCs/>
+        </w:rPr>
+        <w:t>grained</w:t>
+      </w:r>
+      <w:proofErr w:type="spellEnd"/>
+      <w:r>
+        <w:rPr>
+          <w:i/>
+          <w:iCs/>
+        </w:rPr>
+        <w:t xml:space="preserve"> facial features </w:t>
+      </w:r>
+      <w:proofErr w:type="spellStart"/>
+      <w:r>
+        <w:rPr>
+          <w:i/>
+          <w:iCs/>
+        </w:rPr>
+        <w:t>while</w:t>
+      </w:r>
+      <w:proofErr w:type="spellEnd"/>
+      <w:r>
+        <w:rPr>
+          <w:i/>
+          <w:iCs/>
+        </w:rPr>
+        <w:t xml:space="preserve"> </w:t>
+      </w:r>
+      <w:proofErr w:type="spellStart"/>
+      <w:r>
+        <w:rPr>
+          <w:i/>
+          <w:iCs/>
+        </w:rPr>
+        <w:t>maintaining</w:t>
+      </w:r>
+      <w:proofErr w:type="spellEnd"/>
+      <w:r>
+        <w:rPr>
+          <w:i/>
+          <w:iCs/>
+        </w:rPr>
+        <w:t xml:space="preserve"> </w:t>
+      </w:r>
+      <w:proofErr w:type="spellStart"/>
+      <w:r>
+        <w:rPr>
+          <w:i/>
+          <w:iCs/>
+        </w:rPr>
+        <w:t>consistency</w:t>
+      </w:r>
+      <w:proofErr w:type="spellEnd"/>
+      <w:r>
+        <w:rPr>
+          <w:i/>
+          <w:iCs/>
+        </w:rPr>
+        <w:t xml:space="preserve"> </w:t>
+      </w:r>
+      <w:proofErr w:type="spellStart"/>
+      <w:r>
+        <w:rPr>
+          <w:i/>
+          <w:iCs/>
+        </w:rPr>
+        <w:t>with</w:t>
+      </w:r>
+      <w:proofErr w:type="spellEnd"/>
+      <w:r>
+        <w:rPr>
+          <w:i/>
+          <w:iCs/>
+        </w:rPr>
+        <w:t xml:space="preserve"> prior </w:t>
+      </w:r>
+      <w:proofErr w:type="spellStart"/>
+      <w:r>
+        <w:rPr>
+          <w:i/>
+          <w:iCs/>
+        </w:rPr>
+        <w:t>experiments</w:t>
+      </w:r>
+      <w:proofErr w:type="spellEnd"/>
+      <w:r>
+        <w:rPr>
+          <w:i/>
+          <w:iCs/>
+        </w:rPr>
+        <w:t>.</w:t>
+      </w:r>
+    </w:p>
+    <w:p>
+      <w:pPr>
+        <w:pStyle w:val="PargrafodaLista"/>
+        <w:ind w:left="3228"/>
+        <w:jc w:val="both"/>
+      </w:pPr>
+    </w:p>
+    <w:p>
+      <w:pPr>
+        <w:pStyle w:val="PargrafodaLista"/>
+        <w:numPr>
+          <w:ilvl w:val="2"/>
+          <w:numId w:val="43"/>
+        </w:numPr>
+        <w:jc w:val="both"/>
+      </w:pPr>
+      <m:oMath>
+        <m:r>
+          <w:rPr>
+            <w:rFonts w:ascii="Cambria Math" w:hAnsi="Cambria Math"/>
+          </w:rPr>
+          <m:t>kernel_regularizer = tf.keras.regularizers.l2(</m:t>
+        </m:r>
+        <m:r>
+          <w:rPr>
+            <w:rFonts w:ascii="Cambria Math" w:hAnsi="Cambria Math"/>
+          </w:rPr>
+          <m:t>1e-4</m:t>
+        </m:r>
+        <m:r>
+          <w:rPr>
+            <w:rFonts w:ascii="Cambria Math" w:hAnsi="Cambria Math"/>
+          </w:rPr>
+          <m:t>)</m:t>
+        </m:r>
+      </m:oMath>
+    </w:p>
+    <w:p>
+      <w:pPr>
+        <w:pStyle w:val="PargrafodaLista"/>
+        <w:numPr>
+          <w:ilvl w:val="2"/>
+          <w:numId w:val="43"/>
+        </w:numPr>
+        <w:jc w:val="both"/>
+      </w:pPr>
+      <w:r>
+        <w:t xml:space="preserve">Otimizador </w:t>
+      </w:r>
+      <w:r>
+        <w:t xml:space="preserve">Adam com </w:t>
+      </w:r>
+      <m:oMath>
+        <m:r>
+          <w:rPr>
+            <w:rFonts w:ascii="Cambria Math" w:hAnsi="Cambria Math"/>
+          </w:rPr>
+          <m:t>LR = 1e-4</m:t>
+        </m:r>
+      </m:oMath>
+    </w:p>
+    <w:p>
+      <w:pPr>
+        <w:pStyle w:val="PargrafodaLista"/>
+        <w:numPr>
+          <w:ilvl w:val="2"/>
+          <w:numId w:val="43"/>
+        </w:numPr>
+        <w:jc w:val="both"/>
+        <w:rPr>
+          <w:i/>
+          <w:iCs/>
+          <w:color w:val="00B0F0"/>
+        </w:rPr>
+      </w:pPr>
+      <w:r>
+        <w:rPr>
+          <w:color w:val="000000" w:themeColor="text1"/>
+        </w:rPr>
+        <w:t xml:space="preserve">Early </w:t>
+      </w:r>
+      <w:proofErr w:type="spellStart"/>
+      <w:r>
+        <w:rPr>
+          <w:color w:val="000000" w:themeColor="text1"/>
+        </w:rPr>
+        <w:t>Stopping</w:t>
+      </w:r>
+      <w:proofErr w:type="spellEnd"/>
+      <w:r>
+        <w:rPr>
+          <w:color w:val="000000" w:themeColor="text1"/>
+        </w:rPr>
+        <w:t xml:space="preserve"> </w:t>
+      </w:r>
+      <w:r>
+        <w:rPr>
+          <w:rFonts w:cstheme="minorHAnsi"/>
+        </w:rPr>
+        <w:t>→</w:t>
+      </w:r>
+      <w:r>
+        <w:rPr>
+          <w:rFonts w:cstheme="minorHAnsi"/>
+        </w:rPr>
+        <w:t xml:space="preserve"> </w:t>
+      </w:r>
+      <w:proofErr w:type="spellStart"/>
+      <w:proofErr w:type="gramStart"/>
+      <w:r>
+        <w:rPr>
+          <w:i/>
+          <w:iCs/>
+          <w:color w:val="00B0F0"/>
+        </w:rPr>
+        <w:t>EarlyStopping</w:t>
+      </w:r>
+      <w:proofErr w:type="spellEnd"/>
+      <w:r>
+        <w:rPr>
+          <w:i/>
+          <w:iCs/>
+          <w:color w:val="00B0F0"/>
+        </w:rPr>
+        <w:t>(</w:t>
+      </w:r>
+      <w:proofErr w:type="gramEnd"/>
+    </w:p>
+    <w:p>
+      <w:pPr>
+        <w:pStyle w:val="PargrafodaLista"/>
+        <w:ind w:left="4248"/>
+        <w:jc w:val="both"/>
+        <w:rPr>
+          <w:i/>
+          <w:iCs/>
+          <w:color w:val="00B0F0"/>
+        </w:rPr>
+      </w:pPr>
+      <w:r>
+        <w:rPr>
+          <w:i/>
+          <w:iCs/>
+          <w:color w:val="00B0F0"/>
+        </w:rPr>
+        <w:t>monitor="</w:t>
+      </w:r>
+      <w:proofErr w:type="spellStart"/>
+      <w:r>
+        <w:rPr>
+          <w:i/>
+          <w:iCs/>
+          <w:color w:val="00B0F0"/>
+        </w:rPr>
+        <w:t>val_loss</w:t>
+      </w:r>
+      <w:proofErr w:type="spellEnd"/>
+      <w:r>
+        <w:rPr>
+          <w:i/>
+          <w:iCs/>
+          <w:color w:val="00B0F0"/>
+        </w:rPr>
+        <w:t>",</w:t>
+      </w:r>
+    </w:p>
+    <w:p>
+      <w:pPr>
+        <w:pStyle w:val="PargrafodaLista"/>
+        <w:ind w:left="4248"/>
+        <w:jc w:val="both"/>
+        <w:rPr>
+          <w:i/>
+          <w:iCs/>
+          <w:color w:val="00B0F0"/>
+        </w:rPr>
+      </w:pPr>
+      <w:proofErr w:type="spellStart"/>
+      <w:r>
+        <w:rPr>
+          <w:i/>
+          <w:iCs/>
+          <w:color w:val="00B0F0"/>
+        </w:rPr>
+        <w:t>patience</w:t>
+      </w:r>
+      <w:proofErr w:type="spellEnd"/>
+      <w:r>
+        <w:rPr>
+          <w:i/>
+          <w:iCs/>
+          <w:color w:val="00B0F0"/>
+        </w:rPr>
+        <w:t>=20,</w:t>
+      </w:r>
+    </w:p>
+    <w:p>
+      <w:pPr>
+        <w:pStyle w:val="PargrafodaLista"/>
+        <w:ind w:left="4248"/>
+        <w:jc w:val="both"/>
+        <w:rPr>
+          <w:i/>
+          <w:iCs/>
+          <w:color w:val="00B0F0"/>
+        </w:rPr>
+      </w:pPr>
+      <w:proofErr w:type="spellStart"/>
+      <w:r>
+        <w:rPr>
+          <w:i/>
+          <w:iCs/>
+          <w:color w:val="00B0F0"/>
+        </w:rPr>
+        <w:t>restore_best_weights</w:t>
+      </w:r>
+      <w:proofErr w:type="spellEnd"/>
+      <w:r>
+        <w:rPr>
+          <w:i/>
+          <w:iCs/>
+          <w:color w:val="00B0F0"/>
+        </w:rPr>
+        <w:t>=</w:t>
+      </w:r>
+      <w:proofErr w:type="spellStart"/>
+      <w:r>
+        <w:rPr>
+          <w:i/>
+          <w:iCs/>
+          <w:color w:val="00B0F0"/>
+        </w:rPr>
+        <w:t>True</w:t>
+      </w:r>
+      <w:proofErr w:type="spellEnd"/>
+    </w:p>
+    <w:p>
+      <w:pPr>
+        <w:ind w:left="3540"/>
+        <w:jc w:val="both"/>
+        <w:rPr>
+          <w:i/>
+          <w:iCs/>
+          <w:color w:val="00B0F0"/>
+        </w:rPr>
+      </w:pPr>
+      <w:r>
+        <w:rPr>
+          <w:i/>
+          <w:iCs/>
+          <w:color w:val="00B0F0"/>
+        </w:rPr>
+        <w:t xml:space="preserve">           </w:t>
+      </w:r>
+      <w:r>
+        <w:rPr>
+          <w:i/>
+          <w:iCs/>
+          <w:color w:val="00B0F0"/>
+        </w:rPr>
+        <w:t>)</w:t>
+      </w:r>
+    </w:p>
+    <w:p>
+      <w:pPr>
+        <w:pStyle w:val="PargrafodaLista"/>
+        <w:ind w:left="2508"/>
+        <w:jc w:val="both"/>
+      </w:pPr>
+    </w:p>
+    <w:p>
+      <w:pPr>
+        <w:pStyle w:val="PargrafodaLista"/>
+        <w:ind w:left="360"/>
+        <w:jc w:val="both"/>
+        <w:rPr>
+          <w:b/>
+          <w:bCs/>
+          <w:color w:val="00B050"/>
+        </w:rPr>
+      </w:pPr>
+    </w:p>
+    <w:p>
+      <w:pPr>
+        <w:pStyle w:val="PargrafodaLista"/>
+        <w:ind w:left="360"/>
+        <w:jc w:val="both"/>
+        <w:rPr>
+          <w:b/>
+          <w:bCs/>
+          <w:color w:val="00B050"/>
+        </w:rPr>
+      </w:pPr>
+    </w:p>
+    <w:p>
+      <w:pPr>
+        <w:pStyle w:val="PargrafodaLista"/>
+        <w:ind w:left="360"/>
+        <w:jc w:val="both"/>
+        <w:rPr>
+          <w:b/>
+          <w:bCs/>
+          <w:color w:val="00B050"/>
+        </w:rPr>
+      </w:pPr>
+    </w:p>
+    <w:p>
+      <w:pPr>
+        <w:pStyle w:val="PargrafodaLista"/>
+        <w:ind w:left="360"/>
+        <w:jc w:val="both"/>
+        <w:rPr>
+          <w:b/>
+          <w:bCs/>
+          <w:color w:val="00B050"/>
+        </w:rPr>
+      </w:pPr>
+    </w:p>
+    <w:p>
+      <w:pPr>
+        <w:pStyle w:val="PargrafodaLista"/>
+        <w:ind w:left="360"/>
+        <w:jc w:val="both"/>
+        <w:rPr>
+          <w:b/>
+          <w:bCs/>
+          <w:color w:val="00B050"/>
+        </w:rPr>
+      </w:pPr>
+    </w:p>
+    <w:p>
+      <w:pPr>
+        <w:pStyle w:val="PargrafodaLista"/>
+        <w:ind w:left="360"/>
+        <w:jc w:val="both"/>
+        <w:rPr>
+          <w:b/>
+          <w:bCs/>
+          <w:color w:val="00B050"/>
+        </w:rPr>
+      </w:pPr>
+    </w:p>
+    <w:p>
+      <w:pPr>
+        <w:pStyle w:val="PargrafodaLista"/>
+        <w:numPr>
+          <w:ilvl w:val="1"/>
+          <w:numId w:val="1"/>
+        </w:numPr>
+        <w:ind w:left="360"/>
+        <w:jc w:val="both"/>
+        <w:rPr>
+          <w:b/>
+          <w:bCs/>
+          <w:color w:val="00B050"/>
+        </w:rPr>
+      </w:pPr>
+      <w:r>
+        <w:rPr>
+          <w:b/>
+          <w:bCs/>
+          <w:color w:val="00B050"/>
+        </w:rPr>
+        <w:lastRenderedPageBreak/>
+        <w:t>D</w:t>
+      </w:r>
+    </w:p>
+    <w:p>
+      <w:pPr>
+        <w:jc w:val="both"/>
+        <w:rPr>
+          <w:color w:val="000000" w:themeColor="text1"/>
+        </w:rPr>
+      </w:pPr>
+    </w:p>
+    <w:p>
+      <w:pPr>
+        <w:jc w:val="both"/>
+        <w:rPr>
+          <w:color w:val="000000" w:themeColor="text1"/>
+        </w:rPr>
+      </w:pPr>
+    </w:p>
+    <w:p>
+      <w:pPr>
         <w:jc w:val="both"/>
         <w:rPr>
           <w:color w:val="000000" w:themeColor="text1"/>
@@ -6067,7 +7245,7 @@
         <v:path o:extrusionok="f" gradientshapeok="t" o:connecttype="rect"/>
         <o:lock v:ext="edit" aspectratio="t"/>
       </v:shapetype>
-      <v:shape id="_x0000_i1118" type="#_x0000_t75" style="width:693.1pt;height:487.1pt;visibility:visible;mso-wrap-style:square" o:bullet="t">
+      <v:shape id="_x0000_i1079" type="#_x0000_t75" style="width:693pt;height:487pt;visibility:visible;mso-wrap-style:square" o:bullet="t">
         <v:imagedata r:id="rId1" o:title="" croptop="19686f" cropbottom="43833f" cropleft="8606f" cropright="55951f"/>
       </v:shape>
     </w:pict>
@@ -6949,7 +8127,7 @@
   <w:abstractNum w:abstractNumId="8" w15:restartNumberingAfterBreak="0">
     <w:nsid w:val="0B1D780B"/>
     <w:multiLevelType w:val="hybridMultilevel"/>
-    <w:tmpl w:val="6744F55C"/>
+    <w:tmpl w:val="7E2E1334"/>
     <w:lvl w:ilvl="0" w:tplc="04160001">
       <w:start w:val="1"/>
       <w:numFmt w:val="bullet"/>
@@ -6974,7 +8152,7 @@
         <w:rFonts w:ascii="Courier New" w:hAnsi="Courier New" w:cs="Courier New" w:hint="default"/>
       </w:rPr>
     </w:lvl>
-    <w:lvl w:ilvl="2" w:tplc="04160005" w:tentative="1">
+    <w:lvl w:ilvl="2" w:tplc="04160005">
       <w:start w:val="1"/>
       <w:numFmt w:val="bullet"/>
       <w:lvlText w:val=""/>
@@ -6986,7 +8164,7 @@
         <w:rFonts w:ascii="Wingdings" w:hAnsi="Wingdings" w:hint="default"/>
       </w:rPr>
     </w:lvl>
-    <w:lvl w:ilvl="3" w:tplc="04160001" w:tentative="1">
+    <w:lvl w:ilvl="3" w:tplc="04160001">
       <w:start w:val="1"/>
       <w:numFmt w:val="bullet"/>
       <w:lvlText w:val=""/>
@@ -10349,7 +11527,7 @@
   <w:abstractNum w:abstractNumId="39" w15:restartNumberingAfterBreak="0">
     <w:nsid w:val="75C603A4"/>
     <w:multiLevelType w:val="hybridMultilevel"/>
-    <w:tmpl w:val="C6E0098E"/>
+    <w:tmpl w:val="9E6C079A"/>
     <w:lvl w:ilvl="0" w:tplc="04160001">
       <w:start w:val="1"/>
       <w:numFmt w:val="bullet"/>
@@ -12298,6 +13476,16 @@
       </w:tblBorders>
     </w:tblPr>
   </w:style>
+  <w:style w:type="character" w:styleId="TextodoEspaoReservado">
+    <w:name w:val="Placeholder Text"/>
+    <w:basedOn w:val="Fontepargpadro"/>
+    <w:uiPriority w:val="99"/>
+    <w:semiHidden/>
+    <w:rsid w:val="00F33421"/>
+    <w:rPr>
+      <w:color w:val="666666"/>
+    </w:rPr>
+  </w:style>
 </w:styles>
 </file>
 

</xml_diff>

<commit_message>
Otimização da rede - DENSENET
</commit_message>
<xml_diff>
--- a/Documents and Backups/Estudos Conduzidos.docx
+++ b/Documents and Backups/Estudos Conduzidos.docx
@@ -9,64 +9,647 @@
         <w:rPr>
           <w:b/>
           <w:bCs/>
-        </w:rPr>
-      </w:pPr>
-      <w:r>
-        <w:rPr>
-          <w:b/>
-          <w:bCs/>
-        </w:rPr>
-        <w:t>Estudos exploratórios conduzidos para orientar a condução dos próximos experimentos:</w:t>
-      </w:r>
-    </w:p>
-    <w:p>
-      <w:pPr>
-        <w:pStyle w:val="PargrafodaLista"/>
-        <w:jc w:val="both"/>
-        <w:rPr>
-          <w:b/>
-          <w:bCs/>
-        </w:rPr>
-      </w:pPr>
-    </w:p>
-    <w:p>
-      <w:pPr>
-        <w:pStyle w:val="PargrafodaLista"/>
-        <w:numPr>
-          <w:ilvl w:val="1"/>
-          <w:numId w:val="1"/>
-        </w:numPr>
-        <w:ind w:left="360"/>
-        <w:rPr>
-          <w:b/>
-          <w:bCs/>
-          <w:color w:val="00B050"/>
-        </w:rPr>
-      </w:pPr>
-      <w:r>
-        <w:rPr>
-          <w:b/>
-          <w:bCs/>
-          <w:color w:val="00B050"/>
-        </w:rPr>
+          <w:sz w:val="36"/>
+          <w:szCs w:val="36"/>
+        </w:rPr>
+      </w:pPr>
+      <w:r>
+        <w:rPr>
+          <w:b/>
+          <w:bCs/>
+          <w:sz w:val="36"/>
+          <w:szCs w:val="36"/>
+        </w:rPr>
+        <w:t xml:space="preserve">Estudos exploratórios conduzidos para orientar a condução </w:t>
+      </w:r>
+      <w:r>
+        <w:rPr>
+          <w:b/>
+          <w:bCs/>
+          <w:sz w:val="36"/>
+          <w:szCs w:val="36"/>
+        </w:rPr>
+        <w:t xml:space="preserve">dos </w:t>
+      </w:r>
+      <w:r>
+        <w:rPr>
+          <w:b/>
+          <w:bCs/>
+          <w:sz w:val="36"/>
+          <w:szCs w:val="36"/>
+        </w:rPr>
+        <w:t>experimentos:</w:t>
+      </w:r>
+    </w:p>
+    <w:sdt>
+      <w:sdtPr>
+        <w:id w:val="-164017320"/>
+        <w:docPartObj>
+          <w:docPartGallery w:val="Table of Contents"/>
+          <w:docPartUnique/>
+        </w:docPartObj>
+      </w:sdtPr>
+      <w:sdtEndPr>
+        <w:rPr>
+          <w:rFonts w:asciiTheme="minorHAnsi" w:eastAsiaTheme="minorHAnsi" w:hAnsiTheme="minorHAnsi" w:cstheme="minorBidi"/>
+          <w:b/>
+          <w:bCs/>
+          <w:color w:val="auto"/>
+          <w:kern w:val="2"/>
+          <w:sz w:val="22"/>
+          <w:szCs w:val="22"/>
+          <w:lang w:eastAsia="en-US"/>
+          <w14:ligatures w14:val="standardContextual"/>
+        </w:rPr>
+      </w:sdtEndPr>
+      <w:sdtContent>
+        <w:p>
+          <w:pPr>
+            <w:pStyle w:val="CabealhodoSumrio"/>
+          </w:pPr>
+          <w:r>
+            <w:t>Sumário</w:t>
+          </w:r>
+        </w:p>
+        <w:p>
+          <w:pPr>
+            <w:pStyle w:val="Sumrio1"/>
+            <w:tabs>
+              <w:tab w:val="right" w:leader="dot" w:pos="8494"/>
+            </w:tabs>
+            <w:rPr>
+              <w:noProof/>
+            </w:rPr>
+          </w:pPr>
+          <w:r>
+            <w:fldChar w:fldCharType="begin"/>
+          </w:r>
+          <w:r>
+            <w:instrText xml:space="preserve"> TOC \o "1-3" \h \z \u </w:instrText>
+          </w:r>
+          <w:r>
+            <w:fldChar w:fldCharType="separate"/>
+          </w:r>
+          <w:hyperlink w:anchor="_Toc226443798" w:history="1">
+            <w:r>
+              <w:rPr>
+                <w:rStyle w:val="Hyperlink"/>
+                <w:noProof/>
+              </w:rPr>
+              <w:t>ESTUDO EXPLORATÓRIO 1: AVALIAÇÃO DA CONVERSÃO DA BASE DE DADOS PARA TFRECORDS</w:t>
+            </w:r>
+            <w:r>
+              <w:rPr>
+                <w:noProof/>
+                <w:webHidden/>
+              </w:rPr>
+              <w:tab/>
+            </w:r>
+            <w:r>
+              <w:rPr>
+                <w:noProof/>
+                <w:webHidden/>
+              </w:rPr>
+              <w:fldChar w:fldCharType="begin"/>
+            </w:r>
+            <w:r>
+              <w:rPr>
+                <w:noProof/>
+                <w:webHidden/>
+              </w:rPr>
+              <w:instrText xml:space="preserve"> PAGEREF _Toc226443798 \h </w:instrText>
+            </w:r>
+            <w:r>
+              <w:rPr>
+                <w:noProof/>
+                <w:webHidden/>
+              </w:rPr>
+            </w:r>
+            <w:r>
+              <w:rPr>
+                <w:noProof/>
+                <w:webHidden/>
+              </w:rPr>
+              <w:fldChar w:fldCharType="separate"/>
+            </w:r>
+            <w:r>
+              <w:rPr>
+                <w:noProof/>
+                <w:webHidden/>
+              </w:rPr>
+              <w:t>1</w:t>
+            </w:r>
+            <w:r>
+              <w:rPr>
+                <w:noProof/>
+                <w:webHidden/>
+              </w:rPr>
+              <w:fldChar w:fldCharType="end"/>
+            </w:r>
+          </w:hyperlink>
+        </w:p>
+        <w:p>
+          <w:pPr>
+            <w:pStyle w:val="Sumrio1"/>
+            <w:tabs>
+              <w:tab w:val="right" w:leader="dot" w:pos="8494"/>
+            </w:tabs>
+            <w:rPr>
+              <w:noProof/>
+            </w:rPr>
+          </w:pPr>
+          <w:hyperlink w:anchor="_Toc226443799" w:history="1">
+            <w:r>
+              <w:rPr>
+                <w:rStyle w:val="Hyperlink"/>
+                <w:noProof/>
+              </w:rPr>
+              <w:t>ESTUDO EXPLORATÓRIO 2: CONDUÇÃO DE EXPERIMENTOS</w:t>
+            </w:r>
+            <w:r>
+              <w:rPr>
+                <w:noProof/>
+                <w:webHidden/>
+              </w:rPr>
+              <w:tab/>
+            </w:r>
+            <w:r>
+              <w:rPr>
+                <w:noProof/>
+                <w:webHidden/>
+              </w:rPr>
+              <w:fldChar w:fldCharType="begin"/>
+            </w:r>
+            <w:r>
+              <w:rPr>
+                <w:noProof/>
+                <w:webHidden/>
+              </w:rPr>
+              <w:instrText xml:space="preserve"> PAGEREF _Toc226443799 \h </w:instrText>
+            </w:r>
+            <w:r>
+              <w:rPr>
+                <w:noProof/>
+                <w:webHidden/>
+              </w:rPr>
+            </w:r>
+            <w:r>
+              <w:rPr>
+                <w:noProof/>
+                <w:webHidden/>
+              </w:rPr>
+              <w:fldChar w:fldCharType="separate"/>
+            </w:r>
+            <w:r>
+              <w:rPr>
+                <w:noProof/>
+                <w:webHidden/>
+              </w:rPr>
+              <w:t>2</w:t>
+            </w:r>
+            <w:r>
+              <w:rPr>
+                <w:noProof/>
+                <w:webHidden/>
+              </w:rPr>
+              <w:fldChar w:fldCharType="end"/>
+            </w:r>
+          </w:hyperlink>
+        </w:p>
+        <w:p>
+          <w:pPr>
+            <w:pStyle w:val="Sumrio1"/>
+            <w:tabs>
+              <w:tab w:val="right" w:leader="dot" w:pos="8494"/>
+            </w:tabs>
+            <w:rPr>
+              <w:noProof/>
+            </w:rPr>
+          </w:pPr>
+          <w:hyperlink w:anchor="_Toc226443800" w:history="1">
+            <w:r>
+              <w:rPr>
+                <w:rStyle w:val="Hyperlink"/>
+                <w:noProof/>
+              </w:rPr>
+              <w:t>ESTUDO EXPLORATÓRIO 3 – VELOCIDADE DE TREINAMENTO E SATURAÇÃO PREMATURA.</w:t>
+            </w:r>
+            <w:r>
+              <w:rPr>
+                <w:noProof/>
+                <w:webHidden/>
+              </w:rPr>
+              <w:tab/>
+            </w:r>
+            <w:r>
+              <w:rPr>
+                <w:noProof/>
+                <w:webHidden/>
+              </w:rPr>
+              <w:fldChar w:fldCharType="begin"/>
+            </w:r>
+            <w:r>
+              <w:rPr>
+                <w:noProof/>
+                <w:webHidden/>
+              </w:rPr>
+              <w:instrText xml:space="preserve"> PAGEREF _Toc226443800 \h </w:instrText>
+            </w:r>
+            <w:r>
+              <w:rPr>
+                <w:noProof/>
+                <w:webHidden/>
+              </w:rPr>
+            </w:r>
+            <w:r>
+              <w:rPr>
+                <w:noProof/>
+                <w:webHidden/>
+              </w:rPr>
+              <w:fldChar w:fldCharType="separate"/>
+            </w:r>
+            <w:r>
+              <w:rPr>
+                <w:noProof/>
+                <w:webHidden/>
+              </w:rPr>
+              <w:t>4</w:t>
+            </w:r>
+            <w:r>
+              <w:rPr>
+                <w:noProof/>
+                <w:webHidden/>
+              </w:rPr>
+              <w:fldChar w:fldCharType="end"/>
+            </w:r>
+          </w:hyperlink>
+        </w:p>
+        <w:p>
+          <w:pPr>
+            <w:pStyle w:val="Sumrio1"/>
+            <w:tabs>
+              <w:tab w:val="right" w:leader="dot" w:pos="8494"/>
+            </w:tabs>
+            <w:rPr>
+              <w:noProof/>
+            </w:rPr>
+          </w:pPr>
+          <w:hyperlink w:anchor="_Toc226443801" w:history="1">
+            <w:r>
+              <w:rPr>
+                <w:rStyle w:val="Hyperlink"/>
+                <w:noProof/>
+              </w:rPr>
+              <w:t>ESTUDO EXPLORATÓRIO 4 – MOBILENET</w:t>
+            </w:r>
+            <w:r>
+              <w:rPr>
+                <w:noProof/>
+                <w:webHidden/>
+              </w:rPr>
+              <w:tab/>
+            </w:r>
+            <w:r>
+              <w:rPr>
+                <w:noProof/>
+                <w:webHidden/>
+              </w:rPr>
+              <w:fldChar w:fldCharType="begin"/>
+            </w:r>
+            <w:r>
+              <w:rPr>
+                <w:noProof/>
+                <w:webHidden/>
+              </w:rPr>
+              <w:instrText xml:space="preserve"> PAGEREF _Toc226443801 \h </w:instrText>
+            </w:r>
+            <w:r>
+              <w:rPr>
+                <w:noProof/>
+                <w:webHidden/>
+              </w:rPr>
+            </w:r>
+            <w:r>
+              <w:rPr>
+                <w:noProof/>
+                <w:webHidden/>
+              </w:rPr>
+              <w:fldChar w:fldCharType="separate"/>
+            </w:r>
+            <w:r>
+              <w:rPr>
+                <w:noProof/>
+                <w:webHidden/>
+              </w:rPr>
+              <w:t>4</w:t>
+            </w:r>
+            <w:r>
+              <w:rPr>
+                <w:noProof/>
+                <w:webHidden/>
+              </w:rPr>
+              <w:fldChar w:fldCharType="end"/>
+            </w:r>
+          </w:hyperlink>
+        </w:p>
+        <w:p>
+          <w:pPr>
+            <w:pStyle w:val="Sumrio1"/>
+            <w:tabs>
+              <w:tab w:val="right" w:leader="dot" w:pos="8494"/>
+            </w:tabs>
+            <w:rPr>
+              <w:noProof/>
+            </w:rPr>
+          </w:pPr>
+          <w:hyperlink w:anchor="_Toc226443802" w:history="1">
+            <w:r>
+              <w:rPr>
+                <w:rStyle w:val="Hyperlink"/>
+                <w:noProof/>
+              </w:rPr>
+              <w:t>ESTUDO EXPLORATÓRIO 5 – MOBILENET V2</w:t>
+            </w:r>
+            <w:r>
+              <w:rPr>
+                <w:noProof/>
+                <w:webHidden/>
+              </w:rPr>
+              <w:tab/>
+            </w:r>
+            <w:r>
+              <w:rPr>
+                <w:noProof/>
+                <w:webHidden/>
+              </w:rPr>
+              <w:fldChar w:fldCharType="begin"/>
+            </w:r>
+            <w:r>
+              <w:rPr>
+                <w:noProof/>
+                <w:webHidden/>
+              </w:rPr>
+              <w:instrText xml:space="preserve"> PAGEREF _Toc226443802 \h </w:instrText>
+            </w:r>
+            <w:r>
+              <w:rPr>
+                <w:noProof/>
+                <w:webHidden/>
+              </w:rPr>
+            </w:r>
+            <w:r>
+              <w:rPr>
+                <w:noProof/>
+                <w:webHidden/>
+              </w:rPr>
+              <w:fldChar w:fldCharType="separate"/>
+            </w:r>
+            <w:r>
+              <w:rPr>
+                <w:noProof/>
+                <w:webHidden/>
+              </w:rPr>
+              <w:t>6</w:t>
+            </w:r>
+            <w:r>
+              <w:rPr>
+                <w:noProof/>
+                <w:webHidden/>
+              </w:rPr>
+              <w:fldChar w:fldCharType="end"/>
+            </w:r>
+          </w:hyperlink>
+        </w:p>
+        <w:p>
+          <w:pPr>
+            <w:pStyle w:val="Sumrio1"/>
+            <w:tabs>
+              <w:tab w:val="right" w:leader="dot" w:pos="8494"/>
+            </w:tabs>
+            <w:rPr>
+              <w:noProof/>
+            </w:rPr>
+          </w:pPr>
+          <w:hyperlink w:anchor="_Toc226443803" w:history="1">
+            <w:r>
+              <w:rPr>
+                <w:rStyle w:val="Hyperlink"/>
+                <w:noProof/>
+              </w:rPr>
+              <w:t>ESTUDO EXPLORATÓRIO 6 – DENSENET</w:t>
+            </w:r>
+            <w:r>
+              <w:rPr>
+                <w:noProof/>
+                <w:webHidden/>
+              </w:rPr>
+              <w:tab/>
+            </w:r>
+            <w:r>
+              <w:rPr>
+                <w:noProof/>
+                <w:webHidden/>
+              </w:rPr>
+              <w:fldChar w:fldCharType="begin"/>
+            </w:r>
+            <w:r>
+              <w:rPr>
+                <w:noProof/>
+                <w:webHidden/>
+              </w:rPr>
+              <w:instrText xml:space="preserve"> PAGEREF _Toc226443803 \h </w:instrText>
+            </w:r>
+            <w:r>
+              <w:rPr>
+                <w:noProof/>
+                <w:webHidden/>
+              </w:rPr>
+            </w:r>
+            <w:r>
+              <w:rPr>
+                <w:noProof/>
+                <w:webHidden/>
+              </w:rPr>
+              <w:fldChar w:fldCharType="separate"/>
+            </w:r>
+            <w:r>
+              <w:rPr>
+                <w:noProof/>
+                <w:webHidden/>
+              </w:rPr>
+              <w:t>7</w:t>
+            </w:r>
+            <w:r>
+              <w:rPr>
+                <w:noProof/>
+                <w:webHidden/>
+              </w:rPr>
+              <w:fldChar w:fldCharType="end"/>
+            </w:r>
+          </w:hyperlink>
+        </w:p>
+        <w:p>
+          <w:pPr>
+            <w:pStyle w:val="Sumrio1"/>
+            <w:tabs>
+              <w:tab w:val="right" w:leader="dot" w:pos="8494"/>
+            </w:tabs>
+            <w:rPr>
+              <w:noProof/>
+            </w:rPr>
+          </w:pPr>
+          <w:hyperlink w:anchor="_Toc226443804" w:history="1">
+            <w:r>
+              <w:rPr>
+                <w:rStyle w:val="Hyperlink"/>
+                <w:noProof/>
+              </w:rPr>
+              <w:t>ESTUDO EXPLORATÓRIO 7 – CONFIGURAÇÃO OTIMIZADA PARA MOBILENET</w:t>
+            </w:r>
+            <w:r>
+              <w:rPr>
+                <w:noProof/>
+                <w:webHidden/>
+              </w:rPr>
+              <w:tab/>
+            </w:r>
+            <w:r>
+              <w:rPr>
+                <w:noProof/>
+                <w:webHidden/>
+              </w:rPr>
+              <w:fldChar w:fldCharType="begin"/>
+            </w:r>
+            <w:r>
+              <w:rPr>
+                <w:noProof/>
+                <w:webHidden/>
+              </w:rPr>
+              <w:instrText xml:space="preserve"> PAGEREF _Toc226443804 \h </w:instrText>
+            </w:r>
+            <w:r>
+              <w:rPr>
+                <w:noProof/>
+                <w:webHidden/>
+              </w:rPr>
+            </w:r>
+            <w:r>
+              <w:rPr>
+                <w:noProof/>
+                <w:webHidden/>
+              </w:rPr>
+              <w:fldChar w:fldCharType="separate"/>
+            </w:r>
+            <w:r>
+              <w:rPr>
+                <w:noProof/>
+                <w:webHidden/>
+              </w:rPr>
+              <w:t>9</w:t>
+            </w:r>
+            <w:r>
+              <w:rPr>
+                <w:noProof/>
+                <w:webHidden/>
+              </w:rPr>
+              <w:fldChar w:fldCharType="end"/>
+            </w:r>
+          </w:hyperlink>
+        </w:p>
+        <w:p>
+          <w:pPr>
+            <w:pStyle w:val="Sumrio1"/>
+            <w:tabs>
+              <w:tab w:val="right" w:leader="dot" w:pos="8494"/>
+            </w:tabs>
+            <w:rPr>
+              <w:noProof/>
+            </w:rPr>
+          </w:pPr>
+          <w:hyperlink w:anchor="_Toc226443805" w:history="1">
+            <w:r>
+              <w:rPr>
+                <w:rStyle w:val="Hyperlink"/>
+                <w:noProof/>
+              </w:rPr>
+              <w:t>ESTUDO EXPLORATÓRIO 8 – CONFIGURAÇÃO OTIMIZADA PARA DENSENET</w:t>
+            </w:r>
+            <w:r>
+              <w:rPr>
+                <w:noProof/>
+                <w:webHidden/>
+              </w:rPr>
+              <w:tab/>
+            </w:r>
+            <w:r>
+              <w:rPr>
+                <w:noProof/>
+                <w:webHidden/>
+              </w:rPr>
+              <w:fldChar w:fldCharType="begin"/>
+            </w:r>
+            <w:r>
+              <w:rPr>
+                <w:noProof/>
+                <w:webHidden/>
+              </w:rPr>
+              <w:instrText xml:space="preserve"> PAGEREF _Toc226443805 \h </w:instrText>
+            </w:r>
+            <w:r>
+              <w:rPr>
+                <w:noProof/>
+                <w:webHidden/>
+              </w:rPr>
+            </w:r>
+            <w:r>
+              <w:rPr>
+                <w:noProof/>
+                <w:webHidden/>
+              </w:rPr>
+              <w:fldChar w:fldCharType="separate"/>
+            </w:r>
+            <w:r>
+              <w:rPr>
+                <w:noProof/>
+                <w:webHidden/>
+              </w:rPr>
+              <w:t>10</w:t>
+            </w:r>
+            <w:r>
+              <w:rPr>
+                <w:noProof/>
+                <w:webHidden/>
+              </w:rPr>
+              <w:fldChar w:fldCharType="end"/>
+            </w:r>
+          </w:hyperlink>
+        </w:p>
+        <w:p>
+          <w:r>
+            <w:rPr>
+              <w:b/>
+              <w:bCs/>
+            </w:rPr>
+            <w:fldChar w:fldCharType="end"/>
+          </w:r>
+        </w:p>
+      </w:sdtContent>
+    </w:sdt>
+    <w:p>
+      <w:pPr>
+        <w:pStyle w:val="Ttulo1"/>
+      </w:pPr>
+      <w:bookmarkStart w:id="0" w:name="_Toc226443798"/>
+      <w:r>
         <w:t xml:space="preserve">ESTUDO EXPLORATÓRIO 1: </w:t>
       </w:r>
       <w:r>
-        <w:rPr>
-          <w:b/>
-          <w:bCs/>
-          <w:color w:val="00B050"/>
-        </w:rPr>
         <w:t xml:space="preserve">AVALIAÇÃO DA </w:t>
       </w:r>
       <w:r>
-        <w:rPr>
-          <w:b/>
-          <w:bCs/>
-          <w:color w:val="00B050"/>
-        </w:rPr>
-        <w:t>CONVERSÃO DA BASE DE DADOS DOS RATOS PARA TFRECORDS</w:t>
-      </w:r>
+        <w:t>CONVERSÃO DA BASE DE DADOS PARA TFRECORDS</w:t>
+      </w:r>
+      <w:bookmarkEnd w:id="0"/>
     </w:p>
     <w:p>
       <w:pPr>
@@ -246,7 +829,7 @@
                     <pic:cNvPicPr/>
                   </pic:nvPicPr>
                   <pic:blipFill>
-                    <a:blip r:embed="rId7"/>
+                    <a:blip r:embed="rId8"/>
                     <a:stretch>
                       <a:fillRect/>
                     </a:stretch>
@@ -342,6 +925,7 @@
         <w:jc w:val="both"/>
       </w:pPr>
       <w:r>
+        <w:lastRenderedPageBreak/>
         <w:t xml:space="preserve">A figura </w:t>
       </w:r>
       <w:r>
@@ -480,7 +1064,7 @@
                     <pic:cNvPicPr/>
                   </pic:nvPicPr>
                   <pic:blipFill>
-                    <a:blip r:embed="rId8"/>
+                    <a:blip r:embed="rId9"/>
                     <a:stretch>
                       <a:fillRect/>
                     </a:stretch>
@@ -504,6 +1088,13 @@
     <w:p>
       <w:pPr>
         <w:pStyle w:val="PargrafodaLista"/>
+        <w:ind w:left="1080"/>
+        <w:jc w:val="both"/>
+      </w:pPr>
+    </w:p>
+    <w:p>
+      <w:pPr>
+        <w:pStyle w:val="PargrafodaLista"/>
         <w:numPr>
           <w:ilvl w:val="0"/>
           <w:numId w:val="2"/>
@@ -512,7 +1103,6 @@
         <w:jc w:val="both"/>
       </w:pPr>
       <w:r>
-        <w:lastRenderedPageBreak/>
         <w:t xml:space="preserve">Utilizar diretamente as imagens PNG é a abordagem mais simples e comum para </w:t>
       </w:r>
       <w:proofErr w:type="spellStart"/>
@@ -707,7 +1297,7 @@
         <w:ind w:left="1800"/>
         <w:jc w:val="both"/>
       </w:pPr>
-      <w:hyperlink r:id="rId9" w:history="1">
+      <w:hyperlink r:id="rId10" w:history="1">
         <w:r>
           <w:rPr>
             <w:rStyle w:val="Hyperlink"/>
@@ -729,7 +1319,7 @@
         <w:ind w:left="1800"/>
         <w:jc w:val="both"/>
       </w:pPr>
-      <w:hyperlink r:id="rId10" w:history="1">
+      <w:hyperlink r:id="rId11" w:history="1">
         <w:r>
           <w:rPr>
             <w:rStyle w:val="Hyperlink"/>
@@ -751,7 +1341,7 @@
         <w:ind w:left="1800"/>
         <w:jc w:val="both"/>
       </w:pPr>
-      <w:hyperlink r:id="rId11" w:history="1">
+      <w:hyperlink r:id="rId12" w:history="1">
         <w:r>
           <w:rPr>
             <w:rStyle w:val="Hyperlink"/>
@@ -773,7 +1363,7 @@
         <w:ind w:left="1800"/>
         <w:jc w:val="both"/>
       </w:pPr>
-      <w:hyperlink r:id="rId12" w:history="1">
+      <w:hyperlink r:id="rId13" w:history="1">
         <w:r>
           <w:rPr>
             <w:rStyle w:val="Hyperlink"/>
@@ -805,47 +1395,17 @@
     </w:p>
     <w:p>
       <w:pPr>
-        <w:pStyle w:val="PargrafodaLista"/>
-        <w:ind w:left="360"/>
-        <w:jc w:val="both"/>
-        <w:rPr>
-          <w:b/>
-          <w:bCs/>
-          <w:color w:val="00B050"/>
-        </w:rPr>
-      </w:pPr>
-    </w:p>
-    <w:p>
-      <w:pPr>
-        <w:pStyle w:val="PargrafodaLista"/>
-        <w:numPr>
-          <w:ilvl w:val="1"/>
-          <w:numId w:val="1"/>
-        </w:numPr>
-        <w:ind w:left="360"/>
-        <w:jc w:val="both"/>
-        <w:rPr>
-          <w:b/>
-          <w:bCs/>
-          <w:color w:val="00B050"/>
-        </w:rPr>
-      </w:pPr>
-      <w:r>
-        <w:rPr>
-          <w:b/>
-          <w:bCs/>
-          <w:color w:val="00B050"/>
-        </w:rPr>
+        <w:pStyle w:val="Ttulo1"/>
+      </w:pPr>
+      <w:bookmarkStart w:id="1" w:name="_Toc226443799"/>
+      <w:r>
+        <w:lastRenderedPageBreak/>
         <w:t xml:space="preserve">ESTUDO EXPLORATÓRIO 2: </w:t>
       </w:r>
       <w:r>
-        <w:rPr>
-          <w:b/>
-          <w:bCs/>
-          <w:color w:val="00B050"/>
-        </w:rPr>
         <w:t>CONDUÇÃO DE EXPERIMENTOS</w:t>
       </w:r>
+      <w:bookmarkEnd w:id="1"/>
     </w:p>
     <w:p>
       <w:pPr>
@@ -1156,16 +1716,15 @@
         <w:pStyle w:val="PargrafodaLista"/>
         <w:ind w:left="1044"/>
       </w:pPr>
-      <w:bookmarkStart w:id="0" w:name="_Hlk220661474"/>
-      <w:r>
-        <w:lastRenderedPageBreak/>
+      <w:bookmarkStart w:id="2" w:name="_Hlk220661474"/>
+      <w:r>
         <w:t>STEP</w:t>
       </w:r>
       <w:r>
         <w:t>_PER_EPOCH = 500~1000 (também limitado dependendo do tamanho da base de dados)</w:t>
       </w:r>
     </w:p>
-    <w:bookmarkEnd w:id="0"/>
+    <w:bookmarkEnd w:id="2"/>
     <w:p>
       <w:pPr>
         <w:pStyle w:val="PargrafodaLista"/>
@@ -1247,7 +1806,7 @@
           <w:bCs/>
         </w:rPr>
       </w:pPr>
-      <w:bookmarkStart w:id="1" w:name="_Hlk220661535"/>
+      <w:bookmarkStart w:id="3" w:name="_Hlk220661535"/>
       <w:r>
         <w:rPr>
           <w:b/>
@@ -1300,7 +1859,7 @@
         </w:rPr>
         <w:t>TOTAL_STEPS = EPOCHS * STEP_PER_EPOCH</w:t>
       </w:r>
-      <w:bookmarkEnd w:id="1"/>
+      <w:bookmarkEnd w:id="3"/>
     </w:p>
     <w:p>
       <w:pPr>
@@ -1438,6 +1997,16 @@
     </w:p>
     <w:p>
       <w:pPr>
+        <w:jc w:val="both"/>
+      </w:pPr>
+    </w:p>
+    <w:p>
+      <w:pPr>
+        <w:jc w:val="both"/>
+      </w:pPr>
+    </w:p>
+    <w:p>
+      <w:pPr>
         <w:pStyle w:val="PargrafodaLista"/>
         <w:numPr>
           <w:ilvl w:val="1"/>
@@ -1447,6 +2016,7 @@
         <w:jc w:val="both"/>
       </w:pPr>
       <w:r>
+        <w:lastRenderedPageBreak/>
         <w:t>Steps são mais utilizados em caso de streaming de dados, onde não há uma quantidade limite de dados que posso definir o seu final. Com tais conceitos podemos definir:</w:t>
       </w:r>
     </w:p>
@@ -1549,43 +2119,19 @@
     <w:p/>
     <w:p>
       <w:pPr>
-        <w:pStyle w:val="PargrafodaLista"/>
-        <w:numPr>
-          <w:ilvl w:val="1"/>
-          <w:numId w:val="1"/>
-        </w:numPr>
-        <w:ind w:left="360"/>
-        <w:jc w:val="both"/>
-        <w:rPr>
-          <w:b/>
-          <w:bCs/>
-          <w:color w:val="00B050"/>
-        </w:rPr>
-      </w:pPr>
-      <w:r>
-        <w:rPr>
-          <w:b/>
-          <w:bCs/>
-          <w:color w:val="00B050"/>
-        </w:rPr>
+        <w:pStyle w:val="Ttulo1"/>
+      </w:pPr>
+      <w:bookmarkStart w:id="4" w:name="_Toc226443800"/>
+      <w:r>
         <w:t xml:space="preserve">ESTUDO EXPLORATÓRIO 3 – </w:t>
       </w:r>
       <w:r>
-        <w:rPr>
-          <w:b/>
-          <w:bCs/>
-          <w:color w:val="00B050"/>
-        </w:rPr>
         <w:t>VELOCIDADE DE TREINAMENTO E SATURAÇÃO PREMATURA</w:t>
       </w:r>
       <w:r>
-        <w:rPr>
-          <w:b/>
-          <w:bCs/>
-          <w:color w:val="00B050"/>
-        </w:rPr>
         <w:t>.</w:t>
       </w:r>
+      <w:bookmarkEnd w:id="4"/>
     </w:p>
     <w:p>
       <w:pPr>
@@ -1800,38 +2346,18 @@
         <w:t xml:space="preserve"> funcional e gradiente estável. </w:t>
       </w:r>
     </w:p>
-    <w:p/>
-    <w:p>
-      <w:pPr>
-        <w:pStyle w:val="PargrafodaLista"/>
-        <w:numPr>
-          <w:ilvl w:val="1"/>
-          <w:numId w:val="1"/>
-        </w:numPr>
-        <w:ind w:left="360"/>
-        <w:jc w:val="both"/>
-        <w:rPr>
-          <w:b/>
-          <w:bCs/>
-          <w:color w:val="00B050"/>
-        </w:rPr>
-      </w:pPr>
-      <w:r>
-        <w:rPr>
-          <w:b/>
-          <w:bCs/>
-          <w:color w:val="00B050"/>
-        </w:rPr>
+    <w:p>
+      <w:pPr>
+        <w:pStyle w:val="Ttulo1"/>
+      </w:pPr>
+      <w:bookmarkStart w:id="5" w:name="_Toc226443801"/>
+      <w:r>
         <w:t xml:space="preserve">ESTUDO EXPLORATÓRIO 4 – </w:t>
       </w:r>
       <w:r>
-        <w:rPr>
-          <w:b/>
-          <w:bCs/>
-          <w:color w:val="00B050"/>
-        </w:rPr>
         <w:t>MOBILENET</w:t>
       </w:r>
+      <w:bookmarkEnd w:id="5"/>
     </w:p>
     <w:p>
       <w:pPr>
@@ -1839,7 +2365,6 @@
         <w:jc w:val="both"/>
       </w:pPr>
       <w:r>
-        <w:lastRenderedPageBreak/>
         <w:t>A arquitetura parte de um problema muito claro: redes convolucionais tradicionais são pesadas demais para aplicações em tempo real ou dispositivos com pouca capacidade (como celulares ou sistemas embarcados).</w:t>
       </w:r>
     </w:p>
@@ -1942,6 +2467,36 @@
     </w:p>
     <w:p>
       <w:pPr>
+        <w:ind w:left="360" w:firstLine="348"/>
+        <w:jc w:val="both"/>
+      </w:pPr>
+    </w:p>
+    <w:p>
+      <w:pPr>
+        <w:ind w:left="360" w:firstLine="348"/>
+        <w:jc w:val="both"/>
+      </w:pPr>
+    </w:p>
+    <w:p>
+      <w:pPr>
+        <w:ind w:left="360" w:firstLine="348"/>
+        <w:jc w:val="both"/>
+      </w:pPr>
+    </w:p>
+    <w:p>
+      <w:pPr>
+        <w:ind w:left="360" w:firstLine="348"/>
+        <w:jc w:val="both"/>
+      </w:pPr>
+    </w:p>
+    <w:p>
+      <w:pPr>
+        <w:ind w:left="360" w:firstLine="348"/>
+        <w:jc w:val="both"/>
+      </w:pPr>
+    </w:p>
+    <w:p>
+      <w:pPr>
         <w:pStyle w:val="PargrafodaLista"/>
         <w:ind w:firstLine="684"/>
         <w:jc w:val="center"/>
@@ -1951,6 +2506,7 @@
           <w:sz w:val="18"/>
           <w:szCs w:val="18"/>
         </w:rPr>
+        <w:lastRenderedPageBreak/>
         <w:t>Figura</w:t>
       </w:r>
       <w:r>
@@ -2027,7 +2583,7 @@
                     </pic:cNvPicPr>
                   </pic:nvPicPr>
                   <pic:blipFill>
-                    <a:blip r:embed="rId13">
+                    <a:blip r:embed="rId14">
                       <a:extLst>
                         <a:ext uri="{28A0092B-C50C-407E-A947-70E740481C1C}">
                           <a14:useLocalDpi xmlns:a14="http://schemas.microsoft.com/office/drawing/2010/main" val="0"/>
@@ -2450,39 +3006,6 @@
     <w:p>
       <w:pPr>
         <w:pStyle w:val="PargrafodaLista"/>
-        <w:ind w:left="2124"/>
-        <w:jc w:val="both"/>
-        <w:rPr>
-          <w:b/>
-          <w:bCs/>
-        </w:rPr>
-      </w:pPr>
-    </w:p>
-    <w:p>
-      <w:pPr>
-        <w:pStyle w:val="PargrafodaLista"/>
-        <w:ind w:left="2124"/>
-        <w:jc w:val="both"/>
-        <w:rPr>
-          <w:b/>
-          <w:bCs/>
-        </w:rPr>
-      </w:pPr>
-    </w:p>
-    <w:p>
-      <w:pPr>
-        <w:pStyle w:val="PargrafodaLista"/>
-        <w:ind w:left="2124"/>
-        <w:jc w:val="both"/>
-        <w:rPr>
-          <w:b/>
-          <w:bCs/>
-        </w:rPr>
-      </w:pPr>
-    </w:p>
-    <w:p>
-      <w:pPr>
-        <w:pStyle w:val="PargrafodaLista"/>
         <w:numPr>
           <w:ilvl w:val="0"/>
           <w:numId w:val="35"/>
@@ -2677,6 +3200,41 @@
     <w:p>
       <w:pPr>
         <w:pStyle w:val="PargrafodaLista"/>
+        <w:ind w:left="1788"/>
+        <w:jc w:val="both"/>
+      </w:pPr>
+    </w:p>
+    <w:p>
+      <w:pPr>
+        <w:pStyle w:val="PargrafodaLista"/>
+        <w:ind w:left="1788"/>
+        <w:jc w:val="both"/>
+      </w:pPr>
+    </w:p>
+    <w:p>
+      <w:pPr>
+        <w:pStyle w:val="PargrafodaLista"/>
+        <w:ind w:left="1788"/>
+        <w:jc w:val="both"/>
+      </w:pPr>
+    </w:p>
+    <w:p>
+      <w:pPr>
+        <w:pStyle w:val="PargrafodaLista"/>
+        <w:ind w:left="1788"/>
+        <w:jc w:val="both"/>
+      </w:pPr>
+    </w:p>
+    <w:p>
+      <w:pPr>
+        <w:pStyle w:val="PargrafodaLista"/>
+        <w:ind w:left="1788"/>
+        <w:jc w:val="both"/>
+      </w:pPr>
+    </w:p>
+    <w:p>
+      <w:pPr>
+        <w:pStyle w:val="PargrafodaLista"/>
         <w:numPr>
           <w:ilvl w:val="0"/>
           <w:numId w:val="35"/>
@@ -2692,6 +3250,7 @@
           <w:b/>
           <w:bCs/>
         </w:rPr>
+        <w:lastRenderedPageBreak/>
         <w:t>Estrutura da arquitetura</w:t>
       </w:r>
       <w:r>
@@ -3058,56 +3617,16 @@
     </w:p>
     <w:p>
       <w:pPr>
-        <w:pStyle w:val="PargrafodaLista"/>
-        <w:rPr>
-          <w:b/>
-          <w:bCs/>
-        </w:rPr>
-      </w:pPr>
-    </w:p>
-    <w:p>
-      <w:pPr>
-        <w:pStyle w:val="PargrafodaLista"/>
-        <w:ind w:left="1788"/>
-        <w:jc w:val="both"/>
-        <w:rPr>
-          <w:b/>
-          <w:bCs/>
-          <w:color w:val="00B050"/>
-        </w:rPr>
-      </w:pPr>
-    </w:p>
-    <w:p>
-      <w:pPr>
-        <w:pStyle w:val="PargrafodaLista"/>
-        <w:numPr>
-          <w:ilvl w:val="1"/>
-          <w:numId w:val="1"/>
-        </w:numPr>
-        <w:ind w:left="360"/>
-        <w:jc w:val="both"/>
-        <w:rPr>
-          <w:b/>
-          <w:bCs/>
-          <w:color w:val="00B050"/>
-        </w:rPr>
-      </w:pPr>
-      <w:r>
-        <w:rPr>
-          <w:b/>
-          <w:bCs/>
-          <w:color w:val="00B050"/>
-        </w:rPr>
+        <w:pStyle w:val="Ttulo1"/>
+      </w:pPr>
+      <w:bookmarkStart w:id="6" w:name="_Toc226443802"/>
+      <w:r>
         <w:t xml:space="preserve">ESTUDO EXPLORATÓRIO 5 – </w:t>
       </w:r>
       <w:r>
-        <w:rPr>
-          <w:b/>
-          <w:bCs/>
-          <w:color w:val="00B050"/>
-        </w:rPr>
         <w:t>MOBILENET V2</w:t>
       </w:r>
+      <w:bookmarkEnd w:id="6"/>
     </w:p>
     <w:p>
       <w:pPr>
@@ -3433,7 +3952,6 @@
         <w:rPr>
           <w:color w:val="000000" w:themeColor="text1"/>
         </w:rPr>
-        <w:lastRenderedPageBreak/>
         <w:t xml:space="preserve">A </w:t>
       </w:r>
       <w:proofErr w:type="spellStart"/>
@@ -3612,6 +4130,7 @@
         <w:rPr>
           <w:color w:val="000000" w:themeColor="text1"/>
         </w:rPr>
+        <w:lastRenderedPageBreak/>
         <w:t>O</w:t>
       </w:r>
       <w:r>
@@ -4590,155 +5109,151 @@
           <w:bCs/>
           <w:color w:val="000000" w:themeColor="text1"/>
         </w:rPr>
+        <w:t xml:space="preserve">OBSERVAÇÃO: </w:t>
+      </w:r>
+      <w:r>
+        <w:rPr>
+          <w:color w:val="000000" w:themeColor="text1"/>
+        </w:rPr>
+        <w:t>Na p</w:t>
+      </w:r>
+      <w:r>
+        <w:rPr>
+          <w:color w:val="000000" w:themeColor="text1"/>
+        </w:rPr>
+        <w:t>rimeira camada</w:t>
+      </w:r>
+      <w:r>
+        <w:rPr>
+          <w:color w:val="000000" w:themeColor="text1"/>
+        </w:rPr>
+        <w:t xml:space="preserve"> é aplicada uma</w:t>
+      </w:r>
+      <w:r>
+        <w:rPr>
+          <w:color w:val="000000" w:themeColor="text1"/>
+        </w:rPr>
+        <w:t xml:space="preserve"> convolução padrão (como na V1)</w:t>
+      </w:r>
+      <w:r>
+        <w:rPr>
+          <w:color w:val="000000" w:themeColor="text1"/>
+        </w:rPr>
+        <w:t xml:space="preserve"> e as últimas camadas são compostas por </w:t>
+      </w:r>
+      <w:proofErr w:type="spellStart"/>
+      <w:r>
+        <w:rPr>
+          <w:color w:val="000000" w:themeColor="text1"/>
+        </w:rPr>
+        <w:t>Conv</w:t>
+      </w:r>
+      <w:proofErr w:type="spellEnd"/>
+      <w:r>
+        <w:rPr>
+          <w:color w:val="000000" w:themeColor="text1"/>
+        </w:rPr>
+        <w:t xml:space="preserve"> 1x1</w:t>
+      </w:r>
+      <w:r>
+        <w:rPr>
+          <w:color w:val="000000" w:themeColor="text1"/>
+        </w:rPr>
+        <w:t xml:space="preserve">, </w:t>
+      </w:r>
+      <w:r>
+        <w:rPr>
+          <w:color w:val="000000" w:themeColor="text1"/>
+        </w:rPr>
+        <w:t xml:space="preserve">Global </w:t>
+      </w:r>
+      <w:proofErr w:type="spellStart"/>
+      <w:r>
+        <w:rPr>
+          <w:color w:val="000000" w:themeColor="text1"/>
+        </w:rPr>
+        <w:t>Average</w:t>
+      </w:r>
+      <w:proofErr w:type="spellEnd"/>
+      <w:r>
+        <w:rPr>
+          <w:color w:val="000000" w:themeColor="text1"/>
+        </w:rPr>
+        <w:t xml:space="preserve"> </w:t>
+      </w:r>
+      <w:proofErr w:type="spellStart"/>
+      <w:r>
+        <w:rPr>
+          <w:color w:val="000000" w:themeColor="text1"/>
+        </w:rPr>
+        <w:t>Pooling</w:t>
+      </w:r>
+      <w:proofErr w:type="spellEnd"/>
+      <w:r>
+        <w:rPr>
+          <w:color w:val="000000" w:themeColor="text1"/>
+        </w:rPr>
+        <w:t xml:space="preserve"> e </w:t>
+      </w:r>
+      <w:r>
+        <w:rPr>
+          <w:color w:val="000000" w:themeColor="text1"/>
+        </w:rPr>
+        <w:t>Classificador</w:t>
+      </w:r>
+      <w:r>
+        <w:rPr>
+          <w:color w:val="000000" w:themeColor="text1"/>
+        </w:rPr>
+        <w:t>, tal qual na V1.</w:t>
+      </w:r>
+    </w:p>
+    <w:p>
+      <w:pPr>
+        <w:pStyle w:val="PargrafodaLista"/>
+        <w:ind w:left="1788"/>
+        <w:jc w:val="both"/>
+        <w:rPr>
+          <w:color w:val="000000" w:themeColor="text1"/>
+        </w:rPr>
+      </w:pPr>
+    </w:p>
+    <w:p>
+      <w:pPr>
+        <w:pStyle w:val="PargrafodaLista"/>
+        <w:ind w:left="1788"/>
+        <w:jc w:val="both"/>
+        <w:rPr>
+          <w:color w:val="000000" w:themeColor="text1"/>
+        </w:rPr>
+      </w:pPr>
+    </w:p>
+    <w:p>
+      <w:pPr>
+        <w:pStyle w:val="PargrafodaLista"/>
+        <w:ind w:left="1788"/>
+        <w:jc w:val="both"/>
+        <w:rPr>
+          <w:color w:val="000000" w:themeColor="text1"/>
+        </w:rPr>
+      </w:pPr>
+    </w:p>
+    <w:p>
+      <w:pPr>
+        <w:pStyle w:val="Ttulo1"/>
+      </w:pPr>
+      <w:bookmarkStart w:id="7" w:name="_Toc226443803"/>
+      <w:r>
         <w:lastRenderedPageBreak/>
-        <w:t xml:space="preserve">OBSERVAÇÃO: </w:t>
-      </w:r>
-      <w:r>
-        <w:rPr>
-          <w:color w:val="000000" w:themeColor="text1"/>
-        </w:rPr>
-        <w:t>Na p</w:t>
-      </w:r>
-      <w:r>
-        <w:rPr>
-          <w:color w:val="000000" w:themeColor="text1"/>
-        </w:rPr>
-        <w:t>rimeira camada</w:t>
-      </w:r>
-      <w:r>
-        <w:rPr>
-          <w:color w:val="000000" w:themeColor="text1"/>
-        </w:rPr>
-        <w:t xml:space="preserve"> é aplicada uma</w:t>
-      </w:r>
-      <w:r>
-        <w:rPr>
-          <w:color w:val="000000" w:themeColor="text1"/>
-        </w:rPr>
-        <w:t xml:space="preserve"> convolução padrão (como na V1)</w:t>
-      </w:r>
-      <w:r>
-        <w:rPr>
-          <w:color w:val="000000" w:themeColor="text1"/>
-        </w:rPr>
-        <w:t xml:space="preserve"> e as últimas camadas são compostas por </w:t>
-      </w:r>
-      <w:proofErr w:type="spellStart"/>
-      <w:r>
-        <w:rPr>
-          <w:color w:val="000000" w:themeColor="text1"/>
-        </w:rPr>
-        <w:t>Conv</w:t>
-      </w:r>
-      <w:proofErr w:type="spellEnd"/>
-      <w:r>
-        <w:rPr>
-          <w:color w:val="000000" w:themeColor="text1"/>
-        </w:rPr>
-        <w:t xml:space="preserve"> 1x1</w:t>
-      </w:r>
-      <w:r>
-        <w:rPr>
-          <w:color w:val="000000" w:themeColor="text1"/>
-        </w:rPr>
-        <w:t xml:space="preserve">, </w:t>
-      </w:r>
-      <w:r>
-        <w:rPr>
-          <w:color w:val="000000" w:themeColor="text1"/>
-        </w:rPr>
-        <w:t xml:space="preserve">Global </w:t>
-      </w:r>
-      <w:proofErr w:type="spellStart"/>
-      <w:r>
-        <w:rPr>
-          <w:color w:val="000000" w:themeColor="text1"/>
-        </w:rPr>
-        <w:t>Average</w:t>
-      </w:r>
-      <w:proofErr w:type="spellEnd"/>
-      <w:r>
-        <w:rPr>
-          <w:color w:val="000000" w:themeColor="text1"/>
-        </w:rPr>
-        <w:t xml:space="preserve"> </w:t>
-      </w:r>
-      <w:proofErr w:type="spellStart"/>
-      <w:r>
-        <w:rPr>
-          <w:color w:val="000000" w:themeColor="text1"/>
-        </w:rPr>
-        <w:t>Pooling</w:t>
-      </w:r>
-      <w:proofErr w:type="spellEnd"/>
-      <w:r>
-        <w:rPr>
-          <w:color w:val="000000" w:themeColor="text1"/>
-        </w:rPr>
-        <w:t xml:space="preserve"> e </w:t>
-      </w:r>
-      <w:r>
-        <w:rPr>
-          <w:color w:val="000000" w:themeColor="text1"/>
-        </w:rPr>
-        <w:t>Classificador</w:t>
-      </w:r>
-      <w:r>
-        <w:rPr>
-          <w:color w:val="000000" w:themeColor="text1"/>
-        </w:rPr>
-        <w:t>, tal qual na V1.</w:t>
-      </w:r>
-    </w:p>
-    <w:p>
-      <w:pPr>
-        <w:pStyle w:val="PargrafodaLista"/>
-        <w:ind w:left="1788"/>
-        <w:jc w:val="both"/>
-        <w:rPr>
-          <w:color w:val="000000" w:themeColor="text1"/>
-        </w:rPr>
-      </w:pPr>
-    </w:p>
-    <w:p>
-      <w:pPr>
-        <w:pStyle w:val="PargrafodaLista"/>
-        <w:numPr>
-          <w:ilvl w:val="1"/>
-          <w:numId w:val="1"/>
-        </w:numPr>
-        <w:ind w:left="360"/>
-        <w:jc w:val="both"/>
-        <w:rPr>
-          <w:b/>
-          <w:bCs/>
-          <w:color w:val="00B050"/>
-        </w:rPr>
-      </w:pPr>
-      <w:r>
-        <w:rPr>
-          <w:b/>
-          <w:bCs/>
-          <w:color w:val="00B050"/>
-        </w:rPr>
         <w:t xml:space="preserve">ESTUDO EXPLORATÓRIO </w:t>
       </w:r>
       <w:r>
-        <w:rPr>
-          <w:b/>
-          <w:bCs/>
-          <w:color w:val="00B050"/>
-        </w:rPr>
         <w:t>6</w:t>
       </w:r>
       <w:r>
-        <w:rPr>
-          <w:b/>
-          <w:bCs/>
-          <w:color w:val="00B050"/>
-        </w:rPr>
         <w:t xml:space="preserve"> – DENSENET</w:t>
       </w:r>
+      <w:bookmarkEnd w:id="7"/>
     </w:p>
     <w:p>
       <w:pPr>
@@ -5422,7 +5937,6 @@
           <w:b/>
           <w:bCs/>
         </w:rPr>
-        <w:lastRenderedPageBreak/>
         <w:t>Observação:</w:t>
       </w:r>
       <w:r>
@@ -5566,13 +6080,6 @@
       <w:r>
         <w:t>.</w:t>
       </w:r>
-    </w:p>
-    <w:p>
-      <w:pPr>
-        <w:pStyle w:val="PargrafodaLista"/>
-        <w:ind w:left="1068"/>
-        <w:jc w:val="both"/>
-      </w:pPr>
     </w:p>
     <w:p>
       <w:pPr>
@@ -5709,7 +6216,7 @@
                     <pic:cNvPicPr/>
                   </pic:nvPicPr>
                   <pic:blipFill>
-                    <a:blip r:embed="rId14"/>
+                    <a:blip r:embed="rId15"/>
                     <a:stretch>
                       <a:fillRect/>
                     </a:stretch>
@@ -5938,87 +6445,67 @@
     </w:p>
     <w:p>
       <w:pPr>
-        <w:jc w:val="both"/>
-        <w:rPr>
-          <w:color w:val="000000" w:themeColor="text1"/>
-        </w:rPr>
-      </w:pPr>
-    </w:p>
-    <w:p>
-      <w:pPr>
-        <w:jc w:val="both"/>
-        <w:rPr>
-          <w:color w:val="000000" w:themeColor="text1"/>
-        </w:rPr>
-      </w:pPr>
-    </w:p>
-    <w:p>
-      <w:pPr>
-        <w:jc w:val="both"/>
-        <w:rPr>
-          <w:color w:val="000000" w:themeColor="text1"/>
-        </w:rPr>
-      </w:pPr>
-    </w:p>
-    <w:p>
-      <w:pPr>
-        <w:pStyle w:val="PargrafodaLista"/>
+        <w:pStyle w:val="PargrafodaLista"/>
+        <w:rPr>
+          <w:color w:val="000000" w:themeColor="text1"/>
+        </w:rPr>
+      </w:pPr>
+    </w:p>
+    <w:p>
+      <w:pPr>
+        <w:pStyle w:val="PargrafodaLista"/>
+        <w:spacing w:line="240" w:lineRule="auto"/>
         <w:ind w:left="1788"/>
         <w:jc w:val="both"/>
         <w:rPr>
-          <w:b/>
-          <w:bCs/>
-          <w:color w:val="00B050"/>
-        </w:rPr>
-      </w:pPr>
-    </w:p>
-    <w:p>
-      <w:pPr>
-        <w:pStyle w:val="PargrafodaLista"/>
-        <w:numPr>
-          <w:ilvl w:val="1"/>
-          <w:numId w:val="1"/>
-        </w:numPr>
-        <w:ind w:left="360"/>
-        <w:jc w:val="both"/>
-        <w:rPr>
-          <w:b/>
-          <w:bCs/>
-          <w:color w:val="00B050"/>
-        </w:rPr>
-      </w:pPr>
-      <w:r>
-        <w:rPr>
-          <w:b/>
-          <w:bCs/>
-          <w:color w:val="00B050"/>
-        </w:rPr>
+          <w:color w:val="000000" w:themeColor="text1"/>
+        </w:rPr>
+      </w:pPr>
+    </w:p>
+    <w:p>
+      <w:pPr>
+        <w:pStyle w:val="PargrafodaLista"/>
+        <w:spacing w:line="240" w:lineRule="auto"/>
+        <w:ind w:left="1788"/>
+        <w:jc w:val="both"/>
+        <w:rPr>
+          <w:color w:val="000000" w:themeColor="text1"/>
+        </w:rPr>
+      </w:pPr>
+    </w:p>
+    <w:p>
+      <w:pPr>
+        <w:pStyle w:val="PargrafodaLista"/>
+        <w:spacing w:line="240" w:lineRule="auto"/>
+        <w:ind w:left="1788"/>
+        <w:jc w:val="both"/>
+        <w:rPr>
+          <w:color w:val="000000" w:themeColor="text1"/>
+        </w:rPr>
+      </w:pPr>
+    </w:p>
+    <w:p>
+      <w:pPr>
+        <w:pStyle w:val="Ttulo1"/>
+      </w:pPr>
+      <w:bookmarkStart w:id="8" w:name="_Toc226443804"/>
+      <w:r>
+        <w:lastRenderedPageBreak/>
         <w:t xml:space="preserve">ESTUDO EXPLORATÓRIO </w:t>
       </w:r>
       <w:r>
-        <w:rPr>
-          <w:b/>
-          <w:bCs/>
-          <w:color w:val="00B050"/>
-        </w:rPr>
-        <w:t>6</w:t>
-      </w:r>
-      <w:r>
-        <w:rPr>
-          <w:b/>
-          <w:bCs/>
-          <w:color w:val="00B050"/>
-        </w:rPr>
+        <w:t>7</w:t>
+      </w:r>
+      <w:r>
         <w:t xml:space="preserve"> – </w:t>
       </w:r>
       <w:r>
-        <w:rPr>
-          <w:b/>
-          <w:bCs/>
-          <w:color w:val="00B050"/>
-        </w:rPr>
-        <w:t>CONFIGURAÇÃO DE TREINOS</w:t>
-      </w:r>
+        <w:t xml:space="preserve">CONFIGURAÇÃO </w:t>
+      </w:r>
+      <w:r>
+        <w:t>OTIMIZADA PARA MOBILENET</w:t>
+      </w:r>
+      <w:bookmarkEnd w:id="8"/>
     </w:p>
     <w:p>
       <w:pPr>
@@ -6290,19 +6777,19 @@
         <w:jc w:val="both"/>
       </w:pPr>
       <w:r>
-        <w:t xml:space="preserve">Utilizar a ResNetV1 + Alpha reduzido (0.5) </w:t>
+        <w:t xml:space="preserve">Utilizar a </w:t>
+      </w:r>
+      <w:r>
+        <w:t>MobileNet</w:t>
+      </w:r>
+      <w:r>
+        <w:t xml:space="preserve">NetV1 + Alpha reduzido (0.5) </w:t>
       </w:r>
       <w:r>
         <w:rPr>
           <w:rFonts w:cstheme="minorHAnsi"/>
         </w:rPr>
-        <w:t>→</w:t>
-      </w:r>
-      <w:r>
-        <w:rPr>
-          <w:rFonts w:cstheme="minorHAnsi"/>
-        </w:rPr>
-        <w:t xml:space="preserve"> Estratégia amparada pelo artigo original;</w:t>
+        <w:t>→ Estratégia amparada pelo artigo original;</w:t>
       </w:r>
     </w:p>
     <w:p>
@@ -6321,13 +6808,7 @@
         <w:rPr>
           <w:rFonts w:cstheme="minorHAnsi"/>
         </w:rPr>
-        <w:t>→</w:t>
-      </w:r>
-      <w:r>
-        <w:rPr>
-          <w:rFonts w:cstheme="minorHAnsi"/>
-        </w:rPr>
-        <w:t xml:space="preserve"> 160 ou 128. Dessa forma espera-se reduzir ruídos desnecessários;</w:t>
+        <w:t>→ 160 ou 128. Dessa forma espera-se reduzir ruídos desnecessários;</w:t>
       </w:r>
     </w:p>
     <w:p>
@@ -6338,71 +6819,108 @@
           <w:numId w:val="43"/>
         </w:numPr>
         <w:jc w:val="both"/>
-      </w:pPr>
-      <w:proofErr w:type="spellStart"/>
-      <w:r>
-        <w:t>Augmentation</w:t>
-      </w:r>
-      <w:proofErr w:type="spellEnd"/>
-      <w:r>
-        <w:t xml:space="preserve"> leve </w:t>
+        <w:rPr>
+          <w:lang w:val="en-US"/>
+        </w:rPr>
+      </w:pPr>
+      <w:r>
+        <w:rPr>
+          <w:lang w:val="en-US"/>
+        </w:rPr>
+        <w:t xml:space="preserve">Augmentation </w:t>
+      </w:r>
+      <w:proofErr w:type="spellStart"/>
+      <w:r>
+        <w:rPr>
+          <w:lang w:val="en-US"/>
+        </w:rPr>
+        <w:t>leve</w:t>
+      </w:r>
+      <w:proofErr w:type="spellEnd"/>
+      <w:r>
+        <w:rPr>
+          <w:lang w:val="en-US"/>
+        </w:rPr>
+        <w:t xml:space="preserve"> </w:t>
       </w:r>
       <w:r>
         <w:rPr>
           <w:rFonts w:cstheme="minorHAnsi"/>
+          <w:lang w:val="en-US"/>
         </w:rPr>
         <w:t>→</w:t>
       </w:r>
       <w:r>
+        <w:rPr>
+          <w:lang w:val="en-US"/>
+        </w:rPr>
         <w:t xml:space="preserve"> </w:t>
       </w:r>
       <w:proofErr w:type="spellStart"/>
       <w:proofErr w:type="gramStart"/>
       <w:r>
+        <w:rPr>
+          <w:lang w:val="en-US"/>
+        </w:rPr>
         <w:t>RandomRotation</w:t>
       </w:r>
       <w:proofErr w:type="spellEnd"/>
       <w:r>
+        <w:rPr>
+          <w:lang w:val="en-US"/>
+        </w:rPr>
         <w:t>(</w:t>
       </w:r>
       <w:proofErr w:type="gramEnd"/>
       <w:r>
-        <w:t>0.1)</w:t>
-      </w:r>
-      <w:r>
-        <w:t xml:space="preserve">, </w:t>
+        <w:rPr>
+          <w:lang w:val="en-US"/>
+        </w:rPr>
+        <w:t xml:space="preserve">0.1), </w:t>
       </w:r>
       <w:proofErr w:type="spellStart"/>
       <w:proofErr w:type="gramStart"/>
       <w:r>
+        <w:rPr>
+          <w:lang w:val="en-US"/>
+        </w:rPr>
         <w:t>RandomZoom</w:t>
       </w:r>
       <w:proofErr w:type="spellEnd"/>
       <w:r>
+        <w:rPr>
+          <w:lang w:val="en-US"/>
+        </w:rPr>
         <w:t>(</w:t>
       </w:r>
       <w:proofErr w:type="gramEnd"/>
       <w:r>
-        <w:t>0.1)</w:t>
-      </w:r>
-      <w:r>
-        <w:t xml:space="preserve">, </w:t>
+        <w:rPr>
+          <w:lang w:val="en-US"/>
+        </w:rPr>
+        <w:t xml:space="preserve">0.1), </w:t>
       </w:r>
       <w:proofErr w:type="spellStart"/>
       <w:proofErr w:type="gramStart"/>
       <w:r>
+        <w:rPr>
+          <w:lang w:val="en-US"/>
+        </w:rPr>
         <w:t>RandomContrast</w:t>
       </w:r>
       <w:proofErr w:type="spellEnd"/>
       <w:r>
+        <w:rPr>
+          <w:lang w:val="en-US"/>
+        </w:rPr>
         <w:t>(</w:t>
       </w:r>
       <w:proofErr w:type="gramEnd"/>
       <w:r>
-        <w:t>0.1)</w:t>
-      </w:r>
-      <w:r>
-        <w:t>;</w:t>
+        <w:rPr>
+          <w:lang w:val="en-US"/>
+        </w:rPr>
+        <w:t>0.1);</w:t>
       </w:r>
     </w:p>
     <w:p>
@@ -6480,295 +6998,33 @@
           <w:numId w:val="43"/>
         </w:numPr>
         <w:jc w:val="both"/>
-      </w:pPr>
-      <w:r>
-        <w:rPr>
-          <w:b/>
-          <w:bCs/>
+        <w:rPr>
+          <w:lang w:val="en-US"/>
+        </w:rPr>
+      </w:pPr>
+      <w:proofErr w:type="spellStart"/>
+      <w:r>
+        <w:rPr>
+          <w:b/>
+          <w:bCs/>
+          <w:lang w:val="en-US"/>
         </w:rPr>
         <w:t>Justificativa</w:t>
       </w:r>
-      <w:r>
+      <w:proofErr w:type="spellEnd"/>
+      <w:r>
+        <w:rPr>
+          <w:lang w:val="en-US"/>
+        </w:rPr>
         <w:t xml:space="preserve">: </w:t>
       </w:r>
       <w:r>
         <w:rPr>
           <w:i/>
           <w:iCs/>
-        </w:rPr>
-        <w:t xml:space="preserve">The original </w:t>
-      </w:r>
-      <w:proofErr w:type="spellStart"/>
-      <w:r>
-        <w:rPr>
-          <w:i/>
-          <w:iCs/>
-        </w:rPr>
-        <w:t>preprocessing</w:t>
-      </w:r>
-      <w:proofErr w:type="spellEnd"/>
-      <w:r>
-        <w:rPr>
-          <w:i/>
-          <w:iCs/>
-        </w:rPr>
-        <w:t xml:space="preserve"> pipeline </w:t>
-      </w:r>
-      <w:proofErr w:type="spellStart"/>
-      <w:r>
-        <w:rPr>
-          <w:i/>
-          <w:iCs/>
-        </w:rPr>
-        <w:t>was</w:t>
-      </w:r>
-      <w:proofErr w:type="spellEnd"/>
-      <w:r>
-        <w:rPr>
-          <w:i/>
-          <w:iCs/>
-        </w:rPr>
-        <w:t xml:space="preserve"> </w:t>
-      </w:r>
-      <w:proofErr w:type="spellStart"/>
-      <w:r>
-        <w:rPr>
-          <w:i/>
-          <w:iCs/>
-        </w:rPr>
-        <w:t>adapted</w:t>
-      </w:r>
-      <w:proofErr w:type="spellEnd"/>
-      <w:r>
-        <w:rPr>
-          <w:i/>
-          <w:iCs/>
-        </w:rPr>
-        <w:t xml:space="preserve"> </w:t>
-      </w:r>
-      <w:proofErr w:type="spellStart"/>
-      <w:r>
-        <w:rPr>
-          <w:i/>
-          <w:iCs/>
-        </w:rPr>
-        <w:t>to</w:t>
-      </w:r>
-      <w:proofErr w:type="spellEnd"/>
-      <w:r>
-        <w:rPr>
-          <w:i/>
-          <w:iCs/>
-        </w:rPr>
-        <w:t xml:space="preserve"> </w:t>
-      </w:r>
-      <w:proofErr w:type="spellStart"/>
-      <w:r>
-        <w:rPr>
-          <w:i/>
-          <w:iCs/>
-        </w:rPr>
-        <w:t>reduce</w:t>
-      </w:r>
-      <w:proofErr w:type="spellEnd"/>
-      <w:r>
-        <w:rPr>
-          <w:i/>
-          <w:iCs/>
-        </w:rPr>
-        <w:t xml:space="preserve"> </w:t>
-      </w:r>
-      <w:proofErr w:type="spellStart"/>
-      <w:r>
-        <w:rPr>
-          <w:i/>
-          <w:iCs/>
-        </w:rPr>
-        <w:t>excessive</w:t>
-      </w:r>
-      <w:proofErr w:type="spellEnd"/>
-      <w:r>
-        <w:rPr>
-          <w:i/>
-          <w:iCs/>
-        </w:rPr>
-        <w:t xml:space="preserve"> </w:t>
-      </w:r>
-      <w:proofErr w:type="spellStart"/>
-      <w:r>
-        <w:rPr>
-          <w:i/>
-          <w:iCs/>
-        </w:rPr>
-        <w:t>spatial</w:t>
-      </w:r>
-      <w:proofErr w:type="spellEnd"/>
-      <w:r>
-        <w:rPr>
-          <w:i/>
-          <w:iCs/>
-        </w:rPr>
-        <w:t xml:space="preserve"> </w:t>
-      </w:r>
-      <w:proofErr w:type="spellStart"/>
-      <w:r>
-        <w:rPr>
-          <w:i/>
-          <w:iCs/>
-        </w:rPr>
-        <w:t>transformations</w:t>
-      </w:r>
-      <w:proofErr w:type="spellEnd"/>
-      <w:r>
-        <w:rPr>
-          <w:i/>
-          <w:iCs/>
-        </w:rPr>
-        <w:t xml:space="preserve">, </w:t>
-      </w:r>
-      <w:proofErr w:type="spellStart"/>
-      <w:r>
-        <w:rPr>
-          <w:i/>
-          <w:iCs/>
-        </w:rPr>
-        <w:t>aiming</w:t>
-      </w:r>
-      <w:proofErr w:type="spellEnd"/>
-      <w:r>
-        <w:rPr>
-          <w:i/>
-          <w:iCs/>
-        </w:rPr>
-        <w:t xml:space="preserve"> </w:t>
-      </w:r>
-      <w:proofErr w:type="spellStart"/>
-      <w:r>
-        <w:rPr>
-          <w:i/>
-          <w:iCs/>
-        </w:rPr>
-        <w:t>to</w:t>
-      </w:r>
-      <w:proofErr w:type="spellEnd"/>
-      <w:r>
-        <w:rPr>
-          <w:i/>
-          <w:iCs/>
-        </w:rPr>
-        <w:t xml:space="preserve"> </w:t>
-      </w:r>
-      <w:proofErr w:type="spellStart"/>
-      <w:r>
-        <w:rPr>
-          <w:i/>
-          <w:iCs/>
-        </w:rPr>
-        <w:t>better</w:t>
-      </w:r>
-      <w:proofErr w:type="spellEnd"/>
-      <w:r>
-        <w:rPr>
-          <w:i/>
-          <w:iCs/>
-        </w:rPr>
-        <w:t xml:space="preserve"> preserve fine-</w:t>
-      </w:r>
-      <w:proofErr w:type="spellStart"/>
-      <w:r>
-        <w:rPr>
-          <w:i/>
-          <w:iCs/>
-        </w:rPr>
-        <w:t>grained</w:t>
-      </w:r>
-      <w:proofErr w:type="spellEnd"/>
-      <w:r>
-        <w:rPr>
-          <w:i/>
-          <w:iCs/>
-        </w:rPr>
-        <w:t xml:space="preserve"> facial features </w:t>
-      </w:r>
-      <w:proofErr w:type="spellStart"/>
-      <w:r>
-        <w:rPr>
-          <w:i/>
-          <w:iCs/>
-        </w:rPr>
-        <w:t>while</w:t>
-      </w:r>
-      <w:proofErr w:type="spellEnd"/>
-      <w:r>
-        <w:rPr>
-          <w:i/>
-          <w:iCs/>
-        </w:rPr>
-        <w:t xml:space="preserve"> </w:t>
-      </w:r>
-      <w:proofErr w:type="spellStart"/>
-      <w:r>
-        <w:rPr>
-          <w:i/>
-          <w:iCs/>
-        </w:rPr>
-        <w:t>maintaining</w:t>
-      </w:r>
-      <w:proofErr w:type="spellEnd"/>
-      <w:r>
-        <w:rPr>
-          <w:i/>
-          <w:iCs/>
-        </w:rPr>
-        <w:t xml:space="preserve"> </w:t>
-      </w:r>
-      <w:proofErr w:type="spellStart"/>
-      <w:r>
-        <w:rPr>
-          <w:i/>
-          <w:iCs/>
-        </w:rPr>
-        <w:t>consistency</w:t>
-      </w:r>
-      <w:proofErr w:type="spellEnd"/>
-      <w:r>
-        <w:rPr>
-          <w:i/>
-          <w:iCs/>
-        </w:rPr>
-        <w:t xml:space="preserve"> </w:t>
-      </w:r>
-      <w:proofErr w:type="spellStart"/>
-      <w:r>
-        <w:rPr>
-          <w:i/>
-          <w:iCs/>
-        </w:rPr>
-        <w:t>with</w:t>
-      </w:r>
-      <w:proofErr w:type="spellEnd"/>
-      <w:r>
-        <w:rPr>
-          <w:i/>
-          <w:iCs/>
-        </w:rPr>
-        <w:t xml:space="preserve"> prior </w:t>
-      </w:r>
-      <w:proofErr w:type="spellStart"/>
-      <w:r>
-        <w:rPr>
-          <w:i/>
-          <w:iCs/>
-        </w:rPr>
-        <w:t>experiments</w:t>
-      </w:r>
-      <w:proofErr w:type="spellEnd"/>
-      <w:r>
-        <w:rPr>
-          <w:i/>
-          <w:iCs/>
-        </w:rPr>
-        <w:t>.</w:t>
+          <w:lang w:val="en-US"/>
+        </w:rPr>
+        <w:t>The original preprocessing pipeline was adapted to reduce excessive spatial transformations, aiming to better preserve fine-grained facial features while maintaining consistency with prior experiments.</w:t>
       </w:r>
     </w:p>
     <w:p>
@@ -6776,6 +7032,9 @@
         <w:pStyle w:val="PargrafodaLista"/>
         <w:ind w:left="3228"/>
         <w:jc w:val="both"/>
+        <w:rPr>
+          <w:lang w:val="en-US"/>
+        </w:rPr>
       </w:pPr>
     </w:p>
     <w:p>
@@ -6792,19 +7051,7 @@
           <w:rPr>
             <w:rFonts w:ascii="Cambria Math" w:hAnsi="Cambria Math"/>
           </w:rPr>
-          <m:t>kernel_regularizer = tf.keras.regularizers.l2(</m:t>
-        </m:r>
-        <m:r>
-          <w:rPr>
-            <w:rFonts w:ascii="Cambria Math" w:hAnsi="Cambria Math"/>
-          </w:rPr>
-          <m:t>1e-4</m:t>
-        </m:r>
-        <m:r>
-          <w:rPr>
-            <w:rFonts w:ascii="Cambria Math" w:hAnsi="Cambria Math"/>
-          </w:rPr>
-          <m:t>)</m:t>
+          <m:t>kernel_regularizer = tf.keras.regularizers.l2(1e-4)</m:t>
         </m:r>
       </m:oMath>
     </w:p>
@@ -6870,247 +7117,130 @@
         <w:rPr>
           <w:rFonts w:cstheme="minorHAnsi"/>
         </w:rPr>
-        <w:t>→</w:t>
+        <w:t>customizado para encerrar o</w:t>
       </w:r>
       <w:r>
         <w:rPr>
           <w:rFonts w:cstheme="minorHAnsi"/>
         </w:rPr>
-        <w:t xml:space="preserve"> </w:t>
-      </w:r>
-      <w:proofErr w:type="spellStart"/>
-      <w:proofErr w:type="gramStart"/>
-      <w:r>
+        <w:t xml:space="preserve"> treino no caso de um </w:t>
+      </w:r>
+      <w:proofErr w:type="spellStart"/>
+      <w:r>
+        <w:rPr>
+          <w:rFonts w:cstheme="minorHAnsi"/>
+        </w:rPr>
+        <w:t>plateau</w:t>
+      </w:r>
+      <w:proofErr w:type="spellEnd"/>
+    </w:p>
+    <w:p>
+      <w:pPr>
+        <w:pStyle w:val="PargrafodaLista"/>
+        <w:ind w:left="2508"/>
+        <w:jc w:val="both"/>
+        <w:rPr>
+          <w:color w:val="000000" w:themeColor="text1"/>
+        </w:rPr>
+      </w:pPr>
+    </w:p>
+    <w:p>
+      <w:pPr>
+        <w:pStyle w:val="PargrafodaLista"/>
+        <w:ind w:left="2508"/>
+        <w:jc w:val="both"/>
+        <w:rPr>
+          <w:color w:val="000000" w:themeColor="text1"/>
+        </w:rPr>
+      </w:pPr>
+    </w:p>
+    <w:p>
+      <w:pPr>
+        <w:pStyle w:val="PargrafodaLista"/>
+        <w:ind w:left="2508"/>
+        <w:jc w:val="both"/>
+        <w:rPr>
+          <w:color w:val="000000" w:themeColor="text1"/>
+        </w:rPr>
+      </w:pPr>
+    </w:p>
+    <w:p>
+      <w:pPr>
+        <w:pStyle w:val="PargrafodaLista"/>
+        <w:ind w:left="2508"/>
+        <w:jc w:val="both"/>
         <w:rPr>
           <w:i/>
           <w:iCs/>
           <w:color w:val="00B0F0"/>
         </w:rPr>
-        <w:t>EarlyStopping</w:t>
-      </w:r>
-      <w:proofErr w:type="spellEnd"/>
-      <w:r>
-        <w:rPr>
-          <w:i/>
-          <w:iCs/>
-          <w:color w:val="00B0F0"/>
-        </w:rPr>
-        <w:t>(</w:t>
-      </w:r>
-      <w:proofErr w:type="gramEnd"/>
-    </w:p>
-    <w:p>
-      <w:pPr>
-        <w:pStyle w:val="PargrafodaLista"/>
-        <w:ind w:left="4248"/>
-        <w:jc w:val="both"/>
-        <w:rPr>
-          <w:i/>
-          <w:iCs/>
-          <w:color w:val="00B0F0"/>
-        </w:rPr>
-      </w:pPr>
-      <w:r>
-        <w:rPr>
-          <w:i/>
-          <w:iCs/>
-          <w:color w:val="00B0F0"/>
-        </w:rPr>
-        <w:t>monitor="</w:t>
-      </w:r>
-      <w:proofErr w:type="spellStart"/>
-      <w:r>
-        <w:rPr>
-          <w:i/>
-          <w:iCs/>
-          <w:color w:val="00B0F0"/>
-        </w:rPr>
-        <w:t>val_loss</w:t>
-      </w:r>
-      <w:proofErr w:type="spellEnd"/>
-      <w:r>
-        <w:rPr>
-          <w:i/>
-          <w:iCs/>
-          <w:color w:val="00B0F0"/>
-        </w:rPr>
-        <w:t>",</w:t>
-      </w:r>
-    </w:p>
-    <w:p>
-      <w:pPr>
-        <w:pStyle w:val="PargrafodaLista"/>
-        <w:ind w:left="4248"/>
-        <w:jc w:val="both"/>
-        <w:rPr>
-          <w:i/>
-          <w:iCs/>
-          <w:color w:val="00B0F0"/>
-        </w:rPr>
-      </w:pPr>
-      <w:proofErr w:type="spellStart"/>
-      <w:r>
-        <w:rPr>
-          <w:i/>
-          <w:iCs/>
-          <w:color w:val="00B0F0"/>
-        </w:rPr>
-        <w:t>patience</w:t>
-      </w:r>
-      <w:proofErr w:type="spellEnd"/>
-      <w:r>
-        <w:rPr>
-          <w:i/>
-          <w:iCs/>
-          <w:color w:val="00B0F0"/>
-        </w:rPr>
-        <w:t>=20,</w:t>
-      </w:r>
-    </w:p>
-    <w:p>
-      <w:pPr>
-        <w:pStyle w:val="PargrafodaLista"/>
-        <w:ind w:left="4248"/>
-        <w:jc w:val="both"/>
-        <w:rPr>
-          <w:i/>
-          <w:iCs/>
-          <w:color w:val="00B0F0"/>
-        </w:rPr>
-      </w:pPr>
-      <w:proofErr w:type="spellStart"/>
-      <w:r>
-        <w:rPr>
-          <w:i/>
-          <w:iCs/>
-          <w:color w:val="00B0F0"/>
-        </w:rPr>
-        <w:t>restore_best_weights</w:t>
-      </w:r>
-      <w:proofErr w:type="spellEnd"/>
-      <w:r>
-        <w:rPr>
-          <w:i/>
-          <w:iCs/>
-          <w:color w:val="00B0F0"/>
-        </w:rPr>
-        <w:t>=</w:t>
-      </w:r>
-      <w:proofErr w:type="spellStart"/>
-      <w:r>
-        <w:rPr>
-          <w:i/>
-          <w:iCs/>
-          <w:color w:val="00B0F0"/>
-        </w:rPr>
-        <w:t>True</w:t>
-      </w:r>
-      <w:proofErr w:type="spellEnd"/>
-    </w:p>
-    <w:p>
-      <w:pPr>
-        <w:ind w:left="3540"/>
-        <w:jc w:val="both"/>
-        <w:rPr>
-          <w:i/>
-          <w:iCs/>
-          <w:color w:val="00B0F0"/>
-        </w:rPr>
-      </w:pPr>
-      <w:r>
-        <w:rPr>
-          <w:i/>
-          <w:iCs/>
-          <w:color w:val="00B0F0"/>
-        </w:rPr>
-        <w:t xml:space="preserve">           </w:t>
-      </w:r>
-      <w:r>
-        <w:rPr>
-          <w:i/>
-          <w:iCs/>
-          <w:color w:val="00B0F0"/>
-        </w:rPr>
-        <w:t>)</w:t>
-      </w:r>
-    </w:p>
-    <w:p>
-      <w:pPr>
-        <w:pStyle w:val="PargrafodaLista"/>
-        <w:ind w:left="2508"/>
-        <w:jc w:val="both"/>
-      </w:pPr>
-    </w:p>
-    <w:p>
-      <w:pPr>
-        <w:pStyle w:val="PargrafodaLista"/>
-        <w:ind w:left="360"/>
-        <w:jc w:val="both"/>
-        <w:rPr>
-          <w:b/>
-          <w:bCs/>
-          <w:color w:val="00B050"/>
-        </w:rPr>
-      </w:pPr>
-    </w:p>
-    <w:p>
-      <w:pPr>
-        <w:pStyle w:val="PargrafodaLista"/>
-        <w:ind w:left="360"/>
-        <w:jc w:val="both"/>
-        <w:rPr>
-          <w:b/>
-          <w:bCs/>
-          <w:color w:val="00B050"/>
-        </w:rPr>
-      </w:pPr>
-    </w:p>
-    <w:p>
-      <w:pPr>
-        <w:pStyle w:val="PargrafodaLista"/>
-        <w:ind w:left="360"/>
-        <w:jc w:val="both"/>
-        <w:rPr>
-          <w:b/>
-          <w:bCs/>
-          <w:color w:val="00B050"/>
-        </w:rPr>
-      </w:pPr>
-    </w:p>
-    <w:p>
-      <w:pPr>
-        <w:pStyle w:val="PargrafodaLista"/>
-        <w:ind w:left="360"/>
-        <w:jc w:val="both"/>
-        <w:rPr>
-          <w:b/>
-          <w:bCs/>
-          <w:color w:val="00B050"/>
-        </w:rPr>
-      </w:pPr>
-    </w:p>
-    <w:p>
-      <w:pPr>
-        <w:pStyle w:val="PargrafodaLista"/>
-        <w:ind w:left="360"/>
-        <w:jc w:val="both"/>
-        <w:rPr>
-          <w:b/>
-          <w:bCs/>
-          <w:color w:val="00B050"/>
-        </w:rPr>
-      </w:pPr>
-    </w:p>
-    <w:p>
-      <w:pPr>
-        <w:pStyle w:val="PargrafodaLista"/>
-        <w:ind w:left="360"/>
-        <w:jc w:val="both"/>
-        <w:rPr>
-          <w:b/>
-          <w:bCs/>
-          <w:color w:val="00B050"/>
-        </w:rPr>
+      </w:pPr>
+    </w:p>
+    <w:p>
+      <w:pPr>
+        <w:pStyle w:val="Ttulo1"/>
+      </w:pPr>
+      <w:bookmarkStart w:id="9" w:name="_Toc226443805"/>
+      <w:r>
+        <w:lastRenderedPageBreak/>
+        <w:t xml:space="preserve">ESTUDO EXPLORATÓRIO </w:t>
+      </w:r>
+      <w:r>
+        <w:t>8</w:t>
+      </w:r>
+      <w:r>
+        <w:t xml:space="preserve"> – </w:t>
+      </w:r>
+      <w:r>
+        <w:t xml:space="preserve">CONFIGURAÇÃO OTIMIZADA PARA </w:t>
+      </w:r>
+      <w:r>
+        <w:t>DENSENET</w:t>
+      </w:r>
+      <w:bookmarkEnd w:id="9"/>
+    </w:p>
+    <w:p>
+      <w:pPr>
+        <w:pStyle w:val="PargrafodaLista"/>
+        <w:ind w:left="1068"/>
+        <w:jc w:val="both"/>
+      </w:pPr>
+    </w:p>
+    <w:p>
+      <w:pPr>
+        <w:pStyle w:val="PargrafodaLista"/>
+        <w:numPr>
+          <w:ilvl w:val="0"/>
+          <w:numId w:val="43"/>
+        </w:numPr>
+        <w:jc w:val="both"/>
+      </w:pPr>
+      <w:r>
+        <w:t xml:space="preserve">O </w:t>
+      </w:r>
+      <w:r>
+        <w:t>escopo</w:t>
+      </w:r>
+      <w:r>
+        <w:t xml:space="preserve"> do projeto se mantém igual ao que foi apresentado no estudo anterior para a </w:t>
+      </w:r>
+      <w:proofErr w:type="spellStart"/>
+      <w:r>
+        <w:t>MobileNet</w:t>
+      </w:r>
+      <w:proofErr w:type="spellEnd"/>
+      <w:r>
+        <w:t>, seguindo as mesmas necessidades apresentadas lá</w:t>
+      </w:r>
+      <w:r>
+        <w:t>. Com isso não se torna interessante aplicar diretamente a DenseNet-121 apresentada no artigo, mas sim uma versão reduzida e controlada.</w:t>
+      </w:r>
+    </w:p>
+    <w:p>
+      <w:pPr>
+        <w:pStyle w:val="PargrafodaLista"/>
+        <w:ind w:left="1788"/>
+        <w:jc w:val="both"/>
       </w:pPr>
     </w:p>
     <w:p>
@@ -7118,25 +7248,383 @@
         <w:pStyle w:val="PargrafodaLista"/>
         <w:numPr>
           <w:ilvl w:val="1"/>
-          <w:numId w:val="1"/>
+          <w:numId w:val="43"/>
         </w:numPr>
-        <w:ind w:left="360"/>
-        <w:jc w:val="both"/>
-        <w:rPr>
-          <w:b/>
-          <w:bCs/>
-          <w:color w:val="00B050"/>
-        </w:rPr>
-      </w:pPr>
-      <w:r>
-        <w:rPr>
-          <w:b/>
-          <w:bCs/>
-          <w:color w:val="00B050"/>
-        </w:rPr>
-        <w:lastRenderedPageBreak/>
-        <w:t>D</w:t>
-      </w:r>
+        <w:jc w:val="both"/>
+      </w:pPr>
+      <w:r>
+        <w:t>A</w:t>
+      </w:r>
+      <w:r>
+        <w:t xml:space="preserve"> </w:t>
+      </w:r>
+      <w:r>
+        <w:t>DenseNet-121</w:t>
+      </w:r>
+      <w:r>
+        <w:t xml:space="preserve"> f</w:t>
+      </w:r>
+      <w:r>
+        <w:t xml:space="preserve">oi feita para </w:t>
+      </w:r>
+      <w:proofErr w:type="spellStart"/>
+      <w:r>
+        <w:t>ImageNet</w:t>
+      </w:r>
+      <w:proofErr w:type="spellEnd"/>
+      <w:r>
+        <w:t xml:space="preserve"> (1.2M imagens)</w:t>
+      </w:r>
+      <w:r>
+        <w:t xml:space="preserve"> e por </w:t>
+      </w:r>
+      <w:proofErr w:type="spellStart"/>
+      <w:r>
+        <w:t>consequencia</w:t>
+      </w:r>
+      <w:proofErr w:type="spellEnd"/>
+      <w:r>
+        <w:t xml:space="preserve"> é muito profunda para a aplicação deste projeto, isso aumenta consideravelmente o</w:t>
+      </w:r>
+      <w:r>
+        <w:t xml:space="preserve"> risco de </w:t>
+      </w:r>
+      <w:proofErr w:type="spellStart"/>
+      <w:r>
+        <w:t>overfitting</w:t>
+      </w:r>
+      <w:proofErr w:type="spellEnd"/>
+      <w:r>
+        <w:t xml:space="preserve"> no </w:t>
+      </w:r>
+      <w:proofErr w:type="spellStart"/>
+      <w:r>
+        <w:t>dataset</w:t>
+      </w:r>
+      <w:proofErr w:type="spellEnd"/>
+      <w:r>
+        <w:t xml:space="preserve"> dos camundongos.</w:t>
+      </w:r>
+    </w:p>
+    <w:p>
+      <w:pPr>
+        <w:pStyle w:val="PargrafodaLista"/>
+        <w:ind w:left="1788"/>
+        <w:jc w:val="both"/>
+      </w:pPr>
+    </w:p>
+    <w:p>
+      <w:pPr>
+        <w:pStyle w:val="PargrafodaLista"/>
+        <w:numPr>
+          <w:ilvl w:val="0"/>
+          <w:numId w:val="43"/>
+        </w:numPr>
+        <w:jc w:val="both"/>
+        <w:rPr>
+          <w:b/>
+          <w:bCs/>
+        </w:rPr>
+      </w:pPr>
+      <w:r>
+        <w:rPr>
+          <w:b/>
+          <w:bCs/>
+        </w:rPr>
+        <w:t xml:space="preserve">Como extrair o máximo da </w:t>
+      </w:r>
+      <w:proofErr w:type="spellStart"/>
+      <w:r>
+        <w:rPr>
+          <w:b/>
+          <w:bCs/>
+        </w:rPr>
+        <w:t>MobileNet</w:t>
+      </w:r>
+      <w:proofErr w:type="spellEnd"/>
+      <w:r>
+        <w:rPr>
+          <w:b/>
+          <w:bCs/>
+        </w:rPr>
+        <w:t>?</w:t>
+      </w:r>
+    </w:p>
+    <w:p>
+      <w:pPr>
+        <w:pStyle w:val="PargrafodaLista"/>
+        <w:rPr>
+          <w:b/>
+          <w:bCs/>
+        </w:rPr>
+      </w:pPr>
+    </w:p>
+    <w:p>
+      <w:pPr>
+        <w:pStyle w:val="PargrafodaLista"/>
+        <w:numPr>
+          <w:ilvl w:val="1"/>
+          <w:numId w:val="43"/>
+        </w:numPr>
+        <w:jc w:val="both"/>
+      </w:pPr>
+      <w:r>
+        <w:t xml:space="preserve">Utilização de uma </w:t>
+      </w:r>
+      <w:proofErr w:type="spellStart"/>
+      <w:r>
+        <w:t>DenseNet</w:t>
+      </w:r>
+      <w:proofErr w:type="spellEnd"/>
+      <w:r>
+        <w:t xml:space="preserve"> rasa. Como sugestão, temos: </w:t>
+      </w:r>
+    </w:p>
+    <w:p>
+      <w:pPr>
+        <w:pStyle w:val="PargrafodaLista"/>
+        <w:numPr>
+          <w:ilvl w:val="2"/>
+          <w:numId w:val="43"/>
+        </w:numPr>
+        <w:jc w:val="both"/>
+      </w:pPr>
+      <w:proofErr w:type="spellStart"/>
+      <w:r>
+        <w:t>Dense</w:t>
+      </w:r>
+      <w:proofErr w:type="spellEnd"/>
+      <w:r>
+        <w:t xml:space="preserve"> </w:t>
+      </w:r>
+      <w:proofErr w:type="spellStart"/>
+      <w:r>
+        <w:t>Blocks</w:t>
+      </w:r>
+      <w:proofErr w:type="spellEnd"/>
+      <w:r>
+        <w:t>: [4, 6, 8, 6]</w:t>
+      </w:r>
+    </w:p>
+    <w:p>
+      <w:pPr>
+        <w:pStyle w:val="PargrafodaLista"/>
+        <w:numPr>
+          <w:ilvl w:val="2"/>
+          <w:numId w:val="43"/>
+        </w:numPr>
+        <w:jc w:val="both"/>
+      </w:pPr>
+      <w:proofErr w:type="spellStart"/>
+      <w:r>
+        <w:t>growth_rate</w:t>
+      </w:r>
+      <w:proofErr w:type="spellEnd"/>
+      <w:r>
+        <w:t>: k = 16 ou 24</w:t>
+      </w:r>
+    </w:p>
+    <w:p>
+      <w:pPr>
+        <w:pStyle w:val="PargrafodaLista"/>
+        <w:numPr>
+          <w:ilvl w:val="2"/>
+          <w:numId w:val="43"/>
+        </w:numPr>
+        <w:jc w:val="both"/>
+      </w:pPr>
+      <w:proofErr w:type="spellStart"/>
+      <w:r>
+        <w:t>compression</w:t>
+      </w:r>
+      <w:proofErr w:type="spellEnd"/>
+      <w:r>
+        <w:t>: θ = 0.5</w:t>
+      </w:r>
+    </w:p>
+    <w:p>
+      <w:pPr>
+        <w:pStyle w:val="PargrafodaLista"/>
+        <w:numPr>
+          <w:ilvl w:val="1"/>
+          <w:numId w:val="43"/>
+        </w:numPr>
+        <w:jc w:val="both"/>
+      </w:pPr>
+      <w:r>
+        <w:t xml:space="preserve">Segundo o GPT, essa versão oferece capacidade suficiente e é comparável à ResNet-18 </w:t>
+      </w:r>
+      <w:r>
+        <w:rPr>
+          <w:color w:val="EE0000"/>
+        </w:rPr>
+        <w:t>(COMO POSSO VALIDAR ISSO?)</w:t>
+      </w:r>
+      <w:r>
+        <w:rPr>
+          <w:color w:val="EE0000"/>
+        </w:rPr>
+        <w:t>;</w:t>
+      </w:r>
+    </w:p>
+    <w:p>
+      <w:pPr>
+        <w:pStyle w:val="PargrafodaLista"/>
+        <w:numPr>
+          <w:ilvl w:val="1"/>
+          <w:numId w:val="43"/>
+        </w:numPr>
+        <w:jc w:val="both"/>
+        <w:rPr>
+          <w:color w:val="000000" w:themeColor="text1"/>
+        </w:rPr>
+      </w:pPr>
+      <w:r>
+        <w:rPr>
+          <w:color w:val="000000" w:themeColor="text1"/>
+        </w:rPr>
+        <w:t xml:space="preserve">A </w:t>
+      </w:r>
+      <w:proofErr w:type="spellStart"/>
+      <w:r>
+        <w:rPr>
+          <w:color w:val="000000" w:themeColor="text1"/>
+        </w:rPr>
+        <w:t>Densenet</w:t>
+      </w:r>
+      <w:proofErr w:type="spellEnd"/>
+      <w:r>
+        <w:rPr>
+          <w:color w:val="000000" w:themeColor="text1"/>
+        </w:rPr>
+        <w:t xml:space="preserve"> é mais sensível, por isso, é importante reduzir o LR para um valor entre 1e-3 e 5e-4;</w:t>
+      </w:r>
+    </w:p>
+    <w:p>
+      <w:pPr>
+        <w:pStyle w:val="PargrafodaLista"/>
+        <w:numPr>
+          <w:ilvl w:val="1"/>
+          <w:numId w:val="43"/>
+        </w:numPr>
+        <w:jc w:val="both"/>
+        <w:rPr>
+          <w:color w:val="000000" w:themeColor="text1"/>
+        </w:rPr>
+      </w:pPr>
+      <w:r>
+        <w:rPr>
+          <w:color w:val="000000" w:themeColor="text1"/>
+        </w:rPr>
+        <w:t xml:space="preserve">Aplicar </w:t>
+      </w:r>
+      <w:proofErr w:type="spellStart"/>
+      <w:r>
+        <w:rPr>
+          <w:color w:val="000000" w:themeColor="text1"/>
+        </w:rPr>
+        <w:t>early</w:t>
+      </w:r>
+      <w:proofErr w:type="spellEnd"/>
+      <w:r>
+        <w:rPr>
+          <w:color w:val="000000" w:themeColor="text1"/>
+        </w:rPr>
+        <w:t xml:space="preserve"> </w:t>
+      </w:r>
+      <w:proofErr w:type="spellStart"/>
+      <w:r>
+        <w:rPr>
+          <w:color w:val="000000" w:themeColor="text1"/>
+        </w:rPr>
+        <w:t>stopping</w:t>
+      </w:r>
+      <w:proofErr w:type="spellEnd"/>
+      <w:r>
+        <w:rPr>
+          <w:color w:val="000000" w:themeColor="text1"/>
+        </w:rPr>
+        <w:t xml:space="preserve"> (30~50 </w:t>
+      </w:r>
+      <w:proofErr w:type="spellStart"/>
+      <w:r>
+        <w:rPr>
+          <w:color w:val="000000" w:themeColor="text1"/>
+        </w:rPr>
+        <w:t>epochs</w:t>
+      </w:r>
+      <w:proofErr w:type="spellEnd"/>
+      <w:r>
+        <w:rPr>
+          <w:color w:val="000000" w:themeColor="text1"/>
+        </w:rPr>
+        <w:t>);</w:t>
+      </w:r>
+    </w:p>
+    <w:p>
+      <w:pPr>
+        <w:pStyle w:val="PargrafodaLista"/>
+        <w:numPr>
+          <w:ilvl w:val="1"/>
+          <w:numId w:val="43"/>
+        </w:numPr>
+        <w:jc w:val="both"/>
+        <w:rPr>
+          <w:color w:val="000000" w:themeColor="text1"/>
+        </w:rPr>
+      </w:pPr>
+      <w:proofErr w:type="spellStart"/>
+      <w:r>
+        <w:t>Dropout</w:t>
+      </w:r>
+      <w:proofErr w:type="spellEnd"/>
+      <w:r>
+        <w:t xml:space="preserve"> </w:t>
+      </w:r>
+      <w:r>
+        <w:t>(</w:t>
+      </w:r>
+      <w:r>
+        <w:t>0.2~</w:t>
+      </w:r>
+      <w:r>
+        <w:t>0.3)</w:t>
+      </w:r>
+      <w:r>
+        <w:t xml:space="preserve"> antes da camada final</w:t>
+      </w:r>
+      <w:r>
+        <w:t>;</w:t>
+      </w:r>
+    </w:p>
+    <w:p>
+      <w:pPr>
+        <w:pStyle w:val="PargrafodaLista"/>
+        <w:numPr>
+          <w:ilvl w:val="1"/>
+          <w:numId w:val="43"/>
+        </w:numPr>
+        <w:jc w:val="both"/>
+        <w:rPr>
+          <w:color w:val="000000" w:themeColor="text1"/>
+        </w:rPr>
+      </w:pPr>
+      <w:r>
+        <w:t xml:space="preserve">Aplicar Data </w:t>
+      </w:r>
+      <w:proofErr w:type="spellStart"/>
+      <w:r>
+        <w:t>Augmentation</w:t>
+      </w:r>
+      <w:proofErr w:type="spellEnd"/>
+      <w:r>
+        <w:t xml:space="preserve"> um leve, porém um pouco mais agressiva do que a utilizada para a </w:t>
+      </w:r>
+      <w:proofErr w:type="spellStart"/>
+      <w:r>
+        <w:t>MobileNet</w:t>
+      </w:r>
+      <w:proofErr w:type="spellEnd"/>
     </w:p>
     <w:p>
       <w:pPr>
@@ -7245,7 +7733,7 @@
         <v:path o:extrusionok="f" gradientshapeok="t" o:connecttype="rect"/>
         <o:lock v:ext="edit" aspectratio="t"/>
       </v:shapetype>
-      <v:shape id="_x0000_i1079" type="#_x0000_t75" style="width:693pt;height:487pt;visibility:visible;mso-wrap-style:square" o:bullet="t">
+      <v:shape id="_x0000_i1051" type="#_x0000_t75" style="width:693.1pt;height:487.1pt;visibility:visible;mso-wrap-style:square" o:bullet="t">
         <v:imagedata r:id="rId1" o:title="" croptop="19686f" cropbottom="43833f" cropleft="8606f" cropright="55951f"/>
       </v:shape>
     </w:pict>
@@ -13065,6 +13553,7 @@
   <w:style w:type="character" w:default="1" w:styleId="Fontepargpadro">
     <w:name w:val="Default Paragraph Font"/>
     <w:uiPriority w:val="1"/>
+    <w:semiHidden/>
     <w:unhideWhenUsed/>
   </w:style>
   <w:style w:type="table" w:default="1" w:styleId="Tabelanormal">
@@ -13486,6 +13975,38 @@
       <w:color w:val="666666"/>
     </w:rPr>
   </w:style>
+  <w:style w:type="paragraph" w:styleId="CabealhodoSumrio">
+    <w:name w:val="TOC Heading"/>
+    <w:basedOn w:val="Ttulo1"/>
+    <w:next w:val="Normal"/>
+    <w:uiPriority w:val="39"/>
+    <w:unhideWhenUsed/>
+    <w:qFormat/>
+    <w:rsid w:val="00A733E4"/>
+    <w:pPr>
+      <w:spacing w:before="240" w:after="0"/>
+      <w:outlineLvl w:val="9"/>
+    </w:pPr>
+    <w:rPr>
+      <w:kern w:val="0"/>
+      <w:sz w:val="32"/>
+      <w:szCs w:val="32"/>
+      <w:lang w:eastAsia="pt-BR"/>
+      <w14:ligatures w14:val="none"/>
+    </w:rPr>
+  </w:style>
+  <w:style w:type="paragraph" w:styleId="Sumrio1">
+    <w:name w:val="toc 1"/>
+    <w:basedOn w:val="Normal"/>
+    <w:next w:val="Normal"/>
+    <w:autoRedefine/>
+    <w:uiPriority w:val="39"/>
+    <w:unhideWhenUsed/>
+    <w:rsid w:val="00A733E4"/>
+    <w:pPr>
+      <w:spacing w:after="100"/>
+    </w:pPr>
+  </w:style>
 </w:styles>
 </file>
 
@@ -13782,4 +14303,16 @@
     </a:ext>
   </a:extLst>
 </a:theme>
+</file>
+
+<file path=customXml/item1.xml><?xml version="1.0" encoding="utf-8"?>
+<b:Sources xmlns:b="http://schemas.openxmlformats.org/officeDocument/2006/bibliography" xmlns="http://schemas.openxmlformats.org/officeDocument/2006/bibliography" SelectedStyle="\APASixthEditionOfficeOnline.xsl" StyleName="APA" Version="6"/>
+</file>
+
+<file path=customXml/itemProps1.xml><?xml version="1.0" encoding="utf-8"?>
+<ds:datastoreItem xmlns:ds="http://schemas.openxmlformats.org/officeDocument/2006/customXml" ds:itemID="{C37816E1-CA70-44BC-BAD8-A44ABE433DEC}">
+  <ds:schemaRefs>
+    <ds:schemaRef ds:uri="http://schemas.openxmlformats.org/officeDocument/2006/bibliography"/>
+  </ds:schemaRefs>
+</ds:datastoreItem>
 </file>
</xml_diff>

<commit_message>
Callback de Peso para DN e MN
</commit_message>
<xml_diff>
--- a/Documents and Backups/Estudos Conduzidos.docx
+++ b/Documents and Backups/Estudos Conduzidos.docx
@@ -43,6 +43,15 @@
     </w:p>
     <w:sdt>
       <w:sdtPr>
+        <w:rPr>
+          <w:rFonts w:asciiTheme="minorHAnsi" w:eastAsiaTheme="minorHAnsi" w:hAnsiTheme="minorHAnsi" w:cstheme="minorBidi"/>
+          <w:color w:val="auto"/>
+          <w:kern w:val="2"/>
+          <w:sz w:val="22"/>
+          <w:szCs w:val="22"/>
+          <w:lang w:eastAsia="en-US"/>
+          <w14:ligatures w14:val="standardContextual"/>
+        </w:rPr>
         <w:id w:val="-164017320"/>
         <w:docPartObj>
           <w:docPartGallery w:val="Table of Contents"/>
@@ -51,15 +60,8 @@
       </w:sdtPr>
       <w:sdtEndPr>
         <w:rPr>
-          <w:rFonts w:asciiTheme="minorHAnsi" w:eastAsiaTheme="minorHAnsi" w:hAnsiTheme="minorHAnsi" w:cstheme="minorBidi"/>
-          <w:b/>
-          <w:bCs/>
-          <w:color w:val="auto"/>
-          <w:kern w:val="2"/>
-          <w:sz w:val="22"/>
-          <w:szCs w:val="22"/>
-          <w:lang w:eastAsia="en-US"/>
-          <w14:ligatures w14:val="standardContextual"/>
+          <w:b/>
+          <w:bCs/>
         </w:rPr>
       </w:sdtEndPr>
       <w:sdtContent>
@@ -78,7 +80,11 @@
               <w:tab w:val="right" w:leader="dot" w:pos="8494"/>
             </w:tabs>
             <w:rPr>
+              <w:rFonts w:eastAsiaTheme="minorEastAsia"/>
               <w:noProof/>
+              <w:sz w:val="24"/>
+              <w:szCs w:val="24"/>
+              <w:lang w:eastAsia="pt-BR"/>
             </w:rPr>
           </w:pPr>
           <w:r>
@@ -90,7 +96,7 @@
           <w:r>
             <w:fldChar w:fldCharType="separate"/>
           </w:r>
-          <w:hyperlink w:anchor="_Toc226443798" w:history="1">
+          <w:hyperlink w:anchor="_Toc226783394" w:history="1">
             <w:r>
               <w:rPr>
                 <w:rStyle w:val="Hyperlink"/>
@@ -117,7 +123,7 @@
                 <w:noProof/>
                 <w:webHidden/>
               </w:rPr>
-              <w:instrText xml:space="preserve"> PAGEREF _Toc226443798 \h </w:instrText>
+              <w:instrText xml:space="preserve"> PAGEREF _Toc226783394 \h </w:instrText>
             </w:r>
             <w:r>
               <w:rPr>
@@ -155,10 +161,14 @@
               <w:tab w:val="right" w:leader="dot" w:pos="8494"/>
             </w:tabs>
             <w:rPr>
+              <w:rFonts w:eastAsiaTheme="minorEastAsia"/>
               <w:noProof/>
+              <w:sz w:val="24"/>
+              <w:szCs w:val="24"/>
+              <w:lang w:eastAsia="pt-BR"/>
             </w:rPr>
           </w:pPr>
-          <w:hyperlink w:anchor="_Toc226443799" w:history="1">
+          <w:hyperlink w:anchor="_Toc226783395" w:history="1">
             <w:r>
               <w:rPr>
                 <w:rStyle w:val="Hyperlink"/>
@@ -185,7 +195,7 @@
                 <w:noProof/>
                 <w:webHidden/>
               </w:rPr>
-              <w:instrText xml:space="preserve"> PAGEREF _Toc226443799 \h </w:instrText>
+              <w:instrText xml:space="preserve"> PAGEREF _Toc226783395 \h </w:instrText>
             </w:r>
             <w:r>
               <w:rPr>
@@ -205,7 +215,7 @@
                 <w:noProof/>
                 <w:webHidden/>
               </w:rPr>
-              <w:t>2</w:t>
+              <w:t>3</w:t>
             </w:r>
             <w:r>
               <w:rPr>
@@ -223,10 +233,14 @@
               <w:tab w:val="right" w:leader="dot" w:pos="8494"/>
             </w:tabs>
             <w:rPr>
+              <w:rFonts w:eastAsiaTheme="minorEastAsia"/>
               <w:noProof/>
+              <w:sz w:val="24"/>
+              <w:szCs w:val="24"/>
+              <w:lang w:eastAsia="pt-BR"/>
             </w:rPr>
           </w:pPr>
-          <w:hyperlink w:anchor="_Toc226443800" w:history="1">
+          <w:hyperlink w:anchor="_Toc226783396" w:history="1">
             <w:r>
               <w:rPr>
                 <w:rStyle w:val="Hyperlink"/>
@@ -253,7 +267,7 @@
                 <w:noProof/>
                 <w:webHidden/>
               </w:rPr>
-              <w:instrText xml:space="preserve"> PAGEREF _Toc226443800 \h </w:instrText>
+              <w:instrText xml:space="preserve"> PAGEREF _Toc226783396 \h </w:instrText>
             </w:r>
             <w:r>
               <w:rPr>
@@ -291,10 +305,14 @@
               <w:tab w:val="right" w:leader="dot" w:pos="8494"/>
             </w:tabs>
             <w:rPr>
+              <w:rFonts w:eastAsiaTheme="minorEastAsia"/>
               <w:noProof/>
+              <w:sz w:val="24"/>
+              <w:szCs w:val="24"/>
+              <w:lang w:eastAsia="pt-BR"/>
             </w:rPr>
           </w:pPr>
-          <w:hyperlink w:anchor="_Toc226443801" w:history="1">
+          <w:hyperlink w:anchor="_Toc226783397" w:history="1">
             <w:r>
               <w:rPr>
                 <w:rStyle w:val="Hyperlink"/>
@@ -321,7 +339,7 @@
                 <w:noProof/>
                 <w:webHidden/>
               </w:rPr>
-              <w:instrText xml:space="preserve"> PAGEREF _Toc226443801 \h </w:instrText>
+              <w:instrText xml:space="preserve"> PAGEREF _Toc226783397 \h </w:instrText>
             </w:r>
             <w:r>
               <w:rPr>
@@ -359,10 +377,14 @@
               <w:tab w:val="right" w:leader="dot" w:pos="8494"/>
             </w:tabs>
             <w:rPr>
+              <w:rFonts w:eastAsiaTheme="minorEastAsia"/>
               <w:noProof/>
+              <w:sz w:val="24"/>
+              <w:szCs w:val="24"/>
+              <w:lang w:eastAsia="pt-BR"/>
             </w:rPr>
           </w:pPr>
-          <w:hyperlink w:anchor="_Toc226443802" w:history="1">
+          <w:hyperlink w:anchor="_Toc226783398" w:history="1">
             <w:r>
               <w:rPr>
                 <w:rStyle w:val="Hyperlink"/>
@@ -389,7 +411,7 @@
                 <w:noProof/>
                 <w:webHidden/>
               </w:rPr>
-              <w:instrText xml:space="preserve"> PAGEREF _Toc226443802 \h </w:instrText>
+              <w:instrText xml:space="preserve"> PAGEREF _Toc226783398 \h </w:instrText>
             </w:r>
             <w:r>
               <w:rPr>
@@ -427,10 +449,14 @@
               <w:tab w:val="right" w:leader="dot" w:pos="8494"/>
             </w:tabs>
             <w:rPr>
+              <w:rFonts w:eastAsiaTheme="minorEastAsia"/>
               <w:noProof/>
+              <w:sz w:val="24"/>
+              <w:szCs w:val="24"/>
+              <w:lang w:eastAsia="pt-BR"/>
             </w:rPr>
           </w:pPr>
-          <w:hyperlink w:anchor="_Toc226443803" w:history="1">
+          <w:hyperlink w:anchor="_Toc226783399" w:history="1">
             <w:r>
               <w:rPr>
                 <w:rStyle w:val="Hyperlink"/>
@@ -457,7 +483,7 @@
                 <w:noProof/>
                 <w:webHidden/>
               </w:rPr>
-              <w:instrText xml:space="preserve"> PAGEREF _Toc226443803 \h </w:instrText>
+              <w:instrText xml:space="preserve"> PAGEREF _Toc226783399 \h </w:instrText>
             </w:r>
             <w:r>
               <w:rPr>
@@ -477,7 +503,7 @@
                 <w:noProof/>
                 <w:webHidden/>
               </w:rPr>
-              <w:t>7</w:t>
+              <w:t>8</w:t>
             </w:r>
             <w:r>
               <w:rPr>
@@ -495,10 +521,14 @@
               <w:tab w:val="right" w:leader="dot" w:pos="8494"/>
             </w:tabs>
             <w:rPr>
+              <w:rFonts w:eastAsiaTheme="minorEastAsia"/>
               <w:noProof/>
+              <w:sz w:val="24"/>
+              <w:szCs w:val="24"/>
+              <w:lang w:eastAsia="pt-BR"/>
             </w:rPr>
           </w:pPr>
-          <w:hyperlink w:anchor="_Toc226443804" w:history="1">
+          <w:hyperlink w:anchor="_Toc226783400" w:history="1">
             <w:r>
               <w:rPr>
                 <w:rStyle w:val="Hyperlink"/>
@@ -525,75 +555,7 @@
                 <w:noProof/>
                 <w:webHidden/>
               </w:rPr>
-              <w:instrText xml:space="preserve"> PAGEREF _Toc226443804 \h </w:instrText>
-            </w:r>
-            <w:r>
-              <w:rPr>
-                <w:noProof/>
-                <w:webHidden/>
-              </w:rPr>
-            </w:r>
-            <w:r>
-              <w:rPr>
-                <w:noProof/>
-                <w:webHidden/>
-              </w:rPr>
-              <w:fldChar w:fldCharType="separate"/>
-            </w:r>
-            <w:r>
-              <w:rPr>
-                <w:noProof/>
-                <w:webHidden/>
-              </w:rPr>
-              <w:t>9</w:t>
-            </w:r>
-            <w:r>
-              <w:rPr>
-                <w:noProof/>
-                <w:webHidden/>
-              </w:rPr>
-              <w:fldChar w:fldCharType="end"/>
-            </w:r>
-          </w:hyperlink>
-        </w:p>
-        <w:p>
-          <w:pPr>
-            <w:pStyle w:val="Sumrio1"/>
-            <w:tabs>
-              <w:tab w:val="right" w:leader="dot" w:pos="8494"/>
-            </w:tabs>
-            <w:rPr>
-              <w:noProof/>
-            </w:rPr>
-          </w:pPr>
-          <w:hyperlink w:anchor="_Toc226443805" w:history="1">
-            <w:r>
-              <w:rPr>
-                <w:rStyle w:val="Hyperlink"/>
-                <w:noProof/>
-              </w:rPr>
-              <w:t>ESTUDO EXPLORATÓRIO 8 – CONFIGURAÇÃO OTIMIZADA PARA DENSENET</w:t>
-            </w:r>
-            <w:r>
-              <w:rPr>
-                <w:noProof/>
-                <w:webHidden/>
-              </w:rPr>
-              <w:tab/>
-            </w:r>
-            <w:r>
-              <w:rPr>
-                <w:noProof/>
-                <w:webHidden/>
-              </w:rPr>
-              <w:fldChar w:fldCharType="begin"/>
-            </w:r>
-            <w:r>
-              <w:rPr>
-                <w:noProof/>
-                <w:webHidden/>
-              </w:rPr>
-              <w:instrText xml:space="preserve"> PAGEREF _Toc226443805 \h </w:instrText>
+              <w:instrText xml:space="preserve"> PAGEREF _Toc226783400 \h </w:instrText>
             </w:r>
             <w:r>
               <w:rPr>
@@ -625,6 +587,150 @@
           </w:hyperlink>
         </w:p>
         <w:p>
+          <w:pPr>
+            <w:pStyle w:val="Sumrio1"/>
+            <w:tabs>
+              <w:tab w:val="right" w:leader="dot" w:pos="8494"/>
+            </w:tabs>
+            <w:rPr>
+              <w:rFonts w:eastAsiaTheme="minorEastAsia"/>
+              <w:noProof/>
+              <w:sz w:val="24"/>
+              <w:szCs w:val="24"/>
+              <w:lang w:eastAsia="pt-BR"/>
+            </w:rPr>
+          </w:pPr>
+          <w:hyperlink w:anchor="_Toc226783401" w:history="1">
+            <w:r>
+              <w:rPr>
+                <w:rStyle w:val="Hyperlink"/>
+                <w:noProof/>
+              </w:rPr>
+              <w:t>ESTUDO EXPLORATÓRIO 8 – CONFIGURAÇÃO OTIMIZADA PARA DENSENET</w:t>
+            </w:r>
+            <w:r>
+              <w:rPr>
+                <w:noProof/>
+                <w:webHidden/>
+              </w:rPr>
+              <w:tab/>
+            </w:r>
+            <w:r>
+              <w:rPr>
+                <w:noProof/>
+                <w:webHidden/>
+              </w:rPr>
+              <w:fldChar w:fldCharType="begin"/>
+            </w:r>
+            <w:r>
+              <w:rPr>
+                <w:noProof/>
+                <w:webHidden/>
+              </w:rPr>
+              <w:instrText xml:space="preserve"> PAGEREF _Toc226783401 \h </w:instrText>
+            </w:r>
+            <w:r>
+              <w:rPr>
+                <w:noProof/>
+                <w:webHidden/>
+              </w:rPr>
+            </w:r>
+            <w:r>
+              <w:rPr>
+                <w:noProof/>
+                <w:webHidden/>
+              </w:rPr>
+              <w:fldChar w:fldCharType="separate"/>
+            </w:r>
+            <w:r>
+              <w:rPr>
+                <w:noProof/>
+                <w:webHidden/>
+              </w:rPr>
+              <w:t>11</w:t>
+            </w:r>
+            <w:r>
+              <w:rPr>
+                <w:noProof/>
+                <w:webHidden/>
+              </w:rPr>
+              <w:fldChar w:fldCharType="end"/>
+            </w:r>
+          </w:hyperlink>
+        </w:p>
+        <w:p>
+          <w:pPr>
+            <w:pStyle w:val="Sumrio1"/>
+            <w:tabs>
+              <w:tab w:val="right" w:leader="dot" w:pos="8494"/>
+            </w:tabs>
+            <w:rPr>
+              <w:rFonts w:eastAsiaTheme="minorEastAsia"/>
+              <w:noProof/>
+              <w:sz w:val="24"/>
+              <w:szCs w:val="24"/>
+              <w:lang w:eastAsia="pt-BR"/>
+            </w:rPr>
+          </w:pPr>
+          <w:hyperlink w:anchor="_Toc226783402" w:history="1">
+            <w:r>
+              <w:rPr>
+                <w:rStyle w:val="Hyperlink"/>
+                <w:noProof/>
+              </w:rPr>
+              <w:t>ESTUDO EXPLORATÓRIO 9 – CÁLCULO DO ERRO PELO TENSORFLOW</w:t>
+            </w:r>
+            <w:r>
+              <w:rPr>
+                <w:noProof/>
+                <w:webHidden/>
+              </w:rPr>
+              <w:tab/>
+            </w:r>
+            <w:r>
+              <w:rPr>
+                <w:noProof/>
+                <w:webHidden/>
+              </w:rPr>
+              <w:fldChar w:fldCharType="begin"/>
+            </w:r>
+            <w:r>
+              <w:rPr>
+                <w:noProof/>
+                <w:webHidden/>
+              </w:rPr>
+              <w:instrText xml:space="preserve"> PAGEREF _Toc226783402 \h </w:instrText>
+            </w:r>
+            <w:r>
+              <w:rPr>
+                <w:noProof/>
+                <w:webHidden/>
+              </w:rPr>
+            </w:r>
+            <w:r>
+              <w:rPr>
+                <w:noProof/>
+                <w:webHidden/>
+              </w:rPr>
+              <w:fldChar w:fldCharType="separate"/>
+            </w:r>
+            <w:r>
+              <w:rPr>
+                <w:noProof/>
+                <w:webHidden/>
+              </w:rPr>
+              <w:t>11</w:t>
+            </w:r>
+            <w:r>
+              <w:rPr>
+                <w:noProof/>
+                <w:webHidden/>
+              </w:rPr>
+              <w:fldChar w:fldCharType="end"/>
+            </w:r>
+          </w:hyperlink>
+        </w:p>
+        <w:p>
           <w:r>
             <w:rPr>
               <w:b/>
@@ -639,7 +745,7 @@
       <w:pPr>
         <w:pStyle w:val="Ttulo1"/>
       </w:pPr>
-      <w:bookmarkStart w:id="0" w:name="_Toc226443798"/>
+      <w:bookmarkStart w:id="0" w:name="_Toc226783394"/>
       <w:r>
         <w:t xml:space="preserve">ESTUDO EXPLORATÓRIO 1: </w:t>
       </w:r>
@@ -925,7 +1031,6 @@
         <w:jc w:val="both"/>
       </w:pPr>
       <w:r>
-        <w:lastRenderedPageBreak/>
         <w:t xml:space="preserve">A figura </w:t>
       </w:r>
       <w:r>
@@ -1397,7 +1502,7 @@
       <w:pPr>
         <w:pStyle w:val="Ttulo1"/>
       </w:pPr>
-      <w:bookmarkStart w:id="1" w:name="_Toc226443799"/>
+      <w:bookmarkStart w:id="1" w:name="_Toc226783395"/>
       <w:r>
         <w:lastRenderedPageBreak/>
         <w:t xml:space="preserve">ESTUDO EXPLORATÓRIO 2: </w:t>
@@ -2121,7 +2226,7 @@
       <w:pPr>
         <w:pStyle w:val="Ttulo1"/>
       </w:pPr>
-      <w:bookmarkStart w:id="4" w:name="_Toc226443800"/>
+      <w:bookmarkStart w:id="4" w:name="_Toc226783396"/>
       <w:r>
         <w:t xml:space="preserve">ESTUDO EXPLORATÓRIO 3 – </w:t>
       </w:r>
@@ -2350,7 +2455,7 @@
       <w:pPr>
         <w:pStyle w:val="Ttulo1"/>
       </w:pPr>
-      <w:bookmarkStart w:id="5" w:name="_Toc226443801"/>
+      <w:bookmarkStart w:id="5" w:name="_Toc226783397"/>
       <w:r>
         <w:t xml:space="preserve">ESTUDO EXPLORATÓRIO 4 – </w:t>
       </w:r>
@@ -3619,7 +3724,7 @@
       <w:pPr>
         <w:pStyle w:val="Ttulo1"/>
       </w:pPr>
-      <w:bookmarkStart w:id="6" w:name="_Toc226443802"/>
+      <w:bookmarkStart w:id="6" w:name="_Toc226783398"/>
       <w:r>
         <w:t xml:space="preserve">ESTUDO EXPLORATÓRIO 5 – </w:t>
       </w:r>
@@ -5242,7 +5347,7 @@
       <w:pPr>
         <w:pStyle w:val="Ttulo1"/>
       </w:pPr>
-      <w:bookmarkStart w:id="7" w:name="_Toc226443803"/>
+      <w:bookmarkStart w:id="7" w:name="_Toc226783399"/>
       <w:r>
         <w:lastRenderedPageBreak/>
         <w:t xml:space="preserve">ESTUDO EXPLORATÓRIO </w:t>
@@ -6488,7 +6593,7 @@
       <w:pPr>
         <w:pStyle w:val="Ttulo1"/>
       </w:pPr>
-      <w:bookmarkStart w:id="8" w:name="_Toc226443804"/>
+      <w:bookmarkStart w:id="8" w:name="_Toc226783400"/>
       <w:r>
         <w:lastRenderedPageBreak/>
         <w:t xml:space="preserve">ESTUDO EXPLORATÓRIO </w:t>
@@ -7180,7 +7285,7 @@
       <w:pPr>
         <w:pStyle w:val="Ttulo1"/>
       </w:pPr>
-      <w:bookmarkStart w:id="9" w:name="_Toc226443805"/>
+      <w:bookmarkStart w:id="9" w:name="_Toc226783401"/>
       <w:r>
         <w:lastRenderedPageBreak/>
         <w:t xml:space="preserve">ESTUDO EXPLORATÓRIO </w:t>
@@ -7192,10 +7297,7 @@
         <w:t xml:space="preserve"> – </w:t>
       </w:r>
       <w:r>
-        <w:t xml:space="preserve">CONFIGURAÇÃO OTIMIZADA PARA </w:t>
-      </w:r>
-      <w:r>
-        <w:t>DENSENET</w:t>
+        <w:t>CONFIGURAÇÃO OTIMIZADA PARA DENSENET</w:t>
       </w:r>
       <w:bookmarkEnd w:id="9"/>
     </w:p>
@@ -7259,13 +7361,7 @@
         <w:t xml:space="preserve"> </w:t>
       </w:r>
       <w:r>
-        <w:t>DenseNet-121</w:t>
-      </w:r>
-      <w:r>
-        <w:t xml:space="preserve"> f</w:t>
-      </w:r>
-      <w:r>
-        <w:t xml:space="preserve">oi feita para </w:t>
+        <w:t xml:space="preserve">DenseNet-121 foi feita para </w:t>
       </w:r>
       <w:proofErr w:type="spellStart"/>
       <w:r>
@@ -7273,10 +7369,7 @@
       </w:r>
       <w:proofErr w:type="spellEnd"/>
       <w:r>
-        <w:t xml:space="preserve"> (1.2M imagens)</w:t>
-      </w:r>
-      <w:r>
-        <w:t xml:space="preserve"> e por </w:t>
+        <w:t xml:space="preserve"> (1.2M imagens) e por </w:t>
       </w:r>
       <w:proofErr w:type="spellStart"/>
       <w:r>
@@ -7284,10 +7377,7 @@
       </w:r>
       <w:proofErr w:type="spellEnd"/>
       <w:r>
-        <w:t xml:space="preserve"> é muito profunda para a aplicação deste projeto, isso aumenta consideravelmente o</w:t>
-      </w:r>
-      <w:r>
-        <w:t xml:space="preserve"> risco de </w:t>
+        <w:t xml:space="preserve"> é muito profunda para a aplicação deste projeto, isso aumenta consideravelmente o risco de </w:t>
       </w:r>
       <w:proofErr w:type="spellStart"/>
       <w:r>
@@ -7628,25 +7718,481 @@
     </w:p>
     <w:p>
       <w:pPr>
-        <w:jc w:val="both"/>
-        <w:rPr>
-          <w:color w:val="000000" w:themeColor="text1"/>
-        </w:rPr>
-      </w:pPr>
-    </w:p>
-    <w:p>
-      <w:pPr>
-        <w:jc w:val="both"/>
-        <w:rPr>
-          <w:color w:val="000000" w:themeColor="text1"/>
-        </w:rPr>
-      </w:pPr>
-    </w:p>
-    <w:p>
-      <w:pPr>
-        <w:jc w:val="both"/>
-        <w:rPr>
-          <w:color w:val="000000" w:themeColor="text1"/>
+        <w:pStyle w:val="Ttulo1"/>
+      </w:pPr>
+      <w:bookmarkStart w:id="10" w:name="_Toc226783402"/>
+      <w:r>
+        <w:t xml:space="preserve">ESTUDO EXPLORATÓRIO </w:t>
+      </w:r>
+      <w:r>
+        <w:t>9</w:t>
+      </w:r>
+      <w:r>
+        <w:t xml:space="preserve"> – </w:t>
+      </w:r>
+      <w:r>
+        <w:t>CÁLCULO DO ERRO PELO TENSORFLOW</w:t>
+      </w:r>
+      <w:bookmarkEnd w:id="10"/>
+    </w:p>
+    <w:p>
+      <w:pPr>
+        <w:pStyle w:val="PargrafodaLista"/>
+        <w:numPr>
+          <w:ilvl w:val="0"/>
+          <w:numId w:val="48"/>
+        </w:numPr>
+        <w:jc w:val="both"/>
+        <w:rPr>
+          <w:color w:val="000000" w:themeColor="text1"/>
+        </w:rPr>
+      </w:pPr>
+      <w:r>
+        <w:t>A ideia principal é: o “erro” (</w:t>
+      </w:r>
+      <w:proofErr w:type="spellStart"/>
+      <w:r>
+        <w:t>loss</w:t>
+      </w:r>
+      <w:proofErr w:type="spellEnd"/>
+      <w:r>
+        <w:t xml:space="preserve">) que o </w:t>
+      </w:r>
+      <w:proofErr w:type="spellStart"/>
+      <w:r>
+        <w:t>TensorFlow</w:t>
+      </w:r>
+      <w:proofErr w:type="spellEnd"/>
+      <w:r>
+        <w:t xml:space="preserve"> mostra normalmente usa uma função chamada </w:t>
+      </w:r>
+      <w:proofErr w:type="spellStart"/>
+      <w:r>
+        <w:t>cross-entropy</w:t>
+      </w:r>
+      <w:proofErr w:type="spellEnd"/>
+      <w:r>
+        <w:t xml:space="preserve"> (entropia cruzada)</w:t>
+      </w:r>
+    </w:p>
+    <w:p>
+      <w:pPr>
+        <w:pStyle w:val="PargrafodaLista"/>
+        <w:numPr>
+          <w:ilvl w:val="0"/>
+          <w:numId w:val="48"/>
+        </w:numPr>
+        <w:jc w:val="both"/>
+        <w:rPr>
+          <w:color w:val="000000" w:themeColor="text1"/>
+        </w:rPr>
+      </w:pPr>
+      <w:r>
+        <w:rPr>
+          <w:color w:val="000000" w:themeColor="text1"/>
+        </w:rPr>
+        <w:t xml:space="preserve">Para classificação com </w:t>
+      </w:r>
+      <w:proofErr w:type="spellStart"/>
+      <w:r>
+        <w:rPr>
+          <w:color w:val="000000" w:themeColor="text1"/>
+        </w:rPr>
+        <w:t>CNNs</w:t>
+      </w:r>
+      <w:proofErr w:type="spellEnd"/>
+      <w:r>
+        <w:rPr>
+          <w:color w:val="000000" w:themeColor="text1"/>
+        </w:rPr>
+        <w:t>, o mais comum é usar:</w:t>
+      </w:r>
+    </w:p>
+    <w:p>
+      <w:pPr>
+        <w:pStyle w:val="PargrafodaLista"/>
+        <w:numPr>
+          <w:ilvl w:val="1"/>
+          <w:numId w:val="48"/>
+        </w:numPr>
+        <w:jc w:val="both"/>
+        <w:rPr>
+          <w:color w:val="000000" w:themeColor="text1"/>
+        </w:rPr>
+      </w:pPr>
+      <w:proofErr w:type="spellStart"/>
+      <w:r>
+        <w:rPr>
+          <w:color w:val="000000" w:themeColor="text1"/>
+        </w:rPr>
+        <w:t>categorical_crossentropy</w:t>
+      </w:r>
+      <w:proofErr w:type="spellEnd"/>
+      <w:r>
+        <w:rPr>
+          <w:color w:val="000000" w:themeColor="text1"/>
+        </w:rPr>
+        <w:t xml:space="preserve"> (</w:t>
+      </w:r>
+      <w:proofErr w:type="spellStart"/>
+      <w:r>
+        <w:rPr>
+          <w:color w:val="000000" w:themeColor="text1"/>
+        </w:rPr>
+        <w:t>one</w:t>
+      </w:r>
+      <w:proofErr w:type="spellEnd"/>
+      <w:r>
+        <w:rPr>
+          <w:color w:val="000000" w:themeColor="text1"/>
+        </w:rPr>
+        <w:t>-hot)</w:t>
+      </w:r>
+    </w:p>
+    <w:p>
+      <w:pPr>
+        <w:pStyle w:val="PargrafodaLista"/>
+        <w:numPr>
+          <w:ilvl w:val="1"/>
+          <w:numId w:val="48"/>
+        </w:numPr>
+        <w:jc w:val="both"/>
+        <w:rPr>
+          <w:color w:val="000000" w:themeColor="text1"/>
+        </w:rPr>
+      </w:pPr>
+      <w:proofErr w:type="spellStart"/>
+      <w:r>
+        <w:rPr>
+          <w:color w:val="000000" w:themeColor="text1"/>
+        </w:rPr>
+        <w:t>sparse_categorical_crossentropy</w:t>
+      </w:r>
+      <w:proofErr w:type="spellEnd"/>
+      <w:r>
+        <w:rPr>
+          <w:color w:val="000000" w:themeColor="text1"/>
+        </w:rPr>
+        <w:t xml:space="preserve"> (</w:t>
+      </w:r>
+      <w:proofErr w:type="spellStart"/>
+      <w:r>
+        <w:rPr>
+          <w:color w:val="000000" w:themeColor="text1"/>
+        </w:rPr>
+        <w:t>labels</w:t>
+      </w:r>
+      <w:proofErr w:type="spellEnd"/>
+      <w:r>
+        <w:rPr>
+          <w:color w:val="000000" w:themeColor="text1"/>
+        </w:rPr>
+        <w:t xml:space="preserve"> como números)</w:t>
+      </w:r>
+    </w:p>
+    <w:p>
+      <w:pPr>
+        <w:jc w:val="center"/>
+        <w:rPr>
+          <w:color w:val="000000" w:themeColor="text1"/>
+        </w:rPr>
+      </w:pPr>
+      <w:r>
+        <w:rPr>
+          <w:color w:val="000000" w:themeColor="text1"/>
+        </w:rPr>
+        <w:drawing>
+          <wp:inline distT="0" distB="0" distL="0" distR="0" wp14:anchorId="0B77F82A" wp14:editId="6F9268A8">
+            <wp:extent cx="3348990" cy="1186166"/>
+            <wp:effectExtent l="0" t="0" r="3810" b="0"/>
+            <wp:docPr id="1912721472" name="Imagem 1"/>
+            <wp:cNvGraphicFramePr>
+              <a:graphicFrameLocks xmlns:a="http://schemas.openxmlformats.org/drawingml/2006/main" noChangeAspect="1"/>
+            </wp:cNvGraphicFramePr>
+            <a:graphic xmlns:a="http://schemas.openxmlformats.org/drawingml/2006/main">
+              <a:graphicData uri="http://schemas.openxmlformats.org/drawingml/2006/picture">
+                <pic:pic xmlns:pic="http://schemas.openxmlformats.org/drawingml/2006/picture">
+                  <pic:nvPicPr>
+                    <pic:cNvPr id="1912721472" name=""/>
+                    <pic:cNvPicPr/>
+                  </pic:nvPicPr>
+                  <pic:blipFill>
+                    <a:blip r:embed="rId16"/>
+                    <a:stretch>
+                      <a:fillRect/>
+                    </a:stretch>
+                  </pic:blipFill>
+                  <pic:spPr>
+                    <a:xfrm>
+                      <a:off x="0" y="0"/>
+                      <a:ext cx="3355563" cy="1188494"/>
+                    </a:xfrm>
+                    <a:prstGeom prst="rect">
+                      <a:avLst/>
+                    </a:prstGeom>
+                  </pic:spPr>
+                </pic:pic>
+              </a:graphicData>
+            </a:graphic>
+          </wp:inline>
+        </w:drawing>
+      </w:r>
+    </w:p>
+    <w:p>
+      <w:pPr>
+        <w:jc w:val="both"/>
+        <w:rPr>
+          <w:rFonts w:eastAsiaTheme="minorEastAsia"/>
+          <w:color w:val="000000" w:themeColor="text1"/>
+          <w:sz w:val="28"/>
+          <w:szCs w:val="28"/>
+        </w:rPr>
+      </w:pPr>
+      <m:oMathPara>
+        <m:oMath>
+          <m:r>
+            <w:rPr>
+              <w:rFonts w:ascii="Cambria Math" w:hAnsi="Cambria Math"/>
+              <w:color w:val="000000" w:themeColor="text1"/>
+              <w:sz w:val="28"/>
+              <w:szCs w:val="28"/>
+            </w:rPr>
+            <m:t>Loss = -log(</m:t>
+          </m:r>
+          <m:sSub>
+            <m:sSubPr>
+              <m:ctrlPr>
+                <w:rPr>
+                  <w:rFonts w:ascii="Cambria Math" w:hAnsi="Cambria Math"/>
+                  <w:i/>
+                  <w:color w:val="000000" w:themeColor="text1"/>
+                  <w:sz w:val="28"/>
+                  <w:szCs w:val="28"/>
+                </w:rPr>
+              </m:ctrlPr>
+            </m:sSubPr>
+            <m:e>
+              <m:r>
+                <w:rPr>
+                  <w:rFonts w:ascii="Cambria Math" w:hAnsi="Cambria Math"/>
+                  <w:color w:val="000000" w:themeColor="text1"/>
+                  <w:sz w:val="28"/>
+                  <w:szCs w:val="28"/>
+                </w:rPr>
+                <m:t>P</m:t>
+              </m:r>
+            </m:e>
+            <m:sub>
+              <m:r>
+                <w:rPr>
+                  <w:rFonts w:ascii="Cambria Math" w:hAnsi="Cambria Math"/>
+                  <w:color w:val="000000" w:themeColor="text1"/>
+                  <w:sz w:val="28"/>
+                  <w:szCs w:val="28"/>
+                </w:rPr>
+                <m:t>classe_correta</m:t>
+              </m:r>
+            </m:sub>
+          </m:sSub>
+          <m:r>
+            <w:rPr>
+              <w:rFonts w:ascii="Cambria Math" w:hAnsi="Cambria Math"/>
+              <w:color w:val="000000" w:themeColor="text1"/>
+              <w:sz w:val="28"/>
+              <w:szCs w:val="28"/>
+            </w:rPr>
+            <m:t>)</m:t>
+          </m:r>
+        </m:oMath>
+      </m:oMathPara>
+    </w:p>
+    <w:p>
+      <w:pPr>
+        <w:pStyle w:val="PargrafodaLista"/>
+        <w:numPr>
+          <w:ilvl w:val="0"/>
+          <w:numId w:val="49"/>
+        </w:numPr>
+        <w:jc w:val="both"/>
+        <w:rPr>
+          <w:color w:val="000000" w:themeColor="text1"/>
+        </w:rPr>
+      </w:pPr>
+      <w:r>
+        <w:rPr>
+          <w:color w:val="000000" w:themeColor="text1"/>
+        </w:rPr>
+        <w:lastRenderedPageBreak/>
+        <w:t>Exemplo prático:</w:t>
+      </w:r>
+    </w:p>
+    <w:p>
+      <w:pPr>
+        <w:pStyle w:val="PargrafodaLista"/>
+        <w:ind w:left="1788"/>
+        <w:jc w:val="both"/>
+        <w:rPr>
+          <w:color w:val="000000" w:themeColor="text1"/>
+        </w:rPr>
+      </w:pPr>
+    </w:p>
+    <w:p>
+      <w:pPr>
+        <w:pStyle w:val="PargrafodaLista"/>
+        <w:numPr>
+          <w:ilvl w:val="1"/>
+          <w:numId w:val="49"/>
+        </w:numPr>
+        <w:jc w:val="both"/>
+        <w:rPr>
+          <w:color w:val="000000" w:themeColor="text1"/>
+        </w:rPr>
+      </w:pPr>
+      <w:r>
+        <w:rPr>
+          <w:color w:val="000000" w:themeColor="text1"/>
+        </w:rPr>
+        <w:t>O problema possui 3 classes distintas – [0, 1, 2]</w:t>
+      </w:r>
+    </w:p>
+    <w:p>
+      <w:pPr>
+        <w:pStyle w:val="PargrafodaLista"/>
+        <w:numPr>
+          <w:ilvl w:val="1"/>
+          <w:numId w:val="49"/>
+        </w:numPr>
+        <w:jc w:val="both"/>
+        <w:rPr>
+          <w:color w:val="000000" w:themeColor="text1"/>
+        </w:rPr>
+      </w:pPr>
+      <w:r>
+        <w:rPr>
+          <w:color w:val="000000" w:themeColor="text1"/>
+        </w:rPr>
+        <w:t>Para um dado exemplo, supomos que a classe correta seja a 0</w:t>
+      </w:r>
+    </w:p>
+    <w:p>
+      <w:pPr>
+        <w:pStyle w:val="PargrafodaLista"/>
+        <w:numPr>
+          <w:ilvl w:val="1"/>
+          <w:numId w:val="49"/>
+        </w:numPr>
+        <w:jc w:val="both"/>
+        <w:rPr>
+          <w:color w:val="000000" w:themeColor="text1"/>
+        </w:rPr>
+      </w:pPr>
+      <w:r>
+        <w:rPr>
+          <w:color w:val="000000" w:themeColor="text1"/>
+        </w:rPr>
+        <w:t>A predição do classificador resulta em</w:t>
+      </w:r>
+      <w:r>
+        <w:rPr>
+          <w:color w:val="000000" w:themeColor="text1"/>
+        </w:rPr>
+        <w:t>: [0.9, 0.05, 0.05]</w:t>
+      </w:r>
+    </w:p>
+    <w:p>
+      <w:pPr>
+        <w:pStyle w:val="PargrafodaLista"/>
+        <w:numPr>
+          <w:ilvl w:val="1"/>
+          <w:numId w:val="49"/>
+        </w:numPr>
+        <w:jc w:val="both"/>
+        <w:rPr>
+          <w:color w:val="000000" w:themeColor="text1"/>
+        </w:rPr>
+      </w:pPr>
+      <w:r>
+        <w:rPr>
+          <w:color w:val="000000" w:themeColor="text1"/>
+        </w:rPr>
+        <w:t>Cálculo de erro:</w:t>
+      </w:r>
+    </w:p>
+    <w:p>
+      <w:pPr>
+        <w:pStyle w:val="PargrafodaLista"/>
+        <w:ind w:left="1788"/>
+        <w:jc w:val="both"/>
+        <w:rPr>
+          <w:color w:val="000000" w:themeColor="text1"/>
+        </w:rPr>
+      </w:pPr>
+    </w:p>
+    <w:p>
+      <w:pPr>
+        <w:pStyle w:val="PargrafodaLista"/>
+        <w:ind w:left="2496" w:firstLine="336"/>
+        <w:jc w:val="both"/>
+        <w:rPr>
+          <w:rFonts w:eastAsiaTheme="minorEastAsia"/>
+          <w:color w:val="000000" w:themeColor="text1"/>
+          <w:sz w:val="28"/>
+          <w:szCs w:val="28"/>
+        </w:rPr>
+      </w:pPr>
+      <m:oMathPara>
+        <m:oMathParaPr>
+          <m:jc m:val="left"/>
+        </m:oMathParaPr>
+        <m:oMath>
+          <m:r>
+            <w:rPr>
+              <w:rFonts w:ascii="Cambria Math" w:hAnsi="Cambria Math"/>
+              <w:color w:val="000000" w:themeColor="text1"/>
+              <w:sz w:val="28"/>
+              <w:szCs w:val="28"/>
+            </w:rPr>
+            <m:t>loss=-log</m:t>
+          </m:r>
+          <m:r>
+            <w:rPr>
+              <w:rFonts w:ascii="Cambria Math" w:hAnsi="Cambria Math"/>
+              <w:color w:val="000000" w:themeColor="text1"/>
+              <w:sz w:val="28"/>
+              <w:szCs w:val="28"/>
+            </w:rPr>
+            <m:t>(</m:t>
+          </m:r>
+          <m:r>
+            <w:rPr>
+              <w:rFonts w:ascii="Cambria Math" w:hAnsi="Cambria Math"/>
+              <w:color w:val="000000" w:themeColor="text1"/>
+              <w:sz w:val="28"/>
+              <w:szCs w:val="28"/>
+            </w:rPr>
+            <m:t>0.9)≈0.1</m:t>
+          </m:r>
+          <m:r>
+            <w:rPr>
+              <w:rFonts w:ascii="Cambria Math" w:hAnsi="Cambria Math"/>
+              <w:color w:val="000000" w:themeColor="text1"/>
+              <w:sz w:val="28"/>
+              <w:szCs w:val="28"/>
+            </w:rPr>
+            <m:t>0</m:t>
+          </m:r>
+        </m:oMath>
+      </m:oMathPara>
+    </w:p>
+    <w:p>
+      <w:pPr>
+        <w:pStyle w:val="PargrafodaLista"/>
+        <w:ind w:left="2496" w:firstLine="336"/>
+        <w:jc w:val="both"/>
+        <w:rPr>
+          <w:color w:val="000000" w:themeColor="text1"/>
+          <w:sz w:val="28"/>
+          <w:szCs w:val="28"/>
         </w:rPr>
       </w:pPr>
     </w:p>
@@ -7733,7 +8279,7 @@
         <v:path o:extrusionok="f" gradientshapeok="t" o:connecttype="rect"/>
         <o:lock v:ext="edit" aspectratio="t"/>
       </v:shapetype>
-      <v:shape id="_x0000_i1051" type="#_x0000_t75" style="width:693.1pt;height:487.1pt;visibility:visible;mso-wrap-style:square" o:bullet="t">
+      <v:shape id="_x0000_i1060" type="#_x0000_t75" style="width:693pt;height:487pt;visibility:visible;mso-wrap-style:square" o:bullet="t">
         <v:imagedata r:id="rId1" o:title="" croptop="19686f" cropbottom="43833f" cropleft="8606f" cropright="55951f"/>
       </v:shape>
     </w:pict>
@@ -10281,6 +10827,119 @@
     </w:lvl>
   </w:abstractNum>
   <w:abstractNum w:abstractNumId="23" w15:restartNumberingAfterBreak="0">
+    <w:nsid w:val="32356899"/>
+    <w:multiLevelType w:val="hybridMultilevel"/>
+    <w:tmpl w:val="2A68615A"/>
+    <w:lvl w:ilvl="0" w:tplc="04160001">
+      <w:start w:val="1"/>
+      <w:numFmt w:val="bullet"/>
+      <w:lvlText w:val=""/>
+      <w:lvlJc w:val="left"/>
+      <w:pPr>
+        <w:ind w:left="1068" w:hanging="360"/>
+      </w:pPr>
+      <w:rPr>
+        <w:rFonts w:ascii="Symbol" w:hAnsi="Symbol" w:hint="default"/>
+      </w:rPr>
+    </w:lvl>
+    <w:lvl w:ilvl="1" w:tplc="04160003">
+      <w:start w:val="1"/>
+      <w:numFmt w:val="bullet"/>
+      <w:lvlText w:val="o"/>
+      <w:lvlJc w:val="left"/>
+      <w:pPr>
+        <w:ind w:left="1788" w:hanging="360"/>
+      </w:pPr>
+      <w:rPr>
+        <w:rFonts w:ascii="Courier New" w:hAnsi="Courier New" w:cs="Courier New" w:hint="default"/>
+      </w:rPr>
+    </w:lvl>
+    <w:lvl w:ilvl="2" w:tplc="04160005">
+      <w:start w:val="1"/>
+      <w:numFmt w:val="bullet"/>
+      <w:lvlText w:val=""/>
+      <w:lvlJc w:val="left"/>
+      <w:pPr>
+        <w:ind w:left="2508" w:hanging="360"/>
+      </w:pPr>
+      <w:rPr>
+        <w:rFonts w:ascii="Wingdings" w:hAnsi="Wingdings" w:hint="default"/>
+      </w:rPr>
+    </w:lvl>
+    <w:lvl w:ilvl="3" w:tplc="04160001" w:tentative="1">
+      <w:start w:val="1"/>
+      <w:numFmt w:val="bullet"/>
+      <w:lvlText w:val=""/>
+      <w:lvlJc w:val="left"/>
+      <w:pPr>
+        <w:ind w:left="3228" w:hanging="360"/>
+      </w:pPr>
+      <w:rPr>
+        <w:rFonts w:ascii="Symbol" w:hAnsi="Symbol" w:hint="default"/>
+      </w:rPr>
+    </w:lvl>
+    <w:lvl w:ilvl="4" w:tplc="04160003" w:tentative="1">
+      <w:start w:val="1"/>
+      <w:numFmt w:val="bullet"/>
+      <w:lvlText w:val="o"/>
+      <w:lvlJc w:val="left"/>
+      <w:pPr>
+        <w:ind w:left="3948" w:hanging="360"/>
+      </w:pPr>
+      <w:rPr>
+        <w:rFonts w:ascii="Courier New" w:hAnsi="Courier New" w:cs="Courier New" w:hint="default"/>
+      </w:rPr>
+    </w:lvl>
+    <w:lvl w:ilvl="5" w:tplc="04160005" w:tentative="1">
+      <w:start w:val="1"/>
+      <w:numFmt w:val="bullet"/>
+      <w:lvlText w:val=""/>
+      <w:lvlJc w:val="left"/>
+      <w:pPr>
+        <w:ind w:left="4668" w:hanging="360"/>
+      </w:pPr>
+      <w:rPr>
+        <w:rFonts w:ascii="Wingdings" w:hAnsi="Wingdings" w:hint="default"/>
+      </w:rPr>
+    </w:lvl>
+    <w:lvl w:ilvl="6" w:tplc="04160001" w:tentative="1">
+      <w:start w:val="1"/>
+      <w:numFmt w:val="bullet"/>
+      <w:lvlText w:val=""/>
+      <w:lvlJc w:val="left"/>
+      <w:pPr>
+        <w:ind w:left="5388" w:hanging="360"/>
+      </w:pPr>
+      <w:rPr>
+        <w:rFonts w:ascii="Symbol" w:hAnsi="Symbol" w:hint="default"/>
+      </w:rPr>
+    </w:lvl>
+    <w:lvl w:ilvl="7" w:tplc="04160003" w:tentative="1">
+      <w:start w:val="1"/>
+      <w:numFmt w:val="bullet"/>
+      <w:lvlText w:val="o"/>
+      <w:lvlJc w:val="left"/>
+      <w:pPr>
+        <w:ind w:left="6108" w:hanging="360"/>
+      </w:pPr>
+      <w:rPr>
+        <w:rFonts w:ascii="Courier New" w:hAnsi="Courier New" w:cs="Courier New" w:hint="default"/>
+      </w:rPr>
+    </w:lvl>
+    <w:lvl w:ilvl="8" w:tplc="04160005" w:tentative="1">
+      <w:start w:val="1"/>
+      <w:numFmt w:val="bullet"/>
+      <w:lvlText w:val=""/>
+      <w:lvlJc w:val="left"/>
+      <w:pPr>
+        <w:ind w:left="6828" w:hanging="360"/>
+      </w:pPr>
+      <w:rPr>
+        <w:rFonts w:ascii="Wingdings" w:hAnsi="Wingdings" w:hint="default"/>
+      </w:rPr>
+    </w:lvl>
+  </w:abstractNum>
+  <w:abstractNum w:abstractNumId="24" w15:restartNumberingAfterBreak="0">
     <w:nsid w:val="363B3C5A"/>
     <w:multiLevelType w:val="hybridMultilevel"/>
     <w:tmpl w:val="16A40D1A"/>
@@ -10393,7 +11052,7 @@
       </w:rPr>
     </w:lvl>
   </w:abstractNum>
-  <w:abstractNum w:abstractNumId="24" w15:restartNumberingAfterBreak="0">
+  <w:abstractNum w:abstractNumId="25" w15:restartNumberingAfterBreak="0">
     <w:nsid w:val="39EA0086"/>
     <w:multiLevelType w:val="multilevel"/>
     <w:tmpl w:val="765C0A0E"/>
@@ -10506,7 +11165,7 @@
       </w:pPr>
     </w:lvl>
   </w:abstractNum>
-  <w:abstractNum w:abstractNumId="25" w15:restartNumberingAfterBreak="0">
+  <w:abstractNum w:abstractNumId="26" w15:restartNumberingAfterBreak="0">
     <w:nsid w:val="3A44790F"/>
     <w:multiLevelType w:val="hybridMultilevel"/>
     <w:tmpl w:val="6A1AC588"/>
@@ -10619,7 +11278,7 @@
       </w:rPr>
     </w:lvl>
   </w:abstractNum>
-  <w:abstractNum w:abstractNumId="26" w15:restartNumberingAfterBreak="0">
+  <w:abstractNum w:abstractNumId="27" w15:restartNumberingAfterBreak="0">
     <w:nsid w:val="3D216CD6"/>
     <w:multiLevelType w:val="hybridMultilevel"/>
     <w:tmpl w:val="2062B20A"/>
@@ -10732,7 +11391,7 @@
       </w:rPr>
     </w:lvl>
   </w:abstractNum>
-  <w:abstractNum w:abstractNumId="27" w15:restartNumberingAfterBreak="0">
+  <w:abstractNum w:abstractNumId="28" w15:restartNumberingAfterBreak="0">
     <w:nsid w:val="435C54D2"/>
     <w:multiLevelType w:val="hybridMultilevel"/>
     <w:tmpl w:val="AC84C2FE"/>
@@ -10820,7 +11479,7 @@
       </w:pPr>
     </w:lvl>
   </w:abstractNum>
-  <w:abstractNum w:abstractNumId="28" w15:restartNumberingAfterBreak="0">
+  <w:abstractNum w:abstractNumId="29" w15:restartNumberingAfterBreak="0">
     <w:nsid w:val="467A7958"/>
     <w:multiLevelType w:val="hybridMultilevel"/>
     <w:tmpl w:val="F98C2DB2"/>
@@ -10933,7 +11592,7 @@
       </w:rPr>
     </w:lvl>
   </w:abstractNum>
-  <w:abstractNum w:abstractNumId="29" w15:restartNumberingAfterBreak="0">
+  <w:abstractNum w:abstractNumId="30" w15:restartNumberingAfterBreak="0">
     <w:nsid w:val="4B8D2BA5"/>
     <w:multiLevelType w:val="hybridMultilevel"/>
     <w:tmpl w:val="33A0FD20"/>
@@ -11046,7 +11705,7 @@
       </w:rPr>
     </w:lvl>
   </w:abstractNum>
-  <w:abstractNum w:abstractNumId="30" w15:restartNumberingAfterBreak="0">
+  <w:abstractNum w:abstractNumId="31" w15:restartNumberingAfterBreak="0">
     <w:nsid w:val="4E491E67"/>
     <w:multiLevelType w:val="hybridMultilevel"/>
     <w:tmpl w:val="65BC7184"/>
@@ -11159,7 +11818,120 @@
       </w:rPr>
     </w:lvl>
   </w:abstractNum>
-  <w:abstractNum w:abstractNumId="31" w15:restartNumberingAfterBreak="0">
+  <w:abstractNum w:abstractNumId="32" w15:restartNumberingAfterBreak="0">
+    <w:nsid w:val="56B238B8"/>
+    <w:multiLevelType w:val="hybridMultilevel"/>
+    <w:tmpl w:val="5A001A8C"/>
+    <w:lvl w:ilvl="0" w:tplc="04160001">
+      <w:start w:val="1"/>
+      <w:numFmt w:val="bullet"/>
+      <w:lvlText w:val=""/>
+      <w:lvlJc w:val="left"/>
+      <w:pPr>
+        <w:ind w:left="1068" w:hanging="360"/>
+      </w:pPr>
+      <w:rPr>
+        <w:rFonts w:ascii="Symbol" w:hAnsi="Symbol" w:hint="default"/>
+      </w:rPr>
+    </w:lvl>
+    <w:lvl w:ilvl="1" w:tplc="04160003" w:tentative="1">
+      <w:start w:val="1"/>
+      <w:numFmt w:val="bullet"/>
+      <w:lvlText w:val="o"/>
+      <w:lvlJc w:val="left"/>
+      <w:pPr>
+        <w:ind w:left="1788" w:hanging="360"/>
+      </w:pPr>
+      <w:rPr>
+        <w:rFonts w:ascii="Courier New" w:hAnsi="Courier New" w:cs="Courier New" w:hint="default"/>
+      </w:rPr>
+    </w:lvl>
+    <w:lvl w:ilvl="2" w:tplc="04160005" w:tentative="1">
+      <w:start w:val="1"/>
+      <w:numFmt w:val="bullet"/>
+      <w:lvlText w:val=""/>
+      <w:lvlJc w:val="left"/>
+      <w:pPr>
+        <w:ind w:left="2508" w:hanging="360"/>
+      </w:pPr>
+      <w:rPr>
+        <w:rFonts w:ascii="Wingdings" w:hAnsi="Wingdings" w:hint="default"/>
+      </w:rPr>
+    </w:lvl>
+    <w:lvl w:ilvl="3" w:tplc="04160001" w:tentative="1">
+      <w:start w:val="1"/>
+      <w:numFmt w:val="bullet"/>
+      <w:lvlText w:val=""/>
+      <w:lvlJc w:val="left"/>
+      <w:pPr>
+        <w:ind w:left="3228" w:hanging="360"/>
+      </w:pPr>
+      <w:rPr>
+        <w:rFonts w:ascii="Symbol" w:hAnsi="Symbol" w:hint="default"/>
+      </w:rPr>
+    </w:lvl>
+    <w:lvl w:ilvl="4" w:tplc="04160003" w:tentative="1">
+      <w:start w:val="1"/>
+      <w:numFmt w:val="bullet"/>
+      <w:lvlText w:val="o"/>
+      <w:lvlJc w:val="left"/>
+      <w:pPr>
+        <w:ind w:left="3948" w:hanging="360"/>
+      </w:pPr>
+      <w:rPr>
+        <w:rFonts w:ascii="Courier New" w:hAnsi="Courier New" w:cs="Courier New" w:hint="default"/>
+      </w:rPr>
+    </w:lvl>
+    <w:lvl w:ilvl="5" w:tplc="04160005" w:tentative="1">
+      <w:start w:val="1"/>
+      <w:numFmt w:val="bullet"/>
+      <w:lvlText w:val=""/>
+      <w:lvlJc w:val="left"/>
+      <w:pPr>
+        <w:ind w:left="4668" w:hanging="360"/>
+      </w:pPr>
+      <w:rPr>
+        <w:rFonts w:ascii="Wingdings" w:hAnsi="Wingdings" w:hint="default"/>
+      </w:rPr>
+    </w:lvl>
+    <w:lvl w:ilvl="6" w:tplc="04160001" w:tentative="1">
+      <w:start w:val="1"/>
+      <w:numFmt w:val="bullet"/>
+      <w:lvlText w:val=""/>
+      <w:lvlJc w:val="left"/>
+      <w:pPr>
+        <w:ind w:left="5388" w:hanging="360"/>
+      </w:pPr>
+      <w:rPr>
+        <w:rFonts w:ascii="Symbol" w:hAnsi="Symbol" w:hint="default"/>
+      </w:rPr>
+    </w:lvl>
+    <w:lvl w:ilvl="7" w:tplc="04160003" w:tentative="1">
+      <w:start w:val="1"/>
+      <w:numFmt w:val="bullet"/>
+      <w:lvlText w:val="o"/>
+      <w:lvlJc w:val="left"/>
+      <w:pPr>
+        <w:ind w:left="6108" w:hanging="360"/>
+      </w:pPr>
+      <w:rPr>
+        <w:rFonts w:ascii="Courier New" w:hAnsi="Courier New" w:cs="Courier New" w:hint="default"/>
+      </w:rPr>
+    </w:lvl>
+    <w:lvl w:ilvl="8" w:tplc="04160005" w:tentative="1">
+      <w:start w:val="1"/>
+      <w:numFmt w:val="bullet"/>
+      <w:lvlText w:val=""/>
+      <w:lvlJc w:val="left"/>
+      <w:pPr>
+        <w:ind w:left="6828" w:hanging="360"/>
+      </w:pPr>
+      <w:rPr>
+        <w:rFonts w:ascii="Wingdings" w:hAnsi="Wingdings" w:hint="default"/>
+      </w:rPr>
+    </w:lvl>
+  </w:abstractNum>
+  <w:abstractNum w:abstractNumId="33" w15:restartNumberingAfterBreak="0">
     <w:nsid w:val="572156B3"/>
     <w:multiLevelType w:val="hybridMultilevel"/>
     <w:tmpl w:val="BA2471CE"/>
@@ -11272,7 +12044,7 @@
       </w:rPr>
     </w:lvl>
   </w:abstractNum>
-  <w:abstractNum w:abstractNumId="32" w15:restartNumberingAfterBreak="0">
+  <w:abstractNum w:abstractNumId="34" w15:restartNumberingAfterBreak="0">
     <w:nsid w:val="59E26DE5"/>
     <w:multiLevelType w:val="hybridMultilevel"/>
     <w:tmpl w:val="7AB8865A"/>
@@ -11358,7 +12130,7 @@
       </w:pPr>
     </w:lvl>
   </w:abstractNum>
-  <w:abstractNum w:abstractNumId="33" w15:restartNumberingAfterBreak="0">
+  <w:abstractNum w:abstractNumId="35" w15:restartNumberingAfterBreak="0">
     <w:nsid w:val="5C1E465F"/>
     <w:multiLevelType w:val="hybridMultilevel"/>
     <w:tmpl w:val="CC70734E"/>
@@ -11471,7 +12243,120 @@
       </w:rPr>
     </w:lvl>
   </w:abstractNum>
-  <w:abstractNum w:abstractNumId="34" w15:restartNumberingAfterBreak="0">
+  <w:abstractNum w:abstractNumId="36" w15:restartNumberingAfterBreak="0">
+    <w:nsid w:val="5DE15B64"/>
+    <w:multiLevelType w:val="hybridMultilevel"/>
+    <w:tmpl w:val="C276D696"/>
+    <w:lvl w:ilvl="0" w:tplc="04160001">
+      <w:start w:val="1"/>
+      <w:numFmt w:val="bullet"/>
+      <w:lvlText w:val=""/>
+      <w:lvlJc w:val="left"/>
+      <w:pPr>
+        <w:ind w:left="1068" w:hanging="360"/>
+      </w:pPr>
+      <w:rPr>
+        <w:rFonts w:ascii="Symbol" w:hAnsi="Symbol" w:hint="default"/>
+      </w:rPr>
+    </w:lvl>
+    <w:lvl w:ilvl="1" w:tplc="04160003">
+      <w:start w:val="1"/>
+      <w:numFmt w:val="bullet"/>
+      <w:lvlText w:val="o"/>
+      <w:lvlJc w:val="left"/>
+      <w:pPr>
+        <w:ind w:left="1788" w:hanging="360"/>
+      </w:pPr>
+      <w:rPr>
+        <w:rFonts w:ascii="Courier New" w:hAnsi="Courier New" w:cs="Courier New" w:hint="default"/>
+      </w:rPr>
+    </w:lvl>
+    <w:lvl w:ilvl="2" w:tplc="04160005" w:tentative="1">
+      <w:start w:val="1"/>
+      <w:numFmt w:val="bullet"/>
+      <w:lvlText w:val=""/>
+      <w:lvlJc w:val="left"/>
+      <w:pPr>
+        <w:ind w:left="2508" w:hanging="360"/>
+      </w:pPr>
+      <w:rPr>
+        <w:rFonts w:ascii="Wingdings" w:hAnsi="Wingdings" w:hint="default"/>
+      </w:rPr>
+    </w:lvl>
+    <w:lvl w:ilvl="3" w:tplc="04160001" w:tentative="1">
+      <w:start w:val="1"/>
+      <w:numFmt w:val="bullet"/>
+      <w:lvlText w:val=""/>
+      <w:lvlJc w:val="left"/>
+      <w:pPr>
+        <w:ind w:left="3228" w:hanging="360"/>
+      </w:pPr>
+      <w:rPr>
+        <w:rFonts w:ascii="Symbol" w:hAnsi="Symbol" w:hint="default"/>
+      </w:rPr>
+    </w:lvl>
+    <w:lvl w:ilvl="4" w:tplc="04160003" w:tentative="1">
+      <w:start w:val="1"/>
+      <w:numFmt w:val="bullet"/>
+      <w:lvlText w:val="o"/>
+      <w:lvlJc w:val="left"/>
+      <w:pPr>
+        <w:ind w:left="3948" w:hanging="360"/>
+      </w:pPr>
+      <w:rPr>
+        <w:rFonts w:ascii="Courier New" w:hAnsi="Courier New" w:cs="Courier New" w:hint="default"/>
+      </w:rPr>
+    </w:lvl>
+    <w:lvl w:ilvl="5" w:tplc="04160005" w:tentative="1">
+      <w:start w:val="1"/>
+      <w:numFmt w:val="bullet"/>
+      <w:lvlText w:val=""/>
+      <w:lvlJc w:val="left"/>
+      <w:pPr>
+        <w:ind w:left="4668" w:hanging="360"/>
+      </w:pPr>
+      <w:rPr>
+        <w:rFonts w:ascii="Wingdings" w:hAnsi="Wingdings" w:hint="default"/>
+      </w:rPr>
+    </w:lvl>
+    <w:lvl w:ilvl="6" w:tplc="04160001" w:tentative="1">
+      <w:start w:val="1"/>
+      <w:numFmt w:val="bullet"/>
+      <w:lvlText w:val=""/>
+      <w:lvlJc w:val="left"/>
+      <w:pPr>
+        <w:ind w:left="5388" w:hanging="360"/>
+      </w:pPr>
+      <w:rPr>
+        <w:rFonts w:ascii="Symbol" w:hAnsi="Symbol" w:hint="default"/>
+      </w:rPr>
+    </w:lvl>
+    <w:lvl w:ilvl="7" w:tplc="04160003" w:tentative="1">
+      <w:start w:val="1"/>
+      <w:numFmt w:val="bullet"/>
+      <w:lvlText w:val="o"/>
+      <w:lvlJc w:val="left"/>
+      <w:pPr>
+        <w:ind w:left="6108" w:hanging="360"/>
+      </w:pPr>
+      <w:rPr>
+        <w:rFonts w:ascii="Courier New" w:hAnsi="Courier New" w:cs="Courier New" w:hint="default"/>
+      </w:rPr>
+    </w:lvl>
+    <w:lvl w:ilvl="8" w:tplc="04160005" w:tentative="1">
+      <w:start w:val="1"/>
+      <w:numFmt w:val="bullet"/>
+      <w:lvlText w:val=""/>
+      <w:lvlJc w:val="left"/>
+      <w:pPr>
+        <w:ind w:left="6828" w:hanging="360"/>
+      </w:pPr>
+      <w:rPr>
+        <w:rFonts w:ascii="Wingdings" w:hAnsi="Wingdings" w:hint="default"/>
+      </w:rPr>
+    </w:lvl>
+  </w:abstractNum>
+  <w:abstractNum w:abstractNumId="37" w15:restartNumberingAfterBreak="0">
     <w:nsid w:val="613B7216"/>
     <w:multiLevelType w:val="hybridMultilevel"/>
     <w:tmpl w:val="6C2069C4"/>
@@ -11563,7 +12448,7 @@
       </w:pPr>
     </w:lvl>
   </w:abstractNum>
-  <w:abstractNum w:abstractNumId="35" w15:restartNumberingAfterBreak="0">
+  <w:abstractNum w:abstractNumId="38" w15:restartNumberingAfterBreak="0">
     <w:nsid w:val="61455081"/>
     <w:multiLevelType w:val="hybridMultilevel"/>
     <w:tmpl w:val="C7EA0426"/>
@@ -11673,7 +12558,7 @@
       </w:rPr>
     </w:lvl>
   </w:abstractNum>
-  <w:abstractNum w:abstractNumId="36" w15:restartNumberingAfterBreak="0">
+  <w:abstractNum w:abstractNumId="39" w15:restartNumberingAfterBreak="0">
     <w:nsid w:val="66301293"/>
     <w:multiLevelType w:val="hybridMultilevel"/>
     <w:tmpl w:val="2A7C4AA2"/>
@@ -11786,7 +12671,7 @@
       </w:rPr>
     </w:lvl>
   </w:abstractNum>
-  <w:abstractNum w:abstractNumId="37" w15:restartNumberingAfterBreak="0">
+  <w:abstractNum w:abstractNumId="40" w15:restartNumberingAfterBreak="0">
     <w:nsid w:val="72881E46"/>
     <w:multiLevelType w:val="hybridMultilevel"/>
     <w:tmpl w:val="9FFE752E"/>
@@ -11899,7 +12784,7 @@
       </w:rPr>
     </w:lvl>
   </w:abstractNum>
-  <w:abstractNum w:abstractNumId="38" w15:restartNumberingAfterBreak="0">
+  <w:abstractNum w:abstractNumId="41" w15:restartNumberingAfterBreak="0">
     <w:nsid w:val="739B653B"/>
     <w:multiLevelType w:val="hybridMultilevel"/>
     <w:tmpl w:val="86004430"/>
@@ -12012,7 +12897,7 @@
       </w:rPr>
     </w:lvl>
   </w:abstractNum>
-  <w:abstractNum w:abstractNumId="39" w15:restartNumberingAfterBreak="0">
+  <w:abstractNum w:abstractNumId="42" w15:restartNumberingAfterBreak="0">
     <w:nsid w:val="75C603A4"/>
     <w:multiLevelType w:val="hybridMultilevel"/>
     <w:tmpl w:val="9E6C079A"/>
@@ -12122,7 +13007,7 @@
       </w:rPr>
     </w:lvl>
   </w:abstractNum>
-  <w:abstractNum w:abstractNumId="40" w15:restartNumberingAfterBreak="0">
+  <w:abstractNum w:abstractNumId="43" w15:restartNumberingAfterBreak="0">
     <w:nsid w:val="76F55A3F"/>
     <w:multiLevelType w:val="multilevel"/>
     <w:tmpl w:val="D6425CC6"/>
@@ -12271,7 +13156,7 @@
       </w:rPr>
     </w:lvl>
   </w:abstractNum>
-  <w:abstractNum w:abstractNumId="41" w15:restartNumberingAfterBreak="0">
+  <w:abstractNum w:abstractNumId="44" w15:restartNumberingAfterBreak="0">
     <w:nsid w:val="785D5530"/>
     <w:multiLevelType w:val="hybridMultilevel"/>
     <w:tmpl w:val="B5BC727C"/>
@@ -12384,7 +13269,7 @@
       </w:rPr>
     </w:lvl>
   </w:abstractNum>
-  <w:abstractNum w:abstractNumId="42" w15:restartNumberingAfterBreak="0">
+  <w:abstractNum w:abstractNumId="45" w15:restartNumberingAfterBreak="0">
     <w:nsid w:val="78A40A9E"/>
     <w:multiLevelType w:val="hybridMultilevel"/>
     <w:tmpl w:val="1E8C2ABE"/>
@@ -12470,7 +13355,7 @@
       </w:pPr>
     </w:lvl>
   </w:abstractNum>
-  <w:abstractNum w:abstractNumId="43" w15:restartNumberingAfterBreak="0">
+  <w:abstractNum w:abstractNumId="46" w15:restartNumberingAfterBreak="0">
     <w:nsid w:val="7C4F3572"/>
     <w:multiLevelType w:val="hybridMultilevel"/>
     <w:tmpl w:val="10F02A50"/>
@@ -12583,7 +13468,7 @@
       </w:rPr>
     </w:lvl>
   </w:abstractNum>
-  <w:abstractNum w:abstractNumId="44" w15:restartNumberingAfterBreak="0">
+  <w:abstractNum w:abstractNumId="47" w15:restartNumberingAfterBreak="0">
     <w:nsid w:val="7D075251"/>
     <w:multiLevelType w:val="hybridMultilevel"/>
     <w:tmpl w:val="DE3E8316"/>
@@ -12696,7 +13581,7 @@
       </w:rPr>
     </w:lvl>
   </w:abstractNum>
-  <w:abstractNum w:abstractNumId="45" w15:restartNumberingAfterBreak="0">
+  <w:abstractNum w:abstractNumId="48" w15:restartNumberingAfterBreak="0">
     <w:nsid w:val="7FD31BE5"/>
     <w:multiLevelType w:val="hybridMultilevel"/>
     <w:tmpl w:val="A54CCE82"/>
@@ -12810,13 +13695,13 @@
     </w:lvl>
   </w:abstractNum>
   <w:num w:numId="1" w16cid:durableId="231621070">
-    <w:abstractNumId w:val="27"/>
+    <w:abstractNumId w:val="28"/>
   </w:num>
   <w:num w:numId="2" w16cid:durableId="494537868">
     <w:abstractNumId w:val="12"/>
   </w:num>
   <w:num w:numId="3" w16cid:durableId="555967944">
-    <w:abstractNumId w:val="41"/>
+    <w:abstractNumId w:val="44"/>
   </w:num>
   <w:num w:numId="4" w16cid:durableId="975720977">
     <w:abstractNumId w:val="17"/>
@@ -12825,7 +13710,7 @@
     <w:abstractNumId w:val="2"/>
   </w:num>
   <w:num w:numId="6" w16cid:durableId="1947691180">
-    <w:abstractNumId w:val="34"/>
+    <w:abstractNumId w:val="37"/>
   </w:num>
   <w:num w:numId="7" w16cid:durableId="543980649">
     <w:abstractNumId w:val="16"/>
@@ -12834,10 +13719,10 @@
     <w:abstractNumId w:val="0"/>
   </w:num>
   <w:num w:numId="9" w16cid:durableId="736512136">
-    <w:abstractNumId w:val="31"/>
+    <w:abstractNumId w:val="33"/>
   </w:num>
   <w:num w:numId="10" w16cid:durableId="1832524834">
-    <w:abstractNumId w:val="44"/>
+    <w:abstractNumId w:val="47"/>
   </w:num>
   <w:num w:numId="11" w16cid:durableId="1122117184">
     <w:abstractNumId w:val="22"/>
@@ -12852,55 +13737,55 @@
     <w:abstractNumId w:val="3"/>
   </w:num>
   <w:num w:numId="15" w16cid:durableId="1046374455">
-    <w:abstractNumId w:val="36"/>
+    <w:abstractNumId w:val="39"/>
   </w:num>
   <w:num w:numId="16" w16cid:durableId="1399130606">
     <w:abstractNumId w:val="13"/>
   </w:num>
   <w:num w:numId="17" w16cid:durableId="279843836">
-    <w:abstractNumId w:val="33"/>
+    <w:abstractNumId w:val="35"/>
   </w:num>
   <w:num w:numId="18" w16cid:durableId="1173257668">
     <w:abstractNumId w:val="14"/>
   </w:num>
   <w:num w:numId="19" w16cid:durableId="1573469366">
-    <w:abstractNumId w:val="30"/>
+    <w:abstractNumId w:val="31"/>
   </w:num>
   <w:num w:numId="20" w16cid:durableId="1306812659">
     <w:abstractNumId w:val="5"/>
   </w:num>
   <w:num w:numId="21" w16cid:durableId="655647183">
-    <w:abstractNumId w:val="45"/>
+    <w:abstractNumId w:val="48"/>
   </w:num>
   <w:num w:numId="22" w16cid:durableId="915549673">
     <w:abstractNumId w:val="1"/>
   </w:num>
   <w:num w:numId="23" w16cid:durableId="1525512738">
-    <w:abstractNumId w:val="28"/>
+    <w:abstractNumId w:val="29"/>
   </w:num>
   <w:num w:numId="24" w16cid:durableId="2027976820">
-    <w:abstractNumId w:val="29"/>
+    <w:abstractNumId w:val="30"/>
   </w:num>
   <w:num w:numId="25" w16cid:durableId="115225939">
-    <w:abstractNumId w:val="43"/>
+    <w:abstractNumId w:val="46"/>
   </w:num>
   <w:num w:numId="26" w16cid:durableId="1462114911">
-    <w:abstractNumId w:val="38"/>
+    <w:abstractNumId w:val="41"/>
   </w:num>
   <w:num w:numId="27" w16cid:durableId="1454132460">
+    <w:abstractNumId w:val="26"/>
+  </w:num>
+  <w:num w:numId="28" w16cid:durableId="16584153">
     <w:abstractNumId w:val="25"/>
   </w:num>
-  <w:num w:numId="28" w16cid:durableId="16584153">
-    <w:abstractNumId w:val="24"/>
-  </w:num>
   <w:num w:numId="29" w16cid:durableId="515537849">
-    <w:abstractNumId w:val="26"/>
+    <w:abstractNumId w:val="27"/>
   </w:num>
   <w:num w:numId="30" w16cid:durableId="954872968">
     <w:abstractNumId w:val="10"/>
   </w:num>
   <w:num w:numId="31" w16cid:durableId="1487283039">
-    <w:abstractNumId w:val="23"/>
+    <w:abstractNumId w:val="24"/>
   </w:num>
   <w:num w:numId="32" w16cid:durableId="1614098087">
     <w:abstractNumId w:val="9"/>
@@ -12909,7 +13794,7 @@
     <w:abstractNumId w:val="18"/>
   </w:num>
   <w:num w:numId="34" w16cid:durableId="734277080">
-    <w:abstractNumId w:val="39"/>
+    <w:abstractNumId w:val="42"/>
   </w:num>
   <w:num w:numId="35" w16cid:durableId="598677082">
     <w:abstractNumId w:val="15"/>
@@ -12918,7 +13803,7 @@
     <w:abstractNumId w:val="7"/>
   </w:num>
   <w:num w:numId="37" w16cid:durableId="503669862">
-    <w:abstractNumId w:val="35"/>
+    <w:abstractNumId w:val="38"/>
   </w:num>
   <w:num w:numId="38" w16cid:durableId="539130844">
     <w:abstractNumId w:val="4"/>
@@ -12930,10 +13815,10 @@
     <w:abstractNumId w:val="20"/>
   </w:num>
   <w:num w:numId="41" w16cid:durableId="1073894177">
-    <w:abstractNumId w:val="37"/>
+    <w:abstractNumId w:val="40"/>
   </w:num>
   <w:num w:numId="42" w16cid:durableId="776487993">
-    <w:abstractNumId w:val="42"/>
+    <w:abstractNumId w:val="45"/>
   </w:num>
   <w:num w:numId="43" w16cid:durableId="970675162">
     <w:abstractNumId w:val="8"/>
@@ -12942,10 +13827,19 @@
     <w:abstractNumId w:val="6"/>
   </w:num>
   <w:num w:numId="45" w16cid:durableId="375591668">
+    <w:abstractNumId w:val="34"/>
+  </w:num>
+  <w:num w:numId="46" w16cid:durableId="1354721866">
+    <w:abstractNumId w:val="43"/>
+  </w:num>
+  <w:num w:numId="47" w16cid:durableId="2006320800">
     <w:abstractNumId w:val="32"/>
   </w:num>
-  <w:num w:numId="46" w16cid:durableId="1354721866">
-    <w:abstractNumId w:val="40"/>
+  <w:num w:numId="48" w16cid:durableId="1650596410">
+    <w:abstractNumId w:val="36"/>
+  </w:num>
+  <w:num w:numId="49" w16cid:durableId="933393196">
+    <w:abstractNumId w:val="23"/>
   </w:num>
 </w:numbering>
 </file>
@@ -13553,7 +14447,6 @@
   <w:style w:type="character" w:default="1" w:styleId="Fontepargpadro">
     <w:name w:val="Default Paragraph Font"/>
     <w:uiPriority w:val="1"/>
-    <w:semiHidden/>
     <w:unhideWhenUsed/>
   </w:style>
   <w:style w:type="table" w:default="1" w:styleId="Tabelanormal">

</xml_diff>

<commit_message>
Atualização da documentação de estudos
</commit_message>
<xml_diff>
--- a/Documents and Backups/Estudos Conduzidos.docx
+++ b/Documents and Backups/Estudos Conduzidos.docx
@@ -96,7 +96,7 @@
           <w:r>
             <w:fldChar w:fldCharType="separate"/>
           </w:r>
-          <w:hyperlink w:anchor="_Toc226783394" w:history="1">
+          <w:hyperlink w:anchor="_Toc228861937" w:history="1">
             <w:r>
               <w:rPr>
                 <w:rStyle w:val="Hyperlink"/>
@@ -123,7 +123,7 @@
                 <w:noProof/>
                 <w:webHidden/>
               </w:rPr>
-              <w:instrText xml:space="preserve"> PAGEREF _Toc226783394 \h </w:instrText>
+              <w:instrText xml:space="preserve"> PAGEREF _Toc228861937 \h </w:instrText>
             </w:r>
             <w:r>
               <w:rPr>
@@ -168,7 +168,7 @@
               <w:lang w:eastAsia="pt-BR"/>
             </w:rPr>
           </w:pPr>
-          <w:hyperlink w:anchor="_Toc226783395" w:history="1">
+          <w:hyperlink w:anchor="_Toc228861938" w:history="1">
             <w:r>
               <w:rPr>
                 <w:rStyle w:val="Hyperlink"/>
@@ -195,7 +195,7 @@
                 <w:noProof/>
                 <w:webHidden/>
               </w:rPr>
-              <w:instrText xml:space="preserve"> PAGEREF _Toc226783395 \h </w:instrText>
+              <w:instrText xml:space="preserve"> PAGEREF _Toc228861938 \h </w:instrText>
             </w:r>
             <w:r>
               <w:rPr>
@@ -240,7 +240,7 @@
               <w:lang w:eastAsia="pt-BR"/>
             </w:rPr>
           </w:pPr>
-          <w:hyperlink w:anchor="_Toc226783396" w:history="1">
+          <w:hyperlink w:anchor="_Toc228861939" w:history="1">
             <w:r>
               <w:rPr>
                 <w:rStyle w:val="Hyperlink"/>
@@ -267,7 +267,7 @@
                 <w:noProof/>
                 <w:webHidden/>
               </w:rPr>
-              <w:instrText xml:space="preserve"> PAGEREF _Toc226783396 \h </w:instrText>
+              <w:instrText xml:space="preserve"> PAGEREF _Toc228861939 \h </w:instrText>
             </w:r>
             <w:r>
               <w:rPr>
@@ -312,7 +312,7 @@
               <w:lang w:eastAsia="pt-BR"/>
             </w:rPr>
           </w:pPr>
-          <w:hyperlink w:anchor="_Toc226783397" w:history="1">
+          <w:hyperlink w:anchor="_Toc228861940" w:history="1">
             <w:r>
               <w:rPr>
                 <w:rStyle w:val="Hyperlink"/>
@@ -339,7 +339,7 @@
                 <w:noProof/>
                 <w:webHidden/>
               </w:rPr>
-              <w:instrText xml:space="preserve"> PAGEREF _Toc226783397 \h </w:instrText>
+              <w:instrText xml:space="preserve"> PAGEREF _Toc228861940 \h </w:instrText>
             </w:r>
             <w:r>
               <w:rPr>
@@ -384,7 +384,7 @@
               <w:lang w:eastAsia="pt-BR"/>
             </w:rPr>
           </w:pPr>
-          <w:hyperlink w:anchor="_Toc226783398" w:history="1">
+          <w:hyperlink w:anchor="_Toc228861941" w:history="1">
             <w:r>
               <w:rPr>
                 <w:rStyle w:val="Hyperlink"/>
@@ -411,7 +411,7 @@
                 <w:noProof/>
                 <w:webHidden/>
               </w:rPr>
-              <w:instrText xml:space="preserve"> PAGEREF _Toc226783398 \h </w:instrText>
+              <w:instrText xml:space="preserve"> PAGEREF _Toc228861941 \h </w:instrText>
             </w:r>
             <w:r>
               <w:rPr>
@@ -456,7 +456,7 @@
               <w:lang w:eastAsia="pt-BR"/>
             </w:rPr>
           </w:pPr>
-          <w:hyperlink w:anchor="_Toc226783399" w:history="1">
+          <w:hyperlink w:anchor="_Toc228861942" w:history="1">
             <w:r>
               <w:rPr>
                 <w:rStyle w:val="Hyperlink"/>
@@ -483,7 +483,7 @@
                 <w:noProof/>
                 <w:webHidden/>
               </w:rPr>
-              <w:instrText xml:space="preserve"> PAGEREF _Toc226783399 \h </w:instrText>
+              <w:instrText xml:space="preserve"> PAGEREF _Toc228861942 \h </w:instrText>
             </w:r>
             <w:r>
               <w:rPr>
@@ -528,7 +528,7 @@
               <w:lang w:eastAsia="pt-BR"/>
             </w:rPr>
           </w:pPr>
-          <w:hyperlink w:anchor="_Toc226783400" w:history="1">
+          <w:hyperlink w:anchor="_Toc228861943" w:history="1">
             <w:r>
               <w:rPr>
                 <w:rStyle w:val="Hyperlink"/>
@@ -555,7 +555,7 @@
                 <w:noProof/>
                 <w:webHidden/>
               </w:rPr>
-              <w:instrText xml:space="preserve"> PAGEREF _Toc226783400 \h </w:instrText>
+              <w:instrText xml:space="preserve"> PAGEREF _Toc228861943 \h </w:instrText>
             </w:r>
             <w:r>
               <w:rPr>
@@ -600,7 +600,7 @@
               <w:lang w:eastAsia="pt-BR"/>
             </w:rPr>
           </w:pPr>
-          <w:hyperlink w:anchor="_Toc226783401" w:history="1">
+          <w:hyperlink w:anchor="_Toc228861944" w:history="1">
             <w:r>
               <w:rPr>
                 <w:rStyle w:val="Hyperlink"/>
@@ -627,7 +627,7 @@
                 <w:noProof/>
                 <w:webHidden/>
               </w:rPr>
-              <w:instrText xml:space="preserve"> PAGEREF _Toc226783401 \h </w:instrText>
+              <w:instrText xml:space="preserve"> PAGEREF _Toc228861944 \h </w:instrText>
             </w:r>
             <w:r>
               <w:rPr>
@@ -672,7 +672,7 @@
               <w:lang w:eastAsia="pt-BR"/>
             </w:rPr>
           </w:pPr>
-          <w:hyperlink w:anchor="_Toc226783402" w:history="1">
+          <w:hyperlink w:anchor="_Toc228861945" w:history="1">
             <w:r>
               <w:rPr>
                 <w:rStyle w:val="Hyperlink"/>
@@ -699,7 +699,7 @@
                 <w:noProof/>
                 <w:webHidden/>
               </w:rPr>
-              <w:instrText xml:space="preserve"> PAGEREF _Toc226783402 \h </w:instrText>
+              <w:instrText xml:space="preserve"> PAGEREF _Toc228861945 \h </w:instrText>
             </w:r>
             <w:r>
               <w:rPr>
@@ -731,6 +731,78 @@
           </w:hyperlink>
         </w:p>
         <w:p>
+          <w:pPr>
+            <w:pStyle w:val="Sumrio1"/>
+            <w:tabs>
+              <w:tab w:val="right" w:leader="dot" w:pos="8494"/>
+            </w:tabs>
+            <w:rPr>
+              <w:rFonts w:eastAsiaTheme="minorEastAsia"/>
+              <w:noProof/>
+              <w:sz w:val="24"/>
+              <w:szCs w:val="24"/>
+              <w:lang w:eastAsia="pt-BR"/>
+            </w:rPr>
+          </w:pPr>
+          <w:hyperlink w:anchor="_Toc228861946" w:history="1">
+            <w:r>
+              <w:rPr>
+                <w:rStyle w:val="Hyperlink"/>
+                <w:noProof/>
+              </w:rPr>
+              <w:t>ESTUDO EXPLORATÓRIO 10 – USO DO TMUX VIA SSH</w:t>
+            </w:r>
+            <w:r>
+              <w:rPr>
+                <w:noProof/>
+                <w:webHidden/>
+              </w:rPr>
+              <w:tab/>
+            </w:r>
+            <w:r>
+              <w:rPr>
+                <w:noProof/>
+                <w:webHidden/>
+              </w:rPr>
+              <w:fldChar w:fldCharType="begin"/>
+            </w:r>
+            <w:r>
+              <w:rPr>
+                <w:noProof/>
+                <w:webHidden/>
+              </w:rPr>
+              <w:instrText xml:space="preserve"> PAGEREF _Toc228861946 \h </w:instrText>
+            </w:r>
+            <w:r>
+              <w:rPr>
+                <w:noProof/>
+                <w:webHidden/>
+              </w:rPr>
+            </w:r>
+            <w:r>
+              <w:rPr>
+                <w:noProof/>
+                <w:webHidden/>
+              </w:rPr>
+              <w:fldChar w:fldCharType="separate"/>
+            </w:r>
+            <w:r>
+              <w:rPr>
+                <w:noProof/>
+                <w:webHidden/>
+              </w:rPr>
+              <w:t>12</w:t>
+            </w:r>
+            <w:r>
+              <w:rPr>
+                <w:noProof/>
+                <w:webHidden/>
+              </w:rPr>
+              <w:fldChar w:fldCharType="end"/>
+            </w:r>
+          </w:hyperlink>
+        </w:p>
+        <w:p>
           <w:r>
             <w:rPr>
               <w:b/>
@@ -745,7 +817,7 @@
       <w:pPr>
         <w:pStyle w:val="Ttulo1"/>
       </w:pPr>
-      <w:bookmarkStart w:id="0" w:name="_Toc226783394"/>
+      <w:bookmarkStart w:id="0" w:name="_Toc228861937"/>
       <w:r>
         <w:t xml:space="preserve">ESTUDO EXPLORATÓRIO 1: </w:t>
       </w:r>
@@ -1010,7 +1082,11 @@
       </w:r>
       <w:proofErr w:type="spellEnd"/>
       <w:r>
-        <w:t xml:space="preserve"> que busca transformar estruturas de dados (listas, dicionários, tensores, objetos) em bytes binários de maneira eficiente, para armazenar ou transmitir, e depois reconstruí-las exatamente iguais. </w:t>
+        <w:t xml:space="preserve"> que busca transformar estruturas de </w:t>
+      </w:r>
+      <w:r>
+        <w:lastRenderedPageBreak/>
+        <w:t xml:space="preserve">dados (listas, dicionários, tensores, objetos) em bytes binários de maneira eficiente, para armazenar ou transmitir, e depois reconstruí-las exatamente iguais. </w:t>
       </w:r>
     </w:p>
     <w:p>
@@ -1495,6 +1571,7 @@
           <w:b/>
           <w:bCs/>
         </w:rPr>
+        <w:lastRenderedPageBreak/>
         <w:t xml:space="preserve"> </w:t>
       </w:r>
     </w:p>
@@ -1502,9 +1579,8 @@
       <w:pPr>
         <w:pStyle w:val="Ttulo1"/>
       </w:pPr>
-      <w:bookmarkStart w:id="1" w:name="_Toc226783395"/>
-      <w:r>
-        <w:lastRenderedPageBreak/>
+      <w:bookmarkStart w:id="1" w:name="_Toc228861938"/>
+      <w:r>
         <w:t xml:space="preserve">ESTUDO EXPLORATÓRIO 2: </w:t>
       </w:r>
       <w:r>
@@ -2121,7 +2197,6 @@
         <w:jc w:val="both"/>
       </w:pPr>
       <w:r>
-        <w:lastRenderedPageBreak/>
         <w:t>Steps são mais utilizados em caso de streaming de dados, onde não há uma quantidade limite de dados que posso definir o seu final. Com tais conceitos podemos definir:</w:t>
       </w:r>
     </w:p>
@@ -2226,7 +2301,7 @@
       <w:pPr>
         <w:pStyle w:val="Ttulo1"/>
       </w:pPr>
-      <w:bookmarkStart w:id="4" w:name="_Toc226783396"/>
+      <w:bookmarkStart w:id="4" w:name="_Toc228861939"/>
       <w:r>
         <w:t xml:space="preserve">ESTUDO EXPLORATÓRIO 3 – </w:t>
       </w:r>
@@ -2455,7 +2530,7 @@
       <w:pPr>
         <w:pStyle w:val="Ttulo1"/>
       </w:pPr>
-      <w:bookmarkStart w:id="5" w:name="_Toc226783397"/>
+      <w:bookmarkStart w:id="5" w:name="_Toc228861940"/>
       <w:r>
         <w:t xml:space="preserve">ESTUDO EXPLORATÓRIO 4 – </w:t>
       </w:r>
@@ -2611,7 +2686,6 @@
           <w:sz w:val="18"/>
           <w:szCs w:val="18"/>
         </w:rPr>
-        <w:lastRenderedPageBreak/>
         <w:t>Figura</w:t>
       </w:r>
       <w:r>
@@ -3355,7 +3429,6 @@
           <w:b/>
           <w:bCs/>
         </w:rPr>
-        <w:lastRenderedPageBreak/>
         <w:t>Estrutura da arquitetura</w:t>
       </w:r>
       <w:r>
@@ -3724,7 +3797,7 @@
       <w:pPr>
         <w:pStyle w:val="Ttulo1"/>
       </w:pPr>
-      <w:bookmarkStart w:id="6" w:name="_Toc226783398"/>
+      <w:bookmarkStart w:id="6" w:name="_Toc228861941"/>
       <w:r>
         <w:t xml:space="preserve">ESTUDO EXPLORATÓRIO 5 – </w:t>
       </w:r>
@@ -4235,7 +4308,6 @@
         <w:rPr>
           <w:color w:val="000000" w:themeColor="text1"/>
         </w:rPr>
-        <w:lastRenderedPageBreak/>
         <w:t>O</w:t>
       </w:r>
       <w:r>
@@ -5347,7 +5419,7 @@
       <w:pPr>
         <w:pStyle w:val="Ttulo1"/>
       </w:pPr>
-      <w:bookmarkStart w:id="7" w:name="_Toc226783399"/>
+      <w:bookmarkStart w:id="7" w:name="_Toc228861942"/>
       <w:r>
         <w:lastRenderedPageBreak/>
         <w:t xml:space="preserve">ESTUDO EXPLORATÓRIO </w:t>
@@ -6593,7 +6665,7 @@
       <w:pPr>
         <w:pStyle w:val="Ttulo1"/>
       </w:pPr>
-      <w:bookmarkStart w:id="8" w:name="_Toc226783400"/>
+      <w:bookmarkStart w:id="8" w:name="_Toc228861943"/>
       <w:r>
         <w:lastRenderedPageBreak/>
         <w:t xml:space="preserve">ESTUDO EXPLORATÓRIO </w:t>
@@ -7285,7 +7357,7 @@
       <w:pPr>
         <w:pStyle w:val="Ttulo1"/>
       </w:pPr>
-      <w:bookmarkStart w:id="9" w:name="_Toc226783401"/>
+      <w:bookmarkStart w:id="9" w:name="_Toc228861944"/>
       <w:r>
         <w:lastRenderedPageBreak/>
         <w:t xml:space="preserve">ESTUDO EXPLORATÓRIO </w:t>
@@ -7720,7 +7792,7 @@
       <w:pPr>
         <w:pStyle w:val="Ttulo1"/>
       </w:pPr>
-      <w:bookmarkStart w:id="10" w:name="_Toc226783402"/>
+      <w:bookmarkStart w:id="10" w:name="_Toc228861945"/>
       <w:r>
         <w:t xml:space="preserve">ESTUDO EXPLORATÓRIO </w:t>
       </w:r>
@@ -7899,6 +7971,7 @@
       </w:pPr>
       <w:r>
         <w:rPr>
+          <w:noProof/>
           <w:color w:val="000000" w:themeColor="text1"/>
         </w:rPr>
         <w:drawing>
@@ -8152,47 +8225,1184 @@
               <w:sz w:val="28"/>
               <w:szCs w:val="28"/>
             </w:rPr>
-            <m:t>loss=-log</m:t>
-          </m:r>
-          <m:r>
-            <w:rPr>
-              <w:rFonts w:ascii="Cambria Math" w:hAnsi="Cambria Math"/>
-              <w:color w:val="000000" w:themeColor="text1"/>
-              <w:sz w:val="28"/>
-              <w:szCs w:val="28"/>
-            </w:rPr>
-            <m:t>(</m:t>
-          </m:r>
-          <m:r>
-            <w:rPr>
-              <w:rFonts w:ascii="Cambria Math" w:hAnsi="Cambria Math"/>
-              <w:color w:val="000000" w:themeColor="text1"/>
-              <w:sz w:val="28"/>
-              <w:szCs w:val="28"/>
-            </w:rPr>
-            <m:t>0.9)≈0.1</m:t>
-          </m:r>
-          <m:r>
-            <w:rPr>
-              <w:rFonts w:ascii="Cambria Math" w:hAnsi="Cambria Math"/>
-              <w:color w:val="000000" w:themeColor="text1"/>
-              <w:sz w:val="28"/>
-              <w:szCs w:val="28"/>
-            </w:rPr>
-            <m:t>0</m:t>
+            <m:t>loss=-log(0.9)≈0.10</m:t>
           </m:r>
         </m:oMath>
       </m:oMathPara>
     </w:p>
     <w:p>
       <w:pPr>
-        <w:pStyle w:val="PargrafodaLista"/>
-        <w:ind w:left="2496" w:firstLine="336"/>
         <w:jc w:val="both"/>
         <w:rPr>
           <w:color w:val="000000" w:themeColor="text1"/>
           <w:sz w:val="28"/>
           <w:szCs w:val="28"/>
+        </w:rPr>
+      </w:pPr>
+    </w:p>
+    <w:p>
+      <w:pPr>
+        <w:pStyle w:val="Ttulo1"/>
+      </w:pPr>
+      <w:bookmarkStart w:id="11" w:name="_Toc228861946"/>
+      <w:r>
+        <w:t xml:space="preserve">ESTUDO EXPLORATÓRIO </w:t>
+      </w:r>
+      <w:r>
+        <w:t>10</w:t>
+      </w:r>
+      <w:r>
+        <w:t xml:space="preserve"> – </w:t>
+      </w:r>
+      <w:r>
+        <w:t>USO DO TMUX VIA SSH</w:t>
+      </w:r>
+      <w:bookmarkEnd w:id="11"/>
+    </w:p>
+    <w:p>
+      <w:pPr>
+        <w:ind w:left="708"/>
+        <w:jc w:val="both"/>
+      </w:pPr>
+      <w:r>
+        <w:t xml:space="preserve">O </w:t>
+      </w:r>
+      <w:proofErr w:type="spellStart"/>
+      <w:r>
+        <w:t>tmux</w:t>
+      </w:r>
+      <w:proofErr w:type="spellEnd"/>
+      <w:r>
+        <w:t xml:space="preserve"> é uma ferramenta de linha de comando que funciona como um “gerenciador de terminais dentro do terminal”. Em vez de você abrir várias janelas separadas no sistema, o </w:t>
+      </w:r>
+      <w:proofErr w:type="spellStart"/>
+      <w:r>
+        <w:t>tmux</w:t>
+      </w:r>
+      <w:proofErr w:type="spellEnd"/>
+      <w:r>
+        <w:t xml:space="preserve"> permite criar várias sessões, painéis e abas dentro de uma única janela do terminal.</w:t>
+      </w:r>
+    </w:p>
+    <w:p>
+      <w:pPr>
+        <w:pStyle w:val="PargrafodaLista"/>
+        <w:numPr>
+          <w:ilvl w:val="0"/>
+          <w:numId w:val="49"/>
+        </w:numPr>
+        <w:ind w:left="1776"/>
+        <w:jc w:val="both"/>
+      </w:pPr>
+      <w:r>
+        <w:t xml:space="preserve">Na prática, ele resolve um problema comum: perder o que você estava fazendo quando fecha o terminal ou perde a conexão (por exemplo, via SSH). Com o </w:t>
+      </w:r>
+      <w:proofErr w:type="spellStart"/>
+      <w:r>
+        <w:t>tmux</w:t>
+      </w:r>
+      <w:proofErr w:type="spellEnd"/>
+      <w:r>
+        <w:t>, você pode iniciar uma sessão, rodar comandos ou programas e depois “desconectar” dela sem interromper nada. Mais tarde, você pode voltar exatamente de onde parou, com tudo ainda rodando.</w:t>
+      </w:r>
+    </w:p>
+    <w:p>
+      <w:pPr>
+        <w:pStyle w:val="PargrafodaLista"/>
+        <w:ind w:left="1776"/>
+        <w:jc w:val="both"/>
+      </w:pPr>
+    </w:p>
+    <w:p>
+      <w:pPr>
+        <w:pStyle w:val="PargrafodaLista"/>
+        <w:numPr>
+          <w:ilvl w:val="0"/>
+          <w:numId w:val="49"/>
+        </w:numPr>
+        <w:ind w:left="1776"/>
+        <w:jc w:val="both"/>
+      </w:pPr>
+      <w:r>
+        <w:t xml:space="preserve">O </w:t>
+      </w:r>
+      <w:proofErr w:type="spellStart"/>
+      <w:r>
+        <w:t>tmux</w:t>
+      </w:r>
+      <w:proofErr w:type="spellEnd"/>
+      <w:r>
+        <w:t xml:space="preserve"> também trabalha com o conceito de </w:t>
+      </w:r>
+      <w:r>
+        <w:rPr>
+          <w:b/>
+          <w:bCs/>
+        </w:rPr>
+        <w:t>sessões persistentes</w:t>
+      </w:r>
+      <w:r>
+        <w:t xml:space="preserve">. Cada sessão é como um “ambiente de trabalho” independente. Você pode ter várias sessões abertas, nomeá-las e alternar entre elas. </w:t>
+      </w:r>
+    </w:p>
+    <w:p>
+      <w:pPr>
+        <w:pStyle w:val="PargrafodaLista"/>
+        <w:ind w:left="1428"/>
+      </w:pPr>
+    </w:p>
+    <w:p>
+      <w:pPr>
+        <w:ind w:left="708"/>
+        <w:jc w:val="both"/>
+      </w:pPr>
+      <w:r>
+        <w:t xml:space="preserve">Utilização do </w:t>
+      </w:r>
+      <w:proofErr w:type="spellStart"/>
+      <w:r>
+        <w:t>tmux</w:t>
+      </w:r>
+      <w:proofErr w:type="spellEnd"/>
+      <w:r>
+        <w:t xml:space="preserve"> para o projeto atual (Via SSH):</w:t>
+      </w:r>
+    </w:p>
+    <w:p>
+      <w:pPr>
+        <w:pStyle w:val="PargrafodaLista"/>
+        <w:numPr>
+          <w:ilvl w:val="0"/>
+          <w:numId w:val="50"/>
+        </w:numPr>
+        <w:ind w:left="1776"/>
+        <w:jc w:val="both"/>
+        <w:rPr>
+          <w:b/>
+          <w:bCs/>
+        </w:rPr>
+      </w:pPr>
+      <w:r>
+        <w:rPr>
+          <w:b/>
+          <w:bCs/>
+        </w:rPr>
+        <w:t>Acessar servidor remoto via SSH</w:t>
+      </w:r>
+    </w:p>
+    <w:p>
+      <w:pPr>
+        <w:pStyle w:val="PargrafodaLista"/>
+        <w:numPr>
+          <w:ilvl w:val="0"/>
+          <w:numId w:val="50"/>
+        </w:numPr>
+        <w:ind w:left="1776"/>
+        <w:jc w:val="both"/>
+        <w:rPr>
+          <w:b/>
+          <w:bCs/>
+        </w:rPr>
+      </w:pPr>
+      <w:r>
+        <w:rPr>
+          <w:b/>
+          <w:bCs/>
+        </w:rPr>
+        <w:t xml:space="preserve">Entrar na pasta principal do projeto </w:t>
+      </w:r>
+    </w:p>
+    <w:p>
+      <w:pPr>
+        <w:pStyle w:val="PargrafodaLista"/>
+        <w:numPr>
+          <w:ilvl w:val="1"/>
+          <w:numId w:val="50"/>
+        </w:numPr>
+        <w:ind w:left="2496"/>
+        <w:jc w:val="both"/>
+      </w:pPr>
+      <w:r>
+        <w:rPr>
+          <w:i/>
+          <w:iCs/>
+        </w:rPr>
+        <w:t xml:space="preserve">&gt;&gt; </w:t>
+      </w:r>
+      <w:proofErr w:type="spellStart"/>
+      <w:r>
+        <w:rPr>
+          <w:i/>
+          <w:iCs/>
+        </w:rPr>
+        <w:t>cd</w:t>
+      </w:r>
+      <w:proofErr w:type="spellEnd"/>
+      <w:r>
+        <w:rPr>
+          <w:i/>
+          <w:iCs/>
+        </w:rPr>
+        <w:t xml:space="preserve"> </w:t>
+      </w:r>
+      <w:proofErr w:type="spellStart"/>
+      <w:r>
+        <w:rPr>
+          <w:i/>
+          <w:iCs/>
+        </w:rPr>
+        <w:t>Classifiers_Project</w:t>
+      </w:r>
+      <w:proofErr w:type="spellEnd"/>
+    </w:p>
+    <w:p>
+      <w:pPr>
+        <w:pStyle w:val="PargrafodaLista"/>
+        <w:numPr>
+          <w:ilvl w:val="0"/>
+          <w:numId w:val="50"/>
+        </w:numPr>
+        <w:ind w:left="1776"/>
+        <w:jc w:val="both"/>
+        <w:rPr>
+          <w:b/>
+          <w:bCs/>
+          <w:i/>
+          <w:iCs/>
+        </w:rPr>
+      </w:pPr>
+      <w:r>
+        <w:rPr>
+          <w:b/>
+          <w:bCs/>
+        </w:rPr>
+        <w:t xml:space="preserve">Ativar o ambiente virtual </w:t>
+      </w:r>
+      <w:proofErr w:type="spellStart"/>
+      <w:r>
+        <w:rPr>
+          <w:b/>
+          <w:bCs/>
+        </w:rPr>
+        <w:t>python</w:t>
+      </w:r>
+      <w:proofErr w:type="spellEnd"/>
+      <w:r>
+        <w:rPr>
+          <w:b/>
+          <w:bCs/>
+        </w:rPr>
+        <w:t xml:space="preserve"> </w:t>
+      </w:r>
+    </w:p>
+    <w:p>
+      <w:pPr>
+        <w:pStyle w:val="PargrafodaLista"/>
+        <w:numPr>
+          <w:ilvl w:val="1"/>
+          <w:numId w:val="50"/>
+        </w:numPr>
+        <w:ind w:left="2496"/>
+        <w:jc w:val="both"/>
+        <w:rPr>
+          <w:i/>
+          <w:iCs/>
+        </w:rPr>
+      </w:pPr>
+      <w:r>
+        <w:rPr>
+          <w:i/>
+          <w:iCs/>
+        </w:rPr>
+        <w:t xml:space="preserve">&gt;&gt; </w:t>
+      </w:r>
+      <w:proofErr w:type="spellStart"/>
+      <w:proofErr w:type="gramStart"/>
+      <w:r>
+        <w:rPr>
+          <w:i/>
+          <w:iCs/>
+        </w:rPr>
+        <w:t>source</w:t>
+      </w:r>
+      <w:proofErr w:type="spellEnd"/>
+      <w:r>
+        <w:rPr>
+          <w:i/>
+          <w:iCs/>
+        </w:rPr>
+        <w:t xml:space="preserve"> .</w:t>
+      </w:r>
+      <w:proofErr w:type="spellStart"/>
+      <w:r>
+        <w:rPr>
+          <w:i/>
+          <w:iCs/>
+        </w:rPr>
+        <w:t>venv</w:t>
+      </w:r>
+      <w:proofErr w:type="spellEnd"/>
+      <w:proofErr w:type="gramEnd"/>
+      <w:r>
+        <w:rPr>
+          <w:i/>
+          <w:iCs/>
+        </w:rPr>
+        <w:t>/bin/</w:t>
+      </w:r>
+      <w:proofErr w:type="spellStart"/>
+      <w:r>
+        <w:rPr>
+          <w:i/>
+          <w:iCs/>
+        </w:rPr>
+        <w:t>activate</w:t>
+      </w:r>
+      <w:proofErr w:type="spellEnd"/>
+    </w:p>
+    <w:p>
+      <w:pPr>
+        <w:pStyle w:val="PargrafodaLista"/>
+        <w:numPr>
+          <w:ilvl w:val="0"/>
+          <w:numId w:val="50"/>
+        </w:numPr>
+        <w:ind w:left="1776"/>
+        <w:jc w:val="both"/>
+        <w:rPr>
+          <w:b/>
+          <w:bCs/>
+          <w:i/>
+          <w:iCs/>
+        </w:rPr>
+      </w:pPr>
+      <w:r>
+        <w:rPr>
+          <w:b/>
+          <w:bCs/>
+        </w:rPr>
+        <w:t xml:space="preserve">Criar uma nova seção </w:t>
+      </w:r>
+      <w:proofErr w:type="spellStart"/>
+      <w:r>
+        <w:rPr>
+          <w:b/>
+          <w:bCs/>
+        </w:rPr>
+        <w:t>tmux</w:t>
+      </w:r>
+      <w:proofErr w:type="spellEnd"/>
+      <w:r>
+        <w:rPr>
+          <w:b/>
+          <w:bCs/>
+        </w:rPr>
+        <w:t xml:space="preserve"> </w:t>
+      </w:r>
+    </w:p>
+    <w:p>
+      <w:pPr>
+        <w:pStyle w:val="PargrafodaLista"/>
+        <w:numPr>
+          <w:ilvl w:val="1"/>
+          <w:numId w:val="50"/>
+        </w:numPr>
+        <w:ind w:left="2496"/>
+        <w:jc w:val="both"/>
+        <w:rPr>
+          <w:i/>
+          <w:iCs/>
+        </w:rPr>
+      </w:pPr>
+      <w:r>
+        <w:rPr>
+          <w:i/>
+          <w:iCs/>
+        </w:rPr>
+        <w:t xml:space="preserve">&gt;&gt; </w:t>
+      </w:r>
+      <w:proofErr w:type="spellStart"/>
+      <w:r>
+        <w:rPr>
+          <w:i/>
+          <w:iCs/>
+        </w:rPr>
+        <w:t>tmux</w:t>
+      </w:r>
+      <w:proofErr w:type="spellEnd"/>
+      <w:r>
+        <w:rPr>
+          <w:i/>
+          <w:iCs/>
+        </w:rPr>
+        <w:t xml:space="preserve"> new -s </w:t>
+      </w:r>
+      <w:proofErr w:type="spellStart"/>
+      <w:r>
+        <w:rPr>
+          <w:i/>
+          <w:iCs/>
+        </w:rPr>
+        <w:t>nome_seção</w:t>
+      </w:r>
+      <w:proofErr w:type="spellEnd"/>
+    </w:p>
+    <w:p>
+      <w:pPr>
+        <w:pStyle w:val="PargrafodaLista"/>
+        <w:numPr>
+          <w:ilvl w:val="0"/>
+          <w:numId w:val="50"/>
+        </w:numPr>
+        <w:ind w:left="1776"/>
+        <w:jc w:val="both"/>
+        <w:rPr>
+          <w:b/>
+          <w:bCs/>
+          <w:i/>
+          <w:iCs/>
+        </w:rPr>
+      </w:pPr>
+      <w:r>
+        <w:rPr>
+          <w:b/>
+          <w:bCs/>
+        </w:rPr>
+        <w:t>Ativar novamente o ambiente virtual, se necessário</w:t>
+      </w:r>
+    </w:p>
+    <w:p>
+      <w:pPr>
+        <w:pStyle w:val="PargrafodaLista"/>
+        <w:numPr>
+          <w:ilvl w:val="0"/>
+          <w:numId w:val="50"/>
+        </w:numPr>
+        <w:ind w:left="1776"/>
+        <w:jc w:val="both"/>
+        <w:rPr>
+          <w:b/>
+          <w:bCs/>
+        </w:rPr>
+      </w:pPr>
+      <w:r>
+        <w:rPr>
+          <w:b/>
+          <w:bCs/>
+        </w:rPr>
+        <w:t>Criar pasta</w:t>
+      </w:r>
+      <w:r>
+        <w:rPr>
+          <w:b/>
+          <w:bCs/>
+        </w:rPr>
+        <w:t>s</w:t>
+      </w:r>
+      <w:r>
+        <w:rPr>
+          <w:b/>
+          <w:bCs/>
+        </w:rPr>
+        <w:t xml:space="preserve"> do experimento</w:t>
+      </w:r>
+      <w:r>
+        <w:rPr>
+          <w:b/>
+          <w:bCs/>
+        </w:rPr>
+        <w:t>:</w:t>
+      </w:r>
+    </w:p>
+    <w:p>
+      <w:pPr>
+        <w:pStyle w:val="PargrafodaLista"/>
+        <w:numPr>
+          <w:ilvl w:val="1"/>
+          <w:numId w:val="50"/>
+        </w:numPr>
+        <w:ind w:left="2496"/>
+      </w:pPr>
+      <w:r>
+        <w:t xml:space="preserve">&gt;&gt; </w:t>
+      </w:r>
+      <w:proofErr w:type="spellStart"/>
+      <w:r>
+        <w:t>m</w:t>
+      </w:r>
+      <w:r>
+        <w:t>kdir</w:t>
+      </w:r>
+      <w:proofErr w:type="spellEnd"/>
+      <w:r>
+        <w:t xml:space="preserve"> </w:t>
+      </w:r>
+      <w:r>
+        <w:t xml:space="preserve">-p </w:t>
+      </w:r>
+      <w:proofErr w:type="spellStart"/>
+      <w:r>
+        <w:t>experiments</w:t>
+      </w:r>
+      <w:proofErr w:type="spellEnd"/>
+      <w:r>
+        <w:t>/</w:t>
+      </w:r>
+      <w:proofErr w:type="spellStart"/>
+      <w:r>
+        <w:t>nome_experimento</w:t>
+      </w:r>
+      <w:proofErr w:type="spellEnd"/>
+      <w:r>
+        <w:t>/logs</w:t>
+      </w:r>
+    </w:p>
+    <w:p>
+      <w:pPr>
+        <w:pStyle w:val="PargrafodaLista"/>
+        <w:numPr>
+          <w:ilvl w:val="1"/>
+          <w:numId w:val="50"/>
+        </w:numPr>
+        <w:ind w:left="2496"/>
+        <w:rPr>
+          <w:lang w:val="en-US"/>
+        </w:rPr>
+      </w:pPr>
+      <w:r>
+        <w:rPr>
+          <w:lang w:val="en-US"/>
+        </w:rPr>
+        <w:t xml:space="preserve">&gt;&gt; </w:t>
+      </w:r>
+      <w:proofErr w:type="spellStart"/>
+      <w:r>
+        <w:rPr>
+          <w:lang w:val="en-US"/>
+        </w:rPr>
+        <w:t>mkdir</w:t>
+      </w:r>
+      <w:proofErr w:type="spellEnd"/>
+      <w:r>
+        <w:rPr>
+          <w:lang w:val="en-US"/>
+        </w:rPr>
+        <w:t xml:space="preserve"> -p experiments/</w:t>
+      </w:r>
+      <w:proofErr w:type="spellStart"/>
+      <w:r>
+        <w:t>nome_experimento</w:t>
+      </w:r>
+      <w:proofErr w:type="spellEnd"/>
+      <w:r>
+        <w:rPr>
+          <w:lang w:val="en-US"/>
+        </w:rPr>
+        <w:t>/checkpoints</w:t>
+      </w:r>
+    </w:p>
+    <w:p>
+      <w:pPr>
+        <w:pStyle w:val="PargrafodaLista"/>
+        <w:numPr>
+          <w:ilvl w:val="0"/>
+          <w:numId w:val="50"/>
+        </w:numPr>
+        <w:ind w:left="1776"/>
+        <w:rPr>
+          <w:b/>
+          <w:bCs/>
+        </w:rPr>
+      </w:pPr>
+      <w:r>
+        <w:rPr>
+          <w:b/>
+          <w:bCs/>
+        </w:rPr>
+        <w:t>Rodar o treino dentro da seção:</w:t>
+      </w:r>
+    </w:p>
+    <w:p>
+      <w:pPr>
+        <w:pStyle w:val="PargrafodaLista"/>
+        <w:numPr>
+          <w:ilvl w:val="1"/>
+          <w:numId w:val="50"/>
+        </w:numPr>
+        <w:ind w:left="2496"/>
+        <w:rPr>
+          <w:lang w:val="en-US"/>
+        </w:rPr>
+      </w:pPr>
+      <w:r>
+        <w:rPr>
+          <w:lang w:val="en-US"/>
+        </w:rPr>
+        <w:t xml:space="preserve">&gt;&gt; </w:t>
+      </w:r>
+      <w:r>
+        <w:rPr>
+          <w:lang w:val="en-US"/>
+        </w:rPr>
+        <w:t>python VIT/train.py &gt; experiments/exp_01/logs/train.log 2&gt;&amp;1</w:t>
+      </w:r>
+    </w:p>
+    <w:p>
+      <w:pPr>
+        <w:pStyle w:val="PargrafodaLista"/>
+        <w:numPr>
+          <w:ilvl w:val="0"/>
+          <w:numId w:val="50"/>
+        </w:numPr>
+        <w:ind w:left="1776"/>
+        <w:rPr>
+          <w:b/>
+          <w:bCs/>
+        </w:rPr>
+      </w:pPr>
+      <w:r>
+        <w:rPr>
+          <w:b/>
+          <w:bCs/>
+        </w:rPr>
+        <w:t>Desconectar da seção, de modo que o treino continue em execução</w:t>
+      </w:r>
+      <w:r>
+        <w:rPr>
+          <w:b/>
+          <w:bCs/>
+        </w:rPr>
+        <w:t>:</w:t>
+      </w:r>
+    </w:p>
+    <w:p>
+      <w:pPr>
+        <w:pStyle w:val="PargrafodaLista"/>
+        <w:numPr>
+          <w:ilvl w:val="1"/>
+          <w:numId w:val="50"/>
+        </w:numPr>
+        <w:ind w:left="2496"/>
+      </w:pPr>
+      <w:r>
+        <w:t xml:space="preserve">&gt;&gt; Ctrl + B </w:t>
+      </w:r>
+      <w:r>
+        <w:t>seguido por Ctrl +</w:t>
+      </w:r>
+      <w:r>
+        <w:t xml:space="preserve"> D</w:t>
+      </w:r>
+    </w:p>
+    <w:p>
+      <w:pPr>
+        <w:pStyle w:val="PargrafodaLista"/>
+        <w:numPr>
+          <w:ilvl w:val="0"/>
+          <w:numId w:val="50"/>
+        </w:numPr>
+        <w:ind w:left="1776"/>
+        <w:rPr>
+          <w:b/>
+          <w:bCs/>
+        </w:rPr>
+      </w:pPr>
+      <w:r>
+        <w:rPr>
+          <w:b/>
+          <w:bCs/>
+        </w:rPr>
+        <w:t>Monitorar seções</w:t>
+      </w:r>
+      <w:r>
+        <w:rPr>
+          <w:b/>
+          <w:bCs/>
+        </w:rPr>
+        <w:t xml:space="preserve"> em execução</w:t>
+      </w:r>
+    </w:p>
+    <w:p>
+      <w:pPr>
+        <w:pStyle w:val="PargrafodaLista"/>
+        <w:numPr>
+          <w:ilvl w:val="1"/>
+          <w:numId w:val="50"/>
+        </w:numPr>
+        <w:ind w:left="2496"/>
+      </w:pPr>
+      <w:r>
+        <w:t xml:space="preserve">&gt;&gt; </w:t>
+      </w:r>
+      <w:proofErr w:type="spellStart"/>
+      <w:r>
+        <w:t>tmux</w:t>
+      </w:r>
+      <w:proofErr w:type="spellEnd"/>
+      <w:r>
+        <w:t xml:space="preserve"> </w:t>
+      </w:r>
+      <w:proofErr w:type="spellStart"/>
+      <w:r>
+        <w:t>ls</w:t>
+      </w:r>
+      <w:proofErr w:type="spellEnd"/>
+    </w:p>
+    <w:p>
+      <w:pPr>
+        <w:pStyle w:val="PargrafodaLista"/>
+        <w:numPr>
+          <w:ilvl w:val="0"/>
+          <w:numId w:val="50"/>
+        </w:numPr>
+        <w:ind w:left="1776"/>
+        <w:rPr>
+          <w:b/>
+          <w:bCs/>
+        </w:rPr>
+      </w:pPr>
+      <w:r>
+        <w:rPr>
+          <w:b/>
+          <w:bCs/>
+        </w:rPr>
+        <w:lastRenderedPageBreak/>
+        <w:t>Retornar para a seção em execução</w:t>
+      </w:r>
+    </w:p>
+    <w:p>
+      <w:pPr>
+        <w:pStyle w:val="PargrafodaLista"/>
+        <w:numPr>
+          <w:ilvl w:val="1"/>
+          <w:numId w:val="50"/>
+        </w:numPr>
+        <w:ind w:left="2496"/>
+        <w:rPr>
+          <w:lang w:val="en-US"/>
+        </w:rPr>
+      </w:pPr>
+      <w:r>
+        <w:rPr>
+          <w:lang w:val="en-US"/>
+        </w:rPr>
+        <w:t xml:space="preserve">&gt;&gt; </w:t>
+      </w:r>
+      <w:proofErr w:type="spellStart"/>
+      <w:r>
+        <w:rPr>
+          <w:lang w:val="en-US"/>
+        </w:rPr>
+        <w:t>tmux</w:t>
+      </w:r>
+      <w:proofErr w:type="spellEnd"/>
+      <w:r>
+        <w:rPr>
+          <w:lang w:val="en-US"/>
+        </w:rPr>
+        <w:t xml:space="preserve"> attach -t </w:t>
+      </w:r>
+      <w:proofErr w:type="spellStart"/>
+      <w:r>
+        <w:rPr>
+          <w:lang w:val="en-US"/>
+        </w:rPr>
+        <w:t>nome_s</w:t>
+      </w:r>
+      <w:r>
+        <w:rPr>
+          <w:lang w:val="en-US"/>
+        </w:rPr>
+        <w:t>eção</w:t>
+      </w:r>
+      <w:proofErr w:type="spellEnd"/>
+    </w:p>
+    <w:p>
+      <w:pPr>
+        <w:pStyle w:val="PargrafodaLista"/>
+        <w:numPr>
+          <w:ilvl w:val="0"/>
+          <w:numId w:val="50"/>
+        </w:numPr>
+        <w:ind w:left="1776"/>
+        <w:rPr>
+          <w:b/>
+          <w:bCs/>
+        </w:rPr>
+      </w:pPr>
+      <w:r>
+        <w:rPr>
+          <w:b/>
+          <w:bCs/>
+        </w:rPr>
+        <w:t>Forçar reconexão</w:t>
+      </w:r>
+    </w:p>
+    <w:p>
+      <w:pPr>
+        <w:pStyle w:val="PargrafodaLista"/>
+        <w:numPr>
+          <w:ilvl w:val="1"/>
+          <w:numId w:val="50"/>
+        </w:numPr>
+        <w:ind w:left="2496"/>
+        <w:rPr>
+          <w:lang w:val="en-US"/>
+        </w:rPr>
+      </w:pPr>
+      <w:r>
+        <w:rPr>
+          <w:lang w:val="en-US"/>
+        </w:rPr>
+        <w:t xml:space="preserve">&gt;&gt; </w:t>
+      </w:r>
+      <w:proofErr w:type="spellStart"/>
+      <w:r>
+        <w:rPr>
+          <w:lang w:val="en-US"/>
+        </w:rPr>
+        <w:t>tmux</w:t>
+      </w:r>
+      <w:proofErr w:type="spellEnd"/>
+      <w:r>
+        <w:rPr>
+          <w:lang w:val="en-US"/>
+        </w:rPr>
+        <w:t xml:space="preserve"> attach -d -t </w:t>
+      </w:r>
+      <w:proofErr w:type="spellStart"/>
+      <w:r>
+        <w:rPr>
+          <w:lang w:val="en-US"/>
+        </w:rPr>
+        <w:t>nome_s</w:t>
+      </w:r>
+      <w:r>
+        <w:rPr>
+          <w:lang w:val="en-US"/>
+        </w:rPr>
+        <w:t>eção</w:t>
+      </w:r>
+      <w:proofErr w:type="spellEnd"/>
+    </w:p>
+    <w:p>
+      <w:pPr>
+        <w:pStyle w:val="PargrafodaLista"/>
+        <w:numPr>
+          <w:ilvl w:val="0"/>
+          <w:numId w:val="50"/>
+        </w:numPr>
+        <w:ind w:left="1776"/>
+        <w:rPr>
+          <w:b/>
+          <w:bCs/>
+        </w:rPr>
+      </w:pPr>
+      <w:r>
+        <w:rPr>
+          <w:b/>
+          <w:bCs/>
+        </w:rPr>
+        <w:t>Encerrar seção:</w:t>
+      </w:r>
+    </w:p>
+    <w:p>
+      <w:pPr>
+        <w:pStyle w:val="PargrafodaLista"/>
+        <w:numPr>
+          <w:ilvl w:val="1"/>
+          <w:numId w:val="50"/>
+        </w:numPr>
+        <w:ind w:left="2496"/>
+        <w:rPr>
+          <w:lang w:val="en-US"/>
+        </w:rPr>
+      </w:pPr>
+      <w:r>
+        <w:rPr>
+          <w:lang w:val="en-US"/>
+        </w:rPr>
+        <w:t xml:space="preserve">&gt;&gt; </w:t>
+      </w:r>
+      <w:r>
+        <w:rPr>
+          <w:lang w:val="en-US"/>
+        </w:rPr>
+        <w:t>exit (</w:t>
+      </w:r>
+      <w:proofErr w:type="spellStart"/>
+      <w:r>
+        <w:rPr>
+          <w:lang w:val="en-US"/>
+        </w:rPr>
+        <w:t>dentro</w:t>
+      </w:r>
+      <w:proofErr w:type="spellEnd"/>
+      <w:r>
+        <w:rPr>
+          <w:lang w:val="en-US"/>
+        </w:rPr>
+        <w:t xml:space="preserve"> da </w:t>
+      </w:r>
+      <w:proofErr w:type="spellStart"/>
+      <w:r>
+        <w:rPr>
+          <w:lang w:val="en-US"/>
+        </w:rPr>
+        <w:t>seção</w:t>
+      </w:r>
+      <w:proofErr w:type="spellEnd"/>
+      <w:r>
+        <w:rPr>
+          <w:lang w:val="en-US"/>
+        </w:rPr>
+        <w:t>)</w:t>
+      </w:r>
+    </w:p>
+    <w:p>
+      <w:pPr>
+        <w:ind w:left="708"/>
+        <w:rPr>
+          <w:sz w:val="24"/>
+          <w:szCs w:val="24"/>
+        </w:rPr>
+      </w:pPr>
+      <w:r>
+        <w:rPr>
+          <w:rFonts w:cstheme="minorHAnsi"/>
+          <w:b/>
+          <w:bCs/>
+          <w:sz w:val="24"/>
+          <w:szCs w:val="24"/>
+        </w:rPr>
+        <w:t>→</w:t>
+      </w:r>
+      <w:r>
+        <w:rPr>
+          <w:b/>
+          <w:bCs/>
+          <w:sz w:val="24"/>
+          <w:szCs w:val="24"/>
+        </w:rPr>
+        <w:t xml:space="preserve"> Observação: </w:t>
+      </w:r>
+      <w:r>
+        <w:rPr>
+          <w:sz w:val="24"/>
+          <w:szCs w:val="24"/>
+        </w:rPr>
+        <w:t>Trabalhando com múltiplos painéis</w:t>
+      </w:r>
+    </w:p>
+    <w:p>
+      <w:pPr>
+        <w:pStyle w:val="PargrafodaLista"/>
+        <w:numPr>
+          <w:ilvl w:val="0"/>
+          <w:numId w:val="52"/>
+        </w:numPr>
+        <w:rPr>
+          <w:b/>
+          <w:bCs/>
+        </w:rPr>
+      </w:pPr>
+      <w:r>
+        <w:rPr>
+          <w:b/>
+          <w:bCs/>
+        </w:rPr>
+        <w:t>Dividir tela vertical</w:t>
+      </w:r>
+      <w:r>
+        <w:rPr>
+          <w:b/>
+          <w:bCs/>
+        </w:rPr>
+        <w:t>mente</w:t>
+      </w:r>
+      <w:r>
+        <w:rPr>
+          <w:b/>
+          <w:bCs/>
+        </w:rPr>
+        <w:t>:</w:t>
+      </w:r>
+    </w:p>
+    <w:p>
+      <w:pPr>
+        <w:pStyle w:val="PargrafodaLista"/>
+        <w:ind w:left="1776"/>
+      </w:pPr>
+      <w:r>
+        <w:t>&gt;&gt;</w:t>
+      </w:r>
+      <w:r>
+        <w:t xml:space="preserve"> </w:t>
+      </w:r>
+      <w:r>
+        <w:t>Ctrl + B → %</w:t>
+      </w:r>
+    </w:p>
+    <w:p>
+      <w:pPr>
+        <w:pStyle w:val="PargrafodaLista"/>
+        <w:numPr>
+          <w:ilvl w:val="0"/>
+          <w:numId w:val="52"/>
+        </w:numPr>
+        <w:rPr>
+          <w:b/>
+          <w:bCs/>
+        </w:rPr>
+      </w:pPr>
+      <w:r>
+        <w:rPr>
+          <w:b/>
+          <w:bCs/>
+        </w:rPr>
+        <w:t xml:space="preserve">Dividir tela </w:t>
+      </w:r>
+      <w:r>
+        <w:rPr>
+          <w:b/>
+          <w:bCs/>
+        </w:rPr>
+        <w:t>horizontalmente</w:t>
+      </w:r>
+      <w:r>
+        <w:rPr>
+          <w:b/>
+          <w:bCs/>
+        </w:rPr>
+        <w:t>:</w:t>
+      </w:r>
+    </w:p>
+    <w:p>
+      <w:pPr>
+        <w:pStyle w:val="PargrafodaLista"/>
+        <w:ind w:left="1776"/>
+      </w:pPr>
+      <w:r>
+        <w:t>&gt;&gt;</w:t>
+      </w:r>
+      <w:r>
+        <w:t xml:space="preserve"> </w:t>
+      </w:r>
+      <w:r>
+        <w:t>Ctrl + B → "</w:t>
+      </w:r>
+    </w:p>
+    <w:p>
+      <w:pPr>
+        <w:pStyle w:val="PargrafodaLista"/>
+        <w:numPr>
+          <w:ilvl w:val="0"/>
+          <w:numId w:val="52"/>
+        </w:numPr>
+        <w:rPr>
+          <w:b/>
+          <w:bCs/>
+        </w:rPr>
+      </w:pPr>
+      <w:r>
+        <w:rPr>
+          <w:b/>
+          <w:bCs/>
+        </w:rPr>
+        <w:t>Navegar entre diferentes painéis:</w:t>
+      </w:r>
+    </w:p>
+    <w:p>
+      <w:pPr>
+        <w:pStyle w:val="PargrafodaLista"/>
+        <w:ind w:left="1776"/>
+      </w:pPr>
+      <w:r>
+        <w:t>&gt;&gt;</w:t>
+      </w:r>
+      <w:r>
+        <w:t xml:space="preserve"> </w:t>
+      </w:r>
+      <w:r>
+        <w:t>Ctrl + B + setas</w:t>
+      </w:r>
+    </w:p>
+    <w:p>
+      <w:pPr>
+        <w:pStyle w:val="PargrafodaLista"/>
+        <w:numPr>
+          <w:ilvl w:val="0"/>
+          <w:numId w:val="52"/>
+        </w:numPr>
+        <w:rPr>
+          <w:b/>
+          <w:bCs/>
+        </w:rPr>
+      </w:pPr>
+      <w:r>
+        <w:rPr>
+          <w:b/>
+          <w:bCs/>
+        </w:rPr>
+        <w:t>Acompanhar log em tempo real:</w:t>
+      </w:r>
+    </w:p>
+    <w:p>
+      <w:pPr>
+        <w:pStyle w:val="PargrafodaLista"/>
+        <w:ind w:left="1776"/>
+        <w:rPr>
+          <w:lang w:val="en-US"/>
+        </w:rPr>
+      </w:pPr>
+      <w:r>
+        <w:rPr>
+          <w:lang w:val="en-US"/>
+        </w:rPr>
+        <w:t xml:space="preserve">&gt;&gt; </w:t>
+      </w:r>
+      <w:r>
+        <w:rPr>
+          <w:lang w:val="en-US"/>
+        </w:rPr>
+        <w:t>tail -f experiments/</w:t>
+      </w:r>
+      <w:proofErr w:type="spellStart"/>
+      <w:r>
+        <w:rPr>
+          <w:lang w:val="en-US"/>
+        </w:rPr>
+        <w:t>nome_experimento</w:t>
+      </w:r>
+      <w:proofErr w:type="spellEnd"/>
+      <w:r>
+        <w:rPr>
+          <w:lang w:val="en-US"/>
+        </w:rPr>
+        <w:t>/logs/train.log</w:t>
+      </w:r>
+    </w:p>
+    <w:p>
+      <w:pPr>
+        <w:rPr>
+          <w:lang w:val="en-US"/>
+        </w:rPr>
+      </w:pPr>
+      <w:r>
+        <w:rPr>
+          <w:lang w:val="en-US"/>
+        </w:rPr>
+        <w:tab/>
+      </w:r>
+    </w:p>
+    <w:p>
+      <w:pPr>
+        <w:jc w:val="both"/>
+        <w:rPr>
+          <w:color w:val="000000" w:themeColor="text1"/>
+          <w:sz w:val="28"/>
+          <w:szCs w:val="28"/>
+          <w:lang w:val="en-US"/>
         </w:rPr>
       </w:pPr>
     </w:p>
@@ -8279,7 +9489,7 @@
         <v:path o:extrusionok="f" gradientshapeok="t" o:connecttype="rect"/>
         <o:lock v:ext="edit" aspectratio="t"/>
       </v:shapetype>
-      <v:shape id="_x0000_i1060" type="#_x0000_t75" style="width:693pt;height:487pt;visibility:visible;mso-wrap-style:square" o:bullet="t">
+      <v:shape id="_x0000_i1150" type="#_x0000_t75" style="width:691.2pt;height:489.6pt;visibility:visible;mso-wrap-style:square" o:bullet="t">
         <v:imagedata r:id="rId1" o:title="" croptop="19686f" cropbottom="43833f" cropleft="8606f" cropright="55951f"/>
       </v:shape>
     </w:pict>
@@ -10402,6 +11612,92 @@
     </w:lvl>
   </w:abstractNum>
   <w:abstractNum w:abstractNumId="19" w15:restartNumberingAfterBreak="0">
+    <w:nsid w:val="27A64D8B"/>
+    <w:multiLevelType w:val="hybridMultilevel"/>
+    <w:tmpl w:val="76704A36"/>
+    <w:lvl w:ilvl="0" w:tplc="04160015">
+      <w:start w:val="1"/>
+      <w:numFmt w:val="upperLetter"/>
+      <w:lvlText w:val="%1."/>
+      <w:lvlJc w:val="left"/>
+      <w:pPr>
+        <w:ind w:left="1776" w:hanging="360"/>
+      </w:pPr>
+    </w:lvl>
+    <w:lvl w:ilvl="1" w:tplc="04160019" w:tentative="1">
+      <w:start w:val="1"/>
+      <w:numFmt w:val="lowerLetter"/>
+      <w:lvlText w:val="%2."/>
+      <w:lvlJc w:val="left"/>
+      <w:pPr>
+        <w:ind w:left="2496" w:hanging="360"/>
+      </w:pPr>
+    </w:lvl>
+    <w:lvl w:ilvl="2" w:tplc="0416001B" w:tentative="1">
+      <w:start w:val="1"/>
+      <w:numFmt w:val="lowerRoman"/>
+      <w:lvlText w:val="%3."/>
+      <w:lvlJc w:val="right"/>
+      <w:pPr>
+        <w:ind w:left="3216" w:hanging="180"/>
+      </w:pPr>
+    </w:lvl>
+    <w:lvl w:ilvl="3" w:tplc="0416000F" w:tentative="1">
+      <w:start w:val="1"/>
+      <w:numFmt w:val="decimal"/>
+      <w:lvlText w:val="%4."/>
+      <w:lvlJc w:val="left"/>
+      <w:pPr>
+        <w:ind w:left="3936" w:hanging="360"/>
+      </w:pPr>
+    </w:lvl>
+    <w:lvl w:ilvl="4" w:tplc="04160019" w:tentative="1">
+      <w:start w:val="1"/>
+      <w:numFmt w:val="lowerLetter"/>
+      <w:lvlText w:val="%5."/>
+      <w:lvlJc w:val="left"/>
+      <w:pPr>
+        <w:ind w:left="4656" w:hanging="360"/>
+      </w:pPr>
+    </w:lvl>
+    <w:lvl w:ilvl="5" w:tplc="0416001B" w:tentative="1">
+      <w:start w:val="1"/>
+      <w:numFmt w:val="lowerRoman"/>
+      <w:lvlText w:val="%6."/>
+      <w:lvlJc w:val="right"/>
+      <w:pPr>
+        <w:ind w:left="5376" w:hanging="180"/>
+      </w:pPr>
+    </w:lvl>
+    <w:lvl w:ilvl="6" w:tplc="0416000F" w:tentative="1">
+      <w:start w:val="1"/>
+      <w:numFmt w:val="decimal"/>
+      <w:lvlText w:val="%7."/>
+      <w:lvlJc w:val="left"/>
+      <w:pPr>
+        <w:ind w:left="6096" w:hanging="360"/>
+      </w:pPr>
+    </w:lvl>
+    <w:lvl w:ilvl="7" w:tplc="04160019" w:tentative="1">
+      <w:start w:val="1"/>
+      <w:numFmt w:val="lowerLetter"/>
+      <w:lvlText w:val="%8."/>
+      <w:lvlJc w:val="left"/>
+      <w:pPr>
+        <w:ind w:left="6816" w:hanging="360"/>
+      </w:pPr>
+    </w:lvl>
+    <w:lvl w:ilvl="8" w:tplc="0416001B" w:tentative="1">
+      <w:start w:val="1"/>
+      <w:numFmt w:val="lowerRoman"/>
+      <w:lvlText w:val="%9."/>
+      <w:lvlJc w:val="right"/>
+      <w:pPr>
+        <w:ind w:left="7536" w:hanging="180"/>
+      </w:pPr>
+    </w:lvl>
+  </w:abstractNum>
+  <w:abstractNum w:abstractNumId="20" w15:restartNumberingAfterBreak="0">
     <w:nsid w:val="29B241C9"/>
     <w:multiLevelType w:val="hybridMultilevel"/>
     <w:tmpl w:val="0968580C"/>
@@ -10514,7 +11810,7 @@
       </w:rPr>
     </w:lvl>
   </w:abstractNum>
-  <w:abstractNum w:abstractNumId="20" w15:restartNumberingAfterBreak="0">
+  <w:abstractNum w:abstractNumId="21" w15:restartNumberingAfterBreak="0">
     <w:nsid w:val="2CE46092"/>
     <w:multiLevelType w:val="hybridMultilevel"/>
     <w:tmpl w:val="39E2E034"/>
@@ -10627,7 +11923,7 @@
       </w:rPr>
     </w:lvl>
   </w:abstractNum>
-  <w:abstractNum w:abstractNumId="21" w15:restartNumberingAfterBreak="0">
+  <w:abstractNum w:abstractNumId="22" w15:restartNumberingAfterBreak="0">
     <w:nsid w:val="2D4852E9"/>
     <w:multiLevelType w:val="hybridMultilevel"/>
     <w:tmpl w:val="D534DECE"/>
@@ -10713,7 +12009,7 @@
       </w:pPr>
     </w:lvl>
   </w:abstractNum>
-  <w:abstractNum w:abstractNumId="22" w15:restartNumberingAfterBreak="0">
+  <w:abstractNum w:abstractNumId="23" w15:restartNumberingAfterBreak="0">
     <w:nsid w:val="306B2EE5"/>
     <w:multiLevelType w:val="hybridMultilevel"/>
     <w:tmpl w:val="F0105A24"/>
@@ -10826,10 +12122,10 @@
       </w:rPr>
     </w:lvl>
   </w:abstractNum>
-  <w:abstractNum w:abstractNumId="23" w15:restartNumberingAfterBreak="0">
+  <w:abstractNum w:abstractNumId="24" w15:restartNumberingAfterBreak="0">
     <w:nsid w:val="32356899"/>
     <w:multiLevelType w:val="hybridMultilevel"/>
-    <w:tmpl w:val="2A68615A"/>
+    <w:tmpl w:val="689EDD78"/>
     <w:lvl w:ilvl="0" w:tplc="04160001">
       <w:start w:val="1"/>
       <w:numFmt w:val="bullet"/>
@@ -10939,7 +12235,7 @@
       </w:rPr>
     </w:lvl>
   </w:abstractNum>
-  <w:abstractNum w:abstractNumId="24" w15:restartNumberingAfterBreak="0">
+  <w:abstractNum w:abstractNumId="25" w15:restartNumberingAfterBreak="0">
     <w:nsid w:val="363B3C5A"/>
     <w:multiLevelType w:val="hybridMultilevel"/>
     <w:tmpl w:val="16A40D1A"/>
@@ -11052,7 +12348,7 @@
       </w:rPr>
     </w:lvl>
   </w:abstractNum>
-  <w:abstractNum w:abstractNumId="25" w15:restartNumberingAfterBreak="0">
+  <w:abstractNum w:abstractNumId="26" w15:restartNumberingAfterBreak="0">
     <w:nsid w:val="39EA0086"/>
     <w:multiLevelType w:val="multilevel"/>
     <w:tmpl w:val="765C0A0E"/>
@@ -11165,7 +12461,7 @@
       </w:pPr>
     </w:lvl>
   </w:abstractNum>
-  <w:abstractNum w:abstractNumId="26" w15:restartNumberingAfterBreak="0">
+  <w:abstractNum w:abstractNumId="27" w15:restartNumberingAfterBreak="0">
     <w:nsid w:val="3A44790F"/>
     <w:multiLevelType w:val="hybridMultilevel"/>
     <w:tmpl w:val="6A1AC588"/>
@@ -11278,7 +12574,7 @@
       </w:rPr>
     </w:lvl>
   </w:abstractNum>
-  <w:abstractNum w:abstractNumId="27" w15:restartNumberingAfterBreak="0">
+  <w:abstractNum w:abstractNumId="28" w15:restartNumberingAfterBreak="0">
     <w:nsid w:val="3D216CD6"/>
     <w:multiLevelType w:val="hybridMultilevel"/>
     <w:tmpl w:val="2062B20A"/>
@@ -11391,7 +12687,7 @@
       </w:rPr>
     </w:lvl>
   </w:abstractNum>
-  <w:abstractNum w:abstractNumId="28" w15:restartNumberingAfterBreak="0">
+  <w:abstractNum w:abstractNumId="29" w15:restartNumberingAfterBreak="0">
     <w:nsid w:val="435C54D2"/>
     <w:multiLevelType w:val="hybridMultilevel"/>
     <w:tmpl w:val="AC84C2FE"/>
@@ -11479,7 +12775,7 @@
       </w:pPr>
     </w:lvl>
   </w:abstractNum>
-  <w:abstractNum w:abstractNumId="29" w15:restartNumberingAfterBreak="0">
+  <w:abstractNum w:abstractNumId="30" w15:restartNumberingAfterBreak="0">
     <w:nsid w:val="467A7958"/>
     <w:multiLevelType w:val="hybridMultilevel"/>
     <w:tmpl w:val="F98C2DB2"/>
@@ -11592,7 +12888,7 @@
       </w:rPr>
     </w:lvl>
   </w:abstractNum>
-  <w:abstractNum w:abstractNumId="30" w15:restartNumberingAfterBreak="0">
+  <w:abstractNum w:abstractNumId="31" w15:restartNumberingAfterBreak="0">
     <w:nsid w:val="4B8D2BA5"/>
     <w:multiLevelType w:val="hybridMultilevel"/>
     <w:tmpl w:val="33A0FD20"/>
@@ -11705,7 +13001,7 @@
       </w:rPr>
     </w:lvl>
   </w:abstractNum>
-  <w:abstractNum w:abstractNumId="31" w15:restartNumberingAfterBreak="0">
+  <w:abstractNum w:abstractNumId="32" w15:restartNumberingAfterBreak="0">
     <w:nsid w:val="4E491E67"/>
     <w:multiLevelType w:val="hybridMultilevel"/>
     <w:tmpl w:val="65BC7184"/>
@@ -11818,7 +13114,7 @@
       </w:rPr>
     </w:lvl>
   </w:abstractNum>
-  <w:abstractNum w:abstractNumId="32" w15:restartNumberingAfterBreak="0">
+  <w:abstractNum w:abstractNumId="33" w15:restartNumberingAfterBreak="0">
     <w:nsid w:val="56B238B8"/>
     <w:multiLevelType w:val="hybridMultilevel"/>
     <w:tmpl w:val="5A001A8C"/>
@@ -11931,7 +13227,7 @@
       </w:rPr>
     </w:lvl>
   </w:abstractNum>
-  <w:abstractNum w:abstractNumId="33" w15:restartNumberingAfterBreak="0">
+  <w:abstractNum w:abstractNumId="34" w15:restartNumberingAfterBreak="0">
     <w:nsid w:val="572156B3"/>
     <w:multiLevelType w:val="hybridMultilevel"/>
     <w:tmpl w:val="BA2471CE"/>
@@ -12044,7 +13340,7 @@
       </w:rPr>
     </w:lvl>
   </w:abstractNum>
-  <w:abstractNum w:abstractNumId="34" w15:restartNumberingAfterBreak="0">
+  <w:abstractNum w:abstractNumId="35" w15:restartNumberingAfterBreak="0">
     <w:nsid w:val="59E26DE5"/>
     <w:multiLevelType w:val="hybridMultilevel"/>
     <w:tmpl w:val="7AB8865A"/>
@@ -12130,7 +13426,7 @@
       </w:pPr>
     </w:lvl>
   </w:abstractNum>
-  <w:abstractNum w:abstractNumId="35" w15:restartNumberingAfterBreak="0">
+  <w:abstractNum w:abstractNumId="36" w15:restartNumberingAfterBreak="0">
     <w:nsid w:val="5C1E465F"/>
     <w:multiLevelType w:val="hybridMultilevel"/>
     <w:tmpl w:val="CC70734E"/>
@@ -12243,7 +13539,7 @@
       </w:rPr>
     </w:lvl>
   </w:abstractNum>
-  <w:abstractNum w:abstractNumId="36" w15:restartNumberingAfterBreak="0">
+  <w:abstractNum w:abstractNumId="37" w15:restartNumberingAfterBreak="0">
     <w:nsid w:val="5DE15B64"/>
     <w:multiLevelType w:val="hybridMultilevel"/>
     <w:tmpl w:val="C276D696"/>
@@ -12356,7 +13652,7 @@
       </w:rPr>
     </w:lvl>
   </w:abstractNum>
-  <w:abstractNum w:abstractNumId="37" w15:restartNumberingAfterBreak="0">
+  <w:abstractNum w:abstractNumId="38" w15:restartNumberingAfterBreak="0">
     <w:nsid w:val="613B7216"/>
     <w:multiLevelType w:val="hybridMultilevel"/>
     <w:tmpl w:val="6C2069C4"/>
@@ -12448,7 +13744,7 @@
       </w:pPr>
     </w:lvl>
   </w:abstractNum>
-  <w:abstractNum w:abstractNumId="38" w15:restartNumberingAfterBreak="0">
+  <w:abstractNum w:abstractNumId="39" w15:restartNumberingAfterBreak="0">
     <w:nsid w:val="61455081"/>
     <w:multiLevelType w:val="hybridMultilevel"/>
     <w:tmpl w:val="C7EA0426"/>
@@ -12558,7 +13854,7 @@
       </w:rPr>
     </w:lvl>
   </w:abstractNum>
-  <w:abstractNum w:abstractNumId="39" w15:restartNumberingAfterBreak="0">
+  <w:abstractNum w:abstractNumId="40" w15:restartNumberingAfterBreak="0">
     <w:nsid w:val="66301293"/>
     <w:multiLevelType w:val="hybridMultilevel"/>
     <w:tmpl w:val="2A7C4AA2"/>
@@ -12671,7 +13967,96 @@
       </w:rPr>
     </w:lvl>
   </w:abstractNum>
-  <w:abstractNum w:abstractNumId="40" w15:restartNumberingAfterBreak="0">
+  <w:abstractNum w:abstractNumId="41" w15:restartNumberingAfterBreak="0">
+    <w:nsid w:val="681C3EB4"/>
+    <w:multiLevelType w:val="hybridMultilevel"/>
+    <w:tmpl w:val="6B5E972C"/>
+    <w:lvl w:ilvl="0" w:tplc="0416000F">
+      <w:start w:val="1"/>
+      <w:numFmt w:val="decimal"/>
+      <w:lvlText w:val="%1."/>
+      <w:lvlJc w:val="left"/>
+      <w:pPr>
+        <w:ind w:left="1068" w:hanging="360"/>
+      </w:pPr>
+    </w:lvl>
+    <w:lvl w:ilvl="1" w:tplc="04160001">
+      <w:start w:val="1"/>
+      <w:numFmt w:val="bullet"/>
+      <w:lvlText w:val=""/>
+      <w:lvlJc w:val="left"/>
+      <w:pPr>
+        <w:ind w:left="1788" w:hanging="360"/>
+      </w:pPr>
+      <w:rPr>
+        <w:rFonts w:ascii="Symbol" w:hAnsi="Symbol" w:hint="default"/>
+      </w:rPr>
+    </w:lvl>
+    <w:lvl w:ilvl="2" w:tplc="0416001B">
+      <w:start w:val="1"/>
+      <w:numFmt w:val="lowerRoman"/>
+      <w:lvlText w:val="%3."/>
+      <w:lvlJc w:val="right"/>
+      <w:pPr>
+        <w:ind w:left="2508" w:hanging="180"/>
+      </w:pPr>
+    </w:lvl>
+    <w:lvl w:ilvl="3" w:tplc="0416000F" w:tentative="1">
+      <w:start w:val="1"/>
+      <w:numFmt w:val="decimal"/>
+      <w:lvlText w:val="%4."/>
+      <w:lvlJc w:val="left"/>
+      <w:pPr>
+        <w:ind w:left="3228" w:hanging="360"/>
+      </w:pPr>
+    </w:lvl>
+    <w:lvl w:ilvl="4" w:tplc="04160019" w:tentative="1">
+      <w:start w:val="1"/>
+      <w:numFmt w:val="lowerLetter"/>
+      <w:lvlText w:val="%5."/>
+      <w:lvlJc w:val="left"/>
+      <w:pPr>
+        <w:ind w:left="3948" w:hanging="360"/>
+      </w:pPr>
+    </w:lvl>
+    <w:lvl w:ilvl="5" w:tplc="0416001B" w:tentative="1">
+      <w:start w:val="1"/>
+      <w:numFmt w:val="lowerRoman"/>
+      <w:lvlText w:val="%6."/>
+      <w:lvlJc w:val="right"/>
+      <w:pPr>
+        <w:ind w:left="4668" w:hanging="180"/>
+      </w:pPr>
+    </w:lvl>
+    <w:lvl w:ilvl="6" w:tplc="0416000F" w:tentative="1">
+      <w:start w:val="1"/>
+      <w:numFmt w:val="decimal"/>
+      <w:lvlText w:val="%7."/>
+      <w:lvlJc w:val="left"/>
+      <w:pPr>
+        <w:ind w:left="5388" w:hanging="360"/>
+      </w:pPr>
+    </w:lvl>
+    <w:lvl w:ilvl="7" w:tplc="04160019" w:tentative="1">
+      <w:start w:val="1"/>
+      <w:numFmt w:val="lowerLetter"/>
+      <w:lvlText w:val="%8."/>
+      <w:lvlJc w:val="left"/>
+      <w:pPr>
+        <w:ind w:left="6108" w:hanging="360"/>
+      </w:pPr>
+    </w:lvl>
+    <w:lvl w:ilvl="8" w:tplc="0416001B" w:tentative="1">
+      <w:start w:val="1"/>
+      <w:numFmt w:val="lowerRoman"/>
+      <w:lvlText w:val="%9."/>
+      <w:lvlJc w:val="right"/>
+      <w:pPr>
+        <w:ind w:left="6828" w:hanging="180"/>
+      </w:pPr>
+    </w:lvl>
+  </w:abstractNum>
+  <w:abstractNum w:abstractNumId="42" w15:restartNumberingAfterBreak="0">
     <w:nsid w:val="72881E46"/>
     <w:multiLevelType w:val="hybridMultilevel"/>
     <w:tmpl w:val="9FFE752E"/>
@@ -12784,7 +14169,120 @@
       </w:rPr>
     </w:lvl>
   </w:abstractNum>
-  <w:abstractNum w:abstractNumId="41" w15:restartNumberingAfterBreak="0">
+  <w:abstractNum w:abstractNumId="43" w15:restartNumberingAfterBreak="0">
+    <w:nsid w:val="72BF6667"/>
+    <w:multiLevelType w:val="hybridMultilevel"/>
+    <w:tmpl w:val="74B8363E"/>
+    <w:lvl w:ilvl="0" w:tplc="04160001">
+      <w:start w:val="1"/>
+      <w:numFmt w:val="bullet"/>
+      <w:lvlText w:val=""/>
+      <w:lvlJc w:val="left"/>
+      <w:pPr>
+        <w:ind w:left="1428" w:hanging="360"/>
+      </w:pPr>
+      <w:rPr>
+        <w:rFonts w:ascii="Symbol" w:hAnsi="Symbol" w:hint="default"/>
+      </w:rPr>
+    </w:lvl>
+    <w:lvl w:ilvl="1" w:tplc="04160003" w:tentative="1">
+      <w:start w:val="1"/>
+      <w:numFmt w:val="bullet"/>
+      <w:lvlText w:val="o"/>
+      <w:lvlJc w:val="left"/>
+      <w:pPr>
+        <w:ind w:left="2148" w:hanging="360"/>
+      </w:pPr>
+      <w:rPr>
+        <w:rFonts w:ascii="Courier New" w:hAnsi="Courier New" w:cs="Courier New" w:hint="default"/>
+      </w:rPr>
+    </w:lvl>
+    <w:lvl w:ilvl="2" w:tplc="04160005" w:tentative="1">
+      <w:start w:val="1"/>
+      <w:numFmt w:val="bullet"/>
+      <w:lvlText w:val=""/>
+      <w:lvlJc w:val="left"/>
+      <w:pPr>
+        <w:ind w:left="2868" w:hanging="360"/>
+      </w:pPr>
+      <w:rPr>
+        <w:rFonts w:ascii="Wingdings" w:hAnsi="Wingdings" w:hint="default"/>
+      </w:rPr>
+    </w:lvl>
+    <w:lvl w:ilvl="3" w:tplc="04160001" w:tentative="1">
+      <w:start w:val="1"/>
+      <w:numFmt w:val="bullet"/>
+      <w:lvlText w:val=""/>
+      <w:lvlJc w:val="left"/>
+      <w:pPr>
+        <w:ind w:left="3588" w:hanging="360"/>
+      </w:pPr>
+      <w:rPr>
+        <w:rFonts w:ascii="Symbol" w:hAnsi="Symbol" w:hint="default"/>
+      </w:rPr>
+    </w:lvl>
+    <w:lvl w:ilvl="4" w:tplc="04160003" w:tentative="1">
+      <w:start w:val="1"/>
+      <w:numFmt w:val="bullet"/>
+      <w:lvlText w:val="o"/>
+      <w:lvlJc w:val="left"/>
+      <w:pPr>
+        <w:ind w:left="4308" w:hanging="360"/>
+      </w:pPr>
+      <w:rPr>
+        <w:rFonts w:ascii="Courier New" w:hAnsi="Courier New" w:cs="Courier New" w:hint="default"/>
+      </w:rPr>
+    </w:lvl>
+    <w:lvl w:ilvl="5" w:tplc="04160005" w:tentative="1">
+      <w:start w:val="1"/>
+      <w:numFmt w:val="bullet"/>
+      <w:lvlText w:val=""/>
+      <w:lvlJc w:val="left"/>
+      <w:pPr>
+        <w:ind w:left="5028" w:hanging="360"/>
+      </w:pPr>
+      <w:rPr>
+        <w:rFonts w:ascii="Wingdings" w:hAnsi="Wingdings" w:hint="default"/>
+      </w:rPr>
+    </w:lvl>
+    <w:lvl w:ilvl="6" w:tplc="04160001" w:tentative="1">
+      <w:start w:val="1"/>
+      <w:numFmt w:val="bullet"/>
+      <w:lvlText w:val=""/>
+      <w:lvlJc w:val="left"/>
+      <w:pPr>
+        <w:ind w:left="5748" w:hanging="360"/>
+      </w:pPr>
+      <w:rPr>
+        <w:rFonts w:ascii="Symbol" w:hAnsi="Symbol" w:hint="default"/>
+      </w:rPr>
+    </w:lvl>
+    <w:lvl w:ilvl="7" w:tplc="04160003" w:tentative="1">
+      <w:start w:val="1"/>
+      <w:numFmt w:val="bullet"/>
+      <w:lvlText w:val="o"/>
+      <w:lvlJc w:val="left"/>
+      <w:pPr>
+        <w:ind w:left="6468" w:hanging="360"/>
+      </w:pPr>
+      <w:rPr>
+        <w:rFonts w:ascii="Courier New" w:hAnsi="Courier New" w:cs="Courier New" w:hint="default"/>
+      </w:rPr>
+    </w:lvl>
+    <w:lvl w:ilvl="8" w:tplc="04160005" w:tentative="1">
+      <w:start w:val="1"/>
+      <w:numFmt w:val="bullet"/>
+      <w:lvlText w:val=""/>
+      <w:lvlJc w:val="left"/>
+      <w:pPr>
+        <w:ind w:left="7188" w:hanging="360"/>
+      </w:pPr>
+      <w:rPr>
+        <w:rFonts w:ascii="Wingdings" w:hAnsi="Wingdings" w:hint="default"/>
+      </w:rPr>
+    </w:lvl>
+  </w:abstractNum>
+  <w:abstractNum w:abstractNumId="44" w15:restartNumberingAfterBreak="0">
     <w:nsid w:val="739B653B"/>
     <w:multiLevelType w:val="hybridMultilevel"/>
     <w:tmpl w:val="86004430"/>
@@ -12897,10 +14395,10 @@
       </w:rPr>
     </w:lvl>
   </w:abstractNum>
-  <w:abstractNum w:abstractNumId="42" w15:restartNumberingAfterBreak="0">
+  <w:abstractNum w:abstractNumId="45" w15:restartNumberingAfterBreak="0">
     <w:nsid w:val="75C603A4"/>
     <w:multiLevelType w:val="hybridMultilevel"/>
-    <w:tmpl w:val="9E6C079A"/>
+    <w:tmpl w:val="F362A5E2"/>
     <w:lvl w:ilvl="0" w:tplc="04160001">
       <w:start w:val="1"/>
       <w:numFmt w:val="bullet"/>
@@ -13007,7 +14505,7 @@
       </w:rPr>
     </w:lvl>
   </w:abstractNum>
-  <w:abstractNum w:abstractNumId="43" w15:restartNumberingAfterBreak="0">
+  <w:abstractNum w:abstractNumId="46" w15:restartNumberingAfterBreak="0">
     <w:nsid w:val="76F55A3F"/>
     <w:multiLevelType w:val="multilevel"/>
     <w:tmpl w:val="D6425CC6"/>
@@ -13156,7 +14654,7 @@
       </w:rPr>
     </w:lvl>
   </w:abstractNum>
-  <w:abstractNum w:abstractNumId="44" w15:restartNumberingAfterBreak="0">
+  <w:abstractNum w:abstractNumId="47" w15:restartNumberingAfterBreak="0">
     <w:nsid w:val="785D5530"/>
     <w:multiLevelType w:val="hybridMultilevel"/>
     <w:tmpl w:val="B5BC727C"/>
@@ -13269,7 +14767,7 @@
       </w:rPr>
     </w:lvl>
   </w:abstractNum>
-  <w:abstractNum w:abstractNumId="45" w15:restartNumberingAfterBreak="0">
+  <w:abstractNum w:abstractNumId="48" w15:restartNumberingAfterBreak="0">
     <w:nsid w:val="78A40A9E"/>
     <w:multiLevelType w:val="hybridMultilevel"/>
     <w:tmpl w:val="1E8C2ABE"/>
@@ -13355,7 +14853,7 @@
       </w:pPr>
     </w:lvl>
   </w:abstractNum>
-  <w:abstractNum w:abstractNumId="46" w15:restartNumberingAfterBreak="0">
+  <w:abstractNum w:abstractNumId="49" w15:restartNumberingAfterBreak="0">
     <w:nsid w:val="7C4F3572"/>
     <w:multiLevelType w:val="hybridMultilevel"/>
     <w:tmpl w:val="10F02A50"/>
@@ -13468,7 +14966,7 @@
       </w:rPr>
     </w:lvl>
   </w:abstractNum>
-  <w:abstractNum w:abstractNumId="47" w15:restartNumberingAfterBreak="0">
+  <w:abstractNum w:abstractNumId="50" w15:restartNumberingAfterBreak="0">
     <w:nsid w:val="7D075251"/>
     <w:multiLevelType w:val="hybridMultilevel"/>
     <w:tmpl w:val="DE3E8316"/>
@@ -13581,7 +15079,7 @@
       </w:rPr>
     </w:lvl>
   </w:abstractNum>
-  <w:abstractNum w:abstractNumId="48" w15:restartNumberingAfterBreak="0">
+  <w:abstractNum w:abstractNumId="51" w15:restartNumberingAfterBreak="0">
     <w:nsid w:val="7FD31BE5"/>
     <w:multiLevelType w:val="hybridMultilevel"/>
     <w:tmpl w:val="A54CCE82"/>
@@ -13695,13 +15193,13 @@
     </w:lvl>
   </w:abstractNum>
   <w:num w:numId="1" w16cid:durableId="231621070">
-    <w:abstractNumId w:val="28"/>
+    <w:abstractNumId w:val="29"/>
   </w:num>
   <w:num w:numId="2" w16cid:durableId="494537868">
     <w:abstractNumId w:val="12"/>
   </w:num>
   <w:num w:numId="3" w16cid:durableId="555967944">
-    <w:abstractNumId w:val="44"/>
+    <w:abstractNumId w:val="47"/>
   </w:num>
   <w:num w:numId="4" w16cid:durableId="975720977">
     <w:abstractNumId w:val="17"/>
@@ -13710,7 +15208,7 @@
     <w:abstractNumId w:val="2"/>
   </w:num>
   <w:num w:numId="6" w16cid:durableId="1947691180">
-    <w:abstractNumId w:val="37"/>
+    <w:abstractNumId w:val="38"/>
   </w:num>
   <w:num w:numId="7" w16cid:durableId="543980649">
     <w:abstractNumId w:val="16"/>
@@ -13719,73 +15217,73 @@
     <w:abstractNumId w:val="0"/>
   </w:num>
   <w:num w:numId="9" w16cid:durableId="736512136">
-    <w:abstractNumId w:val="33"/>
+    <w:abstractNumId w:val="34"/>
   </w:num>
   <w:num w:numId="10" w16cid:durableId="1832524834">
-    <w:abstractNumId w:val="47"/>
+    <w:abstractNumId w:val="50"/>
   </w:num>
   <w:num w:numId="11" w16cid:durableId="1122117184">
-    <w:abstractNumId w:val="22"/>
+    <w:abstractNumId w:val="23"/>
   </w:num>
   <w:num w:numId="12" w16cid:durableId="2133136465">
     <w:abstractNumId w:val="11"/>
   </w:num>
   <w:num w:numId="13" w16cid:durableId="1067458539">
-    <w:abstractNumId w:val="19"/>
+    <w:abstractNumId w:val="20"/>
   </w:num>
   <w:num w:numId="14" w16cid:durableId="1593928561">
     <w:abstractNumId w:val="3"/>
   </w:num>
   <w:num w:numId="15" w16cid:durableId="1046374455">
-    <w:abstractNumId w:val="39"/>
+    <w:abstractNumId w:val="40"/>
   </w:num>
   <w:num w:numId="16" w16cid:durableId="1399130606">
     <w:abstractNumId w:val="13"/>
   </w:num>
   <w:num w:numId="17" w16cid:durableId="279843836">
-    <w:abstractNumId w:val="35"/>
+    <w:abstractNumId w:val="36"/>
   </w:num>
   <w:num w:numId="18" w16cid:durableId="1173257668">
     <w:abstractNumId w:val="14"/>
   </w:num>
   <w:num w:numId="19" w16cid:durableId="1573469366">
-    <w:abstractNumId w:val="31"/>
+    <w:abstractNumId w:val="32"/>
   </w:num>
   <w:num w:numId="20" w16cid:durableId="1306812659">
     <w:abstractNumId w:val="5"/>
   </w:num>
   <w:num w:numId="21" w16cid:durableId="655647183">
-    <w:abstractNumId w:val="48"/>
+    <w:abstractNumId w:val="51"/>
   </w:num>
   <w:num w:numId="22" w16cid:durableId="915549673">
     <w:abstractNumId w:val="1"/>
   </w:num>
   <w:num w:numId="23" w16cid:durableId="1525512738">
-    <w:abstractNumId w:val="29"/>
+    <w:abstractNumId w:val="30"/>
   </w:num>
   <w:num w:numId="24" w16cid:durableId="2027976820">
-    <w:abstractNumId w:val="30"/>
+    <w:abstractNumId w:val="31"/>
   </w:num>
   <w:num w:numId="25" w16cid:durableId="115225939">
-    <w:abstractNumId w:val="46"/>
+    <w:abstractNumId w:val="49"/>
   </w:num>
   <w:num w:numId="26" w16cid:durableId="1462114911">
-    <w:abstractNumId w:val="41"/>
+    <w:abstractNumId w:val="44"/>
   </w:num>
   <w:num w:numId="27" w16cid:durableId="1454132460">
+    <w:abstractNumId w:val="27"/>
+  </w:num>
+  <w:num w:numId="28" w16cid:durableId="16584153">
     <w:abstractNumId w:val="26"/>
   </w:num>
-  <w:num w:numId="28" w16cid:durableId="16584153">
-    <w:abstractNumId w:val="25"/>
-  </w:num>
   <w:num w:numId="29" w16cid:durableId="515537849">
-    <w:abstractNumId w:val="27"/>
+    <w:abstractNumId w:val="28"/>
   </w:num>
   <w:num w:numId="30" w16cid:durableId="954872968">
     <w:abstractNumId w:val="10"/>
   </w:num>
   <w:num w:numId="31" w16cid:durableId="1487283039">
-    <w:abstractNumId w:val="24"/>
+    <w:abstractNumId w:val="25"/>
   </w:num>
   <w:num w:numId="32" w16cid:durableId="1614098087">
     <w:abstractNumId w:val="9"/>
@@ -13794,7 +15292,7 @@
     <w:abstractNumId w:val="18"/>
   </w:num>
   <w:num w:numId="34" w16cid:durableId="734277080">
-    <w:abstractNumId w:val="42"/>
+    <w:abstractNumId w:val="45"/>
   </w:num>
   <w:num w:numId="35" w16cid:durableId="598677082">
     <w:abstractNumId w:val="15"/>
@@ -13803,22 +15301,22 @@
     <w:abstractNumId w:val="7"/>
   </w:num>
   <w:num w:numId="37" w16cid:durableId="503669862">
-    <w:abstractNumId w:val="38"/>
+    <w:abstractNumId w:val="39"/>
   </w:num>
   <w:num w:numId="38" w16cid:durableId="539130844">
     <w:abstractNumId w:val="4"/>
   </w:num>
   <w:num w:numId="39" w16cid:durableId="976566880">
+    <w:abstractNumId w:val="22"/>
+  </w:num>
+  <w:num w:numId="40" w16cid:durableId="1023172698">
     <w:abstractNumId w:val="21"/>
   </w:num>
-  <w:num w:numId="40" w16cid:durableId="1023172698">
-    <w:abstractNumId w:val="20"/>
-  </w:num>
   <w:num w:numId="41" w16cid:durableId="1073894177">
-    <w:abstractNumId w:val="40"/>
+    <w:abstractNumId w:val="42"/>
   </w:num>
   <w:num w:numId="42" w16cid:durableId="776487993">
-    <w:abstractNumId w:val="45"/>
+    <w:abstractNumId w:val="48"/>
   </w:num>
   <w:num w:numId="43" w16cid:durableId="970675162">
     <w:abstractNumId w:val="8"/>
@@ -13827,19 +15325,28 @@
     <w:abstractNumId w:val="6"/>
   </w:num>
   <w:num w:numId="45" w16cid:durableId="375591668">
-    <w:abstractNumId w:val="34"/>
+    <w:abstractNumId w:val="35"/>
   </w:num>
   <w:num w:numId="46" w16cid:durableId="1354721866">
+    <w:abstractNumId w:val="46"/>
+  </w:num>
+  <w:num w:numId="47" w16cid:durableId="2006320800">
+    <w:abstractNumId w:val="33"/>
+  </w:num>
+  <w:num w:numId="48" w16cid:durableId="1650596410">
+    <w:abstractNumId w:val="37"/>
+  </w:num>
+  <w:num w:numId="49" w16cid:durableId="933393196">
+    <w:abstractNumId w:val="24"/>
+  </w:num>
+  <w:num w:numId="50" w16cid:durableId="32733731">
+    <w:abstractNumId w:val="41"/>
+  </w:num>
+  <w:num w:numId="51" w16cid:durableId="1491747206">
     <w:abstractNumId w:val="43"/>
   </w:num>
-  <w:num w:numId="47" w16cid:durableId="2006320800">
-    <w:abstractNumId w:val="32"/>
-  </w:num>
-  <w:num w:numId="48" w16cid:durableId="1650596410">
-    <w:abstractNumId w:val="36"/>
-  </w:num>
-  <w:num w:numId="49" w16cid:durableId="933393196">
-    <w:abstractNumId w:val="23"/>
+  <w:num w:numId="52" w16cid:durableId="1431269584">
+    <w:abstractNumId w:val="19"/>
   </w:num>
 </w:numbering>
 </file>

</xml_diff>

<commit_message>
Atualização sobre o uso do tmux
</commit_message>
<xml_diff>
--- a/Documents and Backups/Estudos Conduzidos.docx
+++ b/Documents and Backups/Estudos Conduzidos.docx
@@ -8690,28 +8690,7 @@
           <w:b/>
           <w:bCs/>
         </w:rPr>
-        <w:t>Criar pasta</w:t>
-      </w:r>
-      <w:r>
-        <w:rPr>
-          <w:b/>
-          <w:bCs/>
-        </w:rPr>
-        <w:t>s</w:t>
-      </w:r>
-      <w:r>
-        <w:rPr>
-          <w:b/>
-          <w:bCs/>
-        </w:rPr>
-        <w:t xml:space="preserve"> do experimento</w:t>
-      </w:r>
-      <w:r>
-        <w:rPr>
-          <w:b/>
-          <w:bCs/>
-        </w:rPr>
-        <w:t>:</w:t>
+        <w:t>Criar pastas do experimento:</w:t>
       </w:r>
     </w:p>
     <w:p>
@@ -8728,17 +8707,11 @@
       </w:r>
       <w:proofErr w:type="spellStart"/>
       <w:r>
-        <w:t>m</w:t>
-      </w:r>
-      <w:r>
-        <w:t>kdir</w:t>
-      </w:r>
-      <w:proofErr w:type="spellEnd"/>
-      <w:r>
-        <w:t xml:space="preserve"> </w:t>
-      </w:r>
-      <w:r>
-        <w:t xml:space="preserve">-p </w:t>
+        <w:t>mkdir</w:t>
+      </w:r>
+      <w:proofErr w:type="spellEnd"/>
+      <w:r>
+        <w:t xml:space="preserve"> -p </w:t>
       </w:r>
       <w:proofErr w:type="spellStart"/>
       <w:r>
@@ -8838,13 +8811,7 @@
         <w:rPr>
           <w:lang w:val="en-US"/>
         </w:rPr>
-        <w:t xml:space="preserve">&gt;&gt; </w:t>
-      </w:r>
-      <w:r>
-        <w:rPr>
-          <w:lang w:val="en-US"/>
-        </w:rPr>
-        <w:t>python VIT/train.py &gt; experiments/exp_01/logs/train.log 2&gt;&amp;1</w:t>
+        <w:t>&gt;&gt; python VIT/train.py &gt; experiments/exp_01/logs/train.log 2&gt;&amp;1</w:t>
       </w:r>
     </w:p>
     <w:p>
@@ -8912,14 +8879,7 @@
           <w:b/>
           <w:bCs/>
         </w:rPr>
-        <w:t>Monitorar seções</w:t>
-      </w:r>
-      <w:r>
-        <w:rPr>
-          <w:b/>
-          <w:bCs/>
-        </w:rPr>
-        <w:t xml:space="preserve"> em execução</w:t>
+        <w:t>Monitorar seções em execução</w:t>
       </w:r>
     </w:p>
     <w:p>
@@ -9359,39 +9319,474 @@
         <w:rPr>
           <w:lang w:val="en-US"/>
         </w:rPr>
+        <w:t>&gt;&gt; tail -f experiments/</w:t>
+      </w:r>
+      <w:proofErr w:type="spellStart"/>
+      <w:r>
+        <w:rPr>
+          <w:lang w:val="en-US"/>
+        </w:rPr>
+        <w:t>nome_experimento</w:t>
+      </w:r>
+      <w:proofErr w:type="spellEnd"/>
+      <w:r>
+        <w:rPr>
+          <w:lang w:val="en-US"/>
+        </w:rPr>
+        <w:t>/logs/train.log</w:t>
+      </w:r>
+    </w:p>
+    <w:p>
+      <w:pPr>
+        <w:pStyle w:val="PargrafodaLista"/>
+        <w:ind w:left="1776"/>
+        <w:rPr>
+          <w:lang w:val="en-US"/>
+        </w:rPr>
+      </w:pPr>
+    </w:p>
+    <w:p>
+      <w:pPr>
+        <w:ind w:left="708"/>
+        <w:rPr>
+          <w:sz w:val="24"/>
+          <w:szCs w:val="24"/>
+        </w:rPr>
+      </w:pPr>
+      <w:r>
+        <w:rPr>
+          <w:rFonts w:cstheme="minorHAnsi"/>
+          <w:b/>
+          <w:bCs/>
+          <w:sz w:val="24"/>
+          <w:szCs w:val="24"/>
+        </w:rPr>
+        <w:t>→</w:t>
+      </w:r>
+      <w:r>
+        <w:rPr>
+          <w:b/>
+          <w:bCs/>
+          <w:sz w:val="24"/>
+          <w:szCs w:val="24"/>
+        </w:rPr>
+        <w:t xml:space="preserve"> Observação</w:t>
+      </w:r>
+      <w:r>
+        <w:rPr>
+          <w:b/>
+          <w:bCs/>
+          <w:sz w:val="24"/>
+          <w:szCs w:val="24"/>
+        </w:rPr>
+        <w:t xml:space="preserve"> 2</w:t>
+      </w:r>
+      <w:r>
+        <w:rPr>
+          <w:b/>
+          <w:bCs/>
+          <w:sz w:val="24"/>
+          <w:szCs w:val="24"/>
+        </w:rPr>
+        <w:t xml:space="preserve">: </w:t>
+      </w:r>
+      <w:r>
+        <w:rPr>
+          <w:sz w:val="24"/>
+          <w:szCs w:val="24"/>
+        </w:rPr>
+        <w:t>Explicação do comando de execução do script</w:t>
+      </w:r>
+    </w:p>
+    <w:p>
+      <w:pPr>
+        <w:ind w:left="708"/>
+        <w:rPr>
+          <w:i/>
+          <w:iCs/>
+          <w:u w:val="single"/>
+          <w:lang w:val="en-US"/>
+        </w:rPr>
+      </w:pPr>
+      <w:r>
+        <w:rPr>
+          <w:i/>
+          <w:iCs/>
+          <w:u w:val="single"/>
+          <w:lang w:val="en-US"/>
+        </w:rPr>
         <w:t xml:space="preserve">&gt;&gt; </w:t>
       </w:r>
       <w:r>
         <w:rPr>
+          <w:i/>
+          <w:iCs/>
+          <w:u w:val="single"/>
           <w:lang w:val="en-US"/>
         </w:rPr>
-        <w:t>tail -f experiments/</w:t>
-      </w:r>
-      <w:proofErr w:type="spellStart"/>
-      <w:r>
-        <w:rPr>
+        <w:t>python VIT/</w:t>
+      </w:r>
+      <w:r>
+        <w:rPr>
+          <w:i/>
+          <w:iCs/>
+          <w:u w:val="single"/>
           <w:lang w:val="en-US"/>
         </w:rPr>
+        <w:t>ViT_Main</w:t>
+      </w:r>
+      <w:r>
+        <w:rPr>
+          <w:i/>
+          <w:iCs/>
+          <w:u w:val="single"/>
+          <w:lang w:val="en-US"/>
+        </w:rPr>
+        <w:t>.py &gt; experiments/exp_01/logs/train.log 2&gt;&amp;1</w:t>
+      </w:r>
+    </w:p>
+    <w:p>
+      <w:pPr>
+        <w:pStyle w:val="PargrafodaLista"/>
+        <w:numPr>
+          <w:ilvl w:val="0"/>
+          <w:numId w:val="53"/>
+        </w:numPr>
+        <w:rPr>
+          <w:lang w:val="en-US"/>
+        </w:rPr>
+      </w:pPr>
+      <w:r>
+        <w:rPr>
+          <w:lang w:val="en-US"/>
+        </w:rPr>
+        <w:t xml:space="preserve">&gt;&gt; </w:t>
+      </w:r>
+      <w:r>
+        <w:rPr>
+          <w:i/>
+          <w:iCs/>
+          <w:lang w:val="en-US"/>
+        </w:rPr>
+        <w:t xml:space="preserve">python </w:t>
+      </w:r>
+      <w:r>
+        <w:rPr>
+          <w:i/>
+          <w:iCs/>
+          <w:lang w:val="en-US"/>
+        </w:rPr>
+        <w:t>VIT/ViT_Main.py</w:t>
+      </w:r>
+      <w:r>
+        <w:rPr>
+          <w:lang w:val="en-US"/>
+        </w:rPr>
+        <w:t xml:space="preserve"> → Executa o script </w:t>
+      </w:r>
+      <w:r>
+        <w:rPr>
+          <w:i/>
+          <w:iCs/>
+          <w:lang w:val="en-US"/>
+        </w:rPr>
+        <w:t xml:space="preserve">ViT_Main.py </w:t>
+      </w:r>
+      <w:r>
+        <w:rPr>
+          <w:lang w:val="en-US"/>
+        </w:rPr>
+        <w:t>via python</w:t>
+      </w:r>
+    </w:p>
+    <w:p>
+      <w:pPr>
+        <w:pStyle w:val="PargrafodaLista"/>
+        <w:numPr>
+          <w:ilvl w:val="0"/>
+          <w:numId w:val="53"/>
+        </w:numPr>
+      </w:pPr>
+      <w:r>
+        <w:t>‘&gt;’ simboliza o redirecionamento da saída</w:t>
+      </w:r>
+      <w:r>
+        <w:t xml:space="preserve">. </w:t>
+      </w:r>
+      <w:r>
+        <w:t xml:space="preserve">Pega tudo que iria aparecer na tela </w:t>
+      </w:r>
+      <w:r>
+        <w:t xml:space="preserve">do terminal </w:t>
+      </w:r>
+      <w:r>
+        <w:t>(</w:t>
+      </w:r>
+      <w:proofErr w:type="spellStart"/>
+      <w:r>
+        <w:rPr>
+          <w:b/>
+          <w:bCs/>
+        </w:rPr>
+        <w:t>stdout</w:t>
+      </w:r>
+      <w:proofErr w:type="spellEnd"/>
+      <w:r>
+        <w:t>)</w:t>
+      </w:r>
+      <w:r>
+        <w:t xml:space="preserve"> e salva no arquivo </w:t>
+      </w:r>
+      <w:r>
+        <w:rPr>
+          <w:i/>
+          <w:iCs/>
+        </w:rPr>
+        <w:t>train.log</w:t>
+      </w:r>
+    </w:p>
+    <w:p>
+      <w:pPr>
+        <w:pStyle w:val="PargrafodaLista"/>
+        <w:numPr>
+          <w:ilvl w:val="0"/>
+          <w:numId w:val="53"/>
+        </w:numPr>
+      </w:pPr>
+      <w:r>
+        <w:t>‘</w:t>
+      </w:r>
+      <w:r>
+        <w:t>2&gt;&amp;1</w:t>
+      </w:r>
+      <w:r>
+        <w:t xml:space="preserve">’ Define as saídas do treinamento que devem ser armazenadas. </w:t>
+      </w:r>
+      <w:r>
+        <w:t>No Linux existem dois tipos de saída</w:t>
+      </w:r>
+      <w:r>
+        <w:t>s</w:t>
+      </w:r>
+      <w:r>
+        <w:t>:</w:t>
+      </w:r>
+    </w:p>
+    <w:p>
+      <w:pPr>
+        <w:pStyle w:val="PargrafodaLista"/>
+        <w:ind w:left="1776"/>
+      </w:pPr>
+    </w:p>
+    <w:p>
+      <w:pPr>
+        <w:pStyle w:val="PargrafodaLista"/>
+        <w:numPr>
+          <w:ilvl w:val="1"/>
+          <w:numId w:val="53"/>
+        </w:numPr>
+        <w:rPr>
+          <w:i/>
+          <w:iCs/>
+        </w:rPr>
+      </w:pPr>
+      <w:r>
+        <w:rPr>
+          <w:i/>
+          <w:iCs/>
+        </w:rPr>
+        <w:t xml:space="preserve">1 → saída normal (prints) </w:t>
+      </w:r>
+    </w:p>
+    <w:p>
+      <w:pPr>
+        <w:pStyle w:val="PargrafodaLista"/>
+        <w:numPr>
+          <w:ilvl w:val="1"/>
+          <w:numId w:val="53"/>
+        </w:numPr>
+        <w:rPr>
+          <w:i/>
+          <w:iCs/>
+        </w:rPr>
+      </w:pPr>
+      <w:r>
+        <w:rPr>
+          <w:i/>
+          <w:iCs/>
+        </w:rPr>
+        <w:t>2 → erros (</w:t>
+      </w:r>
+      <w:proofErr w:type="spellStart"/>
+      <w:r>
+        <w:rPr>
+          <w:i/>
+          <w:iCs/>
+        </w:rPr>
+        <w:t>exceptions</w:t>
+      </w:r>
+      <w:proofErr w:type="spellEnd"/>
+      <w:r>
+        <w:rPr>
+          <w:i/>
+          <w:iCs/>
+        </w:rPr>
+        <w:t xml:space="preserve">, </w:t>
+      </w:r>
+      <w:proofErr w:type="spellStart"/>
+      <w:r>
+        <w:rPr>
+          <w:i/>
+          <w:iCs/>
+        </w:rPr>
+        <w:t>warnings</w:t>
+      </w:r>
+      <w:proofErr w:type="spellEnd"/>
+      <w:r>
+        <w:rPr>
+          <w:i/>
+          <w:iCs/>
+        </w:rPr>
+        <w:t>)</w:t>
+      </w:r>
+      <w:r>
+        <w:rPr>
+          <w:i/>
+          <w:iCs/>
+        </w:rPr>
+        <w:t xml:space="preserve"> </w:t>
+      </w:r>
+    </w:p>
+    <w:p>
+      <w:pPr>
+        <w:pStyle w:val="PargrafodaLista"/>
+        <w:ind w:left="2496"/>
+        <w:rPr>
+          <w:i/>
+          <w:iCs/>
+        </w:rPr>
+      </w:pPr>
+    </w:p>
+    <w:p>
+      <w:pPr>
+        <w:pStyle w:val="PargrafodaLista"/>
+        <w:ind w:left="1416"/>
+      </w:pPr>
+      <w:r>
+        <w:t xml:space="preserve">Portanto, </w:t>
+      </w:r>
+      <w:r>
+        <w:t xml:space="preserve">este trecho do comando define que </w:t>
+      </w:r>
+      <w:r>
+        <w:t>os</w:t>
+      </w:r>
+      <w:r>
+        <w:t xml:space="preserve"> erros também</w:t>
+      </w:r>
+      <w:r>
+        <w:t xml:space="preserve"> sejam armazenados</w:t>
+      </w:r>
+      <w:r>
+        <w:t xml:space="preserve"> </w:t>
+      </w:r>
+      <w:r>
+        <w:t>n</w:t>
+      </w:r>
+      <w:r>
+        <w:t>o mesmo lugar da saída normal</w:t>
+      </w:r>
+      <w:r>
+        <w:t>.</w:t>
+      </w:r>
+    </w:p>
+    <w:p>
+      <w:pPr>
+        <w:pStyle w:val="PargrafodaLista"/>
+        <w:ind w:left="1416"/>
+      </w:pPr>
+    </w:p>
+    <w:p>
+      <w:pPr>
+        <w:pStyle w:val="PargrafodaLista"/>
+        <w:ind w:left="1416"/>
+      </w:pPr>
+      <w:r>
+        <w:t xml:space="preserve">Ao conduzir o treinamento, o log NÃO é exibido em tempo real no terminal. Para acompanhar os logs é preciso acessar o arquivo train.log por meio do comando </w:t>
+      </w:r>
+      <w:r>
+        <w:rPr>
+          <w:i/>
+          <w:iCs/>
+        </w:rPr>
+        <w:t xml:space="preserve">&gt;&gt; </w:t>
+      </w:r>
+      <w:proofErr w:type="spellStart"/>
+      <w:r>
+        <w:rPr>
+          <w:i/>
+          <w:iCs/>
+        </w:rPr>
+        <w:t>tail</w:t>
+      </w:r>
+      <w:proofErr w:type="spellEnd"/>
+      <w:r>
+        <w:rPr>
+          <w:i/>
+          <w:iCs/>
+        </w:rPr>
+        <w:t xml:space="preserve"> -f </w:t>
+      </w:r>
+      <w:proofErr w:type="spellStart"/>
+      <w:r>
+        <w:rPr>
+          <w:i/>
+          <w:iCs/>
+        </w:rPr>
+        <w:t>experiments</w:t>
+      </w:r>
+      <w:proofErr w:type="spellEnd"/>
+      <w:r>
+        <w:rPr>
+          <w:i/>
+          <w:iCs/>
+        </w:rPr>
+        <w:t>/</w:t>
+      </w:r>
+      <w:proofErr w:type="spellStart"/>
+      <w:r>
+        <w:rPr>
+          <w:i/>
+          <w:iCs/>
+        </w:rPr>
         <w:t>nome_experimento</w:t>
       </w:r>
       <w:proofErr w:type="spellEnd"/>
       <w:r>
         <w:rPr>
-          <w:lang w:val="en-US"/>
+          <w:i/>
+          <w:iCs/>
         </w:rPr>
         <w:t>/logs/train.log</w:t>
       </w:r>
     </w:p>
     <w:p>
       <w:pPr>
-        <w:rPr>
-          <w:lang w:val="en-US"/>
-        </w:rPr>
-      </w:pPr>
-      <w:r>
-        <w:rPr>
-          <w:lang w:val="en-US"/>
-        </w:rPr>
+        <w:ind w:left="2124"/>
+        <w:rPr>
+          <w:i/>
+          <w:iCs/>
+        </w:rPr>
+      </w:pPr>
+    </w:p>
+    <w:p>
+      <w:pPr>
+        <w:pStyle w:val="PargrafodaLista"/>
+        <w:ind w:left="1776"/>
+      </w:pPr>
+    </w:p>
+    <w:p>
+      <w:r>
         <w:tab/>
       </w:r>
     </w:p>
@@ -9402,7 +9797,6 @@
           <w:color w:val="000000" w:themeColor="text1"/>
           <w:sz w:val="28"/>
           <w:szCs w:val="28"/>
-          <w:lang w:val="en-US"/>
         </w:rPr>
       </w:pPr>
     </w:p>
@@ -9489,7 +9883,7 @@
         <v:path o:extrusionok="f" gradientshapeok="t" o:connecttype="rect"/>
         <o:lock v:ext="edit" aspectratio="t"/>
       </v:shapetype>
-      <v:shape id="_x0000_i1150" type="#_x0000_t75" style="width:691.2pt;height:489.6pt;visibility:visible;mso-wrap-style:square" o:bullet="t">
+      <v:shape id="_x0000_i1080" type="#_x0000_t75" style="width:691.2pt;height:489.6pt;visibility:visible;mso-wrap-style:square" o:bullet="t">
         <v:imagedata r:id="rId1" o:title="" croptop="19686f" cropbottom="43833f" cropleft="8606f" cropright="55951f"/>
       </v:shape>
     </w:pict>
@@ -11047,6 +11441,92 @@
     </w:lvl>
   </w:abstractNum>
   <w:abstractNum w:abstractNumId="14" w15:restartNumberingAfterBreak="0">
+    <w:nsid w:val="1A9455BC"/>
+    <w:multiLevelType w:val="hybridMultilevel"/>
+    <w:tmpl w:val="E43A08F4"/>
+    <w:lvl w:ilvl="0" w:tplc="04160015">
+      <w:start w:val="1"/>
+      <w:numFmt w:val="upperLetter"/>
+      <w:lvlText w:val="%1."/>
+      <w:lvlJc w:val="left"/>
+      <w:pPr>
+        <w:ind w:left="1776" w:hanging="360"/>
+      </w:pPr>
+    </w:lvl>
+    <w:lvl w:ilvl="1" w:tplc="04160019">
+      <w:start w:val="1"/>
+      <w:numFmt w:val="lowerLetter"/>
+      <w:lvlText w:val="%2."/>
+      <w:lvlJc w:val="left"/>
+      <w:pPr>
+        <w:ind w:left="2496" w:hanging="360"/>
+      </w:pPr>
+    </w:lvl>
+    <w:lvl w:ilvl="2" w:tplc="0416001B" w:tentative="1">
+      <w:start w:val="1"/>
+      <w:numFmt w:val="lowerRoman"/>
+      <w:lvlText w:val="%3."/>
+      <w:lvlJc w:val="right"/>
+      <w:pPr>
+        <w:ind w:left="3216" w:hanging="180"/>
+      </w:pPr>
+    </w:lvl>
+    <w:lvl w:ilvl="3" w:tplc="0416000F" w:tentative="1">
+      <w:start w:val="1"/>
+      <w:numFmt w:val="decimal"/>
+      <w:lvlText w:val="%4."/>
+      <w:lvlJc w:val="left"/>
+      <w:pPr>
+        <w:ind w:left="3936" w:hanging="360"/>
+      </w:pPr>
+    </w:lvl>
+    <w:lvl w:ilvl="4" w:tplc="04160019" w:tentative="1">
+      <w:start w:val="1"/>
+      <w:numFmt w:val="lowerLetter"/>
+      <w:lvlText w:val="%5."/>
+      <w:lvlJc w:val="left"/>
+      <w:pPr>
+        <w:ind w:left="4656" w:hanging="360"/>
+      </w:pPr>
+    </w:lvl>
+    <w:lvl w:ilvl="5" w:tplc="0416001B" w:tentative="1">
+      <w:start w:val="1"/>
+      <w:numFmt w:val="lowerRoman"/>
+      <w:lvlText w:val="%6."/>
+      <w:lvlJc w:val="right"/>
+      <w:pPr>
+        <w:ind w:left="5376" w:hanging="180"/>
+      </w:pPr>
+    </w:lvl>
+    <w:lvl w:ilvl="6" w:tplc="0416000F" w:tentative="1">
+      <w:start w:val="1"/>
+      <w:numFmt w:val="decimal"/>
+      <w:lvlText w:val="%7."/>
+      <w:lvlJc w:val="left"/>
+      <w:pPr>
+        <w:ind w:left="6096" w:hanging="360"/>
+      </w:pPr>
+    </w:lvl>
+    <w:lvl w:ilvl="7" w:tplc="04160019" w:tentative="1">
+      <w:start w:val="1"/>
+      <w:numFmt w:val="lowerLetter"/>
+      <w:lvlText w:val="%8."/>
+      <w:lvlJc w:val="left"/>
+      <w:pPr>
+        <w:ind w:left="6816" w:hanging="360"/>
+      </w:pPr>
+    </w:lvl>
+    <w:lvl w:ilvl="8" w:tplc="0416001B" w:tentative="1">
+      <w:start w:val="1"/>
+      <w:numFmt w:val="lowerRoman"/>
+      <w:lvlText w:val="%9."/>
+      <w:lvlJc w:val="right"/>
+      <w:pPr>
+        <w:ind w:left="7536" w:hanging="180"/>
+      </w:pPr>
+    </w:lvl>
+  </w:abstractNum>
+  <w:abstractNum w:abstractNumId="15" w15:restartNumberingAfterBreak="0">
     <w:nsid w:val="1BE3798F"/>
     <w:multiLevelType w:val="hybridMultilevel"/>
     <w:tmpl w:val="498C011C"/>
@@ -11159,7 +11639,7 @@
       </w:rPr>
     </w:lvl>
   </w:abstractNum>
-  <w:abstractNum w:abstractNumId="15" w15:restartNumberingAfterBreak="0">
+  <w:abstractNum w:abstractNumId="16" w15:restartNumberingAfterBreak="0">
     <w:nsid w:val="24BD2911"/>
     <w:multiLevelType w:val="hybridMultilevel"/>
     <w:tmpl w:val="F320956E"/>
@@ -11272,7 +11752,7 @@
       </w:rPr>
     </w:lvl>
   </w:abstractNum>
-  <w:abstractNum w:abstractNumId="16" w15:restartNumberingAfterBreak="0">
+  <w:abstractNum w:abstractNumId="17" w15:restartNumberingAfterBreak="0">
     <w:nsid w:val="257F3AFD"/>
     <w:multiLevelType w:val="hybridMultilevel"/>
     <w:tmpl w:val="1EC031A0"/>
@@ -11385,7 +11865,7 @@
       </w:rPr>
     </w:lvl>
   </w:abstractNum>
-  <w:abstractNum w:abstractNumId="17" w15:restartNumberingAfterBreak="0">
+  <w:abstractNum w:abstractNumId="18" w15:restartNumberingAfterBreak="0">
     <w:nsid w:val="266A6226"/>
     <w:multiLevelType w:val="hybridMultilevel"/>
     <w:tmpl w:val="56660C70"/>
@@ -11498,7 +11978,7 @@
       </w:rPr>
     </w:lvl>
   </w:abstractNum>
-  <w:abstractNum w:abstractNumId="18" w15:restartNumberingAfterBreak="0">
+  <w:abstractNum w:abstractNumId="19" w15:restartNumberingAfterBreak="0">
     <w:nsid w:val="275E06D3"/>
     <w:multiLevelType w:val="hybridMultilevel"/>
     <w:tmpl w:val="0EDC60C0"/>
@@ -11611,7 +12091,7 @@
       </w:rPr>
     </w:lvl>
   </w:abstractNum>
-  <w:abstractNum w:abstractNumId="19" w15:restartNumberingAfterBreak="0">
+  <w:abstractNum w:abstractNumId="20" w15:restartNumberingAfterBreak="0">
     <w:nsid w:val="27A64D8B"/>
     <w:multiLevelType w:val="hybridMultilevel"/>
     <w:tmpl w:val="76704A36"/>
@@ -11697,7 +12177,7 @@
       </w:pPr>
     </w:lvl>
   </w:abstractNum>
-  <w:abstractNum w:abstractNumId="20" w15:restartNumberingAfterBreak="0">
+  <w:abstractNum w:abstractNumId="21" w15:restartNumberingAfterBreak="0">
     <w:nsid w:val="29B241C9"/>
     <w:multiLevelType w:val="hybridMultilevel"/>
     <w:tmpl w:val="0968580C"/>
@@ -11810,7 +12290,7 @@
       </w:rPr>
     </w:lvl>
   </w:abstractNum>
-  <w:abstractNum w:abstractNumId="21" w15:restartNumberingAfterBreak="0">
+  <w:abstractNum w:abstractNumId="22" w15:restartNumberingAfterBreak="0">
     <w:nsid w:val="2CE46092"/>
     <w:multiLevelType w:val="hybridMultilevel"/>
     <w:tmpl w:val="39E2E034"/>
@@ -11923,7 +12403,7 @@
       </w:rPr>
     </w:lvl>
   </w:abstractNum>
-  <w:abstractNum w:abstractNumId="22" w15:restartNumberingAfterBreak="0">
+  <w:abstractNum w:abstractNumId="23" w15:restartNumberingAfterBreak="0">
     <w:nsid w:val="2D4852E9"/>
     <w:multiLevelType w:val="hybridMultilevel"/>
     <w:tmpl w:val="D534DECE"/>
@@ -12009,7 +12489,7 @@
       </w:pPr>
     </w:lvl>
   </w:abstractNum>
-  <w:abstractNum w:abstractNumId="23" w15:restartNumberingAfterBreak="0">
+  <w:abstractNum w:abstractNumId="24" w15:restartNumberingAfterBreak="0">
     <w:nsid w:val="306B2EE5"/>
     <w:multiLevelType w:val="hybridMultilevel"/>
     <w:tmpl w:val="F0105A24"/>
@@ -12122,7 +12602,7 @@
       </w:rPr>
     </w:lvl>
   </w:abstractNum>
-  <w:abstractNum w:abstractNumId="24" w15:restartNumberingAfterBreak="0">
+  <w:abstractNum w:abstractNumId="25" w15:restartNumberingAfterBreak="0">
     <w:nsid w:val="32356899"/>
     <w:multiLevelType w:val="hybridMultilevel"/>
     <w:tmpl w:val="689EDD78"/>
@@ -12235,7 +12715,7 @@
       </w:rPr>
     </w:lvl>
   </w:abstractNum>
-  <w:abstractNum w:abstractNumId="25" w15:restartNumberingAfterBreak="0">
+  <w:abstractNum w:abstractNumId="26" w15:restartNumberingAfterBreak="0">
     <w:nsid w:val="363B3C5A"/>
     <w:multiLevelType w:val="hybridMultilevel"/>
     <w:tmpl w:val="16A40D1A"/>
@@ -12348,7 +12828,7 @@
       </w:rPr>
     </w:lvl>
   </w:abstractNum>
-  <w:abstractNum w:abstractNumId="26" w15:restartNumberingAfterBreak="0">
+  <w:abstractNum w:abstractNumId="27" w15:restartNumberingAfterBreak="0">
     <w:nsid w:val="39EA0086"/>
     <w:multiLevelType w:val="multilevel"/>
     <w:tmpl w:val="765C0A0E"/>
@@ -12461,7 +12941,7 @@
       </w:pPr>
     </w:lvl>
   </w:abstractNum>
-  <w:abstractNum w:abstractNumId="27" w15:restartNumberingAfterBreak="0">
+  <w:abstractNum w:abstractNumId="28" w15:restartNumberingAfterBreak="0">
     <w:nsid w:val="3A44790F"/>
     <w:multiLevelType w:val="hybridMultilevel"/>
     <w:tmpl w:val="6A1AC588"/>
@@ -12574,7 +13054,7 @@
       </w:rPr>
     </w:lvl>
   </w:abstractNum>
-  <w:abstractNum w:abstractNumId="28" w15:restartNumberingAfterBreak="0">
+  <w:abstractNum w:abstractNumId="29" w15:restartNumberingAfterBreak="0">
     <w:nsid w:val="3D216CD6"/>
     <w:multiLevelType w:val="hybridMultilevel"/>
     <w:tmpl w:val="2062B20A"/>
@@ -12687,7 +13167,7 @@
       </w:rPr>
     </w:lvl>
   </w:abstractNum>
-  <w:abstractNum w:abstractNumId="29" w15:restartNumberingAfterBreak="0">
+  <w:abstractNum w:abstractNumId="30" w15:restartNumberingAfterBreak="0">
     <w:nsid w:val="435C54D2"/>
     <w:multiLevelType w:val="hybridMultilevel"/>
     <w:tmpl w:val="AC84C2FE"/>
@@ -12775,7 +13255,7 @@
       </w:pPr>
     </w:lvl>
   </w:abstractNum>
-  <w:abstractNum w:abstractNumId="30" w15:restartNumberingAfterBreak="0">
+  <w:abstractNum w:abstractNumId="31" w15:restartNumberingAfterBreak="0">
     <w:nsid w:val="467A7958"/>
     <w:multiLevelType w:val="hybridMultilevel"/>
     <w:tmpl w:val="F98C2DB2"/>
@@ -12888,7 +13368,7 @@
       </w:rPr>
     </w:lvl>
   </w:abstractNum>
-  <w:abstractNum w:abstractNumId="31" w15:restartNumberingAfterBreak="0">
+  <w:abstractNum w:abstractNumId="32" w15:restartNumberingAfterBreak="0">
     <w:nsid w:val="4B8D2BA5"/>
     <w:multiLevelType w:val="hybridMultilevel"/>
     <w:tmpl w:val="33A0FD20"/>
@@ -13001,7 +13481,7 @@
       </w:rPr>
     </w:lvl>
   </w:abstractNum>
-  <w:abstractNum w:abstractNumId="32" w15:restartNumberingAfterBreak="0">
+  <w:abstractNum w:abstractNumId="33" w15:restartNumberingAfterBreak="0">
     <w:nsid w:val="4E491E67"/>
     <w:multiLevelType w:val="hybridMultilevel"/>
     <w:tmpl w:val="65BC7184"/>
@@ -13114,7 +13594,7 @@
       </w:rPr>
     </w:lvl>
   </w:abstractNum>
-  <w:abstractNum w:abstractNumId="33" w15:restartNumberingAfterBreak="0">
+  <w:abstractNum w:abstractNumId="34" w15:restartNumberingAfterBreak="0">
     <w:nsid w:val="56B238B8"/>
     <w:multiLevelType w:val="hybridMultilevel"/>
     <w:tmpl w:val="5A001A8C"/>
@@ -13227,7 +13707,7 @@
       </w:rPr>
     </w:lvl>
   </w:abstractNum>
-  <w:abstractNum w:abstractNumId="34" w15:restartNumberingAfterBreak="0">
+  <w:abstractNum w:abstractNumId="35" w15:restartNumberingAfterBreak="0">
     <w:nsid w:val="572156B3"/>
     <w:multiLevelType w:val="hybridMultilevel"/>
     <w:tmpl w:val="BA2471CE"/>
@@ -13340,7 +13820,7 @@
       </w:rPr>
     </w:lvl>
   </w:abstractNum>
-  <w:abstractNum w:abstractNumId="35" w15:restartNumberingAfterBreak="0">
+  <w:abstractNum w:abstractNumId="36" w15:restartNumberingAfterBreak="0">
     <w:nsid w:val="59E26DE5"/>
     <w:multiLevelType w:val="hybridMultilevel"/>
     <w:tmpl w:val="7AB8865A"/>
@@ -13426,7 +13906,7 @@
       </w:pPr>
     </w:lvl>
   </w:abstractNum>
-  <w:abstractNum w:abstractNumId="36" w15:restartNumberingAfterBreak="0">
+  <w:abstractNum w:abstractNumId="37" w15:restartNumberingAfterBreak="0">
     <w:nsid w:val="5C1E465F"/>
     <w:multiLevelType w:val="hybridMultilevel"/>
     <w:tmpl w:val="CC70734E"/>
@@ -13539,7 +14019,7 @@
       </w:rPr>
     </w:lvl>
   </w:abstractNum>
-  <w:abstractNum w:abstractNumId="37" w15:restartNumberingAfterBreak="0">
+  <w:abstractNum w:abstractNumId="38" w15:restartNumberingAfterBreak="0">
     <w:nsid w:val="5DE15B64"/>
     <w:multiLevelType w:val="hybridMultilevel"/>
     <w:tmpl w:val="C276D696"/>
@@ -13652,7 +14132,7 @@
       </w:rPr>
     </w:lvl>
   </w:abstractNum>
-  <w:abstractNum w:abstractNumId="38" w15:restartNumberingAfterBreak="0">
+  <w:abstractNum w:abstractNumId="39" w15:restartNumberingAfterBreak="0">
     <w:nsid w:val="613B7216"/>
     <w:multiLevelType w:val="hybridMultilevel"/>
     <w:tmpl w:val="6C2069C4"/>
@@ -13744,7 +14224,7 @@
       </w:pPr>
     </w:lvl>
   </w:abstractNum>
-  <w:abstractNum w:abstractNumId="39" w15:restartNumberingAfterBreak="0">
+  <w:abstractNum w:abstractNumId="40" w15:restartNumberingAfterBreak="0">
     <w:nsid w:val="61455081"/>
     <w:multiLevelType w:val="hybridMultilevel"/>
     <w:tmpl w:val="C7EA0426"/>
@@ -13854,7 +14334,7 @@
       </w:rPr>
     </w:lvl>
   </w:abstractNum>
-  <w:abstractNum w:abstractNumId="40" w15:restartNumberingAfterBreak="0">
+  <w:abstractNum w:abstractNumId="41" w15:restartNumberingAfterBreak="0">
     <w:nsid w:val="66301293"/>
     <w:multiLevelType w:val="hybridMultilevel"/>
     <w:tmpl w:val="2A7C4AA2"/>
@@ -13967,7 +14447,7 @@
       </w:rPr>
     </w:lvl>
   </w:abstractNum>
-  <w:abstractNum w:abstractNumId="41" w15:restartNumberingAfterBreak="0">
+  <w:abstractNum w:abstractNumId="42" w15:restartNumberingAfterBreak="0">
     <w:nsid w:val="681C3EB4"/>
     <w:multiLevelType w:val="hybridMultilevel"/>
     <w:tmpl w:val="6B5E972C"/>
@@ -14056,7 +14536,7 @@
       </w:pPr>
     </w:lvl>
   </w:abstractNum>
-  <w:abstractNum w:abstractNumId="42" w15:restartNumberingAfterBreak="0">
+  <w:abstractNum w:abstractNumId="43" w15:restartNumberingAfterBreak="0">
     <w:nsid w:val="72881E46"/>
     <w:multiLevelType w:val="hybridMultilevel"/>
     <w:tmpl w:val="9FFE752E"/>
@@ -14169,7 +14649,7 @@
       </w:rPr>
     </w:lvl>
   </w:abstractNum>
-  <w:abstractNum w:abstractNumId="43" w15:restartNumberingAfterBreak="0">
+  <w:abstractNum w:abstractNumId="44" w15:restartNumberingAfterBreak="0">
     <w:nsid w:val="72BF6667"/>
     <w:multiLevelType w:val="hybridMultilevel"/>
     <w:tmpl w:val="74B8363E"/>
@@ -14282,7 +14762,7 @@
       </w:rPr>
     </w:lvl>
   </w:abstractNum>
-  <w:abstractNum w:abstractNumId="44" w15:restartNumberingAfterBreak="0">
+  <w:abstractNum w:abstractNumId="45" w15:restartNumberingAfterBreak="0">
     <w:nsid w:val="739B653B"/>
     <w:multiLevelType w:val="hybridMultilevel"/>
     <w:tmpl w:val="86004430"/>
@@ -14395,7 +14875,7 @@
       </w:rPr>
     </w:lvl>
   </w:abstractNum>
-  <w:abstractNum w:abstractNumId="45" w15:restartNumberingAfterBreak="0">
+  <w:abstractNum w:abstractNumId="46" w15:restartNumberingAfterBreak="0">
     <w:nsid w:val="75C603A4"/>
     <w:multiLevelType w:val="hybridMultilevel"/>
     <w:tmpl w:val="F362A5E2"/>
@@ -14505,7 +14985,7 @@
       </w:rPr>
     </w:lvl>
   </w:abstractNum>
-  <w:abstractNum w:abstractNumId="46" w15:restartNumberingAfterBreak="0">
+  <w:abstractNum w:abstractNumId="47" w15:restartNumberingAfterBreak="0">
     <w:nsid w:val="76F55A3F"/>
     <w:multiLevelType w:val="multilevel"/>
     <w:tmpl w:val="D6425CC6"/>
@@ -14654,7 +15134,7 @@
       </w:rPr>
     </w:lvl>
   </w:abstractNum>
-  <w:abstractNum w:abstractNumId="47" w15:restartNumberingAfterBreak="0">
+  <w:abstractNum w:abstractNumId="48" w15:restartNumberingAfterBreak="0">
     <w:nsid w:val="785D5530"/>
     <w:multiLevelType w:val="hybridMultilevel"/>
     <w:tmpl w:val="B5BC727C"/>
@@ -14767,7 +15247,7 @@
       </w:rPr>
     </w:lvl>
   </w:abstractNum>
-  <w:abstractNum w:abstractNumId="48" w15:restartNumberingAfterBreak="0">
+  <w:abstractNum w:abstractNumId="49" w15:restartNumberingAfterBreak="0">
     <w:nsid w:val="78A40A9E"/>
     <w:multiLevelType w:val="hybridMultilevel"/>
     <w:tmpl w:val="1E8C2ABE"/>
@@ -14853,7 +15333,7 @@
       </w:pPr>
     </w:lvl>
   </w:abstractNum>
-  <w:abstractNum w:abstractNumId="49" w15:restartNumberingAfterBreak="0">
+  <w:abstractNum w:abstractNumId="50" w15:restartNumberingAfterBreak="0">
     <w:nsid w:val="7C4F3572"/>
     <w:multiLevelType w:val="hybridMultilevel"/>
     <w:tmpl w:val="10F02A50"/>
@@ -14966,7 +15446,7 @@
       </w:rPr>
     </w:lvl>
   </w:abstractNum>
-  <w:abstractNum w:abstractNumId="50" w15:restartNumberingAfterBreak="0">
+  <w:abstractNum w:abstractNumId="51" w15:restartNumberingAfterBreak="0">
     <w:nsid w:val="7D075251"/>
     <w:multiLevelType w:val="hybridMultilevel"/>
     <w:tmpl w:val="DE3E8316"/>
@@ -15079,7 +15559,7 @@
       </w:rPr>
     </w:lvl>
   </w:abstractNum>
-  <w:abstractNum w:abstractNumId="51" w15:restartNumberingAfterBreak="0">
+  <w:abstractNum w:abstractNumId="52" w15:restartNumberingAfterBreak="0">
     <w:nsid w:val="7FD31BE5"/>
     <w:multiLevelType w:val="hybridMultilevel"/>
     <w:tmpl w:val="A54CCE82"/>
@@ -15193,130 +15673,130 @@
     </w:lvl>
   </w:abstractNum>
   <w:num w:numId="1" w16cid:durableId="231621070">
-    <w:abstractNumId w:val="29"/>
+    <w:abstractNumId w:val="30"/>
   </w:num>
   <w:num w:numId="2" w16cid:durableId="494537868">
     <w:abstractNumId w:val="12"/>
   </w:num>
   <w:num w:numId="3" w16cid:durableId="555967944">
-    <w:abstractNumId w:val="47"/>
+    <w:abstractNumId w:val="48"/>
   </w:num>
   <w:num w:numId="4" w16cid:durableId="975720977">
-    <w:abstractNumId w:val="17"/>
+    <w:abstractNumId w:val="18"/>
   </w:num>
   <w:num w:numId="5" w16cid:durableId="1419063285">
     <w:abstractNumId w:val="2"/>
   </w:num>
   <w:num w:numId="6" w16cid:durableId="1947691180">
-    <w:abstractNumId w:val="38"/>
+    <w:abstractNumId w:val="39"/>
   </w:num>
   <w:num w:numId="7" w16cid:durableId="543980649">
-    <w:abstractNumId w:val="16"/>
+    <w:abstractNumId w:val="17"/>
   </w:num>
   <w:num w:numId="8" w16cid:durableId="523710046">
     <w:abstractNumId w:val="0"/>
   </w:num>
   <w:num w:numId="9" w16cid:durableId="736512136">
-    <w:abstractNumId w:val="34"/>
+    <w:abstractNumId w:val="35"/>
   </w:num>
   <w:num w:numId="10" w16cid:durableId="1832524834">
-    <w:abstractNumId w:val="50"/>
+    <w:abstractNumId w:val="51"/>
   </w:num>
   <w:num w:numId="11" w16cid:durableId="1122117184">
-    <w:abstractNumId w:val="23"/>
+    <w:abstractNumId w:val="24"/>
   </w:num>
   <w:num w:numId="12" w16cid:durableId="2133136465">
     <w:abstractNumId w:val="11"/>
   </w:num>
   <w:num w:numId="13" w16cid:durableId="1067458539">
-    <w:abstractNumId w:val="20"/>
+    <w:abstractNumId w:val="21"/>
   </w:num>
   <w:num w:numId="14" w16cid:durableId="1593928561">
     <w:abstractNumId w:val="3"/>
   </w:num>
   <w:num w:numId="15" w16cid:durableId="1046374455">
-    <w:abstractNumId w:val="40"/>
+    <w:abstractNumId w:val="41"/>
   </w:num>
   <w:num w:numId="16" w16cid:durableId="1399130606">
     <w:abstractNumId w:val="13"/>
   </w:num>
   <w:num w:numId="17" w16cid:durableId="279843836">
-    <w:abstractNumId w:val="36"/>
+    <w:abstractNumId w:val="37"/>
   </w:num>
   <w:num w:numId="18" w16cid:durableId="1173257668">
-    <w:abstractNumId w:val="14"/>
+    <w:abstractNumId w:val="15"/>
   </w:num>
   <w:num w:numId="19" w16cid:durableId="1573469366">
-    <w:abstractNumId w:val="32"/>
+    <w:abstractNumId w:val="33"/>
   </w:num>
   <w:num w:numId="20" w16cid:durableId="1306812659">
     <w:abstractNumId w:val="5"/>
   </w:num>
   <w:num w:numId="21" w16cid:durableId="655647183">
-    <w:abstractNumId w:val="51"/>
+    <w:abstractNumId w:val="52"/>
   </w:num>
   <w:num w:numId="22" w16cid:durableId="915549673">
     <w:abstractNumId w:val="1"/>
   </w:num>
   <w:num w:numId="23" w16cid:durableId="1525512738">
-    <w:abstractNumId w:val="30"/>
+    <w:abstractNumId w:val="31"/>
   </w:num>
   <w:num w:numId="24" w16cid:durableId="2027976820">
-    <w:abstractNumId w:val="31"/>
+    <w:abstractNumId w:val="32"/>
   </w:num>
   <w:num w:numId="25" w16cid:durableId="115225939">
-    <w:abstractNumId w:val="49"/>
+    <w:abstractNumId w:val="50"/>
   </w:num>
   <w:num w:numId="26" w16cid:durableId="1462114911">
-    <w:abstractNumId w:val="44"/>
+    <w:abstractNumId w:val="45"/>
   </w:num>
   <w:num w:numId="27" w16cid:durableId="1454132460">
+    <w:abstractNumId w:val="28"/>
+  </w:num>
+  <w:num w:numId="28" w16cid:durableId="16584153">
     <w:abstractNumId w:val="27"/>
   </w:num>
-  <w:num w:numId="28" w16cid:durableId="16584153">
-    <w:abstractNumId w:val="26"/>
-  </w:num>
   <w:num w:numId="29" w16cid:durableId="515537849">
-    <w:abstractNumId w:val="28"/>
+    <w:abstractNumId w:val="29"/>
   </w:num>
   <w:num w:numId="30" w16cid:durableId="954872968">
     <w:abstractNumId w:val="10"/>
   </w:num>
   <w:num w:numId="31" w16cid:durableId="1487283039">
-    <w:abstractNumId w:val="25"/>
+    <w:abstractNumId w:val="26"/>
   </w:num>
   <w:num w:numId="32" w16cid:durableId="1614098087">
     <w:abstractNumId w:val="9"/>
   </w:num>
   <w:num w:numId="33" w16cid:durableId="727531434">
-    <w:abstractNumId w:val="18"/>
+    <w:abstractNumId w:val="19"/>
   </w:num>
   <w:num w:numId="34" w16cid:durableId="734277080">
-    <w:abstractNumId w:val="45"/>
+    <w:abstractNumId w:val="46"/>
   </w:num>
   <w:num w:numId="35" w16cid:durableId="598677082">
-    <w:abstractNumId w:val="15"/>
+    <w:abstractNumId w:val="16"/>
   </w:num>
   <w:num w:numId="36" w16cid:durableId="946348536">
     <w:abstractNumId w:val="7"/>
   </w:num>
   <w:num w:numId="37" w16cid:durableId="503669862">
-    <w:abstractNumId w:val="39"/>
+    <w:abstractNumId w:val="40"/>
   </w:num>
   <w:num w:numId="38" w16cid:durableId="539130844">
     <w:abstractNumId w:val="4"/>
   </w:num>
   <w:num w:numId="39" w16cid:durableId="976566880">
+    <w:abstractNumId w:val="23"/>
+  </w:num>
+  <w:num w:numId="40" w16cid:durableId="1023172698">
     <w:abstractNumId w:val="22"/>
   </w:num>
-  <w:num w:numId="40" w16cid:durableId="1023172698">
-    <w:abstractNumId w:val="21"/>
-  </w:num>
   <w:num w:numId="41" w16cid:durableId="1073894177">
-    <w:abstractNumId w:val="42"/>
+    <w:abstractNumId w:val="43"/>
   </w:num>
   <w:num w:numId="42" w16cid:durableId="776487993">
-    <w:abstractNumId w:val="48"/>
+    <w:abstractNumId w:val="49"/>
   </w:num>
   <w:num w:numId="43" w16cid:durableId="970675162">
     <w:abstractNumId w:val="8"/>
@@ -15325,28 +15805,31 @@
     <w:abstractNumId w:val="6"/>
   </w:num>
   <w:num w:numId="45" w16cid:durableId="375591668">
-    <w:abstractNumId w:val="35"/>
+    <w:abstractNumId w:val="36"/>
   </w:num>
   <w:num w:numId="46" w16cid:durableId="1354721866">
-    <w:abstractNumId w:val="46"/>
+    <w:abstractNumId w:val="47"/>
   </w:num>
   <w:num w:numId="47" w16cid:durableId="2006320800">
-    <w:abstractNumId w:val="33"/>
+    <w:abstractNumId w:val="34"/>
   </w:num>
   <w:num w:numId="48" w16cid:durableId="1650596410">
-    <w:abstractNumId w:val="37"/>
+    <w:abstractNumId w:val="38"/>
   </w:num>
   <w:num w:numId="49" w16cid:durableId="933393196">
-    <w:abstractNumId w:val="24"/>
+    <w:abstractNumId w:val="25"/>
   </w:num>
   <w:num w:numId="50" w16cid:durableId="32733731">
-    <w:abstractNumId w:val="41"/>
+    <w:abstractNumId w:val="42"/>
   </w:num>
   <w:num w:numId="51" w16cid:durableId="1491747206">
-    <w:abstractNumId w:val="43"/>
+    <w:abstractNumId w:val="44"/>
   </w:num>
   <w:num w:numId="52" w16cid:durableId="1431269584">
-    <w:abstractNumId w:val="19"/>
+    <w:abstractNumId w:val="20"/>
+  </w:num>
+  <w:num w:numId="53" w16cid:durableId="1920942858">
+    <w:abstractNumId w:val="14"/>
   </w:num>
 </w:numbering>
 </file>

</xml_diff>

<commit_message>
Atualização do documento de estudos conduzidos
</commit_message>
<xml_diff>
--- a/Documents and Backups/Estudos Conduzidos.docx
+++ b/Documents and Backups/Estudos Conduzidos.docx
@@ -849,7 +849,6 @@
       <w:r>
         <w:t xml:space="preserve">utilizaram os </w:t>
       </w:r>
-      <w:proofErr w:type="spellStart"/>
       <w:r>
         <w:rPr>
           <w:i/>
@@ -857,11 +856,9 @@
         </w:rPr>
         <w:t>TFRecords</w:t>
       </w:r>
-      <w:proofErr w:type="spellEnd"/>
       <w:r>
         <w:t xml:space="preserve"> da </w:t>
       </w:r>
-      <w:proofErr w:type="spellStart"/>
       <w:r>
         <w:rPr>
           <w:i/>
@@ -869,7 +866,6 @@
         </w:rPr>
         <w:t>ImageNet</w:t>
       </w:r>
-      <w:proofErr w:type="spellEnd"/>
       <w:r>
         <w:t xml:space="preserve"> como entrada. </w:t>
       </w:r>
@@ -909,7 +905,6 @@
       <w:r>
         <w:t xml:space="preserve">em vez de processar milhares/milhões de pequenos arquivos de imagem. Um </w:t>
       </w:r>
-      <w:proofErr w:type="spellStart"/>
       <w:r>
         <w:rPr>
           <w:i/>
@@ -917,7 +912,6 @@
         </w:rPr>
         <w:t>TFRecord</w:t>
       </w:r>
-      <w:proofErr w:type="spellEnd"/>
       <w:r>
         <w:t xml:space="preserve"> é basicamente uma lista de exemplos serializados, onde cada exemplo contém features, descritas pela Figura </w:t>
       </w:r>
@@ -964,17 +958,8 @@
           <w:sz w:val="18"/>
           <w:szCs w:val="18"/>
         </w:rPr>
-        <w:t xml:space="preserve">Exemplo da estrutura de um </w:t>
-      </w:r>
-      <w:proofErr w:type="spellStart"/>
-      <w:r>
-        <w:rPr>
-          <w:sz w:val="18"/>
-          <w:szCs w:val="18"/>
-        </w:rPr>
-        <w:t>TFRecord</w:t>
-      </w:r>
-      <w:proofErr w:type="spellEnd"/>
+        <w:t>Exemplo da estrutura de um TFRecord</w:t>
+      </w:r>
     </w:p>
     <w:p>
       <w:pPr>
@@ -1038,7 +1023,6 @@
         <w:ind w:left="1080"/>
         <w:jc w:val="both"/>
       </w:pPr>
-      <w:proofErr w:type="spellStart"/>
       <w:r>
         <w:rPr>
           <w:i/>
@@ -1046,7 +1030,6 @@
         </w:rPr>
         <w:t>Protocol</w:t>
       </w:r>
-      <w:proofErr w:type="spellEnd"/>
       <w:r>
         <w:t xml:space="preserve"> </w:t>
       </w:r>
@@ -1060,7 +1043,6 @@
       <w:r>
         <w:t xml:space="preserve"> (</w:t>
       </w:r>
-      <w:proofErr w:type="spellStart"/>
       <w:r>
         <w:rPr>
           <w:i/>
@@ -1068,11 +1050,9 @@
         </w:rPr>
         <w:t>Protobuf</w:t>
       </w:r>
-      <w:proofErr w:type="spellEnd"/>
       <w:r>
         <w:t xml:space="preserve">) é um formato de serialização de dados criado pelo Google e utilizado na criação dos </w:t>
       </w:r>
-      <w:proofErr w:type="spellStart"/>
       <w:r>
         <w:rPr>
           <w:i/>
@@ -1080,7 +1060,6 @@
         </w:rPr>
         <w:t>TFRecords</w:t>
       </w:r>
-      <w:proofErr w:type="spellEnd"/>
       <w:r>
         <w:t xml:space="preserve"> que busca transformar estruturas de </w:t>
       </w:r>
@@ -1115,7 +1094,6 @@
       <w:r>
         <w:t xml:space="preserve"> apresenta uma tabela com uma relação estimada entre o tamanho e complexidade da base de dados com a conversão prévia para </w:t>
       </w:r>
-      <w:proofErr w:type="spellStart"/>
       <w:r>
         <w:rPr>
           <w:i/>
@@ -1123,11 +1101,9 @@
         </w:rPr>
         <w:t>TFRecords</w:t>
       </w:r>
-      <w:proofErr w:type="spellEnd"/>
       <w:r>
         <w:t xml:space="preserve">. De modo geral, a conversão para </w:t>
       </w:r>
-      <w:proofErr w:type="spellStart"/>
       <w:r>
         <w:rPr>
           <w:i/>
@@ -1135,7 +1111,6 @@
         </w:rPr>
         <w:t>TFRecords</w:t>
       </w:r>
-      <w:proofErr w:type="spellEnd"/>
       <w:r>
         <w:t xml:space="preserve"> se mostra apenas vantajoso para casos onde a base de dados é extensa, ou quando houver treinamento distribuído.</w:t>
       </w:r>
@@ -1184,39 +1159,7 @@
           <w:sz w:val="18"/>
           <w:szCs w:val="18"/>
         </w:rPr>
-        <w:t xml:space="preserve">Relação entre o tamanho/complexidade de um </w:t>
-      </w:r>
-      <w:proofErr w:type="spellStart"/>
-      <w:r>
-        <w:rPr>
-          <w:sz w:val="18"/>
-          <w:szCs w:val="18"/>
-        </w:rPr>
-        <w:t>dataset</w:t>
-      </w:r>
-      <w:proofErr w:type="spellEnd"/>
-      <w:r>
-        <w:rPr>
-          <w:sz w:val="18"/>
-          <w:szCs w:val="18"/>
-        </w:rPr>
-        <w:t xml:space="preserve"> com o uso do </w:t>
-      </w:r>
-      <w:proofErr w:type="spellStart"/>
-      <w:r>
-        <w:rPr>
-          <w:sz w:val="18"/>
-          <w:szCs w:val="18"/>
-        </w:rPr>
-        <w:t>TFRecords</w:t>
-      </w:r>
-      <w:proofErr w:type="spellEnd"/>
-      <w:r>
-        <w:rPr>
-          <w:sz w:val="18"/>
-          <w:szCs w:val="18"/>
-        </w:rPr>
-        <w:t xml:space="preserve"> </w:t>
+        <w:t xml:space="preserve">Relação entre o tamanho/complexidade de um dataset com o uso do TFRecords </w:t>
       </w:r>
     </w:p>
     <w:p>
@@ -1286,7 +1229,6 @@
       <w:r>
         <w:t xml:space="preserve">Utilizar diretamente as imagens PNG é a abordagem mais simples e comum para </w:t>
       </w:r>
-      <w:proofErr w:type="spellStart"/>
       <w:r>
         <w:rPr>
           <w:i/>
@@ -1294,11 +1236,9 @@
         </w:rPr>
         <w:t>datasets</w:t>
       </w:r>
-      <w:proofErr w:type="spellEnd"/>
       <w:r>
         <w:t xml:space="preserve"> pequenos e médios. Nesse caso, o </w:t>
       </w:r>
-      <w:proofErr w:type="spellStart"/>
       <w:r>
         <w:rPr>
           <w:i/>
@@ -1306,11 +1246,9 @@
         </w:rPr>
         <w:t>TensorFlow</w:t>
       </w:r>
-      <w:proofErr w:type="spellEnd"/>
       <w:r>
         <w:t xml:space="preserve"> faz a leitura dos arquivos individuais, decodifica o PNG, aplica os pré-processamentos necessários e envia os tensores para a GPU. Para um </w:t>
       </w:r>
-      <w:proofErr w:type="spellStart"/>
       <w:r>
         <w:rPr>
           <w:i/>
@@ -1318,7 +1256,6 @@
         </w:rPr>
         <w:t>dataset</w:t>
       </w:r>
-      <w:proofErr w:type="spellEnd"/>
       <w:r>
         <w:t xml:space="preserve"> com 13.000 imagens, esse pipeline é mais do que suficiente.</w:t>
       </w:r>
@@ -1343,7 +1280,6 @@
       <w:r>
         <w:t xml:space="preserve">A principal desvantagem dessa opção é a baixa escalabilidade. Caso o </w:t>
       </w:r>
-      <w:proofErr w:type="spellStart"/>
       <w:r>
         <w:rPr>
           <w:i/>
@@ -1351,7 +1287,6 @@
         </w:rPr>
         <w:t>dataset</w:t>
       </w:r>
-      <w:proofErr w:type="spellEnd"/>
       <w:r>
         <w:t xml:space="preserve"> cresça consideravelmente, ou seja, utilizado o treinamento distribuído, o acesso a muitos arquivos pequenos pode se tornar um gargalo de I/O.</w:t>
       </w:r>
@@ -1376,7 +1311,6 @@
       <w:r>
         <w:t xml:space="preserve">É importante destacar que </w:t>
       </w:r>
-      <w:proofErr w:type="spellStart"/>
       <w:r>
         <w:rPr>
           <w:i/>
@@ -1384,11 +1318,9 @@
         </w:rPr>
         <w:t>TFRecords</w:t>
       </w:r>
-      <w:proofErr w:type="spellEnd"/>
       <w:r>
         <w:t xml:space="preserve"> não alteram a qualidade do treinamento. Eles não melhoram </w:t>
       </w:r>
-      <w:proofErr w:type="spellStart"/>
       <w:r>
         <w:rPr>
           <w:i/>
@@ -1396,11 +1328,9 @@
         </w:rPr>
         <w:t>accuracy</w:t>
       </w:r>
-      <w:proofErr w:type="spellEnd"/>
       <w:r>
         <w:t xml:space="preserve">, </w:t>
       </w:r>
-      <w:proofErr w:type="spellStart"/>
       <w:r>
         <w:rPr>
           <w:i/>
@@ -1408,11 +1338,9 @@
         </w:rPr>
         <w:t>loss</w:t>
       </w:r>
-      <w:proofErr w:type="spellEnd"/>
       <w:r>
         <w:t xml:space="preserve"> ou capacidade de generalização do modelo. O conteúdo do dado é exatamente o mesmo; o que muda é apenas a forma como ele é carregado. Como conclusão, a base de dados dos camundongos para este projeto NÃO será convertida em </w:t>
       </w:r>
-      <w:proofErr w:type="spellStart"/>
       <w:r>
         <w:rPr>
           <w:i/>
@@ -1420,7 +1348,6 @@
         </w:rPr>
         <w:t>TFRecords</w:t>
       </w:r>
-      <w:proofErr w:type="spellEnd"/>
       <w:r>
         <w:t xml:space="preserve"> para o treinamento.</w:t>
       </w:r>
@@ -1639,7 +1566,6 @@
         </w:rPr>
         <w:t xml:space="preserve">Fase 1 — </w:t>
       </w:r>
-      <w:proofErr w:type="spellStart"/>
       <w:r>
         <w:rPr>
           <w:b/>
@@ -1647,29 +1573,8 @@
           <w:i/>
           <w:iCs/>
         </w:rPr>
-        <w:t>Sanity</w:t>
-      </w:r>
-      <w:proofErr w:type="spellEnd"/>
-      <w:r>
-        <w:rPr>
-          <w:b/>
-          <w:bCs/>
-          <w:i/>
-          <w:iCs/>
-        </w:rPr>
-        <w:t xml:space="preserve"> </w:t>
-      </w:r>
-      <w:proofErr w:type="spellStart"/>
-      <w:r>
-        <w:rPr>
-          <w:b/>
-          <w:bCs/>
-          <w:i/>
-          <w:iCs/>
-        </w:rPr>
-        <w:t>Check</w:t>
-      </w:r>
-      <w:proofErr w:type="spellEnd"/>
+        <w:t>Sanity Check</w:t>
+      </w:r>
       <w:r>
         <w:rPr>
           <w:b/>
@@ -1719,14 +1624,12 @@
         </w:rPr>
         <w:t>STEP_PER_EPOCH = 100 (</w:t>
       </w:r>
-      <w:proofErr w:type="spellStart"/>
       <w:r>
         <w:rPr>
           <w:lang w:val="en-US"/>
         </w:rPr>
         <w:t>limitado</w:t>
       </w:r>
-      <w:proofErr w:type="spellEnd"/>
       <w:r>
         <w:rPr>
           <w:lang w:val="en-US"/>
@@ -1814,23 +1717,7 @@
           <w:b/>
           <w:bCs/>
         </w:rPr>
-        <w:t xml:space="preserve"> Exploração de </w:t>
-      </w:r>
-      <w:proofErr w:type="spellStart"/>
-      <w:r>
-        <w:rPr>
-          <w:b/>
-          <w:bCs/>
-        </w:rPr>
-        <w:t>hiperparâmetros</w:t>
-      </w:r>
-      <w:proofErr w:type="spellEnd"/>
-      <w:r>
-        <w:rPr>
-          <w:b/>
-          <w:bCs/>
-        </w:rPr>
-        <w:t xml:space="preserve">: </w:t>
+        <w:t xml:space="preserve"> Exploração de hiperparâmetros: </w:t>
       </w:r>
       <w:r>
         <w:t>S</w:t>
@@ -1838,7 +1725,6 @@
       <w:r>
         <w:t xml:space="preserve">erve para avaliar </w:t>
       </w:r>
-      <w:proofErr w:type="spellStart"/>
       <w:r>
         <w:rPr>
           <w:i/>
@@ -1846,11 +1732,9 @@
         </w:rPr>
         <w:t>overfitting</w:t>
       </w:r>
-      <w:proofErr w:type="spellEnd"/>
       <w:r>
         <w:t xml:space="preserve"> e definir valores de Learning Rate e Batch </w:t>
       </w:r>
-      <w:proofErr w:type="spellStart"/>
       <w:r>
         <w:rPr>
           <w:i/>
@@ -1858,7 +1742,6 @@
         </w:rPr>
         <w:t>Size</w:t>
       </w:r>
-      <w:proofErr w:type="spellEnd"/>
       <w:r>
         <w:t xml:space="preserve">. A ideia é observar o comportamento do treinamento, avaliar curvas, otimizar a arquitetura e salvar o melhor checkpoint. </w:t>
       </w:r>
@@ -1954,7 +1837,6 @@
       <w:r>
         <w:t xml:space="preserve">Tem o objetivo de obter a melhor generalização possível para o modelo, possibilitando a coleta de um resultado verdadeiramente científico. Para </w:t>
       </w:r>
-      <w:proofErr w:type="spellStart"/>
       <w:r>
         <w:rPr>
           <w:i/>
@@ -1962,7 +1844,6 @@
         </w:rPr>
         <w:t>datasets</w:t>
       </w:r>
-      <w:proofErr w:type="spellEnd"/>
       <w:r>
         <w:t xml:space="preserve"> menores (como o caso deste projeto), o valor total de steps gira em torno de 10K à 30K.</w:t>
       </w:r>
@@ -2134,7 +2015,6 @@
         </w:rPr>
         <w:t xml:space="preserve">1 </w:t>
       </w:r>
-      <w:proofErr w:type="spellStart"/>
       <w:r>
         <w:rPr>
           <w:b/>
@@ -2144,7 +2024,6 @@
         </w:rPr>
         <w:t>Epoch</w:t>
       </w:r>
-      <w:proofErr w:type="spellEnd"/>
       <w:r>
         <w:t xml:space="preserve"> = “</w:t>
       </w:r>
@@ -2154,7 +2033,6 @@
       <w:r>
         <w:t xml:space="preserve">” pelo </w:t>
       </w:r>
-      <w:proofErr w:type="spellStart"/>
       <w:r>
         <w:rPr>
           <w:i/>
@@ -2162,7 +2040,6 @@
         </w:rPr>
         <w:t>dataset</w:t>
       </w:r>
-      <w:proofErr w:type="spellEnd"/>
       <w:r>
         <w:t xml:space="preserve"> (ou pela amostra definida)</w:t>
       </w:r>
@@ -2331,20 +2208,11 @@
         <w:jc w:val="both"/>
       </w:pPr>
       <w:r>
-        <w:t xml:space="preserve">O experimento 6 da </w:t>
-      </w:r>
-      <w:proofErr w:type="spellStart"/>
-      <w:r>
-        <w:t>ResNet</w:t>
-      </w:r>
-      <w:proofErr w:type="spellEnd"/>
-      <w:r>
-        <w:t xml:space="preserve"> </w:t>
+        <w:t xml:space="preserve">O experimento 6 da ResNet </w:t>
       </w:r>
       <w:r>
         <w:t xml:space="preserve">chegou rapidamente ao limite de informação que o </w:t>
       </w:r>
-      <w:proofErr w:type="spellStart"/>
       <w:r>
         <w:rPr>
           <w:i/>
@@ -2352,7 +2220,6 @@
         </w:rPr>
         <w:t>dataset</w:t>
       </w:r>
-      <w:proofErr w:type="spellEnd"/>
       <w:r>
         <w:t xml:space="preserve"> consegue fornecer. Em outras palavras: a rede aprende tudo o que é estatisticamente aprendível cedo no treinamento, e depois disso só faz refinamentos muito pequenos.</w:t>
       </w:r>
@@ -2395,37 +2262,20 @@
           <w:b/>
           <w:bCs/>
         </w:rPr>
+        <w:t xml:space="preserve"> dataset é pequeno</w:t>
+      </w:r>
+      <w:r>
+        <w:t>:</w:t>
+      </w:r>
+      <w:r>
         <w:t xml:space="preserve"> </w:t>
       </w:r>
-      <w:proofErr w:type="spellStart"/>
-      <w:r>
-        <w:rPr>
-          <w:b/>
-          <w:bCs/>
-        </w:rPr>
-        <w:t>dataset</w:t>
-      </w:r>
-      <w:proofErr w:type="spellEnd"/>
-      <w:r>
-        <w:rPr>
-          <w:b/>
-          <w:bCs/>
-        </w:rPr>
-        <w:t xml:space="preserve"> é pequeno</w:t>
-      </w:r>
-      <w:r>
-        <w:t>:</w:t>
-      </w:r>
-      <w:r>
-        <w:t xml:space="preserve"> </w:t>
-      </w:r>
       <w:r>
         <w:t>m</w:t>
       </w:r>
       <w:r>
         <w:t xml:space="preserve">esmo com </w:t>
       </w:r>
-      <w:proofErr w:type="spellStart"/>
       <w:r>
         <w:rPr>
           <w:i/>
@@ -2433,7 +2283,6 @@
         </w:rPr>
         <w:t>augmentations</w:t>
       </w:r>
-      <w:proofErr w:type="spellEnd"/>
       <w:r>
         <w:t xml:space="preserve">, a diversidade estatística real é limitada. Redes convolucionais aprendem padrões visuais relativamente rápido quando as classes são poucas (3 classes, no </w:t>
       </w:r>
@@ -2491,7 +2340,6 @@
       <w:r>
         <w:t xml:space="preserve"> normalização correta, </w:t>
       </w:r>
-      <w:proofErr w:type="spellStart"/>
       <w:r>
         <w:rPr>
           <w:i/>
@@ -2499,11 +2347,9 @@
         </w:rPr>
         <w:t>augmentations</w:t>
       </w:r>
-      <w:proofErr w:type="spellEnd"/>
       <w:r>
         <w:t xml:space="preserve"> coerentes, </w:t>
       </w:r>
-      <w:proofErr w:type="spellStart"/>
       <w:r>
         <w:rPr>
           <w:i/>
@@ -2511,7 +2357,6 @@
         </w:rPr>
         <w:t>scheduler</w:t>
       </w:r>
-      <w:proofErr w:type="spellEnd"/>
       <w:r>
         <w:t xml:space="preserve"> de </w:t>
       </w:r>
@@ -2559,25 +2404,15 @@
       <w:r>
         <w:t xml:space="preserve">a </w:t>
       </w:r>
-      <w:proofErr w:type="spellStart"/>
-      <w:r>
-        <w:t>ResNet</w:t>
-      </w:r>
-      <w:proofErr w:type="spellEnd"/>
-      <w:r>
-        <w:t xml:space="preserve"> utilizam convoluções padrão, que são computacionalmente caras porque, para cada filtro, há uma combinação completa entre todos os canais de entrada. Isso faz com que o número de operações cresça rapidamente conforme a rede se aprofunda.</w:t>
+      <w:r>
+        <w:t>ResNet utilizam convoluções padrão, que são computacionalmente caras porque, para cada filtro, há uma combinação completa entre todos os canais de entrada. Isso faz com que o número de operações cresça rapidamente conforme a rede se aprofunda.</w:t>
       </w:r>
       <w:r>
         <w:t xml:space="preserve"> </w:t>
       </w:r>
       <w:r>
-        <w:t xml:space="preserve">A </w:t>
-      </w:r>
-      <w:proofErr w:type="spellStart"/>
-      <w:r>
-        <w:t>MobileNet</w:t>
-      </w:r>
-      <w:proofErr w:type="spellEnd"/>
+        <w:t>A MobileNet</w:t>
+      </w:r>
       <w:r>
         <w:t xml:space="preserve"> busca</w:t>
       </w:r>
@@ -2600,47 +2435,13 @@
       <w:r>
         <w:t xml:space="preserve">, chamadas de </w:t>
       </w:r>
-      <w:proofErr w:type="spellStart"/>
       <w:r>
         <w:rPr>
           <w:i/>
           <w:iCs/>
         </w:rPr>
-        <w:t>depthwise</w:t>
-      </w:r>
-      <w:proofErr w:type="spellEnd"/>
-      <w:r>
-        <w:rPr>
-          <w:i/>
-          <w:iCs/>
-        </w:rPr>
-        <w:t xml:space="preserve"> </w:t>
-      </w:r>
-      <w:proofErr w:type="spellStart"/>
-      <w:r>
-        <w:rPr>
-          <w:i/>
-          <w:iCs/>
-        </w:rPr>
-        <w:t>separable</w:t>
-      </w:r>
-      <w:proofErr w:type="spellEnd"/>
-      <w:r>
-        <w:rPr>
-          <w:i/>
-          <w:iCs/>
-        </w:rPr>
-        <w:t xml:space="preserve"> </w:t>
-      </w:r>
-      <w:proofErr w:type="spellStart"/>
-      <w:r>
-        <w:rPr>
-          <w:i/>
-          <w:iCs/>
-        </w:rPr>
-        <w:t>convolutions</w:t>
-      </w:r>
-      <w:proofErr w:type="spellEnd"/>
+        <w:t>depthwise separable convolutions</w:t>
+      </w:r>
       <w:r>
         <w:t>.</w:t>
       </w:r>
@@ -2709,31 +2510,13 @@
         </w:rPr>
         <w:t xml:space="preserve">Ilustração do conceito de </w:t>
       </w:r>
-      <w:proofErr w:type="spellStart"/>
       <w:r>
         <w:rPr>
           <w:sz w:val="18"/>
           <w:szCs w:val="18"/>
         </w:rPr>
-        <w:t>Depthwise</w:t>
-      </w:r>
-      <w:proofErr w:type="spellEnd"/>
-      <w:r>
-        <w:rPr>
-          <w:sz w:val="18"/>
-          <w:szCs w:val="18"/>
-        </w:rPr>
-        <w:t xml:space="preserve"> </w:t>
-      </w:r>
-      <w:proofErr w:type="spellStart"/>
-      <w:r>
-        <w:rPr>
-          <w:sz w:val="18"/>
-          <w:szCs w:val="18"/>
-        </w:rPr>
-        <w:t>Convolution</w:t>
-      </w:r>
-      <w:proofErr w:type="spellEnd"/>
+        <w:t>Depthwise Convolution</w:t>
+      </w:r>
     </w:p>
     <w:p>
       <w:pPr>
@@ -2826,49 +2609,8 @@
           <w:b/>
           <w:bCs/>
         </w:rPr>
-        <w:t xml:space="preserve"> </w:t>
-      </w:r>
-      <w:proofErr w:type="spellStart"/>
-      <w:r>
-        <w:rPr>
-          <w:b/>
-          <w:bCs/>
-        </w:rPr>
-        <w:t>Depthwise</w:t>
-      </w:r>
-      <w:proofErr w:type="spellEnd"/>
-      <w:r>
-        <w:rPr>
-          <w:b/>
-          <w:bCs/>
-        </w:rPr>
-        <w:t xml:space="preserve"> </w:t>
-      </w:r>
-      <w:proofErr w:type="spellStart"/>
-      <w:r>
-        <w:rPr>
-          <w:b/>
-          <w:bCs/>
-        </w:rPr>
-        <w:t>Separable</w:t>
-      </w:r>
-      <w:proofErr w:type="spellEnd"/>
-      <w:r>
-        <w:rPr>
-          <w:b/>
-          <w:bCs/>
-        </w:rPr>
-        <w:t xml:space="preserve"> </w:t>
-      </w:r>
-      <w:proofErr w:type="spellStart"/>
-      <w:r>
-        <w:rPr>
-          <w:b/>
-          <w:bCs/>
-        </w:rPr>
-        <w:t>Convolution</w:t>
-      </w:r>
-      <w:proofErr w:type="spellEnd"/>
+        <w:t xml:space="preserve"> Depthwise Separable Convolution</w:t>
+      </w:r>
       <w:r>
         <w:rPr>
           <w:b/>
@@ -2919,37 +2661,12 @@
           <w:bCs/>
         </w:rPr>
       </w:pPr>
-      <w:proofErr w:type="spellStart"/>
-      <w:r>
-        <w:rPr>
-          <w:b/>
-          <w:bCs/>
-        </w:rPr>
-        <w:t>Depthwise</w:t>
-      </w:r>
-      <w:proofErr w:type="spellEnd"/>
-      <w:r>
-        <w:rPr>
-          <w:b/>
-          <w:bCs/>
-        </w:rPr>
-        <w:t xml:space="preserve"> </w:t>
-      </w:r>
-      <w:proofErr w:type="spellStart"/>
-      <w:r>
-        <w:rPr>
-          <w:b/>
-          <w:bCs/>
-        </w:rPr>
-        <w:t>Convolution</w:t>
-      </w:r>
-      <w:proofErr w:type="spellEnd"/>
-      <w:r>
-        <w:rPr>
-          <w:b/>
-          <w:bCs/>
-        </w:rPr>
-        <w:t xml:space="preserve"> (filtragem espacial):</w:t>
+      <w:r>
+        <w:rPr>
+          <w:b/>
+          <w:bCs/>
+        </w:rPr>
+        <w:t>Depthwise Convolution (filtragem espacial):</w:t>
       </w:r>
       <w:r>
         <w:t xml:space="preserve"> </w:t>
@@ -3044,15 +2761,20 @@
           <w:bCs/>
         </w:rPr>
       </w:pPr>
-      <w:proofErr w:type="spellStart"/>
-      <w:r>
-        <w:rPr>
-          <w:b/>
-          <w:bCs/>
-        </w:rPr>
-        <w:t>Pointwise</w:t>
-      </w:r>
-      <w:proofErr w:type="spellEnd"/>
+      <w:r>
+        <w:rPr>
+          <w:b/>
+          <w:bCs/>
+        </w:rPr>
+        <w:t>Pointwise Convolution (combinação de canais)</w:t>
+      </w:r>
+      <w:r>
+        <w:rPr>
+          <w:b/>
+          <w:bCs/>
+        </w:rPr>
+        <w:t>:</w:t>
+      </w:r>
       <w:r>
         <w:rPr>
           <w:b/>
@@ -3060,49 +2782,11 @@
         </w:rPr>
         <w:t xml:space="preserve"> </w:t>
       </w:r>
-      <w:proofErr w:type="spellStart"/>
-      <w:r>
-        <w:rPr>
-          <w:b/>
-          <w:bCs/>
-        </w:rPr>
-        <w:t>Convolution</w:t>
-      </w:r>
-      <w:proofErr w:type="spellEnd"/>
-      <w:r>
-        <w:rPr>
-          <w:b/>
-          <w:bCs/>
-        </w:rPr>
-        <w:t xml:space="preserve"> (combinação de canais)</w:t>
-      </w:r>
-      <w:r>
-        <w:rPr>
-          <w:b/>
-          <w:bCs/>
-        </w:rPr>
-        <w:t>:</w:t>
-      </w:r>
-      <w:r>
-        <w:rPr>
-          <w:b/>
-          <w:bCs/>
-        </w:rPr>
-        <w:t xml:space="preserve"> </w:t>
-      </w:r>
       <w:r>
         <w:t xml:space="preserve">ocorre após </w:t>
       </w:r>
       <w:r>
-        <w:t xml:space="preserve">a etapa </w:t>
-      </w:r>
-      <w:proofErr w:type="spellStart"/>
-      <w:r>
-        <w:t>depthwise</w:t>
-      </w:r>
-      <w:proofErr w:type="spellEnd"/>
-      <w:r>
-        <w:t xml:space="preserve">, </w:t>
+        <w:t xml:space="preserve">a etapa depthwise, </w:t>
       </w:r>
       <w:r>
         <w:t xml:space="preserve">onde </w:t>
@@ -3120,7 +2804,6 @@
       <w:r>
         <w:t xml:space="preserve">, chamada de </w:t>
       </w:r>
-      <w:proofErr w:type="spellStart"/>
       <w:r>
         <w:rPr>
           <w:i/>
@@ -3128,7 +2811,6 @@
         </w:rPr>
         <w:t>pointwise</w:t>
       </w:r>
-      <w:proofErr w:type="spellEnd"/>
       <w:r>
         <w:t xml:space="preserve"> é aplicada com o intuito de combinar os canais gerados previamente e aprender as relações entre as features extraídas</w:t>
       </w:r>
@@ -3200,23 +2882,7 @@
           <w:b/>
           <w:bCs/>
         </w:rPr>
-        <w:t xml:space="preserve">O bloco base da </w:t>
-      </w:r>
-      <w:proofErr w:type="spellStart"/>
-      <w:r>
-        <w:rPr>
-          <w:b/>
-          <w:bCs/>
-        </w:rPr>
-        <w:t>MobileNet</w:t>
-      </w:r>
-      <w:proofErr w:type="spellEnd"/>
-      <w:r>
-        <w:rPr>
-          <w:b/>
-          <w:bCs/>
-        </w:rPr>
-        <w:t xml:space="preserve"> </w:t>
+        <w:t xml:space="preserve">O bloco base da MobileNet </w:t>
       </w:r>
       <w:r>
         <w:t>é basicamente uma pilha</w:t>
@@ -3260,21 +2926,8 @@
         </w:numPr>
         <w:jc w:val="both"/>
       </w:pPr>
-      <w:proofErr w:type="spellStart"/>
-      <w:r>
-        <w:t>Depthwise</w:t>
-      </w:r>
-      <w:proofErr w:type="spellEnd"/>
-      <w:r>
-        <w:t xml:space="preserve"> </w:t>
-      </w:r>
-      <w:proofErr w:type="spellStart"/>
-      <w:r>
-        <w:t>Conv</w:t>
-      </w:r>
-      <w:proofErr w:type="spellEnd"/>
-      <w:r>
-        <w:t xml:space="preserve"> (3x3)</w:t>
+      <w:r>
+        <w:t>Depthwise Conv (3x3)</w:t>
       </w:r>
     </w:p>
     <w:p>
@@ -3287,13 +2940,8 @@
         <w:jc w:val="both"/>
       </w:pPr>
       <w:r>
-        <w:t xml:space="preserve">Batch </w:t>
-      </w:r>
-      <w:proofErr w:type="spellStart"/>
-      <w:r>
-        <w:t>Normalization</w:t>
-      </w:r>
-      <w:proofErr w:type="spellEnd"/>
+        <w:t>Batch Normalization</w:t>
+      </w:r>
     </w:p>
     <w:p>
       <w:pPr>
@@ -3304,11 +2952,9 @@
         </w:numPr>
         <w:jc w:val="both"/>
       </w:pPr>
-      <w:proofErr w:type="spellStart"/>
       <w:r>
         <w:t>ReLU</w:t>
       </w:r>
-      <w:proofErr w:type="spellEnd"/>
     </w:p>
     <w:p>
       <w:pPr>
@@ -3319,21 +2965,8 @@
         </w:numPr>
         <w:jc w:val="both"/>
       </w:pPr>
-      <w:proofErr w:type="spellStart"/>
-      <w:r>
-        <w:t>Pointwise</w:t>
-      </w:r>
-      <w:proofErr w:type="spellEnd"/>
-      <w:r>
-        <w:t xml:space="preserve"> </w:t>
-      </w:r>
-      <w:proofErr w:type="spellStart"/>
-      <w:r>
-        <w:t>Conv</w:t>
-      </w:r>
-      <w:proofErr w:type="spellEnd"/>
-      <w:r>
-        <w:t xml:space="preserve"> (1x1)</w:t>
+      <w:r>
+        <w:t>Pointwise Conv (1x1)</w:t>
       </w:r>
     </w:p>
     <w:p>
@@ -3346,13 +2979,8 @@
         <w:jc w:val="both"/>
       </w:pPr>
       <w:r>
-        <w:t xml:space="preserve">Batch </w:t>
-      </w:r>
-      <w:proofErr w:type="spellStart"/>
-      <w:r>
-        <w:t>Normalization</w:t>
-      </w:r>
-      <w:proofErr w:type="spellEnd"/>
+        <w:t>Batch Normalization</w:t>
+      </w:r>
     </w:p>
     <w:p>
       <w:pPr>
@@ -3363,11 +2991,9 @@
         </w:numPr>
         <w:jc w:val="both"/>
       </w:pPr>
-      <w:proofErr w:type="spellStart"/>
       <w:r>
         <w:t>ReLU</w:t>
       </w:r>
-      <w:proofErr w:type="spellEnd"/>
     </w:p>
     <w:p>
       <w:pPr>
@@ -3456,43 +3082,11 @@
         <w:jc w:val="both"/>
       </w:pPr>
       <w:r>
-        <w:t xml:space="preserve">A primeira camada da rede não usa </w:t>
-      </w:r>
-      <w:proofErr w:type="spellStart"/>
-      <w:r>
-        <w:t>depthwise</w:t>
-      </w:r>
-      <w:proofErr w:type="spellEnd"/>
-      <w:r>
-        <w:t xml:space="preserve"> </w:t>
-      </w:r>
-      <w:proofErr w:type="spellStart"/>
-      <w:r>
-        <w:t>separable</w:t>
-      </w:r>
-      <w:proofErr w:type="spellEnd"/>
-      <w:r>
-        <w:t xml:space="preserve"> </w:t>
-      </w:r>
-      <w:proofErr w:type="spellStart"/>
-      <w:r>
-        <w:t>conv</w:t>
-      </w:r>
-      <w:proofErr w:type="spellEnd"/>
-      <w:r>
-        <w:t>.</w:t>
+        <w:t>A primeira camada da rede não usa depthwise separable conv.</w:t>
       </w:r>
       <w:r>
         <w:br/>
-        <w:t xml:space="preserve">Ela utiliza uma convolução padrão 3x3 com </w:t>
-      </w:r>
-      <w:proofErr w:type="spellStart"/>
-      <w:r>
-        <w:t>stride</w:t>
-      </w:r>
-      <w:proofErr w:type="spellEnd"/>
-      <w:r>
-        <w:t xml:space="preserve"> 2</w:t>
+        <w:t>Ela utiliza uma convolução padrão 3x3 com stride 2</w:t>
       </w:r>
       <w:r>
         <w:t xml:space="preserve">, visto que </w:t>
@@ -3518,15 +3112,7 @@
         <w:jc w:val="both"/>
       </w:pPr>
       <w:r>
-        <w:t xml:space="preserve">A </w:t>
-      </w:r>
-      <w:proofErr w:type="spellStart"/>
-      <w:r>
-        <w:t>MobileNet</w:t>
-      </w:r>
-      <w:proofErr w:type="spellEnd"/>
-      <w:r>
-        <w:t xml:space="preserve"> reduz o tamanho das imagens ao longo da</w:t>
+        <w:t>A MobileNet reduz o tamanho das imagens ao longo da</w:t>
       </w:r>
       <w:r>
         <w:t>s camadas da</w:t>
@@ -3534,38 +3120,16 @@
       <w:r>
         <w:t xml:space="preserve"> rede usando </w:t>
       </w:r>
-      <w:proofErr w:type="spellStart"/>
-      <w:r>
-        <w:rPr>
-          <w:b/>
-          <w:bCs/>
-        </w:rPr>
-        <w:t>stride</w:t>
-      </w:r>
-      <w:proofErr w:type="spellEnd"/>
-      <w:r>
-        <w:rPr>
-          <w:b/>
-          <w:bCs/>
-        </w:rPr>
-        <w:t xml:space="preserve"> = 2</w:t>
-      </w:r>
-      <w:r>
-        <w:t xml:space="preserve"> em algumas </w:t>
-      </w:r>
-      <w:proofErr w:type="spellStart"/>
-      <w:r>
-        <w:t>depthwise</w:t>
-      </w:r>
-      <w:proofErr w:type="spellEnd"/>
-      <w:r>
-        <w:t xml:space="preserve"> </w:t>
-      </w:r>
-      <w:proofErr w:type="spellStart"/>
-      <w:r>
-        <w:t>convolutions</w:t>
-      </w:r>
-      <w:proofErr w:type="spellEnd"/>
+      <w:r>
+        <w:rPr>
+          <w:b/>
+          <w:bCs/>
+        </w:rPr>
+        <w:t>stride = 2</w:t>
+      </w:r>
+      <w:r>
+        <w:t xml:space="preserve"> em algumas depthwise convolutions</w:t>
+      </w:r>
       <w:r>
         <w:t>, a fim de diminuir a resolução espacial, aumentar o campo receptivo e reduzir o custo computacional.</w:t>
       </w:r>
@@ -3585,23 +3149,7 @@
         <w:jc w:val="both"/>
       </w:pPr>
       <w:r>
-        <w:t xml:space="preserve">No final da rede é aplicado um Global </w:t>
-      </w:r>
-      <w:proofErr w:type="spellStart"/>
-      <w:r>
-        <w:t>Average</w:t>
-      </w:r>
-      <w:proofErr w:type="spellEnd"/>
-      <w:r>
-        <w:t xml:space="preserve"> </w:t>
-      </w:r>
-      <w:proofErr w:type="spellStart"/>
-      <w:r>
-        <w:t>Pooling</w:t>
-      </w:r>
-      <w:proofErr w:type="spellEnd"/>
-      <w:r>
-        <w:t xml:space="preserve"> para extrair as características globais mais relevantes e utilizar como entrada de uma camada totalmente conectada</w:t>
+        <w:t>No final da rede é aplicado um Global Average Pooling para extrair as características globais mais relevantes e utilizar como entrada de uma camada totalmente conectada</w:t>
       </w:r>
     </w:p>
     <w:p>
@@ -3632,23 +3180,7 @@
           <w:b/>
           <w:bCs/>
         </w:rPr>
-        <w:t xml:space="preserve">Controle de complexidade e </w:t>
-      </w:r>
-      <w:proofErr w:type="spellStart"/>
-      <w:r>
-        <w:rPr>
-          <w:b/>
-          <w:bCs/>
-        </w:rPr>
-        <w:t>hiperparâmetros</w:t>
-      </w:r>
-      <w:proofErr w:type="spellEnd"/>
-      <w:r>
-        <w:rPr>
-          <w:b/>
-          <w:bCs/>
-        </w:rPr>
-        <w:t xml:space="preserve"> específicos:</w:t>
+        <w:t>Controle de complexidade e hiperparâmetros específicos:</w:t>
       </w:r>
     </w:p>
     <w:p>
@@ -3675,56 +3207,15 @@
           <w:bCs/>
         </w:rPr>
       </w:pPr>
-      <w:proofErr w:type="spellStart"/>
-      <w:r>
-        <w:rPr>
-          <w:b/>
-          <w:bCs/>
-        </w:rPr>
-        <w:t>Width</w:t>
-      </w:r>
-      <w:proofErr w:type="spellEnd"/>
-      <w:r>
-        <w:rPr>
-          <w:b/>
-          <w:bCs/>
-        </w:rPr>
-        <w:t xml:space="preserve"> </w:t>
-      </w:r>
-      <w:proofErr w:type="spellStart"/>
-      <w:r>
-        <w:rPr>
-          <w:b/>
-          <w:bCs/>
-        </w:rPr>
-        <w:t>Multiplier</w:t>
-      </w:r>
-      <w:proofErr w:type="spellEnd"/>
-      <w:r>
-        <w:rPr>
-          <w:b/>
-          <w:bCs/>
-        </w:rPr>
-        <w:t xml:space="preserve"> (α): </w:t>
-      </w:r>
-      <w:r>
-        <w:t xml:space="preserve">controla o número de canais da rede com o </w:t>
-      </w:r>
-      <w:proofErr w:type="spellStart"/>
-      <w:r>
-        <w:t>intuiuto</w:t>
-      </w:r>
-      <w:proofErr w:type="spellEnd"/>
-      <w:r>
-        <w:t xml:space="preserve"> de reduzir parâmetros e custos, mas pode interferir na precisão (</w:t>
-      </w:r>
-      <w:proofErr w:type="spellStart"/>
-      <w:r>
-        <w:t>ex</w:t>
-      </w:r>
-      <w:proofErr w:type="spellEnd"/>
-      <w:r>
-        <w:t>: α = 1 → modelo completo; α = 0.5 → metade dos filtros)</w:t>
+      <w:r>
+        <w:rPr>
+          <w:b/>
+          <w:bCs/>
+        </w:rPr>
+        <w:t xml:space="preserve">Width Multiplier (α): </w:t>
+      </w:r>
+      <w:r>
+        <w:t>controla o número de canais da rede com o intuiuto de reduzir parâmetros e custos, mas pode interferir na precisão (ex: α = 1 → modelo completo; α = 0.5 → metade dos filtros)</w:t>
       </w:r>
     </w:p>
     <w:p>
@@ -3747,137 +3238,84 @@
           <w:bCs/>
         </w:rPr>
       </w:pPr>
-      <w:proofErr w:type="spellStart"/>
-      <w:r>
-        <w:rPr>
-          <w:b/>
-          <w:bCs/>
-        </w:rPr>
-        <w:t>Resolution</w:t>
-      </w:r>
-      <w:proofErr w:type="spellEnd"/>
-      <w:r>
-        <w:rPr>
-          <w:b/>
-          <w:bCs/>
+      <w:r>
+        <w:rPr>
+          <w:b/>
+          <w:bCs/>
+        </w:rPr>
+        <w:t>Resolution Multiplier (ρ)</w:t>
+      </w:r>
+      <w:r>
+        <w:rPr>
+          <w:b/>
+          <w:bCs/>
+        </w:rPr>
+        <w:t xml:space="preserve">: </w:t>
+      </w:r>
+      <w:r>
+        <w:t>Controla o tamanho da entrada</w:t>
+      </w:r>
+      <w:r>
+        <w:t xml:space="preserve"> dos dados de imagem, de modo que um valor menor acarreta em menos operações</w:t>
+      </w:r>
+    </w:p>
+    <w:p>
+      <w:pPr>
+        <w:pStyle w:val="Ttulo1"/>
+      </w:pPr>
+      <w:bookmarkStart w:id="6" w:name="_Toc228861941"/>
+      <w:r>
+        <w:t xml:space="preserve">ESTUDO EXPLORATÓRIO 5 – </w:t>
+      </w:r>
+      <w:r>
+        <w:t>MOBILENET V2</w:t>
+      </w:r>
+      <w:bookmarkEnd w:id="6"/>
+    </w:p>
+    <w:p>
+      <w:pPr>
+        <w:ind w:left="360" w:firstLine="348"/>
+        <w:jc w:val="both"/>
+        <w:rPr>
+          <w:color w:val="000000" w:themeColor="text1"/>
+        </w:rPr>
+      </w:pPr>
+      <w:r>
+        <w:rPr>
+          <w:color w:val="000000" w:themeColor="text1"/>
+        </w:rPr>
+        <w:t xml:space="preserve">A MobileNet V2 surge como uma evolução direta da MobileNet V1. O objetivo continua sendo </w:t>
+      </w:r>
+      <w:r>
+        <w:rPr>
+          <w:color w:val="000000" w:themeColor="text1"/>
+        </w:rPr>
+        <w:t xml:space="preserve">a </w:t>
+      </w:r>
+      <w:r>
+        <w:rPr>
+          <w:color w:val="000000" w:themeColor="text1"/>
+        </w:rPr>
+        <w:t>constru</w:t>
+      </w:r>
+      <w:r>
+        <w:rPr>
+          <w:color w:val="000000" w:themeColor="text1"/>
+        </w:rPr>
+        <w:t>ção de</w:t>
+      </w:r>
+      <w:r>
+        <w:rPr>
+          <w:color w:val="000000" w:themeColor="text1"/>
+        </w:rPr>
+        <w:t xml:space="preserve"> redes neurais leves e eficientes, ideais para dispositivos com baixa capacidade computacional.</w:t>
+      </w:r>
+      <w:r>
+        <w:rPr>
+          <w:color w:val="000000" w:themeColor="text1"/>
         </w:rPr>
         <w:t xml:space="preserve"> </w:t>
       </w:r>
-      <w:proofErr w:type="spellStart"/>
-      <w:r>
-        <w:rPr>
-          <w:b/>
-          <w:bCs/>
-        </w:rPr>
-        <w:t>Multiplier</w:t>
-      </w:r>
-      <w:proofErr w:type="spellEnd"/>
-      <w:r>
-        <w:rPr>
-          <w:b/>
-          <w:bCs/>
-        </w:rPr>
-        <w:t xml:space="preserve"> (ρ)</w:t>
-      </w:r>
-      <w:r>
-        <w:rPr>
-          <w:b/>
-          <w:bCs/>
-        </w:rPr>
-        <w:t xml:space="preserve">: </w:t>
-      </w:r>
-      <w:r>
-        <w:t>Controla o tamanho da entrada</w:t>
-      </w:r>
-      <w:r>
-        <w:t xml:space="preserve"> dos dados de imagem, de modo que um valor menor acarreta em menos operações</w:t>
-      </w:r>
-    </w:p>
-    <w:p>
-      <w:pPr>
-        <w:pStyle w:val="Ttulo1"/>
-      </w:pPr>
-      <w:bookmarkStart w:id="6" w:name="_Toc228861941"/>
-      <w:r>
-        <w:t xml:space="preserve">ESTUDO EXPLORATÓRIO 5 – </w:t>
-      </w:r>
-      <w:r>
-        <w:t>MOBILENET V2</w:t>
-      </w:r>
-      <w:bookmarkEnd w:id="6"/>
-    </w:p>
-    <w:p>
-      <w:pPr>
-        <w:ind w:left="360" w:firstLine="348"/>
-        <w:jc w:val="both"/>
-        <w:rPr>
-          <w:color w:val="000000" w:themeColor="text1"/>
-        </w:rPr>
-      </w:pPr>
-      <w:r>
-        <w:rPr>
-          <w:color w:val="000000" w:themeColor="text1"/>
-        </w:rPr>
-        <w:t xml:space="preserve">A </w:t>
-      </w:r>
-      <w:proofErr w:type="spellStart"/>
-      <w:r>
-        <w:rPr>
-          <w:color w:val="000000" w:themeColor="text1"/>
-        </w:rPr>
-        <w:t>MobileNet</w:t>
-      </w:r>
-      <w:proofErr w:type="spellEnd"/>
-      <w:r>
-        <w:rPr>
-          <w:color w:val="000000" w:themeColor="text1"/>
-        </w:rPr>
-        <w:t xml:space="preserve"> V2 surge como uma evolução direta da </w:t>
-      </w:r>
-      <w:proofErr w:type="spellStart"/>
-      <w:r>
-        <w:rPr>
-          <w:color w:val="000000" w:themeColor="text1"/>
-        </w:rPr>
-        <w:t>MobileNet</w:t>
-      </w:r>
-      <w:proofErr w:type="spellEnd"/>
-      <w:r>
-        <w:rPr>
-          <w:color w:val="000000" w:themeColor="text1"/>
-        </w:rPr>
-        <w:t xml:space="preserve"> V1. O objetivo continua sendo </w:t>
-      </w:r>
-      <w:r>
-        <w:rPr>
-          <w:color w:val="000000" w:themeColor="text1"/>
-        </w:rPr>
-        <w:t xml:space="preserve">a </w:t>
-      </w:r>
-      <w:r>
-        <w:rPr>
-          <w:color w:val="000000" w:themeColor="text1"/>
-        </w:rPr>
-        <w:t>constru</w:t>
-      </w:r>
-      <w:r>
-        <w:rPr>
-          <w:color w:val="000000" w:themeColor="text1"/>
-        </w:rPr>
-        <w:t>ção de</w:t>
-      </w:r>
-      <w:r>
-        <w:rPr>
-          <w:color w:val="000000" w:themeColor="text1"/>
-        </w:rPr>
-        <w:t xml:space="preserve"> redes neurais leves e eficientes, ideais para dispositivos com baixa capacidade computacional.</w:t>
-      </w:r>
-      <w:r>
-        <w:rPr>
-          <w:color w:val="000000" w:themeColor="text1"/>
-        </w:rPr>
-        <w:t xml:space="preserve"> </w:t>
-      </w:r>
       <w:r>
         <w:rPr>
           <w:color w:val="000000" w:themeColor="text1"/>
@@ -3906,21 +3344,7 @@
         <w:rPr>
           <w:color w:val="000000" w:themeColor="text1"/>
         </w:rPr>
-        <w:t xml:space="preserve"> perda de informação causada por operações não lineares (</w:t>
-      </w:r>
-      <w:proofErr w:type="spellStart"/>
-      <w:r>
-        <w:rPr>
-          <w:color w:val="000000" w:themeColor="text1"/>
-        </w:rPr>
-        <w:t>ReLU</w:t>
-      </w:r>
-      <w:proofErr w:type="spellEnd"/>
-      <w:r>
-        <w:rPr>
-          <w:color w:val="000000" w:themeColor="text1"/>
-        </w:rPr>
-        <w:t xml:space="preserve">) em espaços de baixa dimensão. </w:t>
+        <w:t xml:space="preserve"> perda de informação causada por operações não lineares (ReLU) em espaços de baixa dimensão. </w:t>
       </w:r>
     </w:p>
     <w:p>
@@ -3986,88 +3410,41 @@
         </w:rPr>
         <w:t xml:space="preserve"> </w:t>
       </w:r>
-      <w:proofErr w:type="spellStart"/>
-      <w:r>
-        <w:rPr>
-          <w:color w:val="000000" w:themeColor="text1"/>
-        </w:rPr>
-        <w:t>Depthwise</w:t>
-      </w:r>
-      <w:proofErr w:type="spellEnd"/>
-      <w:r>
-        <w:rPr>
-          <w:color w:val="000000" w:themeColor="text1"/>
-        </w:rPr>
-        <w:t xml:space="preserve"> </w:t>
-      </w:r>
-      <w:proofErr w:type="spellStart"/>
-      <w:r>
-        <w:rPr>
-          <w:color w:val="000000" w:themeColor="text1"/>
-        </w:rPr>
-        <w:t>convolution</w:t>
-      </w:r>
-      <w:proofErr w:type="spellEnd"/>
+      <w:r>
+        <w:rPr>
+          <w:color w:val="000000" w:themeColor="text1"/>
+        </w:rPr>
+        <w:t>Depthwise convolution</w:t>
+      </w:r>
       <w:r>
         <w:rPr>
           <w:color w:val="000000" w:themeColor="text1"/>
         </w:rPr>
         <w:t xml:space="preserve">, seguido por </w:t>
       </w:r>
-      <w:proofErr w:type="spellStart"/>
-      <w:r>
-        <w:rPr>
-          <w:color w:val="000000" w:themeColor="text1"/>
-        </w:rPr>
-        <w:t>Pointwise</w:t>
-      </w:r>
-      <w:proofErr w:type="spellEnd"/>
-      <w:r>
-        <w:rPr>
-          <w:color w:val="000000" w:themeColor="text1"/>
-        </w:rPr>
-        <w:t xml:space="preserve"> </w:t>
-      </w:r>
-      <w:proofErr w:type="spellStart"/>
-      <w:r>
-        <w:rPr>
-          <w:color w:val="000000" w:themeColor="text1"/>
-        </w:rPr>
-        <w:t>convolution</w:t>
-      </w:r>
-      <w:proofErr w:type="spellEnd"/>
+      <w:r>
+        <w:rPr>
+          <w:color w:val="000000" w:themeColor="text1"/>
+        </w:rPr>
+        <w:t>Pointwise convolution</w:t>
+      </w:r>
       <w:r>
         <w:rPr>
           <w:color w:val="000000" w:themeColor="text1"/>
         </w:rPr>
         <w:t xml:space="preserve"> e </w:t>
       </w:r>
-      <w:proofErr w:type="spellStart"/>
-      <w:r>
-        <w:rPr>
-          <w:color w:val="000000" w:themeColor="text1"/>
-        </w:rPr>
-        <w:t>ReLU</w:t>
-      </w:r>
-      <w:proofErr w:type="spellEnd"/>
-      <w:r>
-        <w:rPr>
-          <w:color w:val="000000" w:themeColor="text1"/>
-        </w:rPr>
-        <w:t xml:space="preserve"> em todas as etapas</w:t>
-      </w:r>
-      <w:r>
-        <w:rPr>
-          <w:color w:val="000000" w:themeColor="text1"/>
-        </w:rPr>
-        <w:t xml:space="preserve">. O problema é que a função </w:t>
-      </w:r>
-      <w:proofErr w:type="spellStart"/>
-      <w:r>
-        <w:rPr>
-          <w:color w:val="000000" w:themeColor="text1"/>
-        </w:rPr>
-        <w:t>ReL</w:t>
+      <w:r>
+        <w:rPr>
+          <w:color w:val="000000" w:themeColor="text1"/>
+        </w:rPr>
+        <w:t>ReLU em todas as etapas</w:t>
+      </w:r>
+      <w:r>
+        <w:rPr>
+          <w:color w:val="000000" w:themeColor="text1"/>
+        </w:rPr>
+        <w:t>. O problema é que a função ReL</w:t>
       </w:r>
       <w:r>
         <w:rPr>
@@ -4075,7 +3452,6 @@
         </w:rPr>
         <w:t>U</w:t>
       </w:r>
-      <w:proofErr w:type="spellEnd"/>
       <w:r>
         <w:rPr>
           <w:color w:val="000000" w:themeColor="text1"/>
@@ -4130,21 +3506,7 @@
         <w:rPr>
           <w:color w:val="000000" w:themeColor="text1"/>
         </w:rPr>
-        <w:t xml:space="preserve">A </w:t>
-      </w:r>
-      <w:proofErr w:type="spellStart"/>
-      <w:r>
-        <w:rPr>
-          <w:color w:val="000000" w:themeColor="text1"/>
-        </w:rPr>
-        <w:t>MobileNet</w:t>
-      </w:r>
-      <w:proofErr w:type="spellEnd"/>
-      <w:r>
-        <w:rPr>
-          <w:color w:val="000000" w:themeColor="text1"/>
-        </w:rPr>
-        <w:t xml:space="preserve"> V2 resolve esse problema com três ideias principais:</w:t>
+        <w:t>A MobileNet V2 resolve esse problema com três ideias principais:</w:t>
       </w:r>
     </w:p>
     <w:p>
@@ -4177,27 +3539,7 @@
           <w:color w:val="000000" w:themeColor="text1"/>
           <w:lang w:val="en-US"/>
         </w:rPr>
-        <w:t xml:space="preserve">Inverted Residual Block (Bloco Residual </w:t>
-      </w:r>
-      <w:proofErr w:type="spellStart"/>
-      <w:r>
-        <w:rPr>
-          <w:b/>
-          <w:bCs/>
-          <w:color w:val="000000" w:themeColor="text1"/>
-          <w:lang w:val="en-US"/>
-        </w:rPr>
-        <w:t>Invertido</w:t>
-      </w:r>
-      <w:proofErr w:type="spellEnd"/>
-      <w:r>
-        <w:rPr>
-          <w:b/>
-          <w:bCs/>
-          <w:color w:val="000000" w:themeColor="text1"/>
-          <w:lang w:val="en-US"/>
-        </w:rPr>
-        <w:t>):</w:t>
+        <w:t>Inverted Residual Block (Bloco Residual Invertido):</w:t>
       </w:r>
     </w:p>
     <w:p>
@@ -4213,21 +3555,7 @@
         <w:rPr>
           <w:color w:val="000000" w:themeColor="text1"/>
         </w:rPr>
-        <w:t xml:space="preserve">Diferente de arquiteturas como a </w:t>
-      </w:r>
-      <w:proofErr w:type="spellStart"/>
-      <w:r>
-        <w:rPr>
-          <w:color w:val="000000" w:themeColor="text1"/>
-        </w:rPr>
-        <w:t>ResNet</w:t>
-      </w:r>
-      <w:proofErr w:type="spellEnd"/>
-      <w:r>
-        <w:rPr>
-          <w:color w:val="000000" w:themeColor="text1"/>
-        </w:rPr>
-        <w:t xml:space="preserve">, onde o fluxo </w:t>
+        <w:t xml:space="preserve">Diferente de arquiteturas como a ResNet, onde o fluxo </w:t>
       </w:r>
       <w:r>
         <w:rPr>
@@ -4245,21 +3573,7 @@
         <w:rPr>
           <w:color w:val="000000" w:themeColor="text1"/>
         </w:rPr>
-        <w:t xml:space="preserve">”, a </w:t>
-      </w:r>
-      <w:proofErr w:type="spellStart"/>
-      <w:r>
-        <w:rPr>
-          <w:color w:val="000000" w:themeColor="text1"/>
-        </w:rPr>
-        <w:t>MobileNet</w:t>
-      </w:r>
-      <w:proofErr w:type="spellEnd"/>
-      <w:r>
-        <w:rPr>
-          <w:color w:val="000000" w:themeColor="text1"/>
-        </w:rPr>
-        <w:t xml:space="preserve"> aplica o inverso “</w:t>
+        <w:t>”, a MobileNet aplica o inverso “</w:t>
       </w:r>
       <w:r>
         <w:rPr>
@@ -4320,30 +3634,8 @@
         <w:rPr>
           <w:color w:val="000000" w:themeColor="text1"/>
         </w:rPr>
-        <w:t xml:space="preserve"> de </w:t>
-      </w:r>
-      <w:proofErr w:type="spellStart"/>
-      <w:r>
-        <w:rPr>
-          <w:color w:val="000000" w:themeColor="text1"/>
-        </w:rPr>
-        <w:t>inverted</w:t>
-      </w:r>
-      <w:proofErr w:type="spellEnd"/>
-      <w:r>
-        <w:rPr>
-          <w:color w:val="000000" w:themeColor="text1"/>
-        </w:rPr>
-        <w:t xml:space="preserve"> residual </w:t>
-      </w:r>
-      <w:proofErr w:type="spellStart"/>
-      <w:r>
-        <w:rPr>
-          <w:color w:val="000000" w:themeColor="text1"/>
-        </w:rPr>
-        <w:t>block</w:t>
-      </w:r>
-      <w:proofErr w:type="spellEnd"/>
+        <w:t xml:space="preserve"> de inverted residual block</w:t>
+      </w:r>
       <w:r>
         <w:rPr>
           <w:color w:val="000000" w:themeColor="text1"/>
@@ -4374,45 +3666,13 @@
           <w:bCs/>
           <w:color w:val="000000" w:themeColor="text1"/>
         </w:rPr>
-        <w:t xml:space="preserve">Expansão (1x1 </w:t>
-      </w:r>
-      <w:proofErr w:type="spellStart"/>
-      <w:r>
-        <w:rPr>
-          <w:b/>
-          <w:bCs/>
-          <w:color w:val="000000" w:themeColor="text1"/>
-        </w:rPr>
-        <w:t>convolution</w:t>
-      </w:r>
-      <w:proofErr w:type="spellEnd"/>
-      <w:r>
-        <w:rPr>
-          <w:b/>
-          <w:bCs/>
-          <w:color w:val="000000" w:themeColor="text1"/>
-        </w:rPr>
-        <w:t>)</w:t>
-      </w:r>
-      <w:r>
-        <w:rPr>
-          <w:color w:val="000000" w:themeColor="text1"/>
-        </w:rPr>
-        <w:t xml:space="preserve"> – Busca aumentar o </w:t>
-      </w:r>
-      <w:proofErr w:type="spellStart"/>
-      <w:r>
-        <w:rPr>
-          <w:color w:val="000000" w:themeColor="text1"/>
-        </w:rPr>
-        <w:t>numero</w:t>
-      </w:r>
-      <w:proofErr w:type="spellEnd"/>
-      <w:r>
-        <w:rPr>
-          <w:color w:val="000000" w:themeColor="text1"/>
-        </w:rPr>
-        <w:t xml:space="preserve"> de canais, levando os dados para um espaço com alta dimensionalidade</w:t>
+        <w:t>Expansão (1x1 convolution)</w:t>
+      </w:r>
+      <w:r>
+        <w:rPr>
+          <w:color w:val="000000" w:themeColor="text1"/>
+        </w:rPr>
+        <w:t xml:space="preserve"> – Busca aumentar o numero de canais, levando os dados para um espaço com alta dimensionalidade</w:t>
       </w:r>
     </w:p>
     <w:p>
@@ -4426,41 +3686,13 @@
           <w:color w:val="000000" w:themeColor="text1"/>
         </w:rPr>
       </w:pPr>
-      <w:proofErr w:type="spellStart"/>
-      <w:r>
-        <w:rPr>
-          <w:b/>
-          <w:bCs/>
-          <w:color w:val="000000" w:themeColor="text1"/>
-        </w:rPr>
-        <w:t>Depthwise</w:t>
-      </w:r>
-      <w:proofErr w:type="spellEnd"/>
-      <w:r>
-        <w:rPr>
-          <w:b/>
-          <w:bCs/>
-          <w:color w:val="000000" w:themeColor="text1"/>
-        </w:rPr>
-        <w:t xml:space="preserve"> </w:t>
-      </w:r>
-      <w:proofErr w:type="spellStart"/>
-      <w:r>
-        <w:rPr>
-          <w:b/>
-          <w:bCs/>
-          <w:color w:val="000000" w:themeColor="text1"/>
-        </w:rPr>
-        <w:t>convolution</w:t>
-      </w:r>
-      <w:proofErr w:type="spellEnd"/>
-      <w:r>
-        <w:rPr>
-          <w:b/>
-          <w:bCs/>
-          <w:color w:val="000000" w:themeColor="text1"/>
-        </w:rPr>
-        <w:t xml:space="preserve"> (3x3)</w:t>
+      <w:r>
+        <w:rPr>
+          <w:b/>
+          <w:bCs/>
+          <w:color w:val="000000" w:themeColor="text1"/>
+        </w:rPr>
+        <w:t>Depthwise convolution (3x3)</w:t>
       </w:r>
       <w:r>
         <w:rPr>
@@ -4492,45 +3724,13 @@
           <w:bCs/>
           <w:color w:val="000000" w:themeColor="text1"/>
         </w:rPr>
-        <w:t xml:space="preserve">Projeção (1x1 </w:t>
-      </w:r>
-      <w:proofErr w:type="spellStart"/>
-      <w:r>
-        <w:rPr>
-          <w:b/>
-          <w:bCs/>
-          <w:color w:val="000000" w:themeColor="text1"/>
-        </w:rPr>
-        <w:t>Convolution</w:t>
-      </w:r>
-      <w:proofErr w:type="spellEnd"/>
-      <w:r>
-        <w:rPr>
-          <w:b/>
-          <w:bCs/>
-          <w:color w:val="000000" w:themeColor="text1"/>
-        </w:rPr>
-        <w:t>)</w:t>
-      </w:r>
-      <w:r>
-        <w:rPr>
-          <w:color w:val="000000" w:themeColor="text1"/>
-        </w:rPr>
-        <w:t xml:space="preserve"> – Reduz novamente o </w:t>
-      </w:r>
-      <w:proofErr w:type="spellStart"/>
-      <w:r>
-        <w:rPr>
-          <w:color w:val="000000" w:themeColor="text1"/>
-        </w:rPr>
-        <w:t>numero</w:t>
-      </w:r>
-      <w:proofErr w:type="spellEnd"/>
-      <w:r>
-        <w:rPr>
-          <w:color w:val="000000" w:themeColor="text1"/>
-        </w:rPr>
-        <w:t xml:space="preserve"> de canais, retornando a um espaço compacto</w:t>
+        <w:t>Projeção (1x1 Convolution)</w:t>
+      </w:r>
+      <w:r>
+        <w:rPr>
+          <w:color w:val="000000" w:themeColor="text1"/>
+        </w:rPr>
+        <w:t xml:space="preserve"> – Reduz novamente o numero de canais, retornando a um espaço compacto</w:t>
       </w:r>
     </w:p>
     <w:p>
@@ -4565,25 +3765,7 @@
           <w:bCs/>
           <w:color w:val="000000" w:themeColor="text1"/>
         </w:rPr>
-        <w:t xml:space="preserve">Linear </w:t>
-      </w:r>
-      <w:proofErr w:type="spellStart"/>
-      <w:r>
-        <w:rPr>
-          <w:b/>
-          <w:bCs/>
-          <w:color w:val="000000" w:themeColor="text1"/>
-        </w:rPr>
-        <w:t>Bottleneck</w:t>
-      </w:r>
-      <w:proofErr w:type="spellEnd"/>
-      <w:r>
-        <w:rPr>
-          <w:b/>
-          <w:bCs/>
-          <w:color w:val="000000" w:themeColor="text1"/>
-        </w:rPr>
-        <w:t xml:space="preserve"> (o conceito mais importante):</w:t>
+        <w:t>Linear Bottleneck (o conceito mais importante):</w:t>
       </w:r>
       <w:r>
         <w:rPr>
@@ -4607,16 +3789,8 @@
         <w:rPr>
           <w:color w:val="000000" w:themeColor="text1"/>
         </w:rPr>
-        <w:t xml:space="preserve">A última camada do bloco (projeção) não usa </w:t>
-      </w:r>
-      <w:proofErr w:type="spellStart"/>
-      <w:r>
-        <w:rPr>
-          <w:color w:val="000000" w:themeColor="text1"/>
-        </w:rPr>
-        <w:t>ReLU</w:t>
-      </w:r>
-      <w:proofErr w:type="spellEnd"/>
+        <w:t>A última camada do bloco (projeção) não usa ReLU</w:t>
+      </w:r>
       <w:r>
         <w:rPr>
           <w:color w:val="000000" w:themeColor="text1"/>
@@ -4751,25 +3925,7 @@
           <w:bCs/>
           <w:color w:val="000000" w:themeColor="text1"/>
         </w:rPr>
-        <w:t>Conexões residuais (</w:t>
-      </w:r>
-      <w:proofErr w:type="spellStart"/>
-      <w:r>
-        <w:rPr>
-          <w:b/>
-          <w:bCs/>
-          <w:color w:val="000000" w:themeColor="text1"/>
-        </w:rPr>
-        <w:t>skip</w:t>
-      </w:r>
-      <w:proofErr w:type="spellEnd"/>
-      <w:r>
-        <w:rPr>
-          <w:b/>
-          <w:bCs/>
-          <w:color w:val="000000" w:themeColor="text1"/>
-        </w:rPr>
-        <w:t xml:space="preserve"> connections):</w:t>
+        <w:t>Conexões residuais (skip connections):</w:t>
       </w:r>
     </w:p>
     <w:p>
@@ -4855,25 +4011,7 @@
           <w:bCs/>
           <w:color w:val="000000" w:themeColor="text1"/>
         </w:rPr>
-        <w:t xml:space="preserve">Construção da </w:t>
-      </w:r>
-      <w:proofErr w:type="spellStart"/>
-      <w:r>
-        <w:rPr>
-          <w:b/>
-          <w:bCs/>
-          <w:color w:val="000000" w:themeColor="text1"/>
-        </w:rPr>
-        <w:t>MobileNet</w:t>
-      </w:r>
-      <w:proofErr w:type="spellEnd"/>
-      <w:r>
-        <w:rPr>
-          <w:b/>
-          <w:bCs/>
-          <w:color w:val="000000" w:themeColor="text1"/>
-        </w:rPr>
-        <w:t xml:space="preserve"> V2:</w:t>
+        <w:t>Construção da MobileNet V2:</w:t>
       </w:r>
     </w:p>
     <w:p>
@@ -4902,55 +4040,13 @@
         <w:rPr>
           <w:color w:val="000000" w:themeColor="text1"/>
         </w:rPr>
-        <w:t xml:space="preserve">A arquitetura é composta por vários </w:t>
-      </w:r>
-      <w:proofErr w:type="spellStart"/>
-      <w:r>
-        <w:rPr>
-          <w:color w:val="000000" w:themeColor="text1"/>
-        </w:rPr>
-        <w:t>inverted</w:t>
-      </w:r>
-      <w:proofErr w:type="spellEnd"/>
-      <w:r>
-        <w:rPr>
-          <w:color w:val="000000" w:themeColor="text1"/>
-        </w:rPr>
-        <w:t xml:space="preserve"> residual </w:t>
-      </w:r>
-      <w:proofErr w:type="spellStart"/>
-      <w:r>
-        <w:rPr>
-          <w:color w:val="000000" w:themeColor="text1"/>
-        </w:rPr>
-        <w:t>blocks</w:t>
-      </w:r>
-      <w:proofErr w:type="spellEnd"/>
-      <w:r>
-        <w:rPr>
-          <w:color w:val="000000" w:themeColor="text1"/>
-        </w:rPr>
-        <w:t xml:space="preserve"> empilhados, com variações </w:t>
-      </w:r>
-      <w:r>
-        <w:rPr>
-          <w:color w:val="000000" w:themeColor="text1"/>
-        </w:rPr>
-        <w:t xml:space="preserve">do número de canais, número de repetições, </w:t>
-      </w:r>
-      <w:proofErr w:type="spellStart"/>
-      <w:r>
-        <w:rPr>
-          <w:color w:val="000000" w:themeColor="text1"/>
-        </w:rPr>
-        <w:t>stride</w:t>
-      </w:r>
-      <w:proofErr w:type="spellEnd"/>
-      <w:r>
-        <w:rPr>
-          <w:color w:val="000000" w:themeColor="text1"/>
-        </w:rPr>
-        <w:t xml:space="preserve"> (para reduzir resolução, se necessário)</w:t>
+        <w:t xml:space="preserve">A arquitetura é composta por vários inverted residual blocks empilhados, com variações </w:t>
+      </w:r>
+      <w:r>
+        <w:rPr>
+          <w:color w:val="000000" w:themeColor="text1"/>
+        </w:rPr>
+        <w:t>do número de canais, número de repetições, stride (para reduzir resolução, se necessário)</w:t>
       </w:r>
       <w:r>
         <w:rPr>
@@ -4981,19 +4077,11 @@
           <w:color w:val="000000" w:themeColor="text1"/>
         </w:rPr>
       </w:pPr>
-      <w:proofErr w:type="spellStart"/>
-      <w:r>
-        <w:rPr>
-          <w:color w:val="000000" w:themeColor="text1"/>
-        </w:rPr>
-        <w:t>Conv</w:t>
-      </w:r>
-      <w:proofErr w:type="spellEnd"/>
-      <w:r>
-        <w:rPr>
-          <w:color w:val="000000" w:themeColor="text1"/>
-        </w:rPr>
-        <w:t xml:space="preserve"> 1x1 (expansão)</w:t>
+      <w:r>
+        <w:rPr>
+          <w:color w:val="000000" w:themeColor="text1"/>
+        </w:rPr>
+        <w:t>Conv 1x1 (expansão)</w:t>
       </w:r>
     </w:p>
     <w:p>
@@ -5008,14 +4096,12 @@
           <w:color w:val="000000" w:themeColor="text1"/>
         </w:rPr>
       </w:pPr>
-      <w:proofErr w:type="spellStart"/>
       <w:r>
         <w:rPr>
           <w:color w:val="000000" w:themeColor="text1"/>
         </w:rPr>
         <w:t>BatchNorm</w:t>
       </w:r>
-      <w:proofErr w:type="spellEnd"/>
     </w:p>
     <w:p>
       <w:pPr>
@@ -5048,33 +4134,11 @@
           <w:color w:val="000000" w:themeColor="text1"/>
         </w:rPr>
       </w:pPr>
-      <w:proofErr w:type="spellStart"/>
-      <w:r>
-        <w:rPr>
-          <w:color w:val="000000" w:themeColor="text1"/>
-        </w:rPr>
-        <w:t>Depthwise</w:t>
-      </w:r>
-      <w:proofErr w:type="spellEnd"/>
-      <w:r>
-        <w:rPr>
-          <w:color w:val="000000" w:themeColor="text1"/>
-        </w:rPr>
-        <w:t xml:space="preserve"> </w:t>
-      </w:r>
-      <w:proofErr w:type="spellStart"/>
-      <w:r>
-        <w:rPr>
-          <w:color w:val="000000" w:themeColor="text1"/>
-        </w:rPr>
-        <w:t>Conv</w:t>
-      </w:r>
-      <w:proofErr w:type="spellEnd"/>
-      <w:r>
-        <w:rPr>
-          <w:color w:val="000000" w:themeColor="text1"/>
-        </w:rPr>
-        <w:t xml:space="preserve"> 3x3</w:t>
+      <w:r>
+        <w:rPr>
+          <w:color w:val="000000" w:themeColor="text1"/>
+        </w:rPr>
+        <w:t>Depthwise Conv 3x3</w:t>
       </w:r>
     </w:p>
     <w:p>
@@ -5089,14 +4153,12 @@
           <w:color w:val="000000" w:themeColor="text1"/>
         </w:rPr>
       </w:pPr>
-      <w:proofErr w:type="spellStart"/>
       <w:r>
         <w:rPr>
           <w:color w:val="000000" w:themeColor="text1"/>
         </w:rPr>
         <w:t>BatchNorm</w:t>
       </w:r>
-      <w:proofErr w:type="spellEnd"/>
     </w:p>
     <w:p>
       <w:pPr>
@@ -5140,21 +4202,7 @@
         <w:rPr>
           <w:color w:val="000000" w:themeColor="text1"/>
         </w:rPr>
-        <w:t xml:space="preserve">, não </w:t>
-      </w:r>
-      <w:proofErr w:type="spellStart"/>
-      <w:r>
-        <w:rPr>
-          <w:color w:val="000000" w:themeColor="text1"/>
-        </w:rPr>
-        <w:t>ReLU</w:t>
-      </w:r>
-      <w:proofErr w:type="spellEnd"/>
-      <w:r>
-        <w:rPr>
-          <w:color w:val="000000" w:themeColor="text1"/>
-        </w:rPr>
-        <w:t xml:space="preserve"> padrão</w:t>
+        <w:t>, não ReLU padrão</w:t>
       </w:r>
       <w:r>
         <w:rPr>
@@ -5175,33 +4223,11 @@
           <w:color w:val="000000" w:themeColor="text1"/>
         </w:rPr>
       </w:pPr>
-      <w:proofErr w:type="spellStart"/>
-      <w:r>
-        <w:rPr>
-          <w:color w:val="000000" w:themeColor="text1"/>
-        </w:rPr>
-        <w:t>Conv</w:t>
-      </w:r>
-      <w:proofErr w:type="spellEnd"/>
-      <w:r>
-        <w:rPr>
-          <w:color w:val="000000" w:themeColor="text1"/>
-        </w:rPr>
-        <w:t xml:space="preserve"> 1x1 (projeção — sem </w:t>
-      </w:r>
-      <w:proofErr w:type="spellStart"/>
-      <w:r>
-        <w:rPr>
-          <w:color w:val="000000" w:themeColor="text1"/>
-        </w:rPr>
-        <w:t>ReLU</w:t>
-      </w:r>
-      <w:proofErr w:type="spellEnd"/>
-      <w:r>
-        <w:rPr>
-          <w:color w:val="000000" w:themeColor="text1"/>
-        </w:rPr>
-        <w:t>)</w:t>
+      <w:r>
+        <w:rPr>
+          <w:color w:val="000000" w:themeColor="text1"/>
+        </w:rPr>
+        <w:t>Conv 1x1 (projeção — sem ReLU)</w:t>
       </w:r>
     </w:p>
     <w:p>
@@ -5216,14 +4242,12 @@
           <w:color w:val="000000" w:themeColor="text1"/>
         </w:rPr>
       </w:pPr>
-      <w:proofErr w:type="spellStart"/>
       <w:r>
         <w:rPr>
           <w:color w:val="000000" w:themeColor="text1"/>
         </w:rPr>
         <w:t>BatchNorm</w:t>
       </w:r>
-      <w:proofErr w:type="spellEnd"/>
     </w:p>
     <w:p>
       <w:pPr>
@@ -5241,21 +4265,7 @@
         <w:rPr>
           <w:color w:val="000000" w:themeColor="text1"/>
         </w:rPr>
-        <w:t xml:space="preserve">(Opcional) </w:t>
-      </w:r>
-      <w:proofErr w:type="spellStart"/>
-      <w:r>
-        <w:rPr>
-          <w:color w:val="000000" w:themeColor="text1"/>
-        </w:rPr>
-        <w:t>Skip</w:t>
-      </w:r>
-      <w:proofErr w:type="spellEnd"/>
-      <w:r>
-        <w:rPr>
-          <w:color w:val="000000" w:themeColor="text1"/>
-        </w:rPr>
-        <w:t xml:space="preserve"> connection</w:t>
+        <w:t>(Opcional) Skip connection</w:t>
       </w:r>
     </w:p>
     <w:p>
@@ -5318,19 +4328,11 @@
         </w:rPr>
         <w:t xml:space="preserve"> e as últimas camadas são compostas por </w:t>
       </w:r>
-      <w:proofErr w:type="spellStart"/>
-      <w:r>
-        <w:rPr>
-          <w:color w:val="000000" w:themeColor="text1"/>
-        </w:rPr>
-        <w:t>Conv</w:t>
-      </w:r>
-      <w:proofErr w:type="spellEnd"/>
-      <w:r>
-        <w:rPr>
-          <w:color w:val="000000" w:themeColor="text1"/>
-        </w:rPr>
-        <w:t xml:space="preserve"> 1x1</w:t>
+      <w:r>
+        <w:rPr>
+          <w:color w:val="000000" w:themeColor="text1"/>
+        </w:rPr>
+        <w:t>Conv 1x1</w:t>
       </w:r>
       <w:r>
         <w:rPr>
@@ -5342,30 +4344,8 @@
         <w:rPr>
           <w:color w:val="000000" w:themeColor="text1"/>
         </w:rPr>
-        <w:t xml:space="preserve">Global </w:t>
-      </w:r>
-      <w:proofErr w:type="spellStart"/>
-      <w:r>
-        <w:rPr>
-          <w:color w:val="000000" w:themeColor="text1"/>
-        </w:rPr>
-        <w:t>Average</w:t>
-      </w:r>
-      <w:proofErr w:type="spellEnd"/>
-      <w:r>
-        <w:rPr>
-          <w:color w:val="000000" w:themeColor="text1"/>
-        </w:rPr>
-        <w:t xml:space="preserve"> </w:t>
-      </w:r>
-      <w:proofErr w:type="spellStart"/>
-      <w:r>
-        <w:rPr>
-          <w:color w:val="000000" w:themeColor="text1"/>
-        </w:rPr>
-        <w:t>Pooling</w:t>
-      </w:r>
-      <w:proofErr w:type="spellEnd"/>
+        <w:t>Global Average Pooling</w:t>
+      </w:r>
       <w:r>
         <w:rPr>
           <w:color w:val="000000" w:themeColor="text1"/>
@@ -5446,23 +4426,7 @@
         <w:jc w:val="both"/>
       </w:pPr>
       <w:r>
-        <w:t xml:space="preserve">A </w:t>
-      </w:r>
-      <w:proofErr w:type="spellStart"/>
-      <w:r>
-        <w:t>DenseNet</w:t>
-      </w:r>
-      <w:proofErr w:type="spellEnd"/>
-      <w:r>
-        <w:t xml:space="preserve"> tenta resolver um problema clássico: a perda de informação e gradiente em redes muito profundas. A proposta da </w:t>
-      </w:r>
-      <w:proofErr w:type="spellStart"/>
-      <w:r>
-        <w:t>DenseNet</w:t>
-      </w:r>
-      <w:proofErr w:type="spellEnd"/>
-      <w:r>
-        <w:t xml:space="preserve"> é radical: cada camada recebe como entrada todas as saídas das camadas anteriores. Ou seja, em vez de uma cadeia linear de processamento, a rede cria um padrão altamente conectado, onde cada camada tem acesso direto ao “histórico completo” de features já aprendidas. </w:t>
+        <w:t xml:space="preserve">A DenseNet tenta resolver um problema clássico: a perda de informação e gradiente em redes muito profundas. A proposta da DenseNet é radical: cada camada recebe como entrada todas as saídas das camadas anteriores. Ou seja, em vez de uma cadeia linear de processamento, a rede cria um padrão altamente conectado, onde cada camada tem acesso direto ao “histórico completo” de features já aprendidas. </w:t>
       </w:r>
     </w:p>
     <w:p>
@@ -5566,15 +4530,7 @@
         <w:t xml:space="preserve">: </w:t>
       </w:r>
       <w:r>
-        <w:t xml:space="preserve">Mesmo sendo profunda, a </w:t>
-      </w:r>
-      <w:proofErr w:type="spellStart"/>
-      <w:r>
-        <w:t>DenseNet</w:t>
-      </w:r>
-      <w:proofErr w:type="spellEnd"/>
-      <w:r>
-        <w:t xml:space="preserve"> usa menos parâmetros que redes tradicionais</w:t>
+        <w:t>Mesmo sendo profunda, a DenseNet usa menos parâmetros que redes tradicionais</w:t>
       </w:r>
     </w:p>
     <w:p>
@@ -5591,39 +4547,7 @@
         <w:jc w:val="both"/>
       </w:pPr>
       <w:r>
-        <w:t xml:space="preserve">O principal diferencial da </w:t>
-      </w:r>
-      <w:proofErr w:type="spellStart"/>
-      <w:r>
-        <w:t>DenseNet</w:t>
-      </w:r>
-      <w:proofErr w:type="spellEnd"/>
-      <w:r>
-        <w:t xml:space="preserve"> está na forma como as camadas se conectam. Diferente da </w:t>
-      </w:r>
-      <w:proofErr w:type="spellStart"/>
-      <w:r>
-        <w:t>ResNet</w:t>
-      </w:r>
-      <w:proofErr w:type="spellEnd"/>
-      <w:r>
-        <w:t>, que soma entradas (</w:t>
-      </w:r>
-      <w:proofErr w:type="spellStart"/>
-      <w:r>
-        <w:t>skip</w:t>
-      </w:r>
-      <w:proofErr w:type="spellEnd"/>
-      <w:r>
-        <w:t xml:space="preserve"> connection), a </w:t>
-      </w:r>
-      <w:proofErr w:type="spellStart"/>
-      <w:r>
-        <w:t>DenseNet</w:t>
-      </w:r>
-      <w:proofErr w:type="spellEnd"/>
-      <w:r>
-        <w:t xml:space="preserve"> utiliza concatenação.</w:t>
+        <w:t>O principal diferencial da DenseNet está na forma como as camadas se conectam. Diferente da ResNet, que soma entradas (skip connection), a DenseNet utiliza concatenação.</w:t>
       </w:r>
       <w:r>
         <w:t xml:space="preserve"> </w:t>
@@ -5662,41 +4586,15 @@
         <w:t>a</w:t>
       </w:r>
       <w:r>
-        <w:t xml:space="preserve"> conectividade intensa, a </w:t>
-      </w:r>
-      <w:proofErr w:type="spellStart"/>
-      <w:r>
-        <w:t>DenseNet</w:t>
-      </w:r>
-      <w:proofErr w:type="spellEnd"/>
-      <w:r>
-        <w:t xml:space="preserve"> é dividida em </w:t>
-      </w:r>
-      <w:proofErr w:type="spellStart"/>
-      <w:r>
-        <w:rPr>
-          <w:b/>
-          <w:bCs/>
-        </w:rPr>
-        <w:t>Dense</w:t>
-      </w:r>
-      <w:proofErr w:type="spellEnd"/>
-      <w:r>
-        <w:rPr>
-          <w:b/>
-          <w:bCs/>
-        </w:rPr>
-        <w:t xml:space="preserve"> </w:t>
-      </w:r>
-      <w:proofErr w:type="spellStart"/>
-      <w:r>
-        <w:rPr>
-          <w:b/>
-          <w:bCs/>
-        </w:rPr>
-        <w:t>Blocks</w:t>
-      </w:r>
-      <w:proofErr w:type="spellEnd"/>
+        <w:t xml:space="preserve"> conectividade intensa, a DenseNet é dividida em </w:t>
+      </w:r>
+      <w:r>
+        <w:rPr>
+          <w:b/>
+          <w:bCs/>
+        </w:rPr>
+        <w:t>Dense Blocks</w:t>
+      </w:r>
       <w:r>
         <w:t>, os quais são estruturados da seguinte forma:</w:t>
       </w:r>
@@ -5827,39 +4725,7 @@
         <w:t>é</w:t>
       </w:r>
       <w:r>
-        <w:t xml:space="preserve"> composta por: Batch </w:t>
-      </w:r>
-      <w:proofErr w:type="spellStart"/>
-      <w:r>
-        <w:t>Normalization</w:t>
-      </w:r>
-      <w:proofErr w:type="spellEnd"/>
-      <w:r>
-        <w:t xml:space="preserve">, </w:t>
-      </w:r>
-      <w:proofErr w:type="spellStart"/>
-      <w:r>
-        <w:t>ReLU</w:t>
-      </w:r>
-      <w:proofErr w:type="spellEnd"/>
-      <w:r>
-        <w:t xml:space="preserve"> e Convolução. No modelo mais eficiente (</w:t>
-      </w:r>
-      <w:proofErr w:type="spellStart"/>
-      <w:r>
-        <w:t>DenseNet</w:t>
-      </w:r>
-      <w:proofErr w:type="spellEnd"/>
-      <w:r>
-        <w:t xml:space="preserve">-BC), essa transformação é expandida para incluir um </w:t>
-      </w:r>
-      <w:proofErr w:type="spellStart"/>
-      <w:r>
-        <w:t>bottleneck</w:t>
-      </w:r>
-      <w:proofErr w:type="spellEnd"/>
-      <w:r>
-        <w:t>:</w:t>
+        <w:t xml:space="preserve"> composta por: Batch Normalization, ReLU e Convolução. No modelo mais eficiente (DenseNet-BC), essa transformação é expandida para incluir um bottleneck:</w:t>
       </w:r>
     </w:p>
     <w:p>
@@ -5879,28 +4745,7 @@
         <w:jc w:val="both"/>
       </w:pPr>
       <w:r>
-        <w:t xml:space="preserve">BN → </w:t>
-      </w:r>
-      <w:proofErr w:type="spellStart"/>
-      <w:r>
-        <w:t>ReLU</w:t>
-      </w:r>
-      <w:proofErr w:type="spellEnd"/>
-      <w:r>
-        <w:t xml:space="preserve"> → </w:t>
-      </w:r>
-      <w:proofErr w:type="spellStart"/>
-      <w:proofErr w:type="gramStart"/>
-      <w:r>
-        <w:t>Conv</w:t>
-      </w:r>
-      <w:proofErr w:type="spellEnd"/>
-      <w:r>
-        <w:t>(</w:t>
-      </w:r>
-      <w:proofErr w:type="gramEnd"/>
-      <w:r>
-        <w:t>1×1)</w:t>
+        <w:t>BN → ReLU → Conv(1×1)</w:t>
       </w:r>
     </w:p>
     <w:p>
@@ -5913,28 +4758,7 @@
         <w:jc w:val="both"/>
       </w:pPr>
       <w:r>
-        <w:t xml:space="preserve">BN → </w:t>
-      </w:r>
-      <w:proofErr w:type="spellStart"/>
-      <w:r>
-        <w:t>ReLU</w:t>
-      </w:r>
-      <w:proofErr w:type="spellEnd"/>
-      <w:r>
-        <w:t xml:space="preserve"> → </w:t>
-      </w:r>
-      <w:proofErr w:type="spellStart"/>
-      <w:proofErr w:type="gramStart"/>
-      <w:r>
-        <w:t>Conv</w:t>
-      </w:r>
-      <w:proofErr w:type="spellEnd"/>
-      <w:r>
-        <w:t>(</w:t>
-      </w:r>
-      <w:proofErr w:type="gramEnd"/>
-      <w:r>
-        <w:t>3×3)</w:t>
+        <w:t>BN → ReLU → Conv(3×3)</w:t>
       </w:r>
     </w:p>
     <w:p>
@@ -5951,15 +4775,7 @@
         <w:jc w:val="both"/>
       </w:pPr>
       <w:r>
-        <w:t xml:space="preserve">O uso do </w:t>
-      </w:r>
-      <w:proofErr w:type="spellStart"/>
-      <w:r>
-        <w:t>conv</w:t>
-      </w:r>
-      <w:proofErr w:type="spellEnd"/>
-      <w:r>
-        <w:t xml:space="preserve"> 1×1 antes do 3×3 serve para reduzir dimensionalidade e custo computacional, mantendo a eficiência.</w:t>
+        <w:t>O uso do conv 1×1 antes do 3×3 serve para reduzir dimensionalidade e custo computacional, mantendo a eficiência.</w:t>
       </w:r>
     </w:p>
     <w:p>
@@ -6004,23 +4820,7 @@
         <w:jc w:val="both"/>
       </w:pPr>
       <w:r>
-        <w:t xml:space="preserve">Um conceito fundamental na </w:t>
-      </w:r>
-      <w:proofErr w:type="spellStart"/>
-      <w:r>
-        <w:t>DenseNet</w:t>
-      </w:r>
-      <w:proofErr w:type="spellEnd"/>
-      <w:r>
-        <w:t xml:space="preserve"> é o </w:t>
-      </w:r>
-      <w:proofErr w:type="spellStart"/>
-      <w:r>
-        <w:t>growth</w:t>
-      </w:r>
-      <w:proofErr w:type="spellEnd"/>
-      <w:r>
-        <w:t xml:space="preserve"> rate (k). Ele define quantos novos canais cada camada adiciona ao modelo</w:t>
+        <w:t>Um conceito fundamental na DenseNet é o growth rate (k). Ele define quantos novos canais cada camada adiciona ao modelo</w:t>
       </w:r>
       <w:r>
         <w:t xml:space="preserve">, dessa forma a rede cresce de forma controlada em que cada camada </w:t>
@@ -6120,15 +4920,7 @@
         <w:t xml:space="preserve"> </w:t>
       </w:r>
       <w:r>
-        <w:t xml:space="preserve">Esse design é essencial, porque sem isso a rede explodiria em tamanho rapidamente. O </w:t>
-      </w:r>
-      <w:proofErr w:type="spellStart"/>
-      <w:r>
-        <w:t>paper</w:t>
-      </w:r>
-      <w:proofErr w:type="spellEnd"/>
-      <w:r>
-        <w:t xml:space="preserve"> mostra que valores pequenos como </w:t>
+        <w:t xml:space="preserve">Esse design é essencial, porque sem isso a rede explodiria em tamanho rapidamente. O paper mostra que valores pequenos como </w:t>
       </w:r>
       <w:r>
         <w:rPr>
@@ -6168,53 +4960,13 @@
         <w:jc w:val="both"/>
       </w:pPr>
       <w:r>
-        <w:t xml:space="preserve">Entre os </w:t>
-      </w:r>
-      <w:proofErr w:type="spellStart"/>
-      <w:r>
-        <w:t>Dense</w:t>
-      </w:r>
-      <w:proofErr w:type="spellEnd"/>
-      <w:r>
-        <w:t xml:space="preserve"> </w:t>
-      </w:r>
-      <w:proofErr w:type="spellStart"/>
-      <w:r>
-        <w:t>Blocks</w:t>
-      </w:r>
-      <w:proofErr w:type="spellEnd"/>
-      <w:r>
-        <w:t xml:space="preserve"> existem as </w:t>
-      </w:r>
-      <w:proofErr w:type="spellStart"/>
-      <w:r>
-        <w:t>Transition</w:t>
-      </w:r>
-      <w:proofErr w:type="spellEnd"/>
-      <w:r>
-        <w:t xml:space="preserve"> </w:t>
-      </w:r>
-      <w:proofErr w:type="spellStart"/>
-      <w:r>
-        <w:t>Layers</w:t>
-      </w:r>
-      <w:proofErr w:type="spellEnd"/>
-      <w:r>
-        <w:t xml:space="preserve">, </w:t>
+        <w:t xml:space="preserve">Entre os Dense Blocks existem as Transition Layers, </w:t>
       </w:r>
       <w:r>
         <w:t>responsáveis por r</w:t>
       </w:r>
       <w:r>
-        <w:t>eduzir a dimensão espacial (</w:t>
-      </w:r>
-      <w:proofErr w:type="spellStart"/>
-      <w:r>
-        <w:t>downsampling</w:t>
-      </w:r>
-      <w:proofErr w:type="spellEnd"/>
-      <w:r>
-        <w:t>)</w:t>
+        <w:t>eduzir a dimensão espacial (downsampling)</w:t>
       </w:r>
       <w:r>
         <w:t xml:space="preserve"> e c</w:t>
@@ -6226,33 +4978,7 @@
         <w:t xml:space="preserve">. A estrutura base é: </w:t>
       </w:r>
       <w:r>
-        <w:t xml:space="preserve">BN → </w:t>
-      </w:r>
-      <w:proofErr w:type="spellStart"/>
-      <w:proofErr w:type="gramStart"/>
-      <w:r>
-        <w:t>Conv</w:t>
-      </w:r>
-      <w:proofErr w:type="spellEnd"/>
-      <w:r>
-        <w:t>(</w:t>
-      </w:r>
-      <w:proofErr w:type="gramEnd"/>
-      <w:r>
-        <w:t xml:space="preserve">1×1) → </w:t>
-      </w:r>
-      <w:proofErr w:type="spellStart"/>
-      <w:proofErr w:type="gramStart"/>
-      <w:r>
-        <w:t>AvgPool</w:t>
-      </w:r>
-      <w:proofErr w:type="spellEnd"/>
-      <w:r>
-        <w:t>(</w:t>
-      </w:r>
-      <w:proofErr w:type="gramEnd"/>
-      <w:r>
-        <w:t>2×2)</w:t>
+        <w:t>BN → Conv(1×1) → AvgPool(2×2)</w:t>
       </w:r>
       <w:r>
         <w:t>.</w:t>
@@ -6270,15 +4996,7 @@
         <w:t>Adicionalmente</w:t>
       </w:r>
       <w:r>
-        <w:t xml:space="preserve">, a </w:t>
-      </w:r>
-      <w:proofErr w:type="spellStart"/>
-      <w:r>
-        <w:t>DenseNet</w:t>
-      </w:r>
-      <w:proofErr w:type="spellEnd"/>
-      <w:r>
-        <w:t xml:space="preserve"> introduz o conceito de compressão (θ)</w:t>
+        <w:t>, a DenseNet introduz o conceito de compressão (θ)</w:t>
       </w:r>
       <w:r>
         <w:t xml:space="preserve"> para reduzir o número de canais</w:t>
@@ -6468,23 +5186,7 @@
         <w:jc w:val="both"/>
       </w:pPr>
       <w:r>
-        <w:t xml:space="preserve">Cada camada recebe diretamente o input original e gradientes da saída final, o que cria um efeito de </w:t>
-      </w:r>
-      <w:proofErr w:type="spellStart"/>
-      <w:r>
-        <w:t>deep</w:t>
-      </w:r>
-      <w:proofErr w:type="spellEnd"/>
-      <w:r>
-        <w:t xml:space="preserve"> </w:t>
-      </w:r>
-      <w:proofErr w:type="spellStart"/>
-      <w:r>
-        <w:t>supervision</w:t>
-      </w:r>
-      <w:proofErr w:type="spellEnd"/>
-      <w:r>
-        <w:t xml:space="preserve"> implícita</w:t>
+        <w:t>Cada camada recebe diretamente o input original e gradientes da saída final, o que cria um efeito de deep supervision implícita</w:t>
       </w:r>
       <w:r>
         <w:t>.</w:t>
@@ -6546,13 +5248,8 @@
         <w:t xml:space="preserve"> </w:t>
       </w:r>
       <w:r>
-        <w:t xml:space="preserve">a rede evita </w:t>
-      </w:r>
-      <w:proofErr w:type="spellStart"/>
-      <w:r>
-        <w:t>overfitting</w:t>
-      </w:r>
-      <w:proofErr w:type="spellEnd"/>
+        <w:t>a rede evita overfitting</w:t>
+      </w:r>
       <w:r>
         <w:t>, reduzindo a necessidade de parâmetros</w:t>
       </w:r>
@@ -6737,13 +5434,8 @@
         </w:numPr>
         <w:jc w:val="both"/>
       </w:pPr>
-      <w:proofErr w:type="spellStart"/>
-      <w:r>
-        <w:t>Dataset</w:t>
-      </w:r>
-      <w:proofErr w:type="spellEnd"/>
-      <w:r>
-        <w:t xml:space="preserve"> pequeno (~13k imagens)</w:t>
+      <w:r>
+        <w:t>Dataset pequeno (~13k imagens)</w:t>
       </w:r>
       <w:r>
         <w:t>;</w:t>
@@ -6836,23 +5528,7 @@
         <w:jc w:val="both"/>
       </w:pPr>
       <w:r>
-        <w:t xml:space="preserve">Não devemos treinar a </w:t>
-      </w:r>
-      <w:proofErr w:type="spellStart"/>
-      <w:r>
-        <w:t>MobileNet</w:t>
-      </w:r>
-      <w:proofErr w:type="spellEnd"/>
-      <w:r>
-        <w:t xml:space="preserve"> da mesma forma que a </w:t>
-      </w:r>
-      <w:proofErr w:type="spellStart"/>
-      <w:r>
-        <w:t>ResNet</w:t>
-      </w:r>
-      <w:proofErr w:type="spellEnd"/>
-      <w:r>
-        <w:t>, visto que ela</w:t>
+        <w:t>Não devemos treinar a MobileNet da mesma forma que a ResNet, visto que ela</w:t>
       </w:r>
       <w:r>
         <w:t xml:space="preserve"> NÃO foi projetada para o mesmo regime de treino</w:t>
@@ -6886,23 +5562,7 @@
           <w:b/>
           <w:bCs/>
         </w:rPr>
-        <w:t xml:space="preserve">Como extrair o máximo da </w:t>
-      </w:r>
-      <w:proofErr w:type="spellStart"/>
-      <w:r>
-        <w:rPr>
-          <w:b/>
-          <w:bCs/>
-        </w:rPr>
-        <w:t>MobileNet</w:t>
-      </w:r>
-      <w:proofErr w:type="spellEnd"/>
-      <w:r>
-        <w:rPr>
-          <w:b/>
-          <w:bCs/>
-        </w:rPr>
-        <w:t>?</w:t>
+        <w:t>Como extrair o máximo da MobileNet?</w:t>
       </w:r>
     </w:p>
     <w:p>
@@ -6924,13 +5584,8 @@
         <w:jc w:val="both"/>
       </w:pPr>
       <w:r>
-        <w:t xml:space="preserve">Reduzir a </w:t>
-      </w:r>
-      <w:proofErr w:type="spellStart"/>
-      <w:r>
-        <w:t>MobileNet</w:t>
-      </w:r>
-      <w:proofErr w:type="spellEnd"/>
+        <w:t>Reduzir a MobileNet</w:t>
+      </w:r>
       <w:r>
         <w:t xml:space="preserve"> </w:t>
       </w:r>
@@ -7004,21 +5659,7 @@
         <w:rPr>
           <w:lang w:val="en-US"/>
         </w:rPr>
-        <w:t xml:space="preserve">Augmentation </w:t>
-      </w:r>
-      <w:proofErr w:type="spellStart"/>
-      <w:r>
-        <w:rPr>
-          <w:lang w:val="en-US"/>
-        </w:rPr>
-        <w:t>leve</w:t>
-      </w:r>
-      <w:proofErr w:type="spellEnd"/>
-      <w:r>
-        <w:rPr>
-          <w:lang w:val="en-US"/>
-        </w:rPr>
-        <w:t xml:space="preserve"> </w:t>
+        <w:t xml:space="preserve">Augmentation leve </w:t>
       </w:r>
       <w:r>
         <w:rPr>
@@ -7031,73 +5672,7 @@
         <w:rPr>
           <w:lang w:val="en-US"/>
         </w:rPr>
-        <w:t xml:space="preserve"> </w:t>
-      </w:r>
-      <w:proofErr w:type="spellStart"/>
-      <w:proofErr w:type="gramStart"/>
-      <w:r>
-        <w:rPr>
-          <w:lang w:val="en-US"/>
-        </w:rPr>
-        <w:t>RandomRotation</w:t>
-      </w:r>
-      <w:proofErr w:type="spellEnd"/>
-      <w:r>
-        <w:rPr>
-          <w:lang w:val="en-US"/>
-        </w:rPr>
-        <w:t>(</w:t>
-      </w:r>
-      <w:proofErr w:type="gramEnd"/>
-      <w:r>
-        <w:rPr>
-          <w:lang w:val="en-US"/>
-        </w:rPr>
-        <w:t xml:space="preserve">0.1), </w:t>
-      </w:r>
-      <w:proofErr w:type="spellStart"/>
-      <w:proofErr w:type="gramStart"/>
-      <w:r>
-        <w:rPr>
-          <w:lang w:val="en-US"/>
-        </w:rPr>
-        <w:t>RandomZoom</w:t>
-      </w:r>
-      <w:proofErr w:type="spellEnd"/>
-      <w:r>
-        <w:rPr>
-          <w:lang w:val="en-US"/>
-        </w:rPr>
-        <w:t>(</w:t>
-      </w:r>
-      <w:proofErr w:type="gramEnd"/>
-      <w:r>
-        <w:rPr>
-          <w:lang w:val="en-US"/>
-        </w:rPr>
-        <w:t xml:space="preserve">0.1), </w:t>
-      </w:r>
-      <w:proofErr w:type="spellStart"/>
-      <w:proofErr w:type="gramStart"/>
-      <w:r>
-        <w:rPr>
-          <w:lang w:val="en-US"/>
-        </w:rPr>
-        <w:t>RandomContrast</w:t>
-      </w:r>
-      <w:proofErr w:type="spellEnd"/>
-      <w:r>
-        <w:rPr>
-          <w:lang w:val="en-US"/>
-        </w:rPr>
-        <w:t>(</w:t>
-      </w:r>
-      <w:proofErr w:type="gramEnd"/>
-      <w:r>
-        <w:rPr>
-          <w:lang w:val="en-US"/>
-        </w:rPr>
-        <w:t>0.1);</w:t>
+        <w:t xml:space="preserve"> RandomRotation(0.1), RandomZoom(0.1), RandomContrast(0.1);</w:t>
       </w:r>
     </w:p>
     <w:p>
@@ -7129,18 +5704,8 @@
         </w:numPr>
         <w:jc w:val="both"/>
       </w:pPr>
-      <w:proofErr w:type="spellStart"/>
-      <w:proofErr w:type="gramStart"/>
-      <w:r>
-        <w:t>Dropout</w:t>
-      </w:r>
-      <w:proofErr w:type="spellEnd"/>
-      <w:r>
-        <w:t>(</w:t>
-      </w:r>
-      <w:proofErr w:type="gramEnd"/>
-      <w:r>
-        <w:t>0.3)</w:t>
+      <w:r>
+        <w:t>Dropout(0.3)</w:t>
       </w:r>
       <w:r>
         <w:t xml:space="preserve"> antes da camada final</w:t>
@@ -7156,15 +5721,7 @@
         <w:jc w:val="both"/>
       </w:pPr>
       <w:r>
-        <w:t>Simplificação no carregamento de dados (</w:t>
-      </w:r>
-      <w:proofErr w:type="spellStart"/>
-      <w:r>
-        <w:t>DataLoader</w:t>
-      </w:r>
-      <w:proofErr w:type="spellEnd"/>
-      <w:r>
-        <w:t>)</w:t>
+        <w:t>Simplificação no carregamento de dados (DataLoader)</w:t>
       </w:r>
     </w:p>
     <w:p>
@@ -7179,7 +5736,6 @@
           <w:lang w:val="en-US"/>
         </w:rPr>
       </w:pPr>
-      <w:proofErr w:type="spellStart"/>
       <w:r>
         <w:rPr>
           <w:b/>
@@ -7188,7 +5744,6 @@
         </w:rPr>
         <w:t>Justificativa</w:t>
       </w:r>
-      <w:proofErr w:type="spellEnd"/>
       <w:r>
         <w:rPr>
           <w:lang w:val="en-US"/>
@@ -7274,21 +5829,7 @@
         <w:rPr>
           <w:color w:val="000000" w:themeColor="text1"/>
         </w:rPr>
-        <w:t xml:space="preserve">Early </w:t>
-      </w:r>
-      <w:proofErr w:type="spellStart"/>
-      <w:r>
-        <w:rPr>
-          <w:color w:val="000000" w:themeColor="text1"/>
-        </w:rPr>
-        <w:t>Stopping</w:t>
-      </w:r>
-      <w:proofErr w:type="spellEnd"/>
-      <w:r>
-        <w:rPr>
-          <w:color w:val="000000" w:themeColor="text1"/>
-        </w:rPr>
-        <w:t xml:space="preserve"> </w:t>
+        <w:t xml:space="preserve">Early Stopping </w:t>
       </w:r>
       <w:r>
         <w:rPr>
@@ -7300,16 +5841,8 @@
         <w:rPr>
           <w:rFonts w:cstheme="minorHAnsi"/>
         </w:rPr>
-        <w:t xml:space="preserve"> treino no caso de um </w:t>
-      </w:r>
-      <w:proofErr w:type="spellStart"/>
-      <w:r>
-        <w:rPr>
-          <w:rFonts w:cstheme="minorHAnsi"/>
-        </w:rPr>
-        <w:t>plateau</w:t>
-      </w:r>
-      <w:proofErr w:type="spellEnd"/>
+        <w:t xml:space="preserve"> treino no caso de um plateau</w:t>
+      </w:r>
     </w:p>
     <w:p>
       <w:pPr>
@@ -7396,13 +5929,8 @@
         <w:t>escopo</w:t>
       </w:r>
       <w:r>
-        <w:t xml:space="preserve"> do projeto se mantém igual ao que foi apresentado no estudo anterior para a </w:t>
-      </w:r>
-      <w:proofErr w:type="spellStart"/>
-      <w:r>
-        <w:t>MobileNet</w:t>
-      </w:r>
-      <w:proofErr w:type="spellEnd"/>
+        <w:t xml:space="preserve"> do projeto se mantém igual ao que foi apresentado no estudo anterior para a MobileNet</w:t>
+      </w:r>
       <w:r>
         <w:t>, seguindo as mesmas necessidades apresentadas lá</w:t>
       </w:r>
@@ -7433,39 +5961,7 @@
         <w:t xml:space="preserve"> </w:t>
       </w:r>
       <w:r>
-        <w:t xml:space="preserve">DenseNet-121 foi feita para </w:t>
-      </w:r>
-      <w:proofErr w:type="spellStart"/>
-      <w:r>
-        <w:t>ImageNet</w:t>
-      </w:r>
-      <w:proofErr w:type="spellEnd"/>
-      <w:r>
-        <w:t xml:space="preserve"> (1.2M imagens) e por </w:t>
-      </w:r>
-      <w:proofErr w:type="spellStart"/>
-      <w:r>
-        <w:t>consequencia</w:t>
-      </w:r>
-      <w:proofErr w:type="spellEnd"/>
-      <w:r>
-        <w:t xml:space="preserve"> é muito profunda para a aplicação deste projeto, isso aumenta consideravelmente o risco de </w:t>
-      </w:r>
-      <w:proofErr w:type="spellStart"/>
-      <w:r>
-        <w:t>overfitting</w:t>
-      </w:r>
-      <w:proofErr w:type="spellEnd"/>
-      <w:r>
-        <w:t xml:space="preserve"> no </w:t>
-      </w:r>
-      <w:proofErr w:type="spellStart"/>
-      <w:r>
-        <w:t>dataset</w:t>
-      </w:r>
-      <w:proofErr w:type="spellEnd"/>
-      <w:r>
-        <w:t xml:space="preserve"> dos camundongos.</w:t>
+        <w:t>DenseNet-121 foi feita para ImageNet (1.2M imagens) e por consequencia é muito profunda para a aplicação deste projeto, isso aumenta consideravelmente o risco de overfitting no dataset dos camundongos.</w:t>
       </w:r>
     </w:p>
     <w:p>
@@ -7493,23 +5989,7 @@
           <w:b/>
           <w:bCs/>
         </w:rPr>
-        <w:t xml:space="preserve">Como extrair o máximo da </w:t>
-      </w:r>
-      <w:proofErr w:type="spellStart"/>
-      <w:r>
-        <w:rPr>
-          <w:b/>
-          <w:bCs/>
-        </w:rPr>
-        <w:t>MobileNet</w:t>
-      </w:r>
-      <w:proofErr w:type="spellEnd"/>
-      <w:r>
-        <w:rPr>
-          <w:b/>
-          <w:bCs/>
-        </w:rPr>
-        <w:t>?</w:t>
+        <w:t>Como extrair o máximo da MobileNet?</w:t>
       </w:r>
     </w:p>
     <w:p>
@@ -7531,15 +6011,7 @@
         <w:jc w:val="both"/>
       </w:pPr>
       <w:r>
-        <w:t xml:space="preserve">Utilização de uma </w:t>
-      </w:r>
-      <w:proofErr w:type="spellStart"/>
-      <w:r>
-        <w:t>DenseNet</w:t>
-      </w:r>
-      <w:proofErr w:type="spellEnd"/>
-      <w:r>
-        <w:t xml:space="preserve"> rasa. Como sugestão, temos: </w:t>
+        <w:t xml:space="preserve">Utilização de uma DenseNet rasa. Como sugestão, temos: </w:t>
       </w:r>
     </w:p>
     <w:p>
@@ -7551,21 +6023,8 @@
         </w:numPr>
         <w:jc w:val="both"/>
       </w:pPr>
-      <w:proofErr w:type="spellStart"/>
-      <w:r>
-        <w:t>Dense</w:t>
-      </w:r>
-      <w:proofErr w:type="spellEnd"/>
-      <w:r>
-        <w:t xml:space="preserve"> </w:t>
-      </w:r>
-      <w:proofErr w:type="spellStart"/>
-      <w:r>
-        <w:t>Blocks</w:t>
-      </w:r>
-      <w:proofErr w:type="spellEnd"/>
-      <w:r>
-        <w:t>: [4, 6, 8, 6]</w:t>
+      <w:r>
+        <w:t>Dense Blocks: [4, 6, 8, 6]</w:t>
       </w:r>
     </w:p>
     <w:p>
@@ -7577,13 +6036,8 @@
         </w:numPr>
         <w:jc w:val="both"/>
       </w:pPr>
-      <w:proofErr w:type="spellStart"/>
-      <w:r>
-        <w:t>growth_rate</w:t>
-      </w:r>
-      <w:proofErr w:type="spellEnd"/>
-      <w:r>
-        <w:t>: k = 16 ou 24</w:t>
+      <w:r>
+        <w:t>growth_rate: k = 16 ou 24</w:t>
       </w:r>
     </w:p>
     <w:p>
@@ -7595,13 +6049,8 @@
         </w:numPr>
         <w:jc w:val="both"/>
       </w:pPr>
-      <w:proofErr w:type="spellStart"/>
-      <w:r>
-        <w:t>compression</w:t>
-      </w:r>
-      <w:proofErr w:type="spellEnd"/>
-      <w:r>
-        <w:t>: θ = 0.5</w:t>
+      <w:r>
+        <w:t>compression: θ = 0.5</w:t>
       </w:r>
     </w:p>
     <w:p>
@@ -7645,21 +6094,7 @@
         <w:rPr>
           <w:color w:val="000000" w:themeColor="text1"/>
         </w:rPr>
-        <w:t xml:space="preserve">A </w:t>
-      </w:r>
-      <w:proofErr w:type="spellStart"/>
-      <w:r>
-        <w:rPr>
-          <w:color w:val="000000" w:themeColor="text1"/>
-        </w:rPr>
-        <w:t>Densenet</w:t>
-      </w:r>
-      <w:proofErr w:type="spellEnd"/>
-      <w:r>
-        <w:rPr>
-          <w:color w:val="000000" w:themeColor="text1"/>
-        </w:rPr>
-        <w:t xml:space="preserve"> é mais sensível, por isso, é importante reduzir o LR para um valor entre 1e-3 e 5e-4;</w:t>
+        <w:t>A Densenet é mais sensível, por isso, é importante reduzir o LR para um valor entre 1e-3 e 5e-4;</w:t>
       </w:r>
     </w:p>
     <w:p>
@@ -7678,49 +6113,7 @@
         <w:rPr>
           <w:color w:val="000000" w:themeColor="text1"/>
         </w:rPr>
-        <w:t xml:space="preserve">Aplicar </w:t>
-      </w:r>
-      <w:proofErr w:type="spellStart"/>
-      <w:r>
-        <w:rPr>
-          <w:color w:val="000000" w:themeColor="text1"/>
-        </w:rPr>
-        <w:t>early</w:t>
-      </w:r>
-      <w:proofErr w:type="spellEnd"/>
-      <w:r>
-        <w:rPr>
-          <w:color w:val="000000" w:themeColor="text1"/>
-        </w:rPr>
-        <w:t xml:space="preserve"> </w:t>
-      </w:r>
-      <w:proofErr w:type="spellStart"/>
-      <w:r>
-        <w:rPr>
-          <w:color w:val="000000" w:themeColor="text1"/>
-        </w:rPr>
-        <w:t>stopping</w:t>
-      </w:r>
-      <w:proofErr w:type="spellEnd"/>
-      <w:r>
-        <w:rPr>
-          <w:color w:val="000000" w:themeColor="text1"/>
-        </w:rPr>
-        <w:t xml:space="preserve"> (30~50 </w:t>
-      </w:r>
-      <w:proofErr w:type="spellStart"/>
-      <w:r>
-        <w:rPr>
-          <w:color w:val="000000" w:themeColor="text1"/>
-        </w:rPr>
-        <w:t>epochs</w:t>
-      </w:r>
-      <w:proofErr w:type="spellEnd"/>
-      <w:r>
-        <w:rPr>
-          <w:color w:val="000000" w:themeColor="text1"/>
-        </w:rPr>
-        <w:t>);</w:t>
+        <w:t>Aplicar early stopping (30~50 epochs);</w:t>
       </w:r>
     </w:p>
     <w:p>
@@ -7735,11 +6128,9 @@
           <w:color w:val="000000" w:themeColor="text1"/>
         </w:rPr>
       </w:pPr>
-      <w:proofErr w:type="spellStart"/>
       <w:r>
         <w:t>Dropout</w:t>
       </w:r>
-      <w:proofErr w:type="spellEnd"/>
       <w:r>
         <w:t xml:space="preserve"> </w:t>
       </w:r>
@@ -7772,21 +6163,8 @@
         </w:rPr>
       </w:pPr>
       <w:r>
-        <w:t xml:space="preserve">Aplicar Data </w:t>
-      </w:r>
-      <w:proofErr w:type="spellStart"/>
-      <w:r>
-        <w:t>Augmentation</w:t>
-      </w:r>
-      <w:proofErr w:type="spellEnd"/>
-      <w:r>
-        <w:t xml:space="preserve"> um leve, porém um pouco mais agressiva do que a utilizada para a </w:t>
-      </w:r>
-      <w:proofErr w:type="spellStart"/>
-      <w:r>
-        <w:t>MobileNet</w:t>
-      </w:r>
-      <w:proofErr w:type="spellEnd"/>
+        <w:t>Aplicar Data Augmentation um leve, porém um pouco mais agressiva do que a utilizada para a MobileNet</w:t>
+      </w:r>
     </w:p>
     <w:p>
       <w:pPr>
@@ -7820,31 +6198,7 @@
         </w:rPr>
       </w:pPr>
       <w:r>
-        <w:t>A ideia principal é: o “erro” (</w:t>
-      </w:r>
-      <w:proofErr w:type="spellStart"/>
-      <w:r>
-        <w:t>loss</w:t>
-      </w:r>
-      <w:proofErr w:type="spellEnd"/>
-      <w:r>
-        <w:t xml:space="preserve">) que o </w:t>
-      </w:r>
-      <w:proofErr w:type="spellStart"/>
-      <w:r>
-        <w:t>TensorFlow</w:t>
-      </w:r>
-      <w:proofErr w:type="spellEnd"/>
-      <w:r>
-        <w:t xml:space="preserve"> mostra normalmente usa uma função chamada </w:t>
-      </w:r>
-      <w:proofErr w:type="spellStart"/>
-      <w:r>
-        <w:t>cross-entropy</w:t>
-      </w:r>
-      <w:proofErr w:type="spellEnd"/>
-      <w:r>
-        <w:t xml:space="preserve"> (entropia cruzada)</w:t>
+        <w:t>A ideia principal é: o “erro” (loss) que o TensorFlow mostra normalmente usa uma função chamada cross-entropy (entropia cruzada)</w:t>
       </w:r>
     </w:p>
     <w:p>
@@ -7863,21 +6217,7 @@
         <w:rPr>
           <w:color w:val="000000" w:themeColor="text1"/>
         </w:rPr>
-        <w:t xml:space="preserve">Para classificação com </w:t>
-      </w:r>
-      <w:proofErr w:type="spellStart"/>
-      <w:r>
-        <w:rPr>
-          <w:color w:val="000000" w:themeColor="text1"/>
-        </w:rPr>
-        <w:t>CNNs</w:t>
-      </w:r>
-      <w:proofErr w:type="spellEnd"/>
-      <w:r>
-        <w:rPr>
-          <w:color w:val="000000" w:themeColor="text1"/>
-        </w:rPr>
-        <w:t>, o mais comum é usar:</w:t>
+        <w:t>Para classificação com CNNs, o mais comum é usar:</w:t>
       </w:r>
     </w:p>
     <w:p>
@@ -7892,33 +6232,11 @@
           <w:color w:val="000000" w:themeColor="text1"/>
         </w:rPr>
       </w:pPr>
-      <w:proofErr w:type="spellStart"/>
-      <w:r>
-        <w:rPr>
-          <w:color w:val="000000" w:themeColor="text1"/>
-        </w:rPr>
-        <w:t>categorical_crossentropy</w:t>
-      </w:r>
-      <w:proofErr w:type="spellEnd"/>
-      <w:r>
-        <w:rPr>
-          <w:color w:val="000000" w:themeColor="text1"/>
-        </w:rPr>
-        <w:t xml:space="preserve"> (</w:t>
-      </w:r>
-      <w:proofErr w:type="spellStart"/>
-      <w:r>
-        <w:rPr>
-          <w:color w:val="000000" w:themeColor="text1"/>
-        </w:rPr>
-        <w:t>one</w:t>
-      </w:r>
-      <w:proofErr w:type="spellEnd"/>
-      <w:r>
-        <w:rPr>
-          <w:color w:val="000000" w:themeColor="text1"/>
-        </w:rPr>
-        <w:t>-hot)</w:t>
+      <w:r>
+        <w:rPr>
+          <w:color w:val="000000" w:themeColor="text1"/>
+        </w:rPr>
+        <w:t>categorical_crossentropy (one-hot)</w:t>
       </w:r>
     </w:p>
     <w:p>
@@ -7933,33 +6251,11 @@
           <w:color w:val="000000" w:themeColor="text1"/>
         </w:rPr>
       </w:pPr>
-      <w:proofErr w:type="spellStart"/>
-      <w:r>
-        <w:rPr>
-          <w:color w:val="000000" w:themeColor="text1"/>
-        </w:rPr>
-        <w:t>sparse_categorical_crossentropy</w:t>
-      </w:r>
-      <w:proofErr w:type="spellEnd"/>
-      <w:r>
-        <w:rPr>
-          <w:color w:val="000000" w:themeColor="text1"/>
-        </w:rPr>
-        <w:t xml:space="preserve"> (</w:t>
-      </w:r>
-      <w:proofErr w:type="spellStart"/>
-      <w:r>
-        <w:rPr>
-          <w:color w:val="000000" w:themeColor="text1"/>
-        </w:rPr>
-        <w:t>labels</w:t>
-      </w:r>
-      <w:proofErr w:type="spellEnd"/>
-      <w:r>
-        <w:rPr>
-          <w:color w:val="000000" w:themeColor="text1"/>
-        </w:rPr>
-        <w:t xml:space="preserve"> como números)</w:t>
+      <w:r>
+        <w:rPr>
+          <w:color w:val="000000" w:themeColor="text1"/>
+        </w:rPr>
+        <w:t>sparse_categorical_crossentropy (labels como números)</w:t>
       </w:r>
     </w:p>
     <w:p>
@@ -8234,6 +6530,7 @@
       <w:pPr>
         <w:jc w:val="both"/>
         <w:rPr>
+          <w:rFonts w:eastAsiaTheme="minorEastAsia"/>
           <w:color w:val="000000" w:themeColor="text1"/>
           <w:sz w:val="28"/>
           <w:szCs w:val="28"/>
@@ -8244,6 +6541,403 @@
       <w:pPr>
         <w:pStyle w:val="Ttulo1"/>
       </w:pPr>
+      <w:r>
+        <w:t xml:space="preserve">ESTUDO EXPLORATÓRIO </w:t>
+      </w:r>
+      <w:r>
+        <w:t>9</w:t>
+      </w:r>
+      <w:r>
+        <w:t>.5</w:t>
+      </w:r>
+      <w:r>
+        <w:t xml:space="preserve"> – </w:t>
+      </w:r>
+      <w:r>
+        <w:t>CÁLC</w:t>
+      </w:r>
+      <w:r>
+        <w:t>ULO DA PERDA PARA A VIT</w:t>
+      </w:r>
+    </w:p>
+    <w:p/>
+    <w:p>
+      <w:pPr>
+        <w:pStyle w:val="PargrafodaLista"/>
+        <w:numPr>
+          <w:ilvl w:val="0"/>
+          <w:numId w:val="48"/>
+        </w:numPr>
+        <w:jc w:val="both"/>
+        <w:rPr>
+          <w:rFonts w:eastAsiaTheme="minorEastAsia"/>
+          <w:color w:val="000000" w:themeColor="text1"/>
+        </w:rPr>
+      </w:pPr>
+      <w:r>
+        <w:t xml:space="preserve">Utilização da </w:t>
+      </w:r>
+      <w:r>
+        <w:t>Cross-Entropy Loss (entropia cruzada) para um problema de classificação, mas com uma modificação importante durante o treinamento: Label Smoothing. Já na avaliação, a perda é calculada sem smoothing.</w:t>
+      </w:r>
+    </w:p>
+    <w:p>
+      <w:pPr>
+        <w:pStyle w:val="PargrafodaLista"/>
+        <w:ind w:left="1068"/>
+        <w:jc w:val="both"/>
+        <w:rPr>
+          <w:rFonts w:eastAsiaTheme="minorEastAsia"/>
+          <w:color w:val="000000" w:themeColor="text1"/>
+        </w:rPr>
+      </w:pPr>
+    </w:p>
+    <w:p>
+      <w:pPr>
+        <w:pStyle w:val="PargrafodaLista"/>
+        <w:ind w:left="1068"/>
+        <w:jc w:val="both"/>
+        <w:rPr>
+          <w:rFonts w:eastAsiaTheme="minorEastAsia"/>
+          <w:color w:val="000000" w:themeColor="text1"/>
+          <w:sz w:val="28"/>
+          <w:szCs w:val="28"/>
+        </w:rPr>
+      </w:pPr>
+      <w:r>
+        <w:rPr>
+          <w:rFonts w:eastAsiaTheme="minorEastAsia"/>
+          <w:noProof/>
+          <w:color w:val="000000" w:themeColor="text1"/>
+          <w:sz w:val="28"/>
+          <w:szCs w:val="28"/>
+        </w:rPr>
+        <w:drawing>
+          <wp:inline distT="0" distB="0" distL="0" distR="0" wp14:anchorId="2C7F4412" wp14:editId="47B05F54">
+            <wp:extent cx="3473355" cy="2033343"/>
+            <wp:effectExtent l="0" t="0" r="0" b="5080"/>
+            <wp:docPr id="671046218" name="Imagem 1"/>
+            <wp:cNvGraphicFramePr>
+              <a:graphicFrameLocks xmlns:a="http://schemas.openxmlformats.org/drawingml/2006/main" noChangeAspect="1"/>
+            </wp:cNvGraphicFramePr>
+            <a:graphic xmlns:a="http://schemas.openxmlformats.org/drawingml/2006/main">
+              <a:graphicData uri="http://schemas.openxmlformats.org/drawingml/2006/picture">
+                <pic:pic xmlns:pic="http://schemas.openxmlformats.org/drawingml/2006/picture">
+                  <pic:nvPicPr>
+                    <pic:cNvPr id="0" name="Picture 2"/>
+                    <pic:cNvPicPr>
+                      <a:picLocks noChangeAspect="1" noChangeArrowheads="1"/>
+                    </pic:cNvPicPr>
+                  </pic:nvPicPr>
+                  <pic:blipFill>
+                    <a:blip r:embed="rId17">
+                      <a:extLst>
+                        <a:ext uri="{28A0092B-C50C-407E-A947-70E740481C1C}">
+                          <a14:useLocalDpi xmlns:a14="http://schemas.microsoft.com/office/drawing/2010/main" val="0"/>
+                        </a:ext>
+                      </a:extLst>
+                    </a:blip>
+                    <a:srcRect/>
+                    <a:stretch>
+                      <a:fillRect/>
+                    </a:stretch>
+                  </pic:blipFill>
+                  <pic:spPr bwMode="auto">
+                    <a:xfrm>
+                      <a:off x="0" y="0"/>
+                      <a:ext cx="3488273" cy="2042076"/>
+                    </a:xfrm>
+                    <a:prstGeom prst="rect">
+                      <a:avLst/>
+                    </a:prstGeom>
+                    <a:noFill/>
+                    <a:ln>
+                      <a:noFill/>
+                    </a:ln>
+                  </pic:spPr>
+                </pic:pic>
+              </a:graphicData>
+            </a:graphic>
+          </wp:inline>
+        </w:drawing>
+      </w:r>
+    </w:p>
+    <w:p>
+      <w:pPr>
+        <w:pStyle w:val="PargrafodaLista"/>
+        <w:numPr>
+          <w:ilvl w:val="0"/>
+          <w:numId w:val="48"/>
+        </w:numPr>
+        <w:jc w:val="both"/>
+        <w:rPr>
+          <w:rFonts w:eastAsiaTheme="minorEastAsia"/>
+          <w:color w:val="000000" w:themeColor="text1"/>
+        </w:rPr>
+      </w:pPr>
+      <w:r>
+        <w:rPr>
+          <w:rFonts w:eastAsiaTheme="minorEastAsia"/>
+          <w:color w:val="000000" w:themeColor="text1"/>
+        </w:rPr>
+        <w:t>Primeiro o softmax transforma os logits em probabilidades</w:t>
+      </w:r>
+      <w:r>
+        <w:rPr>
+          <w:rFonts w:eastAsiaTheme="minorEastAsia"/>
+          <w:color w:val="000000" w:themeColor="text1"/>
+        </w:rPr>
+        <w:t>, em sequência é aplicado o logaritmo</w:t>
+      </w:r>
+    </w:p>
+    <w:p>
+      <w:pPr>
+        <w:pStyle w:val="PargrafodaLista"/>
+        <w:rPr>
+          <w:rFonts w:eastAsiaTheme="minorEastAsia"/>
+          <w:color w:val="000000" w:themeColor="text1"/>
+        </w:rPr>
+      </w:pPr>
+    </w:p>
+    <w:p>
+      <w:pPr>
+        <w:pStyle w:val="PargrafodaLista"/>
+        <w:ind w:left="1068"/>
+        <w:jc w:val="both"/>
+        <w:rPr>
+          <w:rFonts w:eastAsiaTheme="minorEastAsia"/>
+          <w:color w:val="000000" w:themeColor="text1"/>
+        </w:rPr>
+      </w:pPr>
+      <w:r>
+        <w:rPr>
+          <w:rFonts w:eastAsiaTheme="minorEastAsia"/>
+          <w:noProof/>
+          <w:color w:val="000000" w:themeColor="text1"/>
+        </w:rPr>
+        <w:drawing>
+          <wp:inline distT="0" distB="0" distL="0" distR="0" wp14:anchorId="07569737" wp14:editId="1FE2CD6D">
+            <wp:extent cx="3489903" cy="2217762"/>
+            <wp:effectExtent l="0" t="0" r="0" b="0"/>
+            <wp:docPr id="708696308" name="Imagem 3"/>
+            <wp:cNvGraphicFramePr>
+              <a:graphicFrameLocks xmlns:a="http://schemas.openxmlformats.org/drawingml/2006/main" noChangeAspect="1"/>
+            </wp:cNvGraphicFramePr>
+            <a:graphic xmlns:a="http://schemas.openxmlformats.org/drawingml/2006/main">
+              <a:graphicData uri="http://schemas.openxmlformats.org/drawingml/2006/picture">
+                <pic:pic xmlns:pic="http://schemas.openxmlformats.org/drawingml/2006/picture">
+                  <pic:nvPicPr>
+                    <pic:cNvPr id="0" name="Picture 4"/>
+                    <pic:cNvPicPr>
+                      <a:picLocks noChangeAspect="1" noChangeArrowheads="1"/>
+                    </pic:cNvPicPr>
+                  </pic:nvPicPr>
+                  <pic:blipFill>
+                    <a:blip r:embed="rId18">
+                      <a:extLst>
+                        <a:ext uri="{28A0092B-C50C-407E-A947-70E740481C1C}">
+                          <a14:useLocalDpi xmlns:a14="http://schemas.microsoft.com/office/drawing/2010/main" val="0"/>
+                        </a:ext>
+                      </a:extLst>
+                    </a:blip>
+                    <a:srcRect/>
+                    <a:stretch>
+                      <a:fillRect/>
+                    </a:stretch>
+                  </pic:blipFill>
+                  <pic:spPr bwMode="auto">
+                    <a:xfrm>
+                      <a:off x="0" y="0"/>
+                      <a:ext cx="3512576" cy="2232170"/>
+                    </a:xfrm>
+                    <a:prstGeom prst="rect">
+                      <a:avLst/>
+                    </a:prstGeom>
+                    <a:noFill/>
+                    <a:ln>
+                      <a:noFill/>
+                    </a:ln>
+                  </pic:spPr>
+                </pic:pic>
+              </a:graphicData>
+            </a:graphic>
+          </wp:inline>
+        </w:drawing>
+      </w:r>
+    </w:p>
+    <w:p>
+      <w:pPr>
+        <w:pStyle w:val="PargrafodaLista"/>
+        <w:rPr>
+          <w:rFonts w:eastAsiaTheme="minorEastAsia"/>
+          <w:color w:val="000000" w:themeColor="text1"/>
+        </w:rPr>
+      </w:pPr>
+    </w:p>
+    <w:p>
+      <w:pPr>
+        <w:pStyle w:val="PargrafodaLista"/>
+        <w:numPr>
+          <w:ilvl w:val="0"/>
+          <w:numId w:val="48"/>
+        </w:numPr>
+        <w:jc w:val="both"/>
+        <w:rPr>
+          <w:rFonts w:eastAsiaTheme="minorEastAsia"/>
+          <w:color w:val="000000" w:themeColor="text1"/>
+        </w:rPr>
+      </w:pPr>
+      <w:r>
+        <w:rPr>
+          <w:rFonts w:eastAsiaTheme="minorEastAsia"/>
+          <w:color w:val="000000" w:themeColor="text1"/>
+        </w:rPr>
+        <w:lastRenderedPageBreak/>
+        <w:t xml:space="preserve">Em sequência o código gera o vetor para one-hot encoding, de modo que </w:t>
+      </w:r>
+      <w:r>
+        <w:rPr>
+          <w:rFonts w:eastAsiaTheme="minorEastAsia"/>
+          <w:color w:val="000000" w:themeColor="text1"/>
+        </w:rPr>
+        <w:t>apenas a classe correta recebe valor 1.</w:t>
+      </w:r>
+    </w:p>
+    <w:p>
+      <w:pPr>
+        <w:pStyle w:val="PargrafodaLista"/>
+        <w:numPr>
+          <w:ilvl w:val="0"/>
+          <w:numId w:val="48"/>
+        </w:numPr>
+        <w:jc w:val="both"/>
+        <w:rPr>
+          <w:rFonts w:eastAsiaTheme="minorEastAsia"/>
+          <w:color w:val="000000" w:themeColor="text1"/>
+        </w:rPr>
+      </w:pPr>
+      <w:r>
+        <w:rPr>
+          <w:rFonts w:eastAsiaTheme="minorEastAsia"/>
+          <w:color w:val="000000" w:themeColor="text1"/>
+        </w:rPr>
+        <w:t xml:space="preserve">Por fim, é aplicado o </w:t>
+      </w:r>
+      <w:r>
+        <w:rPr>
+          <w:rFonts w:eastAsiaTheme="minorEastAsia"/>
+          <w:i/>
+          <w:iCs/>
+          <w:color w:val="000000" w:themeColor="text1"/>
+        </w:rPr>
+        <w:t>label smoothing</w:t>
+      </w:r>
+      <w:r>
+        <w:rPr>
+          <w:rFonts w:eastAsiaTheme="minorEastAsia"/>
+          <w:color w:val="000000" w:themeColor="text1"/>
+        </w:rPr>
+        <w:t>, para</w:t>
+      </w:r>
+      <w:r>
+        <w:rPr>
+          <w:rFonts w:eastAsiaTheme="minorEastAsia"/>
+          <w:color w:val="000000" w:themeColor="text1"/>
+        </w:rPr>
+        <w:t xml:space="preserve"> fazer com que o modelo entenda que a </w:t>
+      </w:r>
+      <w:r>
+        <w:rPr>
+          <w:rFonts w:eastAsiaTheme="minorEastAsia"/>
+          <w:color w:val="000000" w:themeColor="text1"/>
+        </w:rPr>
+        <w:t>classe correta deve ter probabilidade alta, mas não precisa ser exatamente 100%</w:t>
+      </w:r>
+      <w:r>
+        <w:rPr>
+          <w:rFonts w:eastAsiaTheme="minorEastAsia"/>
+          <w:color w:val="000000" w:themeColor="text1"/>
+        </w:rPr>
+        <w:t>, melhorando a generalização.</w:t>
+      </w:r>
+    </w:p>
+    <w:p>
+      <w:pPr>
+        <w:pStyle w:val="PargrafodaLista"/>
+        <w:ind w:left="1068"/>
+        <w:jc w:val="both"/>
+        <w:rPr>
+          <w:rFonts w:eastAsiaTheme="minorEastAsia"/>
+          <w:color w:val="000000" w:themeColor="text1"/>
+        </w:rPr>
+      </w:pPr>
+      <w:r>
+        <w:rPr>
+          <w:rFonts w:eastAsiaTheme="minorEastAsia"/>
+          <w:color w:val="000000" w:themeColor="text1"/>
+        </w:rPr>
+        <w:drawing>
+          <wp:inline distT="0" distB="0" distL="0" distR="0" wp14:anchorId="124DF7F2" wp14:editId="7AB0CC5E">
+            <wp:extent cx="2845558" cy="2203703"/>
+            <wp:effectExtent l="0" t="0" r="0" b="6350"/>
+            <wp:docPr id="414847738" name="Imagem 1"/>
+            <wp:cNvGraphicFramePr>
+              <a:graphicFrameLocks xmlns:a="http://schemas.openxmlformats.org/drawingml/2006/main" noChangeAspect="1"/>
+            </wp:cNvGraphicFramePr>
+            <a:graphic xmlns:a="http://schemas.openxmlformats.org/drawingml/2006/main">
+              <a:graphicData uri="http://schemas.openxmlformats.org/drawingml/2006/picture">
+                <pic:pic xmlns:pic="http://schemas.openxmlformats.org/drawingml/2006/picture">
+                  <pic:nvPicPr>
+                    <pic:cNvPr id="414847738" name=""/>
+                    <pic:cNvPicPr/>
+                  </pic:nvPicPr>
+                  <pic:blipFill>
+                    <a:blip r:embed="rId19"/>
+                    <a:stretch>
+                      <a:fillRect/>
+                    </a:stretch>
+                  </pic:blipFill>
+                  <pic:spPr>
+                    <a:xfrm>
+                      <a:off x="0" y="0"/>
+                      <a:ext cx="2853509" cy="2209861"/>
+                    </a:xfrm>
+                    <a:prstGeom prst="rect">
+                      <a:avLst/>
+                    </a:prstGeom>
+                  </pic:spPr>
+                </pic:pic>
+              </a:graphicData>
+            </a:graphic>
+          </wp:inline>
+        </w:drawing>
+      </w:r>
+    </w:p>
+    <w:p>
+      <w:pPr>
+        <w:pStyle w:val="PargrafodaLista"/>
+        <w:ind w:left="1068"/>
+        <w:jc w:val="both"/>
+        <w:rPr>
+          <w:rFonts w:eastAsiaTheme="minorEastAsia"/>
+          <w:color w:val="000000" w:themeColor="text1"/>
+        </w:rPr>
+      </w:pPr>
+    </w:p>
+    <w:p>
+      <w:pPr>
+        <w:jc w:val="both"/>
+        <w:rPr>
+          <w:color w:val="000000" w:themeColor="text1"/>
+          <w:sz w:val="28"/>
+          <w:szCs w:val="28"/>
+        </w:rPr>
+      </w:pPr>
+    </w:p>
+    <w:p>
+      <w:pPr>
+        <w:pStyle w:val="Ttulo1"/>
+      </w:pPr>
       <w:bookmarkStart w:id="11" w:name="_Toc228861946"/>
       <w:r>
         <w:t xml:space="preserve">ESTUDO EXPLORATÓRIO </w:t>
@@ -8265,23 +6959,7 @@
         <w:jc w:val="both"/>
       </w:pPr>
       <w:r>
-        <w:t xml:space="preserve">O </w:t>
-      </w:r>
-      <w:proofErr w:type="spellStart"/>
-      <w:r>
-        <w:t>tmux</w:t>
-      </w:r>
-      <w:proofErr w:type="spellEnd"/>
-      <w:r>
-        <w:t xml:space="preserve"> é uma ferramenta de linha de comando que funciona como um “gerenciador de terminais dentro do terminal”. Em vez de você abrir várias janelas separadas no sistema, o </w:t>
-      </w:r>
-      <w:proofErr w:type="spellStart"/>
-      <w:r>
-        <w:t>tmux</w:t>
-      </w:r>
-      <w:proofErr w:type="spellEnd"/>
-      <w:r>
-        <w:t xml:space="preserve"> permite criar várias sessões, painéis e abas dentro de uma única janela do terminal.</w:t>
+        <w:t>O tmux é uma ferramenta de linha de comando que funciona como um “gerenciador de terminais dentro do terminal”. Em vez de você abrir várias janelas separadas no sistema, o tmux permite criar várias sessões, painéis e abas dentro de uma única janela do terminal.</w:t>
       </w:r>
     </w:p>
     <w:p>
@@ -8295,15 +6973,7 @@
         <w:jc w:val="both"/>
       </w:pPr>
       <w:r>
-        <w:t xml:space="preserve">Na prática, ele resolve um problema comum: perder o que você estava fazendo quando fecha o terminal ou perde a conexão (por exemplo, via SSH). Com o </w:t>
-      </w:r>
-      <w:proofErr w:type="spellStart"/>
-      <w:r>
-        <w:t>tmux</w:t>
-      </w:r>
-      <w:proofErr w:type="spellEnd"/>
-      <w:r>
-        <w:t>, você pode iniciar uma sessão, rodar comandos ou programas e depois “desconectar” dela sem interromper nada. Mais tarde, você pode voltar exatamente de onde parou, com tudo ainda rodando.</w:t>
+        <w:t>Na prática, ele resolve um problema comum: perder o que você estava fazendo quando fecha o terminal ou perde a conexão (por exemplo, via SSH). Com o tmux, você pode iniciar uma sessão, rodar comandos ou programas e depois “desconectar” dela sem interromper nada. Mais tarde, você pode voltar exatamente de onde parou, com tudo ainda rodando.</w:t>
       </w:r>
     </w:p>
     <w:p>
@@ -8324,15 +6994,7 @@
         <w:jc w:val="both"/>
       </w:pPr>
       <w:r>
-        <w:t xml:space="preserve">O </w:t>
-      </w:r>
-      <w:proofErr w:type="spellStart"/>
-      <w:r>
-        <w:t>tmux</w:t>
-      </w:r>
-      <w:proofErr w:type="spellEnd"/>
-      <w:r>
-        <w:t xml:space="preserve"> também trabalha com o conceito de </w:t>
+        <w:t xml:space="preserve">O tmux também trabalha com o conceito de </w:t>
       </w:r>
       <w:r>
         <w:rPr>
@@ -8357,15 +7019,7 @@
         <w:jc w:val="both"/>
       </w:pPr>
       <w:r>
-        <w:t xml:space="preserve">Utilização do </w:t>
-      </w:r>
-      <w:proofErr w:type="spellStart"/>
-      <w:r>
-        <w:t>tmux</w:t>
-      </w:r>
-      <w:proofErr w:type="spellEnd"/>
-      <w:r>
-        <w:t xml:space="preserve"> para o projeto atual (Via SSH):</w:t>
+        <w:t>Utilização do tmux para o projeto atual (Via SSH):</w:t>
       </w:r>
     </w:p>
     <w:p>
@@ -8427,33 +7081,8 @@
           <w:i/>
           <w:iCs/>
         </w:rPr>
-        <w:t xml:space="preserve">&gt;&gt; </w:t>
-      </w:r>
-      <w:proofErr w:type="spellStart"/>
-      <w:r>
-        <w:rPr>
-          <w:i/>
-          <w:iCs/>
-        </w:rPr>
-        <w:t>cd</w:t>
-      </w:r>
-      <w:proofErr w:type="spellEnd"/>
-      <w:r>
-        <w:rPr>
-          <w:i/>
-          <w:iCs/>
-        </w:rPr>
-        <w:t xml:space="preserve"> </w:t>
-      </w:r>
-      <w:proofErr w:type="spellStart"/>
-      <w:r>
-        <w:rPr>
-          <w:i/>
-          <w:iCs/>
-        </w:rPr>
-        <w:t>Classifiers_Project</w:t>
-      </w:r>
-      <w:proofErr w:type="spellEnd"/>
+        <w:t>&gt;&gt; cd Classifiers_Project</w:t>
+      </w:r>
     </w:p>
     <w:p>
       <w:pPr>
@@ -8476,23 +7105,7 @@
           <w:b/>
           <w:bCs/>
         </w:rPr>
-        <w:t xml:space="preserve">Ativar o ambiente virtual </w:t>
-      </w:r>
-      <w:proofErr w:type="spellStart"/>
-      <w:r>
-        <w:rPr>
-          <w:b/>
-          <w:bCs/>
-        </w:rPr>
-        <w:t>python</w:t>
-      </w:r>
-      <w:proofErr w:type="spellEnd"/>
-      <w:r>
-        <w:rPr>
-          <w:b/>
-          <w:bCs/>
-        </w:rPr>
-        <w:t xml:space="preserve"> </w:t>
+        <w:t xml:space="preserve">Ativar o ambiente virtual python </w:t>
       </w:r>
     </w:p>
     <w:p>
@@ -8514,51 +7127,8 @@
           <w:i/>
           <w:iCs/>
         </w:rPr>
-        <w:t xml:space="preserve">&gt;&gt; </w:t>
-      </w:r>
-      <w:proofErr w:type="spellStart"/>
-      <w:proofErr w:type="gramStart"/>
-      <w:r>
-        <w:rPr>
-          <w:i/>
-          <w:iCs/>
-        </w:rPr>
-        <w:t>source</w:t>
-      </w:r>
-      <w:proofErr w:type="spellEnd"/>
-      <w:r>
-        <w:rPr>
-          <w:i/>
-          <w:iCs/>
-        </w:rPr>
-        <w:t xml:space="preserve"> .</w:t>
-      </w:r>
-      <w:proofErr w:type="spellStart"/>
-      <w:r>
-        <w:rPr>
-          <w:i/>
-          <w:iCs/>
-        </w:rPr>
-        <w:t>venv</w:t>
-      </w:r>
-      <w:proofErr w:type="spellEnd"/>
-      <w:proofErr w:type="gramEnd"/>
-      <w:r>
-        <w:rPr>
-          <w:i/>
-          <w:iCs/>
-        </w:rPr>
-        <w:t>/bin/</w:t>
-      </w:r>
-      <w:proofErr w:type="spellStart"/>
-      <w:r>
-        <w:rPr>
-          <w:i/>
-          <w:iCs/>
-        </w:rPr>
-        <w:t>activate</w:t>
-      </w:r>
-      <w:proofErr w:type="spellEnd"/>
+        <w:t>&gt;&gt; source .venv/bin/activate</w:t>
+      </w:r>
     </w:p>
     <w:p>
       <w:pPr>
@@ -8581,23 +7151,7 @@
           <w:b/>
           <w:bCs/>
         </w:rPr>
-        <w:t xml:space="preserve">Criar uma nova seção </w:t>
-      </w:r>
-      <w:proofErr w:type="spellStart"/>
-      <w:r>
-        <w:rPr>
-          <w:b/>
-          <w:bCs/>
-        </w:rPr>
-        <w:t>tmux</w:t>
-      </w:r>
-      <w:proofErr w:type="spellEnd"/>
-      <w:r>
-        <w:rPr>
-          <w:b/>
-          <w:bCs/>
-        </w:rPr>
-        <w:t xml:space="preserve"> </w:t>
+        <w:t xml:space="preserve">Criar uma nova seção tmux </w:t>
       </w:r>
     </w:p>
     <w:p>
@@ -8621,31 +7175,20 @@
         </w:rPr>
         <w:t xml:space="preserve">&gt;&gt; </w:t>
       </w:r>
-      <w:proofErr w:type="spellStart"/>
       <w:r>
         <w:rPr>
           <w:i/>
           <w:iCs/>
         </w:rPr>
-        <w:t>tmux</w:t>
-      </w:r>
-      <w:proofErr w:type="spellEnd"/>
+        <w:t xml:space="preserve">tmux new -s </w:t>
+      </w:r>
       <w:r>
         <w:rPr>
           <w:i/>
           <w:iCs/>
         </w:rPr>
-        <w:t xml:space="preserve"> new -s </w:t>
-      </w:r>
-      <w:proofErr w:type="spellStart"/>
-      <w:r>
-        <w:rPr>
-          <w:i/>
-          <w:iCs/>
-        </w:rPr>
         <w:t>nome_seção</w:t>
       </w:r>
-      <w:proofErr w:type="spellEnd"/>
     </w:p>
     <w:p>
       <w:pPr>
@@ -8690,6 +7233,7 @@
           <w:b/>
           <w:bCs/>
         </w:rPr>
+        <w:lastRenderedPageBreak/>
         <w:t>Criar pastas do experimento:</w:t>
       </w:r>
     </w:p>
@@ -8703,31 +7247,7 @@
         <w:ind w:left="2496"/>
       </w:pPr>
       <w:r>
-        <w:t xml:space="preserve">&gt;&gt; </w:t>
-      </w:r>
-      <w:proofErr w:type="spellStart"/>
-      <w:r>
-        <w:t>mkdir</w:t>
-      </w:r>
-      <w:proofErr w:type="spellEnd"/>
-      <w:r>
-        <w:t xml:space="preserve"> -p </w:t>
-      </w:r>
-      <w:proofErr w:type="spellStart"/>
-      <w:r>
-        <w:t>experiments</w:t>
-      </w:r>
-      <w:proofErr w:type="spellEnd"/>
-      <w:r>
-        <w:t>/</w:t>
-      </w:r>
-      <w:proofErr w:type="spellStart"/>
-      <w:r>
-        <w:t>nome_experimento</w:t>
-      </w:r>
-      <w:proofErr w:type="spellEnd"/>
-      <w:r>
-        <w:t>/logs</w:t>
+        <w:t>&gt;&gt; mkdir -p experiments/nome_experimento/logs</w:t>
       </w:r>
     </w:p>
     <w:p>
@@ -8748,25 +7268,15 @@
         </w:rPr>
         <w:t xml:space="preserve">&gt;&gt; </w:t>
       </w:r>
-      <w:proofErr w:type="spellStart"/>
       <w:r>
         <w:rPr>
           <w:lang w:val="en-US"/>
         </w:rPr>
-        <w:t>mkdir</w:t>
-      </w:r>
-      <w:proofErr w:type="spellEnd"/>
-      <w:r>
-        <w:rPr>
-          <w:lang w:val="en-US"/>
-        </w:rPr>
-        <w:t xml:space="preserve"> -p experiments/</w:t>
-      </w:r>
-      <w:proofErr w:type="spellStart"/>
+        <w:t>mkdir -p experiments/</w:t>
+      </w:r>
       <w:r>
         <w:t>nome_experimento</w:t>
       </w:r>
-      <w:proofErr w:type="spellEnd"/>
       <w:r>
         <w:rPr>
           <w:lang w:val="en-US"/>
@@ -8892,21 +7402,11 @@
         <w:ind w:left="2496"/>
       </w:pPr>
       <w:r>
-        <w:t xml:space="preserve">&gt;&gt; </w:t>
-      </w:r>
-      <w:proofErr w:type="spellStart"/>
-      <w:r>
-        <w:t>tmux</w:t>
-      </w:r>
-      <w:proofErr w:type="spellEnd"/>
-      <w:r>
-        <w:t xml:space="preserve"> </w:t>
-      </w:r>
-      <w:proofErr w:type="spellStart"/>
+        <w:t xml:space="preserve">&gt;&gt; tmux </w:t>
+      </w:r>
       <w:r>
         <w:t>ls</w:t>
       </w:r>
-      <w:proofErr w:type="spellEnd"/>
     </w:p>
     <w:p>
       <w:pPr>
@@ -8926,7 +7426,6 @@
           <w:b/>
           <w:bCs/>
         </w:rPr>
-        <w:lastRenderedPageBreak/>
         <w:t>Retornar para a seção em execução</w:t>
       </w:r>
     </w:p>
@@ -8946,36 +7445,14 @@
         <w:rPr>
           <w:lang w:val="en-US"/>
         </w:rPr>
-        <w:t xml:space="preserve">&gt;&gt; </w:t>
-      </w:r>
-      <w:proofErr w:type="spellStart"/>
+        <w:t>&gt;&gt; tmux attach -t nome_s</w:t>
+      </w:r>
       <w:r>
         <w:rPr>
           <w:lang w:val="en-US"/>
         </w:rPr>
-        <w:t>tmux</w:t>
-      </w:r>
-      <w:proofErr w:type="spellEnd"/>
-      <w:r>
-        <w:rPr>
-          <w:lang w:val="en-US"/>
-        </w:rPr>
-        <w:t xml:space="preserve"> attach -t </w:t>
-      </w:r>
-      <w:proofErr w:type="spellStart"/>
-      <w:r>
-        <w:rPr>
-          <w:lang w:val="en-US"/>
-        </w:rPr>
-        <w:t>nome_s</w:t>
-      </w:r>
-      <w:r>
-        <w:rPr>
-          <w:lang w:val="en-US"/>
-        </w:rPr>
         <w:t>eção</w:t>
       </w:r>
-      <w:proofErr w:type="spellEnd"/>
     </w:p>
     <w:p>
       <w:pPr>
@@ -9014,36 +7491,14 @@
         <w:rPr>
           <w:lang w:val="en-US"/>
         </w:rPr>
-        <w:t xml:space="preserve">&gt;&gt; </w:t>
-      </w:r>
-      <w:proofErr w:type="spellStart"/>
+        <w:t>&gt;&gt; tmux attach -d -t nome_s</w:t>
+      </w:r>
       <w:r>
         <w:rPr>
           <w:lang w:val="en-US"/>
         </w:rPr>
-        <w:t>tmux</w:t>
-      </w:r>
-      <w:proofErr w:type="spellEnd"/>
-      <w:r>
-        <w:rPr>
-          <w:lang w:val="en-US"/>
-        </w:rPr>
-        <w:t xml:space="preserve"> attach -d -t </w:t>
-      </w:r>
-      <w:proofErr w:type="spellStart"/>
-      <w:r>
-        <w:rPr>
-          <w:lang w:val="en-US"/>
-        </w:rPr>
-        <w:t>nome_s</w:t>
-      </w:r>
-      <w:r>
-        <w:rPr>
-          <w:lang w:val="en-US"/>
-        </w:rPr>
         <w:t>eção</w:t>
       </w:r>
-      <w:proofErr w:type="spellEnd"/>
     </w:p>
     <w:p>
       <w:pPr>
@@ -9088,35 +7543,7 @@
         <w:rPr>
           <w:lang w:val="en-US"/>
         </w:rPr>
-        <w:t>exit (</w:t>
-      </w:r>
-      <w:proofErr w:type="spellStart"/>
-      <w:r>
-        <w:rPr>
-          <w:lang w:val="en-US"/>
-        </w:rPr>
-        <w:t>dentro</w:t>
-      </w:r>
-      <w:proofErr w:type="spellEnd"/>
-      <w:r>
-        <w:rPr>
-          <w:lang w:val="en-US"/>
-        </w:rPr>
-        <w:t xml:space="preserve"> da </w:t>
-      </w:r>
-      <w:proofErr w:type="spellStart"/>
-      <w:r>
-        <w:rPr>
-          <w:lang w:val="en-US"/>
-        </w:rPr>
-        <w:t>seção</w:t>
-      </w:r>
-      <w:proofErr w:type="spellEnd"/>
-      <w:r>
-        <w:rPr>
-          <w:lang w:val="en-US"/>
-        </w:rPr>
-        <w:t>)</w:t>
+        <w:t>exit (dentro da seção)</w:t>
       </w:r>
     </w:p>
     <w:p>
@@ -9311,38 +7738,15 @@
       <w:pPr>
         <w:pStyle w:val="PargrafodaLista"/>
         <w:ind w:left="1776"/>
-        <w:rPr>
-          <w:lang w:val="en-US"/>
-        </w:rPr>
-      </w:pPr>
-      <w:r>
-        <w:rPr>
-          <w:lang w:val="en-US"/>
-        </w:rPr>
-        <w:t>&gt;&gt; tail -f experiments/</w:t>
-      </w:r>
-      <w:proofErr w:type="spellStart"/>
-      <w:r>
-        <w:rPr>
-          <w:lang w:val="en-US"/>
-        </w:rPr>
-        <w:t>nome_experimento</w:t>
-      </w:r>
-      <w:proofErr w:type="spellEnd"/>
-      <w:r>
-        <w:rPr>
-          <w:lang w:val="en-US"/>
-        </w:rPr>
-        <w:t>/logs/train.log</w:t>
+      </w:pPr>
+      <w:r>
+        <w:t>&gt;&gt; tail -f experiments/nome_experimento/logs/train.log</w:t>
       </w:r>
     </w:p>
     <w:p>
       <w:pPr>
         <w:pStyle w:val="PargrafodaLista"/>
         <w:ind w:left="1776"/>
-        <w:rPr>
-          <w:lang w:val="en-US"/>
-        </w:rPr>
       </w:pPr>
     </w:p>
     <w:p>
@@ -9415,34 +7819,7 @@
           <w:u w:val="single"/>
           <w:lang w:val="en-US"/>
         </w:rPr>
-        <w:t xml:space="preserve">&gt;&gt; </w:t>
-      </w:r>
-      <w:r>
-        <w:rPr>
-          <w:i/>
-          <w:iCs/>
-          <w:u w:val="single"/>
-          <w:lang w:val="en-US"/>
-        </w:rPr>
-        <w:t>python VIT/</w:t>
-      </w:r>
-      <w:r>
-        <w:rPr>
-          <w:i/>
-          <w:iCs/>
-          <w:u w:val="single"/>
-          <w:lang w:val="en-US"/>
-        </w:rPr>
-        <w:t>ViT_Main</w:t>
-      </w:r>
-      <w:r>
-        <w:rPr>
-          <w:i/>
-          <w:iCs/>
-          <w:u w:val="single"/>
-          <w:lang w:val="en-US"/>
-        </w:rPr>
-        <w:t>.py &gt; experiments/exp_01/logs/train.log 2&gt;&amp;1</w:t>
+        <w:t>&gt;&gt; python VIT/ViT_Main.py &gt; experiments/exp_01/logs/train.log 2&gt;&amp;1</w:t>
       </w:r>
     </w:p>
     <w:p>
@@ -9468,15 +7845,7 @@
           <w:iCs/>
           <w:lang w:val="en-US"/>
         </w:rPr>
-        <w:t xml:space="preserve">python </w:t>
-      </w:r>
-      <w:r>
-        <w:rPr>
-          <w:i/>
-          <w:iCs/>
-          <w:lang w:val="en-US"/>
-        </w:rPr>
-        <w:t>VIT/ViT_Main.py</w:t>
+        <w:t>python VIT/ViT_Main.py</w:t>
       </w:r>
       <w:r>
         <w:rPr>
@@ -9522,7 +7891,6 @@
       <w:r>
         <w:t>(</w:t>
       </w:r>
-      <w:proofErr w:type="spellStart"/>
       <w:r>
         <w:rPr>
           <w:b/>
@@ -9530,7 +7898,6 @@
         </w:rPr>
         <w:t>stdout</w:t>
       </w:r>
-      <w:proofErr w:type="spellEnd"/>
       <w:r>
         <w:t>)</w:t>
       </w:r>
@@ -9615,168 +7982,78 @@
           <w:i/>
           <w:iCs/>
         </w:rPr>
-        <w:t>2 → erros (</w:t>
-      </w:r>
-      <w:proofErr w:type="spellStart"/>
-      <w:r>
+        <w:t xml:space="preserve">2 → erros (exceptions, warnings) </w:t>
+      </w:r>
+    </w:p>
+    <w:p>
+      <w:pPr>
+        <w:pStyle w:val="PargrafodaLista"/>
+        <w:ind w:left="2496"/>
         <w:rPr>
           <w:i/>
           <w:iCs/>
         </w:rPr>
-        <w:t>exceptions</w:t>
-      </w:r>
-      <w:proofErr w:type="spellEnd"/>
+      </w:pPr>
+    </w:p>
+    <w:p>
+      <w:pPr>
+        <w:pStyle w:val="PargrafodaLista"/>
+        <w:ind w:left="1416"/>
+      </w:pPr>
+      <w:r>
+        <w:t xml:space="preserve">Portanto, </w:t>
+      </w:r>
+      <w:r>
+        <w:t xml:space="preserve">este trecho do comando define que </w:t>
+      </w:r>
+      <w:r>
+        <w:t>os erros também</w:t>
+      </w:r>
+      <w:r>
+        <w:t xml:space="preserve"> sejam armazenados</w:t>
+      </w:r>
+      <w:r>
+        <w:t xml:space="preserve"> </w:t>
+      </w:r>
+      <w:r>
+        <w:t>n</w:t>
+      </w:r>
+      <w:r>
+        <w:t>o mesmo lugar da saída normal</w:t>
+      </w:r>
+      <w:r>
+        <w:t>.</w:t>
+      </w:r>
+    </w:p>
+    <w:p>
+      <w:pPr>
+        <w:pStyle w:val="PargrafodaLista"/>
+        <w:ind w:left="1416"/>
+      </w:pPr>
+    </w:p>
+    <w:p>
+      <w:pPr>
+        <w:pStyle w:val="PargrafodaLista"/>
+        <w:ind w:left="1416"/>
+      </w:pPr>
+      <w:r>
+        <w:t xml:space="preserve">Ao conduzir o treinamento, o log NÃO é exibido em tempo real no terminal. Para acompanhar os logs é preciso acessar o arquivo train.log por meio do comando </w:t>
+      </w:r>
       <w:r>
         <w:rPr>
           <w:i/>
           <w:iCs/>
         </w:rPr>
-        <w:t xml:space="preserve">, </w:t>
-      </w:r>
-      <w:proofErr w:type="spellStart"/>
-      <w:r>
+        <w:t>&gt;&gt; tail -f experiments/nome_experimento/logs/train.log</w:t>
+      </w:r>
+    </w:p>
+    <w:p>
+      <w:pPr>
+        <w:ind w:left="2124"/>
         <w:rPr>
           <w:i/>
           <w:iCs/>
         </w:rPr>
-        <w:t>warnings</w:t>
-      </w:r>
-      <w:proofErr w:type="spellEnd"/>
-      <w:r>
-        <w:rPr>
-          <w:i/>
-          <w:iCs/>
-        </w:rPr>
-        <w:t>)</w:t>
-      </w:r>
-      <w:r>
-        <w:rPr>
-          <w:i/>
-          <w:iCs/>
-        </w:rPr>
-        <w:t xml:space="preserve"> </w:t>
-      </w:r>
-    </w:p>
-    <w:p>
-      <w:pPr>
-        <w:pStyle w:val="PargrafodaLista"/>
-        <w:ind w:left="2496"/>
-        <w:rPr>
-          <w:i/>
-          <w:iCs/>
-        </w:rPr>
-      </w:pPr>
-    </w:p>
-    <w:p>
-      <w:pPr>
-        <w:pStyle w:val="PargrafodaLista"/>
-        <w:ind w:left="1416"/>
-      </w:pPr>
-      <w:r>
-        <w:t xml:space="preserve">Portanto, </w:t>
-      </w:r>
-      <w:r>
-        <w:t xml:space="preserve">este trecho do comando define que </w:t>
-      </w:r>
-      <w:r>
-        <w:t>os</w:t>
-      </w:r>
-      <w:r>
-        <w:t xml:space="preserve"> erros também</w:t>
-      </w:r>
-      <w:r>
-        <w:t xml:space="preserve"> sejam armazenados</w:t>
-      </w:r>
-      <w:r>
-        <w:t xml:space="preserve"> </w:t>
-      </w:r>
-      <w:r>
-        <w:t>n</w:t>
-      </w:r>
-      <w:r>
-        <w:t>o mesmo lugar da saída normal</w:t>
-      </w:r>
-      <w:r>
-        <w:t>.</w:t>
-      </w:r>
-    </w:p>
-    <w:p>
-      <w:pPr>
-        <w:pStyle w:val="PargrafodaLista"/>
-        <w:ind w:left="1416"/>
-      </w:pPr>
-    </w:p>
-    <w:p>
-      <w:pPr>
-        <w:pStyle w:val="PargrafodaLista"/>
-        <w:ind w:left="1416"/>
-      </w:pPr>
-      <w:r>
-        <w:t xml:space="preserve">Ao conduzir o treinamento, o log NÃO é exibido em tempo real no terminal. Para acompanhar os logs é preciso acessar o arquivo train.log por meio do comando </w:t>
-      </w:r>
-      <w:r>
-        <w:rPr>
-          <w:i/>
-          <w:iCs/>
-        </w:rPr>
-        <w:t xml:space="preserve">&gt;&gt; </w:t>
-      </w:r>
-      <w:proofErr w:type="spellStart"/>
-      <w:r>
-        <w:rPr>
-          <w:i/>
-          <w:iCs/>
-        </w:rPr>
-        <w:t>tail</w:t>
-      </w:r>
-      <w:proofErr w:type="spellEnd"/>
-      <w:r>
-        <w:rPr>
-          <w:i/>
-          <w:iCs/>
-        </w:rPr>
-        <w:t xml:space="preserve"> -f </w:t>
-      </w:r>
-      <w:proofErr w:type="spellStart"/>
-      <w:r>
-        <w:rPr>
-          <w:i/>
-          <w:iCs/>
-        </w:rPr>
-        <w:t>experiments</w:t>
-      </w:r>
-      <w:proofErr w:type="spellEnd"/>
-      <w:r>
-        <w:rPr>
-          <w:i/>
-          <w:iCs/>
-        </w:rPr>
-        <w:t>/</w:t>
-      </w:r>
-      <w:proofErr w:type="spellStart"/>
-      <w:r>
-        <w:rPr>
-          <w:i/>
-          <w:iCs/>
-        </w:rPr>
-        <w:t>nome_experimento</w:t>
-      </w:r>
-      <w:proofErr w:type="spellEnd"/>
-      <w:r>
-        <w:rPr>
-          <w:i/>
-          <w:iCs/>
-        </w:rPr>
-        <w:t>/logs/train.log</w:t>
-      </w:r>
-    </w:p>
-    <w:p>
-      <w:pPr>
-        <w:ind w:left="2124"/>
-        <w:rPr>
-          <w:i/>
-          <w:iCs/>
-        </w:rPr>
       </w:pPr>
     </w:p>
     <w:p>
@@ -9787,6 +8064,7 @@
     </w:p>
     <w:p>
       <w:r>
+        <w:lastRenderedPageBreak/>
         <w:tab/>
       </w:r>
     </w:p>
@@ -9883,7 +8161,7 @@
         <v:path o:extrusionok="f" gradientshapeok="t" o:connecttype="rect"/>
         <o:lock v:ext="edit" aspectratio="t"/>
       </v:shapetype>
-      <v:shape id="_x0000_i1080" type="#_x0000_t75" style="width:691.2pt;height:489.6pt;visibility:visible;mso-wrap-style:square" o:bullet="t">
+      <v:shape id="_x0000_i1054" type="#_x0000_t75" style="width:691.2pt;height:489.6pt;visibility:visible;mso-wrap-style:square" o:bullet="t">
         <v:imagedata r:id="rId1" o:title="" croptop="19686f" cropbottom="43833f" cropleft="8606f" cropright="55951f"/>
       </v:shape>
     </w:pict>

</xml_diff>